<commit_message>
update: modify JufAimee_Onderzoeksverslag.docx with new content
</commit_message>
<xml_diff>
--- a/docs/Analyseren/JufAimee_Onderzoeksverslag.docx
+++ b/docs/Analyseren/JufAimee_Onderzoeksverslag.docx
@@ -171,15 +171,7 @@
           <w:sz w:val="22"/>
           <w:szCs w:val="22"/>
         </w:rPr>
-        <w:t>Mei</w:t>
-      </w:r>
-      <w:r>
-        <w:rPr>
-          <w:color w:val="888888"/>
-          <w:sz w:val="22"/>
-          <w:szCs w:val="22"/>
-        </w:rPr>
-        <w:t xml:space="preserve"> 2026</w:t>
+        <w:t>Mei 2026</w:t>
       </w:r>
     </w:p>
     <w:p>
@@ -2994,7 +2986,35 @@
         <w:rPr>
           <w:lang w:val="en-GB"/>
         </w:rPr>
-        <w:t>7. Acceptatiecriteria en Definition of Done</w:t>
+        <w:t xml:space="preserve">7. </w:t>
+      </w:r>
+      <w:proofErr w:type="spellStart"/>
+      <w:r>
+        <w:rPr>
+          <w:lang w:val="en-GB"/>
+        </w:rPr>
+        <w:t>Acceptatiecriteria</w:t>
+      </w:r>
+      <w:proofErr w:type="spellEnd"/>
+      <w:r>
+        <w:rPr>
+          <w:lang w:val="en-GB"/>
+        </w:rPr>
+        <w:t xml:space="preserve"> </w:t>
+      </w:r>
+      <w:proofErr w:type="spellStart"/>
+      <w:r>
+        <w:rPr>
+          <w:lang w:val="en-GB"/>
+        </w:rPr>
+        <w:t>en</w:t>
+      </w:r>
+      <w:proofErr w:type="spellEnd"/>
+      <w:r>
+        <w:rPr>
+          <w:lang w:val="en-GB"/>
+        </w:rPr>
+        <w:t xml:space="preserve"> Definition of Done</w:t>
       </w:r>
       <w:bookmarkEnd w:id="24"/>
     </w:p>
@@ -3378,14 +3398,7 @@
           <w:i/>
           <w:iCs/>
         </w:rPr>
-        <w:t>Systeemprompt</w:t>
-      </w:r>
-      <w:r>
-        <w:rPr>
-          <w:i/>
-          <w:iCs/>
-        </w:rPr>
-        <w:t>-isolatie</w:t>
+        <w:t>Systeemprompt-isolatie</w:t>
       </w:r>
     </w:p>
     <w:p>
@@ -3407,14 +3420,7 @@
           <w:i/>
           <w:iCs/>
         </w:rPr>
-        <w:t>Scheiding</w:t>
-      </w:r>
-      <w:r>
-        <w:rPr>
-          <w:i/>
-          <w:iCs/>
-        </w:rPr>
-        <w:t xml:space="preserve"> tussen vaste AI-instructies en gebruikersinvoer; </w:t>
+        <w:t xml:space="preserve">Scheiding tussen vaste AI-instructies en gebruikersinvoer; </w:t>
       </w:r>
     </w:p>
     <w:p>
@@ -3436,14 +3442,7 @@
           <w:i/>
           <w:iCs/>
         </w:rPr>
-        <w:t>Invoerfiltering</w:t>
-      </w:r>
-      <w:r>
-        <w:rPr>
-          <w:i/>
-          <w:iCs/>
-        </w:rPr>
-        <w:t xml:space="preserve"> op bekende injectiepatronen; </w:t>
+        <w:t xml:space="preserve">Invoerfiltering op bekende injectiepatronen; </w:t>
       </w:r>
     </w:p>
     <w:p>
@@ -3465,14 +3464,7 @@
           <w:i/>
           <w:iCs/>
         </w:rPr>
-        <w:t>Outputvalidatie</w:t>
-      </w:r>
-      <w:r>
-        <w:rPr>
-          <w:i/>
-          <w:iCs/>
-        </w:rPr>
-        <w:t xml:space="preserve">; </w:t>
+        <w:t xml:space="preserve">Outputvalidatie; </w:t>
       </w:r>
     </w:p>
     <w:p>
@@ -3494,14 +3486,7 @@
           <w:i/>
           <w:iCs/>
         </w:rPr>
-        <w:t>Auditlogging</w:t>
-      </w:r>
-      <w:r>
-        <w:rPr>
-          <w:i/>
-          <w:iCs/>
-        </w:rPr>
-        <w:t xml:space="preserve"> van interacties voor controle achteraf door de leraar of beheerder.</w:t>
+        <w:t>Auditlogging van interacties voor controle achteraf door de leraar of beheerder.</w:t>
       </w:r>
     </w:p>
     <w:p>
@@ -3683,15 +3668,7 @@
         <w:jc w:val="both"/>
       </w:pPr>
       <w:r>
-        <w:t xml:space="preserve">De hybride architectuur van Juf Aimee bevat reeds een chat-modelcomponent voor begeleiding. Een logische vervolgstap is een zijpaneel waarmee leerlingen tijdens het maken van een opdracht vragen kunnen stellen. Het model geeft geen antwoorden maar hints, gebaseerd op de Socratische methode. Dit bevordert zelfstandig redeneren, wat essentieel is voor hoogbegaafde leerlingen. </w:t>
-      </w:r>
-      <w:proofErr w:type="gramStart"/>
-      <w:r>
-        <w:t>Conform</w:t>
-      </w:r>
-      <w:proofErr w:type="gramEnd"/>
-      <w:r>
-        <w:t xml:space="preserve"> EU AI Act Art. 14 blijft de leraar te allen tijde in staat de assistent te monitoren en in te grijpen.</w:t>
+        <w:t>De hybride architectuur van Juf Aimee bevat reeds een chat-modelcomponent voor begeleiding. Een logische vervolgstap is een zijpaneel waarmee leerlingen tijdens het maken van een opdracht vragen kunnen stellen. Het model geeft geen antwoorden maar hints, gebaseerd op de Socratische methode. Dit bevordert zelfstandig redeneren, wat essentieel is voor hoogbegaafde leerlingen. Conform EU AI Act Art. 14 blijft de leraar te allen tijde in staat de assistent te monitoren en in te grijpen.</w:t>
       </w:r>
     </w:p>
     <w:p>
@@ -3708,14 +3685,47 @@
         <w:jc w:val="both"/>
       </w:pPr>
       <w:r>
-        <w:t>In de productiefase wordt gewerkt met echte persoonsgegevens van kinderen. De AVG art. 5(1)(c) schrijft dataminimalisatie voor. Concreet advies voor een volgende fase: OPP-embeddings worden opgeslagen onder een pseudoniem leerling-ID in plaats van de naam van de leerling, namen worden uitsluitend getoond aan de direct verantwoordelijke leraar, en er geldt een bewaartermijn gekoppeld aan de schoolloopbaan. Externe AI-providers ontvangen nooit ruwe leerlingdata, in lijn met het geadviseerde lokale deployment-model.</w:t>
-      </w:r>
+        <w:t xml:space="preserve">In de productiefase wordt gewerkt met echte persoonsgegevens van kinderen. De AVG art. 5(1)(c) schrijft dataminimalisatie voor. Concreet advies voor een volgende fase: OPP-embeddings worden opgeslagen onder een pseudoniem leerling-ID in plaats van de naam van de leerling, namen worden uitsluitend getoond aan de direct verantwoordelijke leraar, en er geldt een bewaartermijn gekoppeld aan de schoolloopbaan. Externe AI-providers ontvangen nooit ruwe leerlingdata, in lijn met het geadviseerde lokale </w:t>
+      </w:r>
+      <w:proofErr w:type="spellStart"/>
+      <w:r>
+        <w:t>deployment</w:t>
+      </w:r>
+      <w:proofErr w:type="spellEnd"/>
+      <w:r>
+        <w:t>-model.</w:t>
+      </w:r>
+    </w:p>
+    <w:p>
+      <w:pPr>
+        <w:spacing w:before="80" w:after="80"/>
+        <w:jc w:val="both"/>
+      </w:pPr>
+    </w:p>
+    <w:p>
+      <w:pPr>
+        <w:spacing w:before="80" w:after="80"/>
+        <w:jc w:val="both"/>
+      </w:pPr>
+    </w:p>
+    <w:p>
+      <w:pPr>
+        <w:spacing w:before="80" w:after="80"/>
+        <w:jc w:val="both"/>
+      </w:pPr>
+    </w:p>
+    <w:p>
+      <w:pPr>
+        <w:spacing w:before="80" w:after="80"/>
+        <w:jc w:val="both"/>
+      </w:pPr>
     </w:p>
     <w:p>
       <w:pPr>
         <w:pStyle w:val="Kop2"/>
       </w:pPr>
       <w:r>
+        <w:lastRenderedPageBreak/>
         <w:t>10.3 Ouderportaal met inzagerecht</w:t>
       </w:r>
     </w:p>
@@ -3725,12 +3735,194 @@
         <w:jc w:val="both"/>
       </w:pPr>
       <w:r>
-        <w:t xml:space="preserve">Ouders van leerlingen hebben op basis van AVG art. 15 het recht op inzage in welke gegevens over hun kind worden verwerkt. Een eenvoudig ouderportaal — uitsluitend met leesrechten, zonder bewerkingsmogelijkheden — maakt Juf Aimee </w:t>
-      </w:r>
-      <w:r>
-        <w:lastRenderedPageBreak/>
-        <w:t>transparant naar alle betrokkenen en vergroot het vertrouwen van scholen in de inzet van het platform. Dit sluit direct aan op de eis van uitlegbaarheid (XAI) en mensgerichte AI zoals beschreven in het theoretisch kader.</w:t>
-      </w:r>
+        <w:t>Ouders van leerlingen hebben op basis van AVG art. 15 het recht op inzage in welke gegevens over hun kind worden verwerkt. Een eenvoudig ouderportaal — uitsluitend met leesrechten, zonder bewerkingsmogelijkheden — maakt Juf Aimee transparant naar alle betrokkenen en vergroot het vertrouwen van scholen in de inzet van het platform. Dit sluit direct aan op de eis van uitlegbaarheid (XAI) en mensgerichte AI zoals beschreven in het theoretisch kader.</w:t>
+      </w:r>
+    </w:p>
+    <w:p>
+      <w:pPr>
+        <w:pStyle w:val="Kop2"/>
+      </w:pPr>
+      <w:r>
+        <w:t xml:space="preserve">10.4 AI-taalbuddy voor leerlingen </w:t>
+      </w:r>
+    </w:p>
+    <w:p>
+      <w:pPr>
+        <w:spacing w:before="80" w:after="80"/>
+        <w:jc w:val="both"/>
+      </w:pPr>
+      <w:r>
+        <w:t xml:space="preserve">Een logische doorontwikkeling van Juf Aimee is een gespreksgerichte AI-taalbuddy waarmee leerlingen een vreemde taal kunnen oefenen via gesproken dialoog. Hoogbegaafde leerlingen leren doorgaans sneller een nieuwe taal, maar vinden binnen de reguliere klas weinig ruimte voor individuele oefening </w:t>
+      </w:r>
+      <w:r>
+        <w:t xml:space="preserve">(Hornstra et al, 2023) </w:t>
+      </w:r>
+      <w:r>
+        <w:t xml:space="preserve">Een AI-taalbuddy biedt die oefentijd op maat: het systeem stemt de gespreksonderwerpen en moeilijkheidsgraad af op de interesses en het niveau van de leerling, zoals vastgelegd in het </w:t>
+      </w:r>
+      <w:r>
+        <w:t>leerlingprofiel en het opbouwende portfolio</w:t>
+      </w:r>
+      <w:r>
+        <w:t>. De leerkracht houdt altijd inzicht in de voortgang en blijft eindverantwoordelijk voor de taalontwikkeling van de leerling.</w:t>
+      </w:r>
+      <w:bookmarkStart w:id="28" w:name="_Toc225245705"/>
+    </w:p>
+    <w:p>
+      <w:pPr>
+        <w:spacing w:before="80" w:after="80"/>
+        <w:jc w:val="both"/>
+      </w:pPr>
+    </w:p>
+    <w:p>
+      <w:pPr>
+        <w:spacing w:before="80" w:after="80"/>
+        <w:jc w:val="both"/>
+      </w:pPr>
+    </w:p>
+    <w:p>
+      <w:pPr>
+        <w:spacing w:before="80" w:after="80"/>
+        <w:jc w:val="both"/>
+      </w:pPr>
+    </w:p>
+    <w:p>
+      <w:pPr>
+        <w:spacing w:before="80" w:after="80"/>
+        <w:jc w:val="both"/>
+      </w:pPr>
+    </w:p>
+    <w:p>
+      <w:pPr>
+        <w:spacing w:before="80" w:after="80"/>
+        <w:jc w:val="both"/>
+      </w:pPr>
+    </w:p>
+    <w:p>
+      <w:pPr>
+        <w:spacing w:before="80" w:after="80"/>
+        <w:jc w:val="both"/>
+      </w:pPr>
+    </w:p>
+    <w:p>
+      <w:pPr>
+        <w:spacing w:before="80" w:after="80"/>
+        <w:jc w:val="both"/>
+      </w:pPr>
+    </w:p>
+    <w:p>
+      <w:pPr>
+        <w:spacing w:before="80" w:after="80"/>
+        <w:jc w:val="both"/>
+      </w:pPr>
+    </w:p>
+    <w:p>
+      <w:pPr>
+        <w:spacing w:before="80" w:after="80"/>
+        <w:jc w:val="both"/>
+      </w:pPr>
+    </w:p>
+    <w:p>
+      <w:pPr>
+        <w:spacing w:before="80" w:after="80"/>
+        <w:jc w:val="both"/>
+      </w:pPr>
+    </w:p>
+    <w:p>
+      <w:pPr>
+        <w:spacing w:before="80" w:after="80"/>
+        <w:jc w:val="both"/>
+      </w:pPr>
+    </w:p>
+    <w:p>
+      <w:pPr>
+        <w:spacing w:before="80" w:after="80"/>
+        <w:jc w:val="both"/>
+      </w:pPr>
+    </w:p>
+    <w:p>
+      <w:pPr>
+        <w:spacing w:before="80" w:after="80"/>
+        <w:jc w:val="both"/>
+      </w:pPr>
+    </w:p>
+    <w:p>
+      <w:pPr>
+        <w:spacing w:before="80" w:after="80"/>
+        <w:jc w:val="both"/>
+      </w:pPr>
+    </w:p>
+    <w:p>
+      <w:pPr>
+        <w:spacing w:before="80" w:after="80"/>
+        <w:jc w:val="both"/>
+      </w:pPr>
+    </w:p>
+    <w:p>
+      <w:pPr>
+        <w:spacing w:before="80" w:after="80"/>
+        <w:jc w:val="both"/>
+      </w:pPr>
+    </w:p>
+    <w:p>
+      <w:pPr>
+        <w:spacing w:before="80" w:after="80"/>
+        <w:jc w:val="both"/>
+      </w:pPr>
+    </w:p>
+    <w:p>
+      <w:pPr>
+        <w:spacing w:before="80" w:after="80"/>
+        <w:jc w:val="both"/>
+      </w:pPr>
+    </w:p>
+    <w:p>
+      <w:pPr>
+        <w:spacing w:before="80" w:after="80"/>
+        <w:jc w:val="both"/>
+      </w:pPr>
+    </w:p>
+    <w:p>
+      <w:pPr>
+        <w:spacing w:before="80" w:after="80"/>
+        <w:jc w:val="both"/>
+      </w:pPr>
+    </w:p>
+    <w:p>
+      <w:pPr>
+        <w:spacing w:before="80" w:after="80"/>
+        <w:jc w:val="both"/>
+      </w:pPr>
+    </w:p>
+    <w:p>
+      <w:pPr>
+        <w:spacing w:before="80" w:after="80"/>
+        <w:jc w:val="both"/>
+      </w:pPr>
+    </w:p>
+    <w:p>
+      <w:pPr>
+        <w:spacing w:before="80" w:after="80"/>
+        <w:jc w:val="both"/>
+      </w:pPr>
+    </w:p>
+    <w:p>
+      <w:pPr>
+        <w:spacing w:before="80" w:after="80"/>
+        <w:jc w:val="both"/>
+      </w:pPr>
+    </w:p>
+    <w:p>
+      <w:pPr>
+        <w:spacing w:before="80" w:after="80"/>
+        <w:jc w:val="both"/>
+      </w:pPr>
+    </w:p>
+    <w:p>
+      <w:pPr>
+        <w:spacing w:before="80" w:after="80"/>
+        <w:jc w:val="both"/>
+      </w:pPr>
     </w:p>
     <w:p>
       <w:pPr>
@@ -3739,15 +3931,6 @@
           <w:bottom w:val="single" w:sz="4" w:space="4" w:color="2E75B6"/>
         </w:pBdr>
       </w:pPr>
-      <w:bookmarkStart w:id="28" w:name="_Toc225245705"/>
-    </w:p>
-    <w:p>
-      <w:pPr>
-        <w:pStyle w:val="Kop1"/>
-        <w:pBdr>
-          <w:bottom w:val="single" w:sz="4" w:space="4" w:color="2E75B6"/>
-        </w:pBdr>
-      </w:pPr>
       <w:r>
         <w:t>11. Literatuur</w:t>
       </w:r>
@@ -3755,25 +3938,26 @@
     </w:p>
     <w:p>
       <w:pPr>
-        <w:spacing w:before="80" w:after="80"/>
-        <w:ind w:left="720" w:hanging="720"/>
-        <w:rPr>
-          <w:sz w:val="22"/>
-          <w:szCs w:val="22"/>
+        <w:pStyle w:val="Lijstalinea"/>
+      </w:pPr>
+      <w:r>
+        <w:t xml:space="preserve">Akata, Z., Balliet, D., De Rijke, M., Dignum, F., Dignum, V., Eiben, G., Fokkens, A., Grossi, D., Hindriks, K., Hoos, H., Hung, H., Jonker, C., Monz, C., Neerincx, M. A., Oliehoek, F., Prakken, H., Schlobach, S., van der Gaag, L. C., van Harmelen, F., &amp; Welling, M. (2020). </w:t>
+      </w:r>
+    </w:p>
+    <w:p>
+      <w:pPr>
+        <w:pStyle w:val="Lijstalinea"/>
+      </w:pPr>
+    </w:p>
+    <w:p>
+      <w:pPr>
+        <w:pStyle w:val="Lijstalinea"/>
+        <w:rPr>
           <w:lang w:val="en-GB"/>
         </w:rPr>
       </w:pPr>
       <w:r>
         <w:rPr>
-          <w:sz w:val="22"/>
-          <w:szCs w:val="22"/>
-        </w:rPr>
-        <w:t xml:space="preserve">Akata, Z., Balliet, D., De Rijke, M., Dignum, F., Dignum, V., Eiben, G., Fokkens, A., Grossi, D., Hindriks, K., Hoos, H., Hung, H., Jonker, C., Monz, C., Neerincx, M. A., Oliehoek, F., Prakken, H., Schlobach, S., van der Gaag, L. C., van Harmelen, F., &amp; Welling, M. (2020). </w:t>
-      </w:r>
-      <w:r>
-        <w:rPr>
-          <w:sz w:val="22"/>
-          <w:szCs w:val="22"/>
           <w:lang w:val="en-GB"/>
         </w:rPr>
         <w:t xml:space="preserve">A research agenda for hybrid intelligence: Augmenting human intellect with collaborative, adaptive, responsible, and explainable artificial intelligence. </w:t>
@@ -3782,16 +3966,12 @@
         <w:rPr>
           <w:i/>
           <w:iCs/>
-          <w:sz w:val="22"/>
-          <w:szCs w:val="22"/>
           <w:lang w:val="en-GB"/>
         </w:rPr>
         <w:t>Computer, 53</w:t>
       </w:r>
       <w:r>
         <w:rPr>
-          <w:sz w:val="22"/>
-          <w:szCs w:val="22"/>
           <w:lang w:val="en-GB"/>
         </w:rPr>
         <w:t>(8), 18–28.</w:t>
@@ -3799,144 +3979,237 @@
     </w:p>
     <w:p>
       <w:pPr>
-        <w:spacing w:before="80" w:after="80"/>
-        <w:ind w:left="720" w:hanging="720"/>
-        <w:rPr>
-          <w:sz w:val="22"/>
-          <w:szCs w:val="22"/>
+        <w:pStyle w:val="Lijstalinea"/>
+        <w:rPr>
           <w:lang w:val="en-GB"/>
         </w:rPr>
       </w:pPr>
     </w:p>
     <w:p>
       <w:pPr>
-        <w:spacing w:before="80" w:after="80"/>
-        <w:ind w:left="720" w:hanging="720"/>
-        <w:rPr>
-          <w:sz w:val="22"/>
-          <w:szCs w:val="22"/>
+        <w:pStyle w:val="Lijstalinea"/>
+        <w:rPr>
           <w:lang w:val="en-GB"/>
         </w:rPr>
       </w:pPr>
       <w:r>
         <w:rPr>
-          <w:sz w:val="22"/>
-          <w:szCs w:val="22"/>
           <w:lang w:val="en-GB"/>
         </w:rPr>
-        <w:t xml:space="preserve">Bloom, B. S. (Ed.). (1956). </w:t>
-      </w:r>
-      <w:r>
-        <w:rPr>
-          <w:i/>
-          <w:iCs/>
-          <w:sz w:val="22"/>
-          <w:szCs w:val="22"/>
+        <w:t>Bloom, B. S. (Ed.). (1956). Taxonomy of educational objectives: The classification of educational goals. Handbook I: Cognitive domain. David McKay.</w:t>
+      </w:r>
+    </w:p>
+    <w:p>
+      <w:pPr>
+        <w:pStyle w:val="Lijstalinea"/>
+        <w:rPr>
           <w:lang w:val="en-GB"/>
         </w:rPr>
-        <w:t>Taxonomy of educational objectives: The classification of educational goals. Handbook I: Cognitive domain.</w:t>
-      </w:r>
-      <w:r>
-        <w:rPr>
-          <w:sz w:val="22"/>
-          <w:szCs w:val="22"/>
+      </w:pPr>
+    </w:p>
+    <w:p>
+      <w:pPr>
+        <w:pStyle w:val="Lijstalinea"/>
+        <w:rPr>
           <w:lang w:val="en-GB"/>
         </w:rPr>
-        <w:t xml:space="preserve"> David McKay.</w:t>
-      </w:r>
-    </w:p>
-    <w:p>
-      <w:pPr>
-        <w:spacing w:before="80" w:after="80"/>
-        <w:ind w:left="720" w:hanging="720"/>
+      </w:pPr>
+      <w:r>
         <w:rPr>
           <w:lang w:val="en-GB"/>
         </w:rPr>
-      </w:pPr>
-    </w:p>
-    <w:p>
-      <w:pPr>
-        <w:spacing w:before="80" w:after="80"/>
-        <w:ind w:left="720" w:hanging="720"/>
-        <w:rPr>
-          <w:sz w:val="22"/>
-          <w:szCs w:val="22"/>
-        </w:rPr>
-      </w:pPr>
-      <w:r>
-        <w:rPr>
-          <w:sz w:val="22"/>
-          <w:szCs w:val="22"/>
+        <w:t>Kramer, S., &amp; Oey, M. (2026). Juf Aimee: AI-collega voor passend onderwijs. Presentatie, Hogeschool van Amsterdam, Digital Life.</w:t>
+      </w:r>
+    </w:p>
+    <w:p>
+      <w:pPr>
+        <w:pStyle w:val="Lijstalinea"/>
+        <w:rPr>
           <w:lang w:val="en-GB"/>
         </w:rPr>
-        <w:t xml:space="preserve">Kramer, S., &amp; Oey, M. (2026). </w:t>
-      </w:r>
-      <w:r>
-        <w:rPr>
-          <w:i/>
-          <w:iCs/>
-          <w:sz w:val="22"/>
-          <w:szCs w:val="22"/>
-        </w:rPr>
-        <w:t>Juf Aimee: AI-collega voor passend onderwijs.</w:t>
-      </w:r>
-      <w:r>
-        <w:rPr>
-          <w:sz w:val="22"/>
-          <w:szCs w:val="22"/>
-        </w:rPr>
-        <w:t xml:space="preserve"> Presentatie, Hogeschool van Amsterdam, Digital Life.</w:t>
-      </w:r>
-    </w:p>
-    <w:p>
-      <w:pPr>
-        <w:spacing w:before="80" w:after="80"/>
-        <w:ind w:left="720" w:hanging="720"/>
-      </w:pPr>
-    </w:p>
-    <w:p>
-      <w:pPr>
-        <w:spacing w:before="80" w:after="80"/>
-        <w:ind w:left="720" w:hanging="720"/>
-        <w:rPr>
-          <w:sz w:val="22"/>
-          <w:szCs w:val="22"/>
+      </w:pPr>
+    </w:p>
+    <w:p>
+      <w:pPr>
+        <w:pStyle w:val="Lijstalinea"/>
+        <w:rPr>
           <w:lang w:val="en-GB"/>
         </w:rPr>
       </w:pPr>
-      <w:r>
-        <w:rPr>
-          <w:sz w:val="22"/>
-          <w:szCs w:val="22"/>
+      <w:proofErr w:type="spellStart"/>
+      <w:r>
+        <w:rPr>
           <w:lang w:val="en-GB"/>
         </w:rPr>
-        <w:t xml:space="preserve">OWASP. (2023). </w:t>
-      </w:r>
-      <w:r>
-        <w:rPr>
-          <w:i/>
-          <w:iCs/>
-          <w:sz w:val="22"/>
-          <w:szCs w:val="22"/>
+        <w:t>Europees</w:t>
+      </w:r>
+      <w:proofErr w:type="spellEnd"/>
+      <w:r>
+        <w:rPr>
           <w:lang w:val="en-GB"/>
         </w:rPr>
-        <w:t>OWASP Top 10 for Large Language Model Applications — LLM01: Prompt Injection.</w:t>
-      </w:r>
-      <w:r>
-        <w:rPr>
-          <w:sz w:val="22"/>
-          <w:szCs w:val="22"/>
+        <w:t xml:space="preserve"> Parlement &amp; Raad van de </w:t>
+      </w:r>
+      <w:proofErr w:type="spellStart"/>
+      <w:r>
+        <w:rPr>
           <w:lang w:val="en-GB"/>
         </w:rPr>
+        <w:t>Europese</w:t>
+      </w:r>
+      <w:proofErr w:type="spellEnd"/>
+      <w:r>
+        <w:rPr>
+          <w:lang w:val="en-GB"/>
+        </w:rPr>
         <w:t xml:space="preserve"> </w:t>
       </w:r>
+      <w:proofErr w:type="spellStart"/>
+      <w:r>
+        <w:rPr>
+          <w:lang w:val="en-GB"/>
+        </w:rPr>
+        <w:t>Unie</w:t>
+      </w:r>
+      <w:proofErr w:type="spellEnd"/>
+      <w:r>
+        <w:rPr>
+          <w:lang w:val="en-GB"/>
+        </w:rPr>
+        <w:t xml:space="preserve">. (2024). </w:t>
+      </w:r>
+      <w:proofErr w:type="spellStart"/>
+      <w:r>
+        <w:rPr>
+          <w:lang w:val="en-GB"/>
+        </w:rPr>
+        <w:t>Verordening</w:t>
+      </w:r>
+      <w:proofErr w:type="spellEnd"/>
+      <w:r>
+        <w:rPr>
+          <w:lang w:val="en-GB"/>
+        </w:rPr>
+        <w:t xml:space="preserve"> (EU) 2024/1689 </w:t>
+      </w:r>
+      <w:proofErr w:type="spellStart"/>
+      <w:r>
+        <w:rPr>
+          <w:lang w:val="en-GB"/>
+        </w:rPr>
+        <w:t>betreffende</w:t>
+      </w:r>
+      <w:proofErr w:type="spellEnd"/>
+      <w:r>
+        <w:rPr>
+          <w:lang w:val="en-GB"/>
+        </w:rPr>
+        <w:t xml:space="preserve"> </w:t>
+      </w:r>
+      <w:proofErr w:type="spellStart"/>
+      <w:r>
+        <w:rPr>
+          <w:lang w:val="en-GB"/>
+        </w:rPr>
+        <w:t>artificiële</w:t>
+      </w:r>
+      <w:proofErr w:type="spellEnd"/>
+      <w:r>
+        <w:rPr>
+          <w:lang w:val="en-GB"/>
+        </w:rPr>
+        <w:t xml:space="preserve"> </w:t>
+      </w:r>
+      <w:proofErr w:type="spellStart"/>
+      <w:r>
+        <w:rPr>
+          <w:lang w:val="en-GB"/>
+        </w:rPr>
+        <w:t>intelligentie</w:t>
+      </w:r>
+      <w:proofErr w:type="spellEnd"/>
+      <w:r>
+        <w:rPr>
+          <w:lang w:val="en-GB"/>
+        </w:rPr>
+        <w:t xml:space="preserve"> (EU AI Act), Art. 14 — Human Oversight. </w:t>
+      </w:r>
+      <w:proofErr w:type="spellStart"/>
+      <w:r>
+        <w:rPr>
+          <w:lang w:val="en-GB"/>
+        </w:rPr>
+        <w:t>Publicatieblad</w:t>
+      </w:r>
+      <w:proofErr w:type="spellEnd"/>
+      <w:r>
+        <w:rPr>
+          <w:lang w:val="en-GB"/>
+        </w:rPr>
+        <w:t xml:space="preserve"> van de </w:t>
+      </w:r>
+      <w:proofErr w:type="spellStart"/>
+      <w:r>
+        <w:rPr>
+          <w:lang w:val="en-GB"/>
+        </w:rPr>
+        <w:t>Europese</w:t>
+      </w:r>
+      <w:proofErr w:type="spellEnd"/>
+      <w:r>
+        <w:rPr>
+          <w:lang w:val="en-GB"/>
+        </w:rPr>
+        <w:t xml:space="preserve"> </w:t>
+      </w:r>
+      <w:proofErr w:type="spellStart"/>
+      <w:r>
+        <w:rPr>
+          <w:lang w:val="en-GB"/>
+        </w:rPr>
+        <w:t>Unie</w:t>
+      </w:r>
+      <w:proofErr w:type="spellEnd"/>
+      <w:r>
+        <w:rPr>
+          <w:lang w:val="en-GB"/>
+        </w:rPr>
+        <w:t>.</w:t>
+      </w:r>
+    </w:p>
+    <w:p>
+      <w:pPr>
+        <w:pStyle w:val="Lijstalinea"/>
+        <w:rPr>
+          <w:lang w:val="en-GB"/>
+        </w:rPr>
+      </w:pPr>
+    </w:p>
+    <w:p>
+      <w:pPr>
+        <w:pStyle w:val="Lijstalinea"/>
+        <w:rPr>
+          <w:lang w:val="en-GB"/>
+        </w:rPr>
+      </w:pPr>
+      <w:r>
+        <w:rPr>
+          <w:lang w:val="en-GB"/>
+        </w:rPr>
+        <w:t>OWASP. (2023). OWASP Top 10 for Large Language Model Applications — LLM01: Prompt Injection.</w:t>
+      </w:r>
+    </w:p>
+    <w:p>
+      <w:pPr>
+        <w:pStyle w:val="Lijstalinea"/>
+        <w:rPr>
+          <w:lang w:val="en-GB"/>
+        </w:rPr>
+      </w:pPr>
       <w:hyperlink r:id="rId8" w:history="1">
         <w:r>
           <w:rPr>
             <w:rStyle w:val="Hyperlink"/>
-            <w:sz w:val="22"/>
-            <w:szCs w:val="22"/>
-            <w:lang w:val="en-GB"/>
           </w:rPr>
           <w:t>https://owasp.org/www-project-top-10-for-large-language-model-applications/</w:t>
         </w:r>
@@ -3944,8 +4217,7 @@
     </w:p>
     <w:p>
       <w:pPr>
-        <w:spacing w:before="80" w:after="80"/>
-        <w:ind w:left="720" w:hanging="720"/>
+        <w:pStyle w:val="Lijstalinea"/>
         <w:rPr>
           <w:lang w:val="en-GB"/>
         </w:rPr>
@@ -3953,69 +4225,43 @@
     </w:p>
     <w:p>
       <w:pPr>
-        <w:spacing w:before="80" w:after="80"/>
-        <w:ind w:left="720" w:hanging="720"/>
-        <w:rPr>
-          <w:sz w:val="22"/>
-          <w:szCs w:val="22"/>
+        <w:pStyle w:val="Lijstalinea"/>
+        <w:rPr>
           <w:lang w:val="en-GB"/>
         </w:rPr>
       </w:pPr>
       <w:r>
         <w:rPr>
-          <w:sz w:val="22"/>
-          <w:szCs w:val="22"/>
           <w:lang w:val="en-GB"/>
         </w:rPr>
-        <w:t xml:space="preserve">Perez, F., &amp; Ribeiro, I. (2022). </w:t>
-      </w:r>
-      <w:r>
-        <w:rPr>
-          <w:i/>
-          <w:iCs/>
-          <w:sz w:val="22"/>
-          <w:szCs w:val="22"/>
+        <w:t xml:space="preserve">Perez, F., &amp; Ribeiro, I. (2022). Ignore Previous Prompt: Attack Techniques </w:t>
+      </w:r>
+      <w:proofErr w:type="gramStart"/>
+      <w:r>
+        <w:rPr>
           <w:lang w:val="en-GB"/>
         </w:rPr>
-        <w:t xml:space="preserve">Ignore Previous Prompt: Attack Techniques </w:t>
-      </w:r>
-      <w:proofErr w:type="gramStart"/>
-      <w:r>
-        <w:rPr>
-          <w:i/>
-          <w:iCs/>
-          <w:sz w:val="22"/>
-          <w:szCs w:val="22"/>
+        <w:t>For</w:t>
+      </w:r>
+      <w:proofErr w:type="gramEnd"/>
+      <w:r>
+        <w:rPr>
           <w:lang w:val="en-GB"/>
         </w:rPr>
-        <w:t>For</w:t>
-      </w:r>
-      <w:proofErr w:type="gramEnd"/>
-      <w:r>
-        <w:rPr>
-          <w:i/>
-          <w:iCs/>
-          <w:sz w:val="22"/>
-          <w:szCs w:val="22"/>
+        <w:t xml:space="preserve"> Language Models. arXiv. </w:t>
+      </w:r>
+    </w:p>
+    <w:p>
+      <w:pPr>
+        <w:pStyle w:val="Lijstalinea"/>
+        <w:rPr>
           <w:lang w:val="en-GB"/>
         </w:rPr>
-        <w:t xml:space="preserve"> Language Models.</w:t>
-      </w:r>
-      <w:r>
-        <w:rPr>
-          <w:sz w:val="22"/>
-          <w:szCs w:val="22"/>
-          <w:lang w:val="en-GB"/>
-        </w:rPr>
-        <w:t xml:space="preserve"> arXiv. </w:t>
-      </w:r>
+      </w:pPr>
       <w:hyperlink r:id="rId9" w:history="1">
         <w:r>
           <w:rPr>
             <w:rStyle w:val="Hyperlink"/>
-            <w:sz w:val="22"/>
-            <w:szCs w:val="22"/>
-            <w:lang w:val="en-GB"/>
           </w:rPr>
           <w:t>https://arxiv.org/abs/2211.09527</w:t>
         </w:r>
@@ -4023,8 +4269,7 @@
     </w:p>
     <w:p>
       <w:pPr>
-        <w:spacing w:before="80" w:after="80"/>
-        <w:ind w:left="720" w:hanging="720"/>
+        <w:pStyle w:val="Lijstalinea"/>
         <w:rPr>
           <w:lang w:val="en-GB"/>
         </w:rPr>
@@ -4032,45 +4277,73 @@
     </w:p>
     <w:p>
       <w:pPr>
-        <w:spacing w:before="80" w:after="80"/>
-        <w:ind w:left="720" w:hanging="720"/>
-        <w:rPr>
-          <w:sz w:val="22"/>
-          <w:szCs w:val="22"/>
-        </w:rPr>
-      </w:pPr>
-      <w:r>
-        <w:rPr>
-          <w:sz w:val="22"/>
-          <w:szCs w:val="22"/>
-        </w:rPr>
-        <w:t xml:space="preserve">Europees Parlement &amp; Raad van de Europese Unie. (2024). </w:t>
+        <w:pStyle w:val="Lijstalinea"/>
+        <w:rPr>
+          <w:lang w:val="en-GB"/>
+        </w:rPr>
+      </w:pPr>
+      <w:r>
+        <w:rPr>
+          <w:lang w:val="en-GB"/>
+        </w:rPr>
+        <w:t xml:space="preserve">Lisette Hornstra et al. (2023). </w:t>
       </w:r>
       <w:r>
         <w:rPr>
           <w:i/>
           <w:iCs/>
-          <w:sz w:val="22"/>
-          <w:szCs w:val="22"/>
-        </w:rPr>
-        <w:t>Verordening (EU) 2024/1689 betreffende artificiële intelligentie (EU AI Act), Art. 14 — Human Oversight.</w:t>
-      </w:r>
-      <w:r>
-        <w:rPr>
-          <w:sz w:val="22"/>
-          <w:szCs w:val="22"/>
-        </w:rPr>
-        <w:t xml:space="preserve"> Publicatieblad van de Europese Unie.</w:t>
-      </w:r>
-    </w:p>
-    <w:p>
-      <w:pPr>
-        <w:spacing w:before="80" w:after="80"/>
-        <w:ind w:left="720" w:hanging="720"/>
+          <w:lang w:val="en-GB"/>
+        </w:rPr>
+        <w:t>Academic motivation of intellectually gifted students and their classmates in regular primary school classes: A multidimensional, longitudinal, person- and variable-</w:t>
+      </w:r>
+      <w:proofErr w:type="spellStart"/>
+      <w:r>
+        <w:rPr>
+          <w:i/>
+          <w:iCs/>
+          <w:lang w:val="en-GB"/>
+        </w:rPr>
+        <w:t>centered</w:t>
+      </w:r>
+      <w:proofErr w:type="spellEnd"/>
+      <w:r>
+        <w:rPr>
+          <w:i/>
+          <w:iCs/>
+          <w:lang w:val="en-GB"/>
+        </w:rPr>
+        <w:t xml:space="preserve"> approach</w:t>
+      </w:r>
+      <w:r>
+        <w:rPr>
+          <w:lang w:val="en-GB"/>
+        </w:rPr>
+        <w:t>.</w:t>
+      </w:r>
+    </w:p>
+    <w:p>
+      <w:pPr>
+        <w:pStyle w:val="Lijstalinea"/>
+      </w:pPr>
+      <w:hyperlink r:id="rId10" w:history="1">
+        <w:r>
+          <w:rPr>
+            <w:rStyle w:val="Hyperlink"/>
+          </w:rPr>
+          <w:t>https://www.sciencedirect.com/science/article/pii/S1041608023000894?via%3Dihub</w:t>
+        </w:r>
+      </w:hyperlink>
+    </w:p>
+    <w:p>
+      <w:pPr>
+        <w:pStyle w:val="Lijstalinea"/>
+        <w:rPr>
+          <w:lang w:val="en-GB"/>
+        </w:rPr>
       </w:pPr>
     </w:p>
     <w:sectPr>
-      <w:footerReference w:type="default" r:id="rId10"/>
+      <w:footerReference w:type="default" r:id="rId11"/>
       <w:pgSz w:w="11906" w:h="16838"/>
       <w:pgMar w:top="1440" w:right="1440" w:bottom="1440" w:left="1800" w:header="708" w:footer="708" w:gutter="0"/>
       <w:cols w:space="708"/>
@@ -5105,6 +5378,22 @@
       <w:shd w:val="clear" w:color="auto" w:fill="E1DFDD"/>
     </w:rPr>
   </w:style>
+  <w:style w:type="character" w:customStyle="1" w:styleId="whitespace-normal">
+    <w:name w:val="whitespace-normal"/>
+    <w:basedOn w:val="Standaardalinea-lettertype"/>
+    <w:rsid w:val="00D477BB"/>
+  </w:style>
+  <w:style w:type="character" w:styleId="Nadruk">
+    <w:name w:val="Emphasis"/>
+    <w:basedOn w:val="Standaardalinea-lettertype"/>
+    <w:uiPriority w:val="20"/>
+    <w:qFormat/>
+    <w:rsid w:val="00D477BB"/>
+    <w:rPr>
+      <w:i/>
+      <w:iCs/>
+    </w:rPr>
+  </w:style>
 </w:styles>
 </file>
 

</xml_diff>

<commit_message>
update: refine contact information formatting in JufAimee_Onderzoeksverslag.docx
</commit_message>
<xml_diff>
--- a/docs/Analyseren/JufAimee_Onderzoeksverslag.docx
+++ b/docs/Analyseren/JufAimee_Onderzoeksverslag.docx
@@ -133,7 +133,19 @@
         <w:rPr>
           <w:color w:val="555555"/>
         </w:rPr>
-        <w:t>Lectoraat Digital Life — Hogeschool van Amsterdam</w:t>
+        <w:t xml:space="preserve">Lectoraat Digital Life </w:t>
+      </w:r>
+      <w:r>
+        <w:rPr>
+          <w:color w:val="555555"/>
+        </w:rPr>
+        <w:t>-</w:t>
+      </w:r>
+      <w:r>
+        <w:rPr>
+          <w:color w:val="555555"/>
+        </w:rPr>
+        <w:t xml:space="preserve"> Hogeschool van Amsterdam</w:t>
       </w:r>
     </w:p>
     <w:p>
@@ -141,23 +153,27 @@
         <w:spacing w:after="100"/>
         <w:jc w:val="center"/>
       </w:pPr>
-      <w:proofErr w:type="gramStart"/>
       <w:r>
         <w:rPr>
           <w:color w:val="2E75B6"/>
           <w:sz w:val="22"/>
           <w:szCs w:val="22"/>
         </w:rPr>
-        <w:t>s.kramer2@hva.nl</w:t>
-      </w:r>
-      <w:proofErr w:type="gramEnd"/>
+        <w:t xml:space="preserve">s.kramer2@hva.nl </w:t>
+      </w:r>
+      <w:r>
+        <w:rPr>
+          <w:color w:val="555555"/>
+        </w:rPr>
+        <w:t xml:space="preserve">- </w:t>
+      </w:r>
       <w:r>
         <w:rPr>
           <w:color w:val="2E75B6"/>
           <w:sz w:val="22"/>
           <w:szCs w:val="22"/>
         </w:rPr>
-        <w:t xml:space="preserve"> — m.a.oey@hva.nl</w:t>
+        <w:t>m.a.oey@hva.nl</w:t>
       </w:r>
     </w:p>
     <w:p>
@@ -2805,15 +2821,7 @@
         <w:jc w:val="both"/>
       </w:pPr>
       <w:r>
-        <w:t xml:space="preserve">Het Hybride AI-framework (Akata et al., 2020) beschrijft AI-systemen die samenwerken met mensen op basis van wederzijdse aanvulling. In de context van Juf Aimee betekent dit dat de </w:t>
-      </w:r>
-      <w:proofErr w:type="gramStart"/>
-      <w:r>
-        <w:t>AI taken</w:t>
-      </w:r>
-      <w:proofErr w:type="gramEnd"/>
-      <w:r>
-        <w:t xml:space="preserve"> overneemt waarvoor zij beter geschikt is </w:t>
+        <w:t xml:space="preserve">Het Hybride AI-framework (Akata et al., 2020) beschrijft AI-systemen die samenwerken met mensen op basis van wederzijdse aanvulling. In de context van Juf Aimee betekent dit dat de AI taken overneemt waarvoor zij beter geschikt is </w:t>
       </w:r>
       <w:r>
         <w:lastRenderedPageBreak/>
@@ -3158,13 +3166,8 @@
         </w:numPr>
         <w:spacing w:before="60" w:after="60"/>
       </w:pPr>
-      <w:proofErr w:type="gramStart"/>
-      <w:r>
-        <w:t>Issue /</w:t>
-      </w:r>
-      <w:proofErr w:type="gramEnd"/>
-      <w:r>
-        <w:t xml:space="preserve"> taak staat op ‘Done’ in het projectboard.</w:t>
+      <w:r>
+        <w:t>Issue / taak staat op ‘Done’ in het projectboard.</w:t>
       </w:r>
     </w:p>
     <w:p>
@@ -4010,129 +4013,39 @@
     <w:p>
       <w:pPr>
         <w:pStyle w:val="Lijstalinea"/>
+      </w:pPr>
+      <w:r>
         <w:rPr>
           <w:lang w:val="en-GB"/>
         </w:rPr>
-      </w:pPr>
-      <w:r>
+        <w:t xml:space="preserve">Kramer, S., &amp; Oey, M. (2026). </w:t>
+      </w:r>
+      <w:r>
+        <w:t>Juf Aimee: AI-collega voor passend onderwijs. Presentatie, Hogeschool van Amsterdam, Digital Life.</w:t>
+      </w:r>
+    </w:p>
+    <w:p>
+      <w:pPr>
+        <w:pStyle w:val="Lijstalinea"/>
+      </w:pPr>
+    </w:p>
+    <w:p>
+      <w:pPr>
+        <w:pStyle w:val="Lijstalinea"/>
         <w:rPr>
           <w:lang w:val="en-GB"/>
         </w:rPr>
-        <w:t>Kramer, S., &amp; Oey, M. (2026). Juf Aimee: AI-collega voor passend onderwijs. Presentatie, Hogeschool van Amsterdam, Digital Life.</w:t>
-      </w:r>
-    </w:p>
-    <w:p>
-      <w:pPr>
-        <w:pStyle w:val="Lijstalinea"/>
-        <w:rPr>
-          <w:lang w:val="en-GB"/>
-        </w:rPr>
-      </w:pPr>
-    </w:p>
-    <w:p>
-      <w:pPr>
-        <w:pStyle w:val="Lijstalinea"/>
-        <w:rPr>
-          <w:lang w:val="en-GB"/>
-        </w:rPr>
-      </w:pPr>
+      </w:pPr>
+      <w:r>
+        <w:t xml:space="preserve">Europees Parlement &amp; Raad van de Europese Unie. (2024). Verordening (EU) 2024/1689 betreffende artificiële intelligentie (EU AI Act), Art. 14 — Human </w:t>
+      </w:r>
       <w:proofErr w:type="spellStart"/>
       <w:r>
-        <w:rPr>
-          <w:lang w:val="en-GB"/>
-        </w:rPr>
-        <w:t>Europees</w:t>
+        <w:t>Oversight</w:t>
       </w:r>
       <w:proofErr w:type="spellEnd"/>
       <w:r>
-        <w:rPr>
-          <w:lang w:val="en-GB"/>
-        </w:rPr>
-        <w:t xml:space="preserve"> Parlement &amp; Raad van de </w:t>
-      </w:r>
-      <w:proofErr w:type="spellStart"/>
-      <w:r>
-        <w:rPr>
-          <w:lang w:val="en-GB"/>
-        </w:rPr>
-        <w:t>Europese</w:t>
-      </w:r>
-      <w:proofErr w:type="spellEnd"/>
-      <w:r>
-        <w:rPr>
-          <w:lang w:val="en-GB"/>
-        </w:rPr>
-        <w:t xml:space="preserve"> </w:t>
-      </w:r>
-      <w:proofErr w:type="spellStart"/>
-      <w:r>
-        <w:rPr>
-          <w:lang w:val="en-GB"/>
-        </w:rPr>
-        <w:t>Unie</w:t>
-      </w:r>
-      <w:proofErr w:type="spellEnd"/>
-      <w:r>
-        <w:rPr>
-          <w:lang w:val="en-GB"/>
-        </w:rPr>
-        <w:t xml:space="preserve">. (2024). </w:t>
-      </w:r>
-      <w:proofErr w:type="spellStart"/>
-      <w:r>
-        <w:rPr>
-          <w:lang w:val="en-GB"/>
-        </w:rPr>
-        <w:t>Verordening</w:t>
-      </w:r>
-      <w:proofErr w:type="spellEnd"/>
-      <w:r>
-        <w:rPr>
-          <w:lang w:val="en-GB"/>
-        </w:rPr>
-        <w:t xml:space="preserve"> (EU) 2024/1689 </w:t>
-      </w:r>
-      <w:proofErr w:type="spellStart"/>
-      <w:r>
-        <w:rPr>
-          <w:lang w:val="en-GB"/>
-        </w:rPr>
-        <w:t>betreffende</w:t>
-      </w:r>
-      <w:proofErr w:type="spellEnd"/>
-      <w:r>
-        <w:rPr>
-          <w:lang w:val="en-GB"/>
-        </w:rPr>
-        <w:t xml:space="preserve"> </w:t>
-      </w:r>
-      <w:proofErr w:type="spellStart"/>
-      <w:r>
-        <w:rPr>
-          <w:lang w:val="en-GB"/>
-        </w:rPr>
-        <w:t>artificiële</w:t>
-      </w:r>
-      <w:proofErr w:type="spellEnd"/>
-      <w:r>
-        <w:rPr>
-          <w:lang w:val="en-GB"/>
-        </w:rPr>
-        <w:t xml:space="preserve"> </w:t>
-      </w:r>
-      <w:proofErr w:type="spellStart"/>
-      <w:r>
-        <w:rPr>
-          <w:lang w:val="en-GB"/>
-        </w:rPr>
-        <w:t>intelligentie</w:t>
-      </w:r>
-      <w:proofErr w:type="spellEnd"/>
-      <w:r>
-        <w:rPr>
-          <w:lang w:val="en-GB"/>
-        </w:rPr>
-        <w:t xml:space="preserve"> (EU AI Act), Art. 14 — Human Oversight. </w:t>
+        <w:t xml:space="preserve">. </w:t>
       </w:r>
       <w:proofErr w:type="spellStart"/>
       <w:r>
@@ -4210,6 +4123,7 @@
         <w:r>
           <w:rPr>
             <w:rStyle w:val="Hyperlink"/>
+            <w:lang w:val="en-GB"/>
           </w:rPr>
           <w:t>https://owasp.org/www-project-top-10-for-large-language-model-applications/</w:t>
         </w:r>
@@ -4234,29 +4148,12 @@
         <w:rPr>
           <w:lang w:val="en-GB"/>
         </w:rPr>
-        <w:t xml:space="preserve">Perez, F., &amp; Ribeiro, I. (2022). Ignore Previous Prompt: Attack Techniques </w:t>
-      </w:r>
-      <w:proofErr w:type="gramStart"/>
-      <w:r>
-        <w:rPr>
-          <w:lang w:val="en-GB"/>
-        </w:rPr>
-        <w:t>For</w:t>
-      </w:r>
-      <w:proofErr w:type="gramEnd"/>
-      <w:r>
-        <w:rPr>
-          <w:lang w:val="en-GB"/>
-        </w:rPr>
-        <w:t xml:space="preserve"> Language Models. arXiv. </w:t>
+        <w:t xml:space="preserve">Perez, F., &amp; Ribeiro, I. (2022). Ignore Previous Prompt: Attack Techniques For Language Models. arXiv. </w:t>
       </w:r>
     </w:p>
     <w:p>
       <w:pPr>
         <w:pStyle w:val="Lijstalinea"/>
-        <w:rPr>
-          <w:lang w:val="en-GB"/>
-        </w:rPr>
       </w:pPr>
       <w:hyperlink r:id="rId9" w:history="1">
         <w:r>
@@ -4270,23 +4167,23 @@
     <w:p>
       <w:pPr>
         <w:pStyle w:val="Lijstalinea"/>
+      </w:pPr>
+    </w:p>
+    <w:p>
+      <w:pPr>
+        <w:pStyle w:val="Lijstalinea"/>
         <w:rPr>
           <w:lang w:val="en-GB"/>
         </w:rPr>
       </w:pPr>
-    </w:p>
-    <w:p>
-      <w:pPr>
-        <w:pStyle w:val="Lijstalinea"/>
+      <w:r>
+        <w:t xml:space="preserve">Lisette Hornstra et al. </w:t>
+      </w:r>
+      <w:r>
         <w:rPr>
           <w:lang w:val="en-GB"/>
         </w:rPr>
-      </w:pPr>
-      <w:r>
-        <w:rPr>
-          <w:lang w:val="en-GB"/>
-        </w:rPr>
-        <w:t xml:space="preserve">Lisette Hornstra et al. (2023). </w:t>
+        <w:t xml:space="preserve">(2023). </w:t>
       </w:r>
       <w:r>
         <w:rPr>
@@ -4324,11 +4221,15 @@
     <w:p>
       <w:pPr>
         <w:pStyle w:val="Lijstalinea"/>
+        <w:rPr>
+          <w:lang w:val="en-GB"/>
+        </w:rPr>
       </w:pPr>
       <w:hyperlink r:id="rId10" w:history="1">
         <w:r>
           <w:rPr>
             <w:rStyle w:val="Hyperlink"/>
+            <w:lang w:val="en-GB"/>
           </w:rPr>
           <w:t>https://www.sciencedirect.com/science/article/pii/S1041608023000894?via%3Dihub</w:t>
         </w:r>
@@ -4384,43 +4285,7 @@
         <w:sz w:val="20"/>
         <w:szCs w:val="20"/>
       </w:rPr>
-      <w:t xml:space="preserve">Juf Aimee — </w:t>
-    </w:r>
-    <w:proofErr w:type="gramStart"/>
-    <w:r>
-      <w:rPr>
-        <w:color w:val="888888"/>
-        <w:sz w:val="20"/>
-        <w:szCs w:val="20"/>
-      </w:rPr>
-      <w:t>Onderzoeksverslag  |</w:t>
-    </w:r>
-    <w:proofErr w:type="gramEnd"/>
-    <w:r>
-      <w:rPr>
-        <w:color w:val="888888"/>
-        <w:sz w:val="20"/>
-        <w:szCs w:val="20"/>
-      </w:rPr>
-      <w:t xml:space="preserve">  Digital Life, Hogeschool van </w:t>
-    </w:r>
-    <w:proofErr w:type="gramStart"/>
-    <w:r>
-      <w:rPr>
-        <w:color w:val="888888"/>
-        <w:sz w:val="20"/>
-        <w:szCs w:val="20"/>
-      </w:rPr>
-      <w:t>Amsterdam  |</w:t>
-    </w:r>
-    <w:proofErr w:type="gramEnd"/>
-    <w:r>
-      <w:rPr>
-        <w:color w:val="888888"/>
-        <w:sz w:val="20"/>
-        <w:szCs w:val="20"/>
-      </w:rPr>
-      <w:t xml:space="preserve">  Pagina </w:t>
+      <w:t xml:space="preserve">Juf Aimee — Onderzoeksverslag  |  Digital Life, Hogeschool van Amsterdam  |  Pagina </w:t>
     </w:r>
     <w:r>
       <w:rPr>

</xml_diff>

<commit_message>
onderzoeksverslag verbeterd met kernzinnen in begin van theoretisch kader.
</commit_message>
<xml_diff>
--- a/docs/Analyseren/JufAimee_Onderzoeksverslag.docx
+++ b/docs/Analyseren/JufAimee_Onderzoeksverslag.docx
@@ -382,6 +382,9 @@
       <w:pPr>
         <w:spacing w:before="80" w:after="80"/>
       </w:pPr>
+      <w:r>
+        <w:tab/>
+      </w:r>
     </w:p>
     <w:p>
       <w:pPr>
@@ -3203,204 +3206,175 @@
     </w:p>
     <w:p>
       <w:pPr>
-        <w:spacing w:before="80" w:after="80"/>
-        <w:jc w:val="both"/>
-        <w:rPr>
-          <w:rFonts w:ascii="Arial" w:eastAsia="Arial" w:hAnsi="Arial" w:cs="Arial"/>
-        </w:rPr>
-      </w:pPr>
-      <w:r>
-        <w:rPr>
-          <w:rFonts w:ascii="Arial" w:eastAsia="Arial" w:hAnsi="Arial" w:cs="Arial"/>
-        </w:rPr>
-        <w:t>De Taxonomie van Bloom biedt een gelaagd model van cognitieve vaardigheden, van lagere-orde onthouden, begrijpen</w:t>
-      </w:r>
-      <w:r>
-        <w:rPr>
-          <w:rFonts w:ascii="Arial" w:eastAsia="Arial" w:hAnsi="Arial" w:cs="Arial"/>
-        </w:rPr>
-        <w:t xml:space="preserve"> en</w:t>
-      </w:r>
-      <w:r>
-        <w:rPr>
-          <w:rFonts w:ascii="Arial" w:eastAsia="Arial" w:hAnsi="Arial" w:cs="Arial"/>
-        </w:rPr>
-        <w:t xml:space="preserve"> toepassen naar hogere-orde denkvaardigheden analyseren, evalueren</w:t>
-      </w:r>
-      <w:r>
-        <w:rPr>
-          <w:rFonts w:ascii="Arial" w:eastAsia="Arial" w:hAnsi="Arial" w:cs="Arial"/>
-        </w:rPr>
-        <w:t xml:space="preserve"> en</w:t>
-      </w:r>
-      <w:r>
-        <w:rPr>
-          <w:rFonts w:ascii="Arial" w:eastAsia="Arial" w:hAnsi="Arial" w:cs="Arial"/>
-        </w:rPr>
-        <w:t xml:space="preserve"> creëren. Hoogbegaafde leerlingen profiteren het meest van opdrachten die de hogere niveaus aanspreken. Juf Aimee gebruikt dit kader als basis voor het genereren en categoriseren van opdrachten.</w:t>
-      </w:r>
-    </w:p>
-    <w:p>
-      <w:pPr>
         <w:pStyle w:val="Kop2"/>
+        <w:rPr>
+          <w:b w:val="0"/>
+          <w:bCs w:val="0"/>
+          <w:color w:val="auto"/>
+          <w:sz w:val="24"/>
+          <w:szCs w:val="24"/>
+        </w:rPr>
       </w:pPr>
       <w:bookmarkStart w:id="18" w:name="_Toc225245695"/>
       <w:r>
+        <w:rPr>
+          <w:b w:val="0"/>
+          <w:bCs w:val="0"/>
+          <w:color w:val="auto"/>
+          <w:sz w:val="24"/>
+          <w:szCs w:val="24"/>
+        </w:rPr>
+        <w:t>De Taxonomie van Bloom biedt een gelaagd model van cognitieve vaardigheden. Het model loopt van lagere-orde vaardigheden onthouden, begrijpen en toepassen naar hogere-orde denkvaardigheden zoals analyseren, evalueren en creëren. Hoogbegaafde leerlingen profiteren het meest van opdrachten die de hogere niveaus aanspreken. Juf Aimee gebruikt dit kader als basis voor het genereren en categoriseren van opdrachten.</w:t>
+      </w:r>
+    </w:p>
+    <w:p>
+      <w:pPr>
+        <w:pStyle w:val="Kop2"/>
+      </w:pPr>
+      <w:r>
         <w:t>5.2 Hybride AI</w:t>
       </w:r>
       <w:bookmarkEnd w:id="18"/>
     </w:p>
     <w:p>
       <w:pPr>
-        <w:spacing w:before="80" w:after="80"/>
-        <w:jc w:val="both"/>
-        <w:rPr>
-          <w:rFonts w:ascii="Arial" w:eastAsia="Arial" w:hAnsi="Arial" w:cs="Arial"/>
-        </w:rPr>
-      </w:pPr>
-      <w:r>
-        <w:rPr>
-          <w:rFonts w:ascii="Arial" w:eastAsia="Arial" w:hAnsi="Arial" w:cs="Arial"/>
-        </w:rPr>
-        <w:t xml:space="preserve">Het Hybride </w:t>
-      </w:r>
-      <w:r>
-        <w:rPr>
-          <w:rFonts w:ascii="Arial" w:eastAsia="Arial" w:hAnsi="Arial" w:cs="Arial"/>
-          <w:i/>
-          <w:iCs/>
-        </w:rPr>
-        <w:t>AI-framework</w:t>
-      </w:r>
-      <w:r>
-        <w:rPr>
-          <w:rFonts w:ascii="Arial" w:eastAsia="Arial" w:hAnsi="Arial" w:cs="Arial"/>
-        </w:rPr>
-        <w:t xml:space="preserve"> (Akata et al., 2020) beschrijft AI-systemen die samenwerken met mensen op basis van wederzijdse aanvulling. In de context van Juf Aimee betekent dit dat de </w:t>
-      </w:r>
-      <w:r>
-        <w:rPr>
-          <w:rFonts w:ascii="Arial" w:eastAsia="Arial" w:hAnsi="Arial" w:cs="Arial"/>
-        </w:rPr>
-        <w:t>AI-taken</w:t>
-      </w:r>
-      <w:r>
-        <w:rPr>
-          <w:rFonts w:ascii="Arial" w:eastAsia="Arial" w:hAnsi="Arial" w:cs="Arial"/>
-        </w:rPr>
-        <w:t xml:space="preserve"> overneemt waarvoor zij beter geschikt is grootschalige personalisatie, voortgangsmonitoring terwijl de leraar de taken behoudt die menselijk oordeelsvermogen vereisen pedagogische beslissingen, relatie met de leer</w:t>
-      </w:r>
-      <w:r>
-        <w:rPr>
-          <w:rFonts w:ascii="Arial" w:eastAsia="Arial" w:hAnsi="Arial" w:cs="Arial"/>
-        </w:rPr>
-        <w:t>ling</w:t>
-      </w:r>
-      <w:r>
-        <w:rPr>
-          <w:rFonts w:ascii="Arial" w:eastAsia="Arial" w:hAnsi="Arial" w:cs="Arial"/>
-        </w:rPr>
-        <w:t>.</w:t>
-      </w:r>
-    </w:p>
-    <w:p>
-      <w:pPr>
         <w:pStyle w:val="Kop2"/>
+        <w:rPr>
+          <w:b w:val="0"/>
+          <w:bCs w:val="0"/>
+          <w:color w:val="auto"/>
+          <w:sz w:val="24"/>
+          <w:szCs w:val="24"/>
+        </w:rPr>
       </w:pPr>
       <w:bookmarkStart w:id="19" w:name="_Toc225245696"/>
       <w:r>
+        <w:rPr>
+          <w:b w:val="0"/>
+          <w:bCs w:val="0"/>
+          <w:color w:val="auto"/>
+          <w:sz w:val="24"/>
+          <w:szCs w:val="24"/>
+        </w:rPr>
+        <w:t xml:space="preserve">Juf Aimee is ontworpen als een hybride AI-systeem waarin </w:t>
+      </w:r>
+      <w:r>
+        <w:rPr>
+          <w:b w:val="0"/>
+          <w:bCs w:val="0"/>
+          <w:color w:val="auto"/>
+          <w:sz w:val="24"/>
+          <w:szCs w:val="24"/>
+        </w:rPr>
+        <w:t>de gebruiker</w:t>
+      </w:r>
+      <w:r>
+        <w:rPr>
+          <w:b w:val="0"/>
+          <w:bCs w:val="0"/>
+          <w:color w:val="auto"/>
+          <w:sz w:val="24"/>
+          <w:szCs w:val="24"/>
+        </w:rPr>
+        <w:t xml:space="preserve"> en </w:t>
+      </w:r>
+      <w:r>
+        <w:rPr>
+          <w:b w:val="0"/>
+          <w:bCs w:val="0"/>
+          <w:color w:val="auto"/>
+          <w:sz w:val="24"/>
+          <w:szCs w:val="24"/>
+        </w:rPr>
+        <w:t>artificiële intelligentie</w:t>
+      </w:r>
+      <w:r>
+        <w:rPr>
+          <w:b w:val="0"/>
+          <w:bCs w:val="0"/>
+          <w:color w:val="auto"/>
+          <w:sz w:val="24"/>
+          <w:szCs w:val="24"/>
+        </w:rPr>
+        <w:t xml:space="preserve"> elkaar aanvullen, niet vervangen. Het Hybride AI-framework (Akata et al., 2020) beschrijft hoe AI-systemen en mensen samenwerken op basis van wederzijdse aanvulling. Concreet betekent dit dat de AI de taken overneemt waarvoor zij beter geschikt is</w:t>
+      </w:r>
+      <w:r>
+        <w:rPr>
+          <w:b w:val="0"/>
+          <w:bCs w:val="0"/>
+          <w:color w:val="auto"/>
+          <w:sz w:val="24"/>
+          <w:szCs w:val="24"/>
+        </w:rPr>
+        <w:t>,</w:t>
+      </w:r>
+      <w:r>
+        <w:rPr>
+          <w:b w:val="0"/>
+          <w:bCs w:val="0"/>
+          <w:color w:val="auto"/>
+          <w:sz w:val="24"/>
+          <w:szCs w:val="24"/>
+        </w:rPr>
+        <w:t xml:space="preserve"> grootschalige personalisatie en voortgangsmonitoring</w:t>
+      </w:r>
+      <w:r>
+        <w:rPr>
+          <w:b w:val="0"/>
+          <w:bCs w:val="0"/>
+          <w:color w:val="auto"/>
+          <w:sz w:val="24"/>
+          <w:szCs w:val="24"/>
+        </w:rPr>
+        <w:t xml:space="preserve"> </w:t>
+      </w:r>
+      <w:r>
+        <w:rPr>
+          <w:b w:val="0"/>
+          <w:bCs w:val="0"/>
+          <w:color w:val="auto"/>
+          <w:sz w:val="24"/>
+          <w:szCs w:val="24"/>
+        </w:rPr>
+        <w:t>terwijl de leraar de taken behoudt die menselijk oordeelsvermogen vereisen: pedagogische beslissingen en de relatie met de leerling.</w:t>
+      </w:r>
+    </w:p>
+    <w:p>
+      <w:pPr>
+        <w:pStyle w:val="Kop2"/>
+      </w:pPr>
+      <w:r>
         <w:t>5.3 Uitlegbare AI (XAI)</w:t>
       </w:r>
       <w:bookmarkEnd w:id="19"/>
     </w:p>
     <w:p>
       <w:pPr>
-        <w:spacing w:before="80" w:after="80"/>
-        <w:jc w:val="both"/>
-        <w:rPr>
-          <w:rFonts w:ascii="Arial" w:eastAsia="Arial" w:hAnsi="Arial" w:cs="Arial"/>
-        </w:rPr>
-      </w:pPr>
-      <w:r>
-        <w:rPr>
-          <w:rFonts w:ascii="Arial" w:eastAsia="Arial" w:hAnsi="Arial" w:cs="Arial"/>
-          <w:i/>
-          <w:iCs/>
-        </w:rPr>
-        <w:t>Explainability</w:t>
-      </w:r>
-      <w:r>
-        <w:rPr>
-          <w:rFonts w:ascii="Arial" w:eastAsia="Arial" w:hAnsi="Arial" w:cs="Arial"/>
-        </w:rPr>
-        <w:t xml:space="preserve"> </w:t>
-      </w:r>
-      <w:r>
-        <w:rPr>
-          <w:rFonts w:ascii="Arial" w:eastAsia="Arial" w:hAnsi="Arial" w:cs="Arial"/>
-        </w:rPr>
-        <w:t>(</w:t>
-      </w:r>
-      <w:r>
-        <w:rPr>
-          <w:rFonts w:ascii="Arial" w:eastAsia="Arial" w:hAnsi="Arial" w:cs="Arial"/>
-        </w:rPr>
-        <w:t>Liao &amp; K. R. Varshney</w:t>
-      </w:r>
-      <w:r>
-        <w:rPr>
-          <w:rFonts w:ascii="Arial" w:eastAsia="Arial" w:hAnsi="Arial" w:cs="Arial"/>
-        </w:rPr>
-        <w:t xml:space="preserve">, </w:t>
-      </w:r>
-      <w:r>
-        <w:rPr>
-          <w:rFonts w:ascii="Arial" w:eastAsia="Arial" w:hAnsi="Arial" w:cs="Arial"/>
-        </w:rPr>
-        <w:t>2021)</w:t>
-      </w:r>
-      <w:r>
-        <w:rPr>
-          <w:rFonts w:ascii="Arial" w:eastAsia="Arial" w:hAnsi="Arial" w:cs="Arial"/>
-        </w:rPr>
-        <w:t xml:space="preserve"> </w:t>
-      </w:r>
-      <w:r>
-        <w:rPr>
-          <w:rFonts w:ascii="Arial" w:eastAsia="Arial" w:hAnsi="Arial" w:cs="Arial"/>
-        </w:rPr>
-        <w:t>is een centrale randvoorwaarde voor verantwoord AI-gebruik in het onderwijs. Leraren moeten kunnen begrijpen waarom Juf Aimee een bepaalde opdracht aanbeveelt.</w:t>
-      </w:r>
-      <w:r>
-        <w:rPr>
-          <w:rFonts w:ascii="Arial" w:eastAsia="Arial" w:hAnsi="Arial" w:cs="Arial"/>
-        </w:rPr>
-        <w:t xml:space="preserve"> </w:t>
-      </w:r>
-      <w:r>
-        <w:rPr>
-          <w:rFonts w:ascii="Arial" w:eastAsia="Arial" w:hAnsi="Arial" w:cs="Arial"/>
-        </w:rPr>
-        <w:t>Dit vereist ontwerp</w:t>
-      </w:r>
-      <w:r>
-        <w:rPr>
-          <w:rFonts w:ascii="Arial" w:eastAsia="Arial" w:hAnsi="Arial" w:cs="Arial"/>
-        </w:rPr>
-        <w:t>keuzes</w:t>
-      </w:r>
-      <w:r>
-        <w:rPr>
-          <w:rFonts w:ascii="Arial" w:eastAsia="Arial" w:hAnsi="Arial" w:cs="Arial"/>
-        </w:rPr>
-        <w:t xml:space="preserve"> rondom transparantie: korte, begrijpelijke uitleg bij elke aanbeveling, zonder technisch jargon.</w:t>
-      </w:r>
-    </w:p>
-    <w:p>
-      <w:pPr>
         <w:pStyle w:val="Kop2"/>
+        <w:rPr>
+          <w:b w:val="0"/>
+          <w:bCs w:val="0"/>
+          <w:color w:val="auto"/>
+          <w:sz w:val="24"/>
+          <w:szCs w:val="24"/>
+        </w:rPr>
       </w:pPr>
       <w:bookmarkStart w:id="20" w:name="_Toc225245697"/>
+      <w:r>
+        <w:rPr>
+          <w:b w:val="0"/>
+          <w:bCs w:val="0"/>
+          <w:color w:val="auto"/>
+          <w:sz w:val="24"/>
+          <w:szCs w:val="24"/>
+        </w:rPr>
+        <w:t>Leraren kunnen Juf Aimee alleen verantwoord inzetten als zij begrijpen waarom het systeem een bepaalde aanbeveling doet. Explainability (Liao &amp; Varshney, 2021) is daarom een centrale randvoorwaarde voor verantwoord AI-gebruik in het onderwijs. Dit vereist bewuste ontwerpkeuzes rondom transparantie: elke aanbeveling gaat vergezeld van een korte, begrijpelijke uitleg zonder technisch jargon.</w:t>
+      </w:r>
+    </w:p>
+    <w:p>
+      <w:pPr>
+        <w:pStyle w:val="Kop2"/>
+      </w:pPr>
       <w:r>
         <w:t>5.4 Privacy en AVG</w:t>
       </w:r>
@@ -3746,7 +3720,6 @@
         <w:rPr>
           <w:lang w:val="en-GB"/>
         </w:rPr>
-        <w:lastRenderedPageBreak/>
         <w:t>7. Acceptatiecriteria en Definition of Done</w:t>
       </w:r>
       <w:bookmarkEnd w:id="24"/>
@@ -4095,6 +4068,7 @@
         <w:pStyle w:val="Geenafstand"/>
       </w:pPr>
       <w:r>
+        <w:lastRenderedPageBreak/>
         <w:t>Co-designsessies met leraren en leerlingen kunnen worden georganiseerd via de scholen en partijen die betrokken zijn bij het bredere onderzoeksvoorstel.</w:t>
       </w:r>
     </w:p>
@@ -4122,7 +4096,6 @@
         </w:pBdr>
       </w:pPr>
       <w:r>
-        <w:lastRenderedPageBreak/>
         <w:t>9. Aanbevelingen</w:t>
       </w:r>
     </w:p>
@@ -4402,6 +4375,7 @@
         <w:spacing w:after="120"/>
       </w:pPr>
       <w:r>
+        <w:lastRenderedPageBreak/>
         <w:t>Voor leerlingen biedt dit bescherming tegen misbruik en garandeert het pedagogisch verantwoorde AI-uitvoer. Voor scholen en de opdrachtgever verlaagt het het juridisch en reputatierisico bij inzet van het platform en maakt het aantoonbare naleving van de AVG en EU AI Act mogelijk.</w:t>
       </w:r>
     </w:p>
@@ -4430,7 +4404,6 @@
         <w:pStyle w:val="Kop2"/>
       </w:pPr>
       <w:r>
-        <w:lastRenderedPageBreak/>
         <w:t>9.2 RAS verrijken met individuele leerlingvoortgang</w:t>
       </w:r>
     </w:p>
@@ -4531,21 +4504,6 @@
       <w:r>
         <w:t>een structureel knelpunt in het onderwijs voor hoogbegaafde leerlingen.</w:t>
       </w:r>
-    </w:p>
-    <w:p>
-      <w:pPr>
-        <w:spacing w:before="80" w:after="80"/>
-      </w:pPr>
-    </w:p>
-    <w:p>
-      <w:pPr>
-        <w:spacing w:before="80" w:after="80"/>
-      </w:pPr>
-    </w:p>
-    <w:p>
-      <w:pPr>
-        <w:spacing w:before="80" w:after="80"/>
-      </w:pPr>
     </w:p>
     <w:p>
       <w:pPr>
@@ -4635,89 +4593,92 @@
         </w:pBdr>
       </w:pPr>
       <w:r>
+        <w:t>10. Future Work</w:t>
+      </w:r>
+    </w:p>
+    <w:p>
+      <w:pPr>
+        <w:pStyle w:val="Geenafstand"/>
+      </w:pPr>
+      <w:r>
+        <w:t>Op basis van de gerealiseerde architectuur en inzichten uit analyse en modelonderzoek zijn drie doorontwikkelingen kansrijk voor een volgende fase van Juf Aimee. Deze zijn bewust niet als directe aanbevelingen geformuleerd, maar als toekomstige richtingen die voortbouwen op de huidige implementatie.</w:t>
+      </w:r>
+    </w:p>
+    <w:p>
+      <w:pPr>
+        <w:pStyle w:val="Kop2"/>
+      </w:pPr>
+      <w:r>
+        <w:t>10.1 AI-gespreksassistent voor leerlingen</w:t>
+      </w:r>
+    </w:p>
+    <w:p>
+      <w:pPr>
+        <w:pStyle w:val="Geenafstand"/>
+      </w:pPr>
+      <w:r>
+        <w:t>De hybride architectuur van Juf Aimee bevat reeds een chat-modelcomponent voor begeleiding. Een logische vervolgstap is een zijpaneel waarmee leerlingen tijdens het maken van een opdracht vragen kunnen stellen. Het model geeft geen antwoorden maar hints, gebaseerd op de Socratische methode. Dit bevordert zelfstandig redeneren, wat essentieel is voor hoogbegaafde leerlingen. Conform EU AI Act Art. 14 blijft de leraar te allen tijde in staat de assistent te monitoren en in te grijpen.</w:t>
+      </w:r>
+    </w:p>
+    <w:p>
+      <w:pPr>
+        <w:pStyle w:val="Kop2"/>
+      </w:pPr>
+      <w:r>
+        <w:t>10.2 Anonimisering van leerlingdata</w:t>
+      </w:r>
+    </w:p>
+    <w:p>
+      <w:pPr>
+        <w:pStyle w:val="Geenafstand"/>
+      </w:pPr>
+      <w:r>
+        <w:t>In de productiefase wordt gewerkt met echte persoonsgegevens van kinderen. De AVG art. 5(1)(c) schrijft dataminimalisatie voor. Concreet advies voor een volgende fase: OPP-embeddings worden opgeslagen onder een pseudoniem leerling-ID in plaats van de naam van de leerling, namen worden uitsluitend getoond aan de direct verantwoordelijke leraar, en er geldt een bewaartermijn gekoppeld aan de schoolloopbaan. Externe AI-providers ontvangen nooit ruwe leerlingdata, in lijn met het geadviseerde lokale deployment-model.</w:t>
+      </w:r>
+    </w:p>
+    <w:p>
+      <w:pPr>
+        <w:pStyle w:val="Kop2"/>
+      </w:pPr>
+      <w:r>
+        <w:t>10.3 Ouderportaal met inzagerecht</w:t>
+      </w:r>
+    </w:p>
+    <w:p>
+      <w:pPr>
+        <w:pStyle w:val="Geenafstand"/>
+      </w:pPr>
+      <w:r>
+        <w:t>Ouders van leerlingen hebben op basis van AVG art. 15 het recht op inzage in welke gegevens over hun kind worden verwerkt. Een eenvoudig ouderportaal uitsluitend met leesrechten, zonder bewerkingsmogelijkheden maakt Juf Aimee transparant naar alle betrokkenen en vergroot het vertrouwen van scholen in de inzet van het platform. Dit sluit direct aan op de eis van uitlegbaarheid (XAI) en mensgerichte AI zoals beschreven in het theoretisch kader.</w:t>
+      </w:r>
+    </w:p>
+    <w:p>
+      <w:pPr>
+        <w:pStyle w:val="Kop2"/>
+      </w:pPr>
+      <w:r>
+        <w:t xml:space="preserve">10.4 AI-taalbuddy voor leerlingen </w:t>
+      </w:r>
+    </w:p>
+    <w:p>
+      <w:pPr>
+        <w:pStyle w:val="Geenafstand"/>
+      </w:pPr>
+      <w:r>
+        <w:t xml:space="preserve">Een logische doorontwikkeling van Juf Aimee is een gespreksgerichte AI-taalbuddy waarmee leerlingen een vreemde taal kunnen oefenen via gesproken dialoog. Hoogbegaafde leerlingen leren doorgaans sneller een nieuwe taal, maar vinden binnen de reguliere klas weinig ruimte voor individuele oefening </w:t>
+      </w:r>
+      <w:r>
+        <w:t xml:space="preserve">(Hornstra et al, 2023) </w:t>
+      </w:r>
+      <w:r>
+        <w:t xml:space="preserve">Een AI-taalbuddy biedt die oefentijd op maat: het systeem stemt de gespreksonderwerpen en moeilijkheidsgraad af op de interesses en het niveau van de leerling, zoals vastgelegd in het </w:t>
+      </w:r>
+      <w:r>
+        <w:t xml:space="preserve">leerlingprofiel en het opbouwende </w:t>
+      </w:r>
+      <w:r>
         <w:lastRenderedPageBreak/>
-        <w:t>10. Future Work</w:t>
-      </w:r>
-    </w:p>
-    <w:p>
-      <w:pPr>
-        <w:pStyle w:val="Geenafstand"/>
-      </w:pPr>
-      <w:r>
-        <w:t>Op basis van de gerealiseerde architectuur en inzichten uit analyse en modelonderzoek zijn drie doorontwikkelingen kansrijk voor een volgende fase van Juf Aimee. Deze zijn bewust niet als directe aanbevelingen geformuleerd, maar als toekomstige richtingen die voortbouwen op de huidige implementatie.</w:t>
-      </w:r>
-    </w:p>
-    <w:p>
-      <w:pPr>
-        <w:pStyle w:val="Kop2"/>
-      </w:pPr>
-      <w:r>
-        <w:t>10.1 AI-gespreksassistent voor leerlingen</w:t>
-      </w:r>
-    </w:p>
-    <w:p>
-      <w:pPr>
-        <w:pStyle w:val="Geenafstand"/>
-      </w:pPr>
-      <w:r>
-        <w:t>De hybride architectuur van Juf Aimee bevat reeds een chat-modelcomponent voor begeleiding. Een logische vervolgstap is een zijpaneel waarmee leerlingen tijdens het maken van een opdracht vragen kunnen stellen. Het model geeft geen antwoorden maar hints, gebaseerd op de Socratische methode. Dit bevordert zelfstandig redeneren, wat essentieel is voor hoogbegaafde leerlingen. Conform EU AI Act Art. 14 blijft de leraar te allen tijde in staat de assistent te monitoren en in te grijpen.</w:t>
-      </w:r>
-    </w:p>
-    <w:p>
-      <w:pPr>
-        <w:pStyle w:val="Kop2"/>
-      </w:pPr>
-      <w:r>
-        <w:t>10.2 Anonimisering van leerlingdata</w:t>
-      </w:r>
-    </w:p>
-    <w:p>
-      <w:pPr>
-        <w:pStyle w:val="Geenafstand"/>
-      </w:pPr>
-      <w:r>
-        <w:t>In de productiefase wordt gewerkt met echte persoonsgegevens van kinderen. De AVG art. 5(1)(c) schrijft dataminimalisatie voor. Concreet advies voor een volgende fase: OPP-embeddings worden opgeslagen onder een pseudoniem leerling-ID in plaats van de naam van de leerling, namen worden uitsluitend getoond aan de direct verantwoordelijke leraar, en er geldt een bewaartermijn gekoppeld aan de schoolloopbaan. Externe AI-providers ontvangen nooit ruwe leerlingdata, in lijn met het geadviseerde lokale deployment-model.</w:t>
-      </w:r>
-    </w:p>
-    <w:p>
-      <w:pPr>
-        <w:pStyle w:val="Kop2"/>
-      </w:pPr>
-      <w:r>
-        <w:t>10.3 Ouderportaal met inzagerecht</w:t>
-      </w:r>
-    </w:p>
-    <w:p>
-      <w:pPr>
-        <w:pStyle w:val="Geenafstand"/>
-      </w:pPr>
-      <w:r>
-        <w:t>Ouders van leerlingen hebben op basis van AVG art. 15 het recht op inzage in welke gegevens over hun kind worden verwerkt. Een eenvoudig ouderportaal uitsluitend met leesrechten, zonder bewerkingsmogelijkheden maakt Juf Aimee transparant naar alle betrokkenen en vergroot het vertrouwen van scholen in de inzet van het platform. Dit sluit direct aan op de eis van uitlegbaarheid (XAI) en mensgerichte AI zoals beschreven in het theoretisch kader.</w:t>
-      </w:r>
-    </w:p>
-    <w:p>
-      <w:pPr>
-        <w:pStyle w:val="Kop2"/>
-      </w:pPr>
-      <w:r>
-        <w:t xml:space="preserve">10.4 AI-taalbuddy voor leerlingen </w:t>
-      </w:r>
-    </w:p>
-    <w:p>
-      <w:pPr>
-        <w:pStyle w:val="Geenafstand"/>
-      </w:pPr>
-      <w:r>
-        <w:t xml:space="preserve">Een logische doorontwikkeling van Juf Aimee is een gespreksgerichte AI-taalbuddy waarmee leerlingen een vreemde taal kunnen oefenen via gesproken dialoog. Hoogbegaafde leerlingen leren doorgaans sneller een nieuwe taal, maar vinden binnen de reguliere klas weinig ruimte voor individuele oefening </w:t>
-      </w:r>
-      <w:r>
-        <w:t xml:space="preserve">(Hornstra et al, 2023) </w:t>
-      </w:r>
-      <w:r>
-        <w:t xml:space="preserve">Een AI-taalbuddy biedt die oefentijd op maat: het systeem stemt de gespreksonderwerpen en moeilijkheidsgraad af op de interesses en het niveau van de leerling, zoals vastgelegd in het </w:t>
-      </w:r>
-      <w:r>
-        <w:t>leerlingprofiel en het opbouwende portfolio</w:t>
+        <w:t>portfolio</w:t>
       </w:r>
       <w:r>
         <w:t>. De leerkracht houdt altijd inzicht in de voortgang en blijft eindverantwoordelijk voor de taalontwikkeling van de leerling.</w:t>
@@ -4750,7 +4711,6 @@
         </w:pBdr>
       </w:pPr>
       <w:r>
-        <w:lastRenderedPageBreak/>
         <w:t>11. Literatuur</w:t>
       </w:r>
       <w:bookmarkEnd w:id="28"/>
@@ -5839,6 +5799,7 @@
           <w:i/>
           <w:iCs/>
         </w:rPr>
+        <w:lastRenderedPageBreak/>
         <w:t>Morteza</w:t>
       </w:r>
       <w:proofErr w:type="spellEnd"/>
@@ -6028,25 +5989,7 @@
           <w:i/>
           <w:iCs/>
         </w:rPr>
-        <w:t xml:space="preserve"> </w:t>
-      </w:r>
-      <w:proofErr w:type="spellStart"/>
-      <w:r>
-        <w:rPr>
-          <w:rFonts w:ascii="Arial" w:eastAsia="Arial" w:hAnsi="Arial" w:cs="Arial"/>
-          <w:i/>
-          <w:iCs/>
-        </w:rPr>
-        <w:t>framework</w:t>
-      </w:r>
-      <w:proofErr w:type="spellEnd"/>
-      <w:r>
-        <w:rPr>
-          <w:rFonts w:ascii="Arial" w:eastAsia="Arial" w:hAnsi="Arial" w:cs="Arial"/>
-          <w:i/>
-          <w:iCs/>
-        </w:rPr>
-        <w:t xml:space="preserve">. International Journal of </w:t>
+        <w:t xml:space="preserve"> framework. International Journal of </w:t>
       </w:r>
       <w:proofErr w:type="spellStart"/>
       <w:r>
@@ -6255,11 +6198,6 @@
         <w:docPartUnique/>
       </w:docPartObj>
     </w:sdtPr>
-    <w:sdtEndPr>
-      <w:rPr>
-        <w:rStyle w:val="Paginanummer"/>
-      </w:rPr>
-    </w:sdtEndPr>
     <w:sdtContent>
       <w:p>
         <w:pPr>
@@ -6318,11 +6256,6 @@
         <w:docPartUnique/>
       </w:docPartObj>
     </w:sdtPr>
-    <w:sdtEndPr>
-      <w:rPr>
-        <w:rStyle w:val="Paginanummer"/>
-      </w:rPr>
-    </w:sdtEndPr>
     <w:sdtContent>
       <w:p>
         <w:pPr>

</xml_diff>

<commit_message>
inleiding toegevoegd bij theoretisch kader en bronnen met hyperlinks
</commit_message>
<xml_diff>
--- a/docs/Analyseren/JufAimee_Onderzoeksverslag.docx
+++ b/docs/Analyseren/JufAimee_Onderzoeksverslag.docx
@@ -2786,11 +2786,36 @@
       <w:r>
         <w:t xml:space="preserve">. Hoogbegaafde leerlingen hebben specifieke leerbehoeften die vragen om opdrachten die hogere-orde denkvaardigheden aanspreken, zoals analyseren, evalueren en creëren </w:t>
       </w:r>
-      <w:r>
-        <w:t>(Anderson &amp; Krathwohl, 2001</w:t>
-      </w:r>
-      <w:r>
-        <w:t>). In de praktijk krijgen deze leerlingen echter vaak ‘meer van hetzelfde’: extra werkbladen of sneller door de leerstof, zonder echte verdieping of verbreding.</w:t>
+      <w:hyperlink r:id="rId9" w:history="1">
+        <w:r>
+          <w:rPr>
+            <w:rStyle w:val="Hyperlink"/>
+          </w:rPr>
+          <w:t xml:space="preserve">(Anderson &amp; </w:t>
+        </w:r>
+        <w:proofErr w:type="spellStart"/>
+        <w:r>
+          <w:rPr>
+            <w:rStyle w:val="Hyperlink"/>
+          </w:rPr>
+          <w:t>Krathwohl</w:t>
+        </w:r>
+        <w:proofErr w:type="spellEnd"/>
+        <w:r>
+          <w:rPr>
+            <w:rStyle w:val="Hyperlink"/>
+          </w:rPr>
+          <w:t>, 2001</w:t>
+        </w:r>
+        <w:r>
+          <w:rPr>
+            <w:rStyle w:val="Hyperlink"/>
+          </w:rPr>
+          <w:t>).</w:t>
+        </w:r>
+      </w:hyperlink>
+      <w:r>
+        <w:t xml:space="preserve"> In de praktijk krijgen deze leerlingen echter vaak ‘meer van hetzelfde’: extra werkbladen of sneller door de leerstof, zonder echte verdieping of verbreding.</w:t>
       </w:r>
     </w:p>
     <w:p>
@@ -2831,7 +2856,26 @@
         <w:t xml:space="preserve">human augmentation) </w:t>
       </w:r>
       <w:r>
-        <w:t>en niet als vervanging. Dit sluit aan op het framework van Hybride AI, zoals beschreven door Akata et al. (2020), waarbij mens en AI samenwerken op basis van complementaire sterktes. De leraar behoudt altijd de professionele regie; Juf Aimee functioneert als een uitlegbare, transparante AI-collega die onderbouwde suggesties doet en de leraar informeert over de redenering achter elke aanbeveling.</w:t>
+        <w:t xml:space="preserve">en niet als vervanging. Dit sluit aan op het framework van Hybride AI, zoals beschreven door </w:t>
+      </w:r>
+      <w:hyperlink r:id="rId10" w:history="1">
+        <w:proofErr w:type="spellStart"/>
+        <w:r>
+          <w:rPr>
+            <w:rStyle w:val="Hyperlink"/>
+          </w:rPr>
+          <w:t>Akata</w:t>
+        </w:r>
+        <w:proofErr w:type="spellEnd"/>
+        <w:r>
+          <w:rPr>
+            <w:rStyle w:val="Hyperlink"/>
+          </w:rPr>
+          <w:t xml:space="preserve"> et al. (2020),</w:t>
+        </w:r>
+      </w:hyperlink>
+      <w:r>
+        <w:t xml:space="preserve"> waarbij mens en AI samenwerken op basis van complementaire sterktes. De leraar behoudt altijd de professionele regie; Juf Aimee functioneert als een uitlegbare, transparante AI-collega die onderbouwde suggesties doet en de leraar informeert over de redenering achter elke aanbeveling.</w:t>
       </w:r>
     </w:p>
     <w:p>
@@ -3200,13 +3244,6 @@
       </w:pPr>
       <w:bookmarkStart w:id="17" w:name="_Toc225245694"/>
       <w:r>
-        <w:t>5.1 Taxonomie van Bloom</w:t>
-      </w:r>
-      <w:bookmarkEnd w:id="17"/>
-    </w:p>
-    <w:p>
-      <w:pPr>
-        <w:pStyle w:val="Kop2"/>
         <w:rPr>
           <w:b w:val="0"/>
           <w:bCs w:val="0"/>
@@ -3214,8 +3251,8 @@
           <w:sz w:val="24"/>
           <w:szCs w:val="24"/>
         </w:rPr>
-      </w:pPr>
-      <w:bookmarkStart w:id="18" w:name="_Toc225245695"/>
+        <w:t>Juf Aimee is gebouwd op vier theoretische pijlers die samen een verantwoord en effectief AI-systeem voor het onderwijs vormen. De Taxonomie van Bloom biedt het didactisch kader voor het genereren van opdrachten die aansluiten op het cognitieve niveau van hoogbegaafde leerlingen. Het Hybride AI-framework garandeert dat de AI de leraar ondersteunt zonder diens professionele rol over te nemen. Uitlegbare AI zorgt ervoor dat leraren de aanbevelingen van het systeem kunnen begrijpen en beoordelen. Tot slot stelt AVG-compliance harde eisen aan de omgang met leerlingdata, waarbij dataminimalisatie en lokale deployment de privacy van minderjarige leerlingen waarborgen.</w:t>
+      </w:r>
       <w:r>
         <w:rPr>
           <w:b w:val="0"/>
@@ -3224,21 +3261,9 @@
           <w:sz w:val="24"/>
           <w:szCs w:val="24"/>
         </w:rPr>
-        <w:t>De Taxonomie van Bloom biedt een gelaagd model van cognitieve vaardigheden. Het model loopt van lagere-orde vaardigheden onthouden, begrijpen en toepassen naar hogere-orde denkvaardigheden zoals analyseren, evalueren en creëren. Hoogbegaafde leerlingen profiteren het meest van opdrachten die de hogere niveaus aanspreken. Juf Aimee gebruikt dit kader als basis voor het genereren en categoriseren van opdrachten.</w:t>
-      </w:r>
-    </w:p>
-    <w:p>
-      <w:pPr>
-        <w:pStyle w:val="Kop2"/>
-      </w:pPr>
-      <w:r>
-        <w:t>5.2 Hybride AI</w:t>
-      </w:r>
-      <w:bookmarkEnd w:id="18"/>
-    </w:p>
-    <w:p>
-      <w:pPr>
-        <w:pStyle w:val="Kop2"/>
+        <w:br/>
+      </w:r>
+      <w:r>
         <w:rPr>
           <w:b w:val="0"/>
           <w:bCs w:val="0"/>
@@ -3246,9 +3271,19 @@
           <w:sz w:val="24"/>
           <w:szCs w:val="24"/>
         </w:rPr>
-      </w:pPr>
-      <w:bookmarkStart w:id="19" w:name="_Toc225245696"/>
-      <w:r>
+        <w:br/>
+      </w:r>
+      <w:r>
+        <w:br/>
+      </w:r>
+      <w:r>
+        <w:t>5.1 Taxonomie van Bloom</w:t>
+      </w:r>
+      <w:bookmarkEnd w:id="17"/>
+    </w:p>
+    <w:p>
+      <w:pPr>
+        <w:pStyle w:val="Kop2"/>
         <w:rPr>
           <w:b w:val="0"/>
           <w:bCs w:val="0"/>
@@ -3256,8 +3291,8 @@
           <w:sz w:val="24"/>
           <w:szCs w:val="24"/>
         </w:rPr>
-        <w:t xml:space="preserve">Juf Aimee is ontworpen als een hybride AI-systeem waarin </w:t>
-      </w:r>
+      </w:pPr>
+      <w:bookmarkStart w:id="18" w:name="_Toc225245695"/>
       <w:r>
         <w:rPr>
           <w:b w:val="0"/>
@@ -3266,9 +3301,21 @@
           <w:sz w:val="24"/>
           <w:szCs w:val="24"/>
         </w:rPr>
-        <w:t>de gebruiker</w:t>
-      </w:r>
-      <w:r>
+        <w:t>De Taxonomie van Bloom biedt een gelaagd model van cognitieve vaardigheden. Het model loopt van lagere-orde vaardigheden onthouden, begrijpen en toepassen naar hogere-orde denkvaardigheden zoals analyseren, evalueren en creëren. Hoogbegaafde leerlingen profiteren het meest van opdrachten die de hogere niveaus aanspreken. Juf Aimee gebruikt dit kader als basis voor het genereren en categoriseren van opdrachten.</w:t>
+      </w:r>
+    </w:p>
+    <w:p>
+      <w:pPr>
+        <w:pStyle w:val="Kop2"/>
+      </w:pPr>
+      <w:r>
+        <w:t>5.2 Hybride AI</w:t>
+      </w:r>
+      <w:bookmarkEnd w:id="18"/>
+    </w:p>
+    <w:p>
+      <w:pPr>
+        <w:pStyle w:val="Kop2"/>
         <w:rPr>
           <w:b w:val="0"/>
           <w:bCs w:val="0"/>
@@ -3276,8 +3323,8 @@
           <w:sz w:val="24"/>
           <w:szCs w:val="24"/>
         </w:rPr>
-        <w:t xml:space="preserve"> en </w:t>
-      </w:r>
+      </w:pPr>
+      <w:bookmarkStart w:id="19" w:name="_Toc225245696"/>
       <w:r>
         <w:rPr>
           <w:b w:val="0"/>
@@ -3286,7 +3333,7 @@
           <w:sz w:val="24"/>
           <w:szCs w:val="24"/>
         </w:rPr>
-        <w:t>artificiële intelligentie</w:t>
+        <w:t xml:space="preserve">Juf Aimee is ontworpen als een hybride AI-systeem waarin </w:t>
       </w:r>
       <w:r>
         <w:rPr>
@@ -3296,7 +3343,7 @@
           <w:sz w:val="24"/>
           <w:szCs w:val="24"/>
         </w:rPr>
-        <w:t xml:space="preserve"> elkaar aanvullen, niet vervangen. Het Hybride AI-framework (Akata et al., 2020) beschrijft hoe AI-systemen en mensen samenwerken op basis van wederzijdse aanvulling. Concreet betekent dit dat de AI de taken overneemt waarvoor zij beter geschikt is</w:t>
+        <w:t>de gebruiker</w:t>
       </w:r>
       <w:r>
         <w:rPr>
@@ -3306,7 +3353,7 @@
           <w:sz w:val="24"/>
           <w:szCs w:val="24"/>
         </w:rPr>
-        <w:t>,</w:t>
+        <w:t xml:space="preserve"> en </w:t>
       </w:r>
       <w:r>
         <w:rPr>
@@ -3316,7 +3363,7 @@
           <w:sz w:val="24"/>
           <w:szCs w:val="24"/>
         </w:rPr>
-        <w:t xml:space="preserve"> grootschalige personalisatie en voortgangsmonitoring</w:t>
+        <w:t>artificiële intelligentie</w:t>
       </w:r>
       <w:r>
         <w:rPr>
@@ -3326,7 +3373,7 @@
           <w:sz w:val="24"/>
           <w:szCs w:val="24"/>
         </w:rPr>
-        <w:t xml:space="preserve"> </w:t>
+        <w:t xml:space="preserve"> elkaar aanvullen, niet vervangen. Het Hybride AI-framework (Akata et al., 2020) beschrijft hoe AI-systemen en mensen samenwerken op basis van wederzijdse aanvulling. Concreet betekent dit dat de AI de taken overneemt waarvoor zij beter geschikt is</w:t>
       </w:r>
       <w:r>
         <w:rPr>
@@ -3336,21 +3383,9 @@
           <w:sz w:val="24"/>
           <w:szCs w:val="24"/>
         </w:rPr>
-        <w:t>terwijl de leraar de taken behoudt die menselijk oordeelsvermogen vereisen: pedagogische beslissingen en de relatie met de leerling.</w:t>
-      </w:r>
-    </w:p>
-    <w:p>
-      <w:pPr>
-        <w:pStyle w:val="Kop2"/>
-      </w:pPr>
-      <w:r>
-        <w:t>5.3 Uitlegbare AI (XAI)</w:t>
-      </w:r>
-      <w:bookmarkEnd w:id="19"/>
-    </w:p>
-    <w:p>
-      <w:pPr>
-        <w:pStyle w:val="Kop2"/>
+        <w:t>,</w:t>
+      </w:r>
+      <w:r>
         <w:rPr>
           <w:b w:val="0"/>
           <w:bCs w:val="0"/>
@@ -3358,8 +3393,8 @@
           <w:sz w:val="24"/>
           <w:szCs w:val="24"/>
         </w:rPr>
-      </w:pPr>
-      <w:bookmarkStart w:id="20" w:name="_Toc225245697"/>
+        <w:t xml:space="preserve"> grootschalige personalisatie en voortgangsmonitoring</w:t>
+      </w:r>
       <w:r>
         <w:rPr>
           <w:b w:val="0"/>
@@ -3368,7 +3403,17 @@
           <w:sz w:val="24"/>
           <w:szCs w:val="24"/>
         </w:rPr>
-        <w:t>Leraren kunnen Juf Aimee alleen verantwoord inzetten als zij begrijpen waarom het systeem een bepaalde aanbeveling doet. Explainability (Liao &amp; Varshney, 2021) is daarom een centrale randvoorwaarde voor verantwoord AI-gebruik in het onderwijs. Dit vereist bewuste ontwerpkeuzes rondom transparantie: elke aanbeveling gaat vergezeld van een korte, begrijpelijke uitleg zonder technisch jargon.</w:t>
+        <w:t xml:space="preserve"> </w:t>
+      </w:r>
+      <w:r>
+        <w:rPr>
+          <w:b w:val="0"/>
+          <w:bCs w:val="0"/>
+          <w:color w:val="auto"/>
+          <w:sz w:val="24"/>
+          <w:szCs w:val="24"/>
+        </w:rPr>
+        <w:t>terwijl de leraar de taken behoudt die menselijk oordeelsvermogen vereisen: pedagogische beslissingen en de relatie met de leerling.</w:t>
       </w:r>
     </w:p>
     <w:p>
@@ -3376,6 +3421,70 @@
         <w:pStyle w:val="Kop2"/>
       </w:pPr>
       <w:r>
+        <w:t>5.3 Uitlegbare AI (XAI)</w:t>
+      </w:r>
+      <w:bookmarkEnd w:id="19"/>
+    </w:p>
+    <w:p>
+      <w:pPr>
+        <w:pStyle w:val="Kop2"/>
+        <w:rPr>
+          <w:b w:val="0"/>
+          <w:bCs w:val="0"/>
+          <w:color w:val="auto"/>
+          <w:sz w:val="24"/>
+          <w:szCs w:val="24"/>
+        </w:rPr>
+      </w:pPr>
+      <w:bookmarkStart w:id="20" w:name="_Toc225245697"/>
+      <w:r>
+        <w:rPr>
+          <w:b w:val="0"/>
+          <w:bCs w:val="0"/>
+          <w:color w:val="auto"/>
+          <w:sz w:val="24"/>
+          <w:szCs w:val="24"/>
+        </w:rPr>
+        <w:t xml:space="preserve">Leraren kunnen Juf Aimee alleen verantwoord inzetten als zij begrijpen waarom het systeem een bepaalde aanbeveling doet. Explainability </w:t>
+      </w:r>
+      <w:hyperlink r:id="rId11" w:history="1">
+        <w:r>
+          <w:rPr>
+            <w:rStyle w:val="Hyperlink"/>
+            <w:b w:val="0"/>
+            <w:bCs w:val="0"/>
+            <w:sz w:val="24"/>
+            <w:szCs w:val="24"/>
+          </w:rPr>
+          <w:t>(Liao &amp; Varshney, 202</w:t>
+        </w:r>
+        <w:r>
+          <w:rPr>
+            <w:rStyle w:val="Hyperlink"/>
+            <w:b w:val="0"/>
+            <w:bCs w:val="0"/>
+            <w:sz w:val="24"/>
+            <w:szCs w:val="24"/>
+          </w:rPr>
+          <w:t>1</w:t>
+        </w:r>
+      </w:hyperlink>
+      <w:r>
+        <w:rPr>
+          <w:b w:val="0"/>
+          <w:bCs w:val="0"/>
+          <w:color w:val="auto"/>
+          <w:sz w:val="24"/>
+          <w:szCs w:val="24"/>
+        </w:rPr>
+        <w:t>) is daarom een centrale randvoorwaarde voor verantwoord AI-gebruik in het onderwijs. Dit vereist bewuste ontwerpkeuzes rondom transparantie: elke aanbeveling gaat vergezeld van een korte, begrijpelijke uitleg zonder technisch jargon.</w:t>
+      </w:r>
+    </w:p>
+    <w:p>
+      <w:pPr>
+        <w:pStyle w:val="Kop2"/>
+      </w:pPr>
+      <w:r>
         <w:t>5.4 Privacy en AVG</w:t>
       </w:r>
       <w:bookmarkEnd w:id="20"/>
@@ -3387,90 +3496,9 @@
       <w:r>
         <w:t>Omdat Juf Aimee werkt met gegevens van minderjarige leerlingen, is AVG-compliance een harde eis. In het proof of concept wordt gewerkt met fictieve en gesimuleerde data. In de verdere ontwikkeling zullen leerlingprofielen, interactielogs en voortgangsdata zorgvuldig worden beschermd en geminimaliseerd</w:t>
       </w:r>
-    </w:p>
-    <w:p>
-      <w:pPr>
-        <w:spacing w:before="80" w:after="80"/>
-        <w:jc w:val="both"/>
-      </w:pPr>
-    </w:p>
-    <w:p>
-      <w:pPr>
-        <w:spacing w:before="80" w:after="80"/>
-        <w:jc w:val="both"/>
-      </w:pPr>
-    </w:p>
-    <w:p>
-      <w:pPr>
-        <w:spacing w:before="80" w:after="80"/>
-        <w:jc w:val="both"/>
-      </w:pPr>
-    </w:p>
-    <w:p>
-      <w:pPr>
-        <w:spacing w:before="80" w:after="80"/>
-        <w:jc w:val="both"/>
-      </w:pPr>
-    </w:p>
-    <w:p>
-      <w:pPr>
-        <w:spacing w:before="80" w:after="80"/>
-        <w:jc w:val="both"/>
-      </w:pPr>
-    </w:p>
-    <w:p>
-      <w:pPr>
-        <w:spacing w:before="80" w:after="80"/>
-        <w:jc w:val="both"/>
-      </w:pPr>
-    </w:p>
-    <w:p>
-      <w:pPr>
-        <w:spacing w:before="80" w:after="80"/>
-        <w:jc w:val="both"/>
-      </w:pPr>
-    </w:p>
-    <w:p>
-      <w:pPr>
-        <w:spacing w:before="80" w:after="80"/>
-        <w:jc w:val="both"/>
-      </w:pPr>
-    </w:p>
-    <w:p>
-      <w:pPr>
-        <w:spacing w:before="80" w:after="80"/>
-        <w:jc w:val="both"/>
-      </w:pPr>
-    </w:p>
-    <w:p>
-      <w:pPr>
-        <w:spacing w:before="80" w:after="80"/>
-        <w:jc w:val="both"/>
-      </w:pPr>
-    </w:p>
-    <w:p>
-      <w:pPr>
-        <w:spacing w:before="80" w:after="80"/>
-        <w:jc w:val="both"/>
-      </w:pPr>
-    </w:p>
-    <w:p>
-      <w:pPr>
-        <w:spacing w:before="80" w:after="80"/>
-        <w:jc w:val="both"/>
-      </w:pPr>
-    </w:p>
-    <w:p>
-      <w:pPr>
-        <w:spacing w:before="80" w:after="80"/>
-        <w:jc w:val="both"/>
-      </w:pPr>
-    </w:p>
-    <w:p>
-      <w:pPr>
-        <w:spacing w:before="80" w:after="80"/>
-        <w:jc w:val="both"/>
-      </w:pPr>
+      <w:r>
+        <w:t>.</w:t>
+      </w:r>
     </w:p>
     <w:p>
       <w:pPr>
@@ -3481,6 +3509,7 @@
       </w:pPr>
       <w:bookmarkStart w:id="21" w:name="_Toc225245698"/>
       <w:r>
+        <w:lastRenderedPageBreak/>
         <w:t>6. Aanpak en methoden</w:t>
       </w:r>
       <w:bookmarkEnd w:id="21"/>
@@ -3720,6 +3749,7 @@
         <w:rPr>
           <w:lang w:val="en-GB"/>
         </w:rPr>
+        <w:lastRenderedPageBreak/>
         <w:t>7. Acceptatiecriteria en Definition of Done</w:t>
       </w:r>
       <w:bookmarkEnd w:id="24"/>
@@ -4008,7 +4038,7 @@
           <w:rFonts w:ascii="Arial" w:hAnsi="Arial" w:cs="Arial"/>
         </w:rPr>
       </w:pPr>
-      <w:hyperlink r:id="rId9" w:history="1">
+      <w:hyperlink r:id="rId12" w:history="1">
         <w:r>
           <w:rPr>
             <w:rStyle w:val="Hyperlink"/>
@@ -4029,7 +4059,7 @@
         </w:rPr>
         <w:t xml:space="preserve">     </w:t>
       </w:r>
-      <w:hyperlink r:id="rId10" w:history="1">
+      <w:hyperlink r:id="rId13" w:history="1">
         <w:r>
           <w:rPr>
             <w:rStyle w:val="Hyperlink"/>
@@ -4068,7 +4098,6 @@
         <w:pStyle w:val="Geenafstand"/>
       </w:pPr>
       <w:r>
-        <w:lastRenderedPageBreak/>
         <w:t>Co-designsessies met leraren en leerlingen kunnen worden georganiseerd via de scholen en partijen die betrokken zijn bij het bredere onderzoeksvoorstel.</w:t>
       </w:r>
     </w:p>
@@ -4096,6 +4125,7 @@
         </w:pBdr>
       </w:pPr>
       <w:r>
+        <w:lastRenderedPageBreak/>
         <w:t>9. Aanbevelingen</w:t>
       </w:r>
     </w:p>
@@ -4147,8 +4177,30 @@
         <w:t xml:space="preserve"> </w:t>
       </w:r>
       <w:r>
-        <w:t>een techniek waarbij een gebruiker het model via de invoer kan manipuleren om buiten zijn bedoelde functie te handelen (Perez &amp; Ribeiro, 2022; OWASP LLM Top 10, LLM01).</w:t>
-      </w:r>
+        <w:t xml:space="preserve">een techniek waarbij een gebruiker het model via de invoer kan manipuleren om buiten zijn bedoelde functie te handelen </w:t>
+      </w:r>
+      <w:hyperlink r:id="rId14" w:history="1">
+        <w:r>
+          <w:rPr>
+            <w:rStyle w:val="Hyperlink"/>
+          </w:rPr>
+          <w:t xml:space="preserve">(Perez &amp; </w:t>
+        </w:r>
+        <w:proofErr w:type="spellStart"/>
+        <w:r>
+          <w:rPr>
+            <w:rStyle w:val="Hyperlink"/>
+          </w:rPr>
+          <w:t>Ribeiro</w:t>
+        </w:r>
+        <w:proofErr w:type="spellEnd"/>
+        <w:r>
+          <w:rPr>
+            <w:rStyle w:val="Hyperlink"/>
+          </w:rPr>
+          <w:t>, 2022; OWASP LLM Top 10, LLM01).</w:t>
+        </w:r>
+      </w:hyperlink>
     </w:p>
     <w:p>
       <w:pPr>
@@ -4375,35 +4427,35 @@
         <w:spacing w:after="120"/>
       </w:pPr>
       <w:r>
+        <w:t>Voor leerlingen biedt dit bescherming tegen misbruik en garandeert het pedagogisch verantwoorde AI-uitvoer. Voor scholen en de opdrachtgever verlaagt het het juridisch en reputatierisico bij inzet van het platform en maakt het aantoonbare naleving van de AVG en EU AI Act mogelijk.</w:t>
+      </w:r>
+    </w:p>
+    <w:p>
+      <w:pPr>
+        <w:pStyle w:val="Geenafstand"/>
+      </w:pPr>
+    </w:p>
+    <w:p>
+      <w:pPr>
+        <w:pStyle w:val="Geenafstand"/>
+      </w:pPr>
+    </w:p>
+    <w:p>
+      <w:pPr>
+        <w:pStyle w:val="Geenafstand"/>
+      </w:pPr>
+    </w:p>
+    <w:p>
+      <w:pPr>
+        <w:pStyle w:val="Geenafstand"/>
+      </w:pPr>
+    </w:p>
+    <w:p>
+      <w:pPr>
+        <w:pStyle w:val="Kop2"/>
+      </w:pPr>
+      <w:r>
         <w:lastRenderedPageBreak/>
-        <w:t>Voor leerlingen biedt dit bescherming tegen misbruik en garandeert het pedagogisch verantwoorde AI-uitvoer. Voor scholen en de opdrachtgever verlaagt het het juridisch en reputatierisico bij inzet van het platform en maakt het aantoonbare naleving van de AVG en EU AI Act mogelijk.</w:t>
-      </w:r>
-    </w:p>
-    <w:p>
-      <w:pPr>
-        <w:pStyle w:val="Geenafstand"/>
-      </w:pPr>
-    </w:p>
-    <w:p>
-      <w:pPr>
-        <w:pStyle w:val="Geenafstand"/>
-      </w:pPr>
-    </w:p>
-    <w:p>
-      <w:pPr>
-        <w:pStyle w:val="Geenafstand"/>
-      </w:pPr>
-    </w:p>
-    <w:p>
-      <w:pPr>
-        <w:pStyle w:val="Geenafstand"/>
-      </w:pPr>
-    </w:p>
-    <w:p>
-      <w:pPr>
-        <w:pStyle w:val="Kop2"/>
-      </w:pPr>
-      <w:r>
         <w:t>9.2 RAS verrijken met individuele leerlingvoortgang</w:t>
       </w:r>
     </w:p>
@@ -4504,36 +4556,6 @@
       <w:r>
         <w:t>een structureel knelpunt in het onderwijs voor hoogbegaafde leerlingen.</w:t>
       </w:r>
-    </w:p>
-    <w:p>
-      <w:pPr>
-        <w:spacing w:before="80" w:after="80"/>
-      </w:pPr>
-    </w:p>
-    <w:p>
-      <w:pPr>
-        <w:spacing w:before="80" w:after="80"/>
-      </w:pPr>
-    </w:p>
-    <w:p>
-      <w:pPr>
-        <w:spacing w:before="80" w:after="80"/>
-      </w:pPr>
-    </w:p>
-    <w:p>
-      <w:pPr>
-        <w:spacing w:before="80" w:after="80"/>
-      </w:pPr>
-    </w:p>
-    <w:p>
-      <w:pPr>
-        <w:spacing w:before="80" w:after="80"/>
-      </w:pPr>
-    </w:p>
-    <w:p>
-      <w:pPr>
-        <w:spacing w:before="80" w:after="80"/>
-      </w:pPr>
     </w:p>
     <w:p>
       <w:pPr>
@@ -4617,7 +4639,19 @@
         <w:pStyle w:val="Geenafstand"/>
       </w:pPr>
       <w:r>
-        <w:t>De hybride architectuur van Juf Aimee bevat reeds een chat-modelcomponent voor begeleiding. Een logische vervolgstap is een zijpaneel waarmee leerlingen tijdens het maken van een opdracht vragen kunnen stellen. Het model geeft geen antwoorden maar hints, gebaseerd op de Socratische methode. Dit bevordert zelfstandig redeneren, wat essentieel is voor hoogbegaafde leerlingen. Conform EU AI Act Art. 14 blijft de leraar te allen tijde in staat de assistent te monitoren en in te grijpen.</w:t>
+        <w:lastRenderedPageBreak/>
+        <w:t xml:space="preserve">De hybride architectuur van Juf Aimee bevat reeds een chat-modelcomponent voor begeleiding. Een logische vervolgstap is een zijpaneel waarmee leerlingen tijdens het maken van een opdracht vragen kunnen stellen. Het model geeft geen antwoorden maar hints, gebaseerd op de Socratische methode. Dit bevordert zelfstandig redeneren, wat essentieel is voor hoogbegaafde leerlingen. Conform </w:t>
+      </w:r>
+      <w:hyperlink r:id="rId15" w:history="1">
+        <w:r>
+          <w:rPr>
+            <w:rStyle w:val="Hyperlink"/>
+          </w:rPr>
+          <w:t>EU AI Act Art. 14</w:t>
+        </w:r>
+      </w:hyperlink>
+      <w:r>
+        <w:t xml:space="preserve"> blijft de leraar te allen tijde in staat de assistent te monitoren en in te grijpen.</w:t>
       </w:r>
     </w:p>
     <w:p>
@@ -4649,7 +4683,18 @@
         <w:pStyle w:val="Geenafstand"/>
       </w:pPr>
       <w:r>
-        <w:t>Ouders van leerlingen hebben op basis van AVG art. 15 het recht op inzage in welke gegevens over hun kind worden verwerkt. Een eenvoudig ouderportaal uitsluitend met leesrechten, zonder bewerkingsmogelijkheden maakt Juf Aimee transparant naar alle betrokkenen en vergroot het vertrouwen van scholen in de inzet van het platform. Dit sluit direct aan op de eis van uitlegbaarheid (XAI) en mensgerichte AI zoals beschreven in het theoretisch kader.</w:t>
+        <w:t xml:space="preserve">Ouders van leerlingen hebben op basis van AVG art. 15 het recht op inzage in welke gegevens over hun kind worden verwerkt. Een eenvoudig ouderportaal uitsluitend met leesrechten, zonder bewerkingsmogelijkheden maakt Juf Aimee transparant naar alle betrokkenen en vergroot het vertrouwen van scholen in de inzet van het platform. Dit sluit direct aan op de eis van uitlegbaarheid </w:t>
+      </w:r>
+      <w:hyperlink r:id="rId16" w:history="1">
+        <w:r>
+          <w:rPr>
+            <w:rStyle w:val="Hyperlink"/>
+          </w:rPr>
+          <w:t>(XAI)</w:t>
+        </w:r>
+      </w:hyperlink>
+      <w:r>
+        <w:t xml:space="preserve"> en mensgerichte AI zoals beschreven in het theoretisch kader.</w:t>
       </w:r>
     </w:p>
     <w:p>
@@ -4668,22 +4713,83 @@
         <w:t xml:space="preserve">Een logische doorontwikkeling van Juf Aimee is een gespreksgerichte AI-taalbuddy waarmee leerlingen een vreemde taal kunnen oefenen via gesproken dialoog. Hoogbegaafde leerlingen leren doorgaans sneller een nieuwe taal, maar vinden binnen de reguliere klas weinig ruimte voor individuele oefening </w:t>
       </w:r>
       <w:r>
-        <w:t xml:space="preserve">(Hornstra et al, 2023) </w:t>
+        <w:t>(</w:t>
+      </w:r>
+      <w:hyperlink r:id="rId17" w:history="1">
+        <w:r>
+          <w:rPr>
+            <w:rStyle w:val="Hyperlink"/>
+          </w:rPr>
+          <w:t>Hor</w:t>
+        </w:r>
+        <w:r>
+          <w:rPr>
+            <w:rStyle w:val="Hyperlink"/>
+          </w:rPr>
+          <w:t>n</w:t>
+        </w:r>
+        <w:r>
+          <w:rPr>
+            <w:rStyle w:val="Hyperlink"/>
+          </w:rPr>
+          <w:t>s</w:t>
+        </w:r>
+        <w:r>
+          <w:rPr>
+            <w:rStyle w:val="Hyperlink"/>
+          </w:rPr>
+          <w:t>tra et al, 2023)</w:t>
+        </w:r>
+      </w:hyperlink>
+      <w:r>
+        <w:t xml:space="preserve"> </w:t>
       </w:r>
       <w:r>
         <w:t xml:space="preserve">Een AI-taalbuddy biedt die oefentijd op maat: het systeem stemt de gespreksonderwerpen en moeilijkheidsgraad af op de interesses en het niveau van de leerling, zoals vastgelegd in het </w:t>
       </w:r>
       <w:r>
-        <w:t xml:space="preserve">leerlingprofiel en het opbouwende </w:t>
-      </w:r>
-      <w:r>
-        <w:lastRenderedPageBreak/>
-        <w:t>portfolio</w:t>
+        <w:t>leerlingprofiel en het opbouwende portfolio</w:t>
       </w:r>
       <w:r>
         <w:t>. De leerkracht houdt altijd inzicht in de voortgang en blijft eindverantwoordelijk voor de taalontwikkeling van de leerling.</w:t>
       </w:r>
       <w:bookmarkStart w:id="28" w:name="_Toc225245705"/>
+    </w:p>
+    <w:p>
+      <w:pPr>
+        <w:spacing w:before="80" w:after="80"/>
+        <w:jc w:val="both"/>
+      </w:pPr>
+    </w:p>
+    <w:p>
+      <w:pPr>
+        <w:spacing w:before="80" w:after="80"/>
+        <w:jc w:val="both"/>
+      </w:pPr>
+    </w:p>
+    <w:p>
+      <w:pPr>
+        <w:spacing w:before="80" w:after="80"/>
+        <w:jc w:val="both"/>
+      </w:pPr>
+    </w:p>
+    <w:p>
+      <w:pPr>
+        <w:spacing w:before="80" w:after="80"/>
+        <w:jc w:val="both"/>
+      </w:pPr>
+    </w:p>
+    <w:p>
+      <w:pPr>
+        <w:spacing w:before="80" w:after="80"/>
+        <w:jc w:val="both"/>
+      </w:pPr>
+    </w:p>
+    <w:p>
+      <w:pPr>
+        <w:spacing w:before="80" w:after="80"/>
+        <w:jc w:val="both"/>
+      </w:pPr>
     </w:p>
     <w:p>
       <w:pPr>
@@ -4711,6 +4817,7 @@
         </w:pBdr>
       </w:pPr>
       <w:r>
+        <w:lastRenderedPageBreak/>
         <w:t>11. Literatuur</w:t>
       </w:r>
       <w:bookmarkEnd w:id="28"/>
@@ -4745,7 +4852,7 @@
         </w:rPr>
         <w:t xml:space="preserve"> </w:t>
       </w:r>
-      <w:hyperlink r:id="rId11" w:tgtFrame="_new" w:history="1">
+      <w:hyperlink r:id="rId18" w:tgtFrame="_new" w:history="1">
         <w:r>
           <w:rPr>
             <w:rStyle w:val="Hyperlink"/>
@@ -4789,7 +4896,7 @@
           <w:lang w:val="en-GB"/>
         </w:rPr>
       </w:pPr>
-      <w:hyperlink r:id="rId12" w:history="1">
+      <w:hyperlink r:id="rId19" w:history="1">
         <w:r>
           <w:rPr>
             <w:rStyle w:val="Hyperlink"/>
@@ -4802,32 +4909,34 @@
     <w:p>
       <w:pPr>
         <w:pStyle w:val="Lijstalinea"/>
-        <w:rPr>
-          <w:lang w:val="en-GB"/>
-        </w:rPr>
-      </w:pPr>
-    </w:p>
-    <w:p>
-      <w:pPr>
-        <w:pStyle w:val="Lijstalinea"/>
-        <w:rPr>
-          <w:i/>
-          <w:iCs/>
-        </w:rPr>
-      </w:pPr>
+      </w:pPr>
+    </w:p>
+    <w:p>
+      <w:pPr>
+        <w:pStyle w:val="Geenafstand"/>
+        <w:rPr>
+          <w:i/>
+          <w:iCs/>
+        </w:rPr>
+      </w:pPr>
+      <w:r>
+        <w:rPr>
+          <w:i/>
+          <w:iCs/>
+        </w:rPr>
+        <w:t xml:space="preserve">L. W. Anderson &amp; D. R. Krathwohl. (2001). A </w:t>
+      </w:r>
       <w:proofErr w:type="spellStart"/>
       <w:r>
         <w:rPr>
-          <w:rStyle w:val="whitespace-normal"/>
-          <w:i/>
-          <w:iCs/>
-        </w:rPr>
-        <w:t>Saleema</w:t>
+          <w:i/>
+          <w:iCs/>
+        </w:rPr>
+        <w:t>taxonomy</w:t>
       </w:r>
       <w:proofErr w:type="spellEnd"/>
       <w:r>
         <w:rPr>
-          <w:rStyle w:val="whitespace-normal"/>
           <w:i/>
           <w:iCs/>
         </w:rPr>
@@ -4836,11 +4945,10 @@
       <w:proofErr w:type="spellStart"/>
       <w:r>
         <w:rPr>
-          <w:rStyle w:val="whitespace-normal"/>
-          <w:i/>
-          <w:iCs/>
-        </w:rPr>
-        <w:t>Amershi</w:t>
+          <w:i/>
+          <w:iCs/>
+        </w:rPr>
+        <w:t>for</w:t>
       </w:r>
       <w:proofErr w:type="spellEnd"/>
       <w:r>
@@ -4848,52 +4956,63 @@
           <w:i/>
           <w:iCs/>
         </w:rPr>
-        <w:t xml:space="preserve"> et al. (2019). </w:t>
+        <w:t xml:space="preserve"> </w:t>
       </w:r>
       <w:proofErr w:type="spellStart"/>
       <w:r>
         <w:rPr>
-          <w:rStyle w:val="Nadruk"/>
-          <w:i w:val="0"/>
-          <w:iCs w:val="0"/>
-        </w:rPr>
-        <w:t>Guidelines</w:t>
+          <w:i/>
+          <w:iCs/>
+        </w:rPr>
+        <w:t>learning</w:t>
       </w:r>
       <w:proofErr w:type="spellEnd"/>
       <w:r>
         <w:rPr>
-          <w:rStyle w:val="Nadruk"/>
-          <w:i w:val="0"/>
-          <w:iCs w:val="0"/>
+          <w:i/>
+          <w:iCs/>
+        </w:rPr>
+        <w:t xml:space="preserve">, teaching, </w:t>
+      </w:r>
+      <w:proofErr w:type="spellStart"/>
+      <w:r>
+        <w:rPr>
+          <w:i/>
+          <w:iCs/>
+        </w:rPr>
+        <w:t>and</w:t>
+      </w:r>
+      <w:proofErr w:type="spellEnd"/>
+      <w:r>
+        <w:rPr>
+          <w:i/>
+          <w:iCs/>
         </w:rPr>
         <w:t xml:space="preserve"> </w:t>
       </w:r>
       <w:proofErr w:type="spellStart"/>
       <w:r>
         <w:rPr>
-          <w:rStyle w:val="Nadruk"/>
-          <w:i w:val="0"/>
-          <w:iCs w:val="0"/>
-        </w:rPr>
-        <w:t>for</w:t>
+          <w:i/>
+          <w:iCs/>
+        </w:rPr>
+        <w:t>assessing</w:t>
       </w:r>
       <w:proofErr w:type="spellEnd"/>
       <w:r>
         <w:rPr>
-          <w:rStyle w:val="Nadruk"/>
-          <w:i w:val="0"/>
-          <w:iCs w:val="0"/>
-        </w:rPr>
-        <w:t xml:space="preserve"> Human-AI </w:t>
+          <w:i/>
+          <w:iCs/>
+        </w:rPr>
+        <w:t xml:space="preserve">: A </w:t>
       </w:r>
       <w:proofErr w:type="spellStart"/>
       <w:r>
         <w:rPr>
-          <w:rStyle w:val="Nadruk"/>
-          <w:i w:val="0"/>
-          <w:iCs w:val="0"/>
-        </w:rPr>
-        <w:t>Interaction</w:t>
+          <w:i/>
+          <w:iCs/>
+        </w:rPr>
+        <w:t>revision</w:t>
       </w:r>
       <w:proofErr w:type="spellEnd"/>
       <w:r>
@@ -4901,6 +5020,70 @@
           <w:i/>
           <w:iCs/>
         </w:rPr>
+        <w:t xml:space="preserve"> of </w:t>
+      </w:r>
+      <w:proofErr w:type="spellStart"/>
+      <w:r>
+        <w:rPr>
+          <w:i/>
+          <w:iCs/>
+        </w:rPr>
+        <w:t>Bloom’s</w:t>
+      </w:r>
+      <w:proofErr w:type="spellEnd"/>
+      <w:r>
+        <w:rPr>
+          <w:i/>
+          <w:iCs/>
+        </w:rPr>
+        <w:t xml:space="preserve"> </w:t>
+      </w:r>
+      <w:proofErr w:type="spellStart"/>
+      <w:r>
+        <w:rPr>
+          <w:i/>
+          <w:iCs/>
+        </w:rPr>
+        <w:t>Taxonomy</w:t>
+      </w:r>
+      <w:proofErr w:type="spellEnd"/>
+      <w:r>
+        <w:rPr>
+          <w:i/>
+          <w:iCs/>
+        </w:rPr>
+        <w:t xml:space="preserve"> of </w:t>
+      </w:r>
+      <w:proofErr w:type="spellStart"/>
+      <w:r>
+        <w:rPr>
+          <w:i/>
+          <w:iCs/>
+        </w:rPr>
+        <w:t>Educational</w:t>
+      </w:r>
+      <w:proofErr w:type="spellEnd"/>
+      <w:r>
+        <w:rPr>
+          <w:i/>
+          <w:iCs/>
+        </w:rPr>
+        <w:t xml:space="preserve"> </w:t>
+      </w:r>
+      <w:proofErr w:type="spellStart"/>
+      <w:r>
+        <w:rPr>
+          <w:i/>
+          <w:iCs/>
+        </w:rPr>
+        <w:t>Objectives</w:t>
+      </w:r>
+      <w:proofErr w:type="spellEnd"/>
+      <w:r>
+        <w:rPr>
+          <w:i/>
+          <w:iCs/>
+        </w:rPr>
         <w:t xml:space="preserve">. </w:t>
       </w:r>
       <w:proofErr w:type="spellStart"/>
@@ -4909,7 +5092,7 @@
           <w:i/>
           <w:iCs/>
         </w:rPr>
-        <w:t>Proceedings</w:t>
+        <w:t>Allyn</w:t>
       </w:r>
       <w:proofErr w:type="spellEnd"/>
       <w:r>
@@ -4917,240 +5100,14 @@
           <w:i/>
           <w:iCs/>
         </w:rPr>
-        <w:t xml:space="preserve"> of </w:t>
-      </w:r>
-      <w:proofErr w:type="spellStart"/>
-      <w:r>
-        <w:rPr>
-          <w:i/>
-          <w:iCs/>
-        </w:rPr>
-        <w:t>the</w:t>
-      </w:r>
-      <w:proofErr w:type="spellEnd"/>
-      <w:r>
-        <w:rPr>
-          <w:i/>
-          <w:iCs/>
-        </w:rPr>
-        <w:t xml:space="preserve"> 2019 CHI Conference on Human Factors in Computing Systems.</w:t>
-      </w:r>
-    </w:p>
-    <w:p>
-      <w:pPr>
-        <w:pStyle w:val="Lijstalinea"/>
-      </w:pPr>
-      <w:hyperlink r:id="rId13" w:history="1">
-        <w:r>
-          <w:rPr>
-            <w:rStyle w:val="Hyperlink"/>
-          </w:rPr>
-          <w:t>https://dl.acm.org/doi/10.1145/3290605.3300233</w:t>
-        </w:r>
-      </w:hyperlink>
-    </w:p>
-    <w:p>
-      <w:pPr>
-        <w:pStyle w:val="Lijstalinea"/>
-      </w:pPr>
+        <w:t xml:space="preserve"> &amp; Bacon.</w:t>
+      </w:r>
     </w:p>
     <w:p>
       <w:pPr>
         <w:pStyle w:val="Geenafstand"/>
-        <w:rPr>
-          <w:i/>
-          <w:iCs/>
-        </w:rPr>
-      </w:pPr>
-      <w:r>
-        <w:rPr>
-          <w:i/>
-          <w:iCs/>
-        </w:rPr>
-        <w:t xml:space="preserve">L. W. Anderson &amp; D. R. Krathwohl. (2001). A </w:t>
-      </w:r>
-      <w:proofErr w:type="spellStart"/>
-      <w:r>
-        <w:rPr>
-          <w:i/>
-          <w:iCs/>
-        </w:rPr>
-        <w:t>taxonomy</w:t>
-      </w:r>
-      <w:proofErr w:type="spellEnd"/>
-      <w:r>
-        <w:rPr>
-          <w:i/>
-          <w:iCs/>
-        </w:rPr>
-        <w:t xml:space="preserve"> </w:t>
-      </w:r>
-      <w:proofErr w:type="spellStart"/>
-      <w:r>
-        <w:rPr>
-          <w:i/>
-          <w:iCs/>
-        </w:rPr>
-        <w:t>for</w:t>
-      </w:r>
-      <w:proofErr w:type="spellEnd"/>
-      <w:r>
-        <w:rPr>
-          <w:i/>
-          <w:iCs/>
-        </w:rPr>
-        <w:t xml:space="preserve"> </w:t>
-      </w:r>
-      <w:proofErr w:type="spellStart"/>
-      <w:r>
-        <w:rPr>
-          <w:i/>
-          <w:iCs/>
-        </w:rPr>
-        <w:t>learning</w:t>
-      </w:r>
-      <w:proofErr w:type="spellEnd"/>
-      <w:r>
-        <w:rPr>
-          <w:i/>
-          <w:iCs/>
-        </w:rPr>
-        <w:t xml:space="preserve">, teaching, </w:t>
-      </w:r>
-      <w:proofErr w:type="spellStart"/>
-      <w:r>
-        <w:rPr>
-          <w:i/>
-          <w:iCs/>
-        </w:rPr>
-        <w:t>and</w:t>
-      </w:r>
-      <w:proofErr w:type="spellEnd"/>
-      <w:r>
-        <w:rPr>
-          <w:i/>
-          <w:iCs/>
-        </w:rPr>
-        <w:t xml:space="preserve"> </w:t>
-      </w:r>
-      <w:proofErr w:type="spellStart"/>
-      <w:r>
-        <w:rPr>
-          <w:i/>
-          <w:iCs/>
-        </w:rPr>
-        <w:t>assessing</w:t>
-      </w:r>
-      <w:proofErr w:type="spellEnd"/>
-      <w:r>
-        <w:rPr>
-          <w:i/>
-          <w:iCs/>
-        </w:rPr>
-        <w:t xml:space="preserve">: A </w:t>
-      </w:r>
-      <w:proofErr w:type="spellStart"/>
-      <w:r>
-        <w:rPr>
-          <w:i/>
-          <w:iCs/>
-        </w:rPr>
-        <w:t>revision</w:t>
-      </w:r>
-      <w:proofErr w:type="spellEnd"/>
-      <w:r>
-        <w:rPr>
-          <w:i/>
-          <w:iCs/>
-        </w:rPr>
-        <w:t xml:space="preserve"> of </w:t>
-      </w:r>
-      <w:proofErr w:type="spellStart"/>
-      <w:r>
-        <w:rPr>
-          <w:i/>
-          <w:iCs/>
-        </w:rPr>
-        <w:t>Bloom’s</w:t>
-      </w:r>
-      <w:proofErr w:type="spellEnd"/>
-      <w:r>
-        <w:rPr>
-          <w:i/>
-          <w:iCs/>
-        </w:rPr>
-        <w:t xml:space="preserve"> </w:t>
-      </w:r>
-      <w:proofErr w:type="spellStart"/>
-      <w:r>
-        <w:rPr>
-          <w:i/>
-          <w:iCs/>
-        </w:rPr>
-        <w:t>Taxonomy</w:t>
-      </w:r>
-      <w:proofErr w:type="spellEnd"/>
-      <w:r>
-        <w:rPr>
-          <w:i/>
-          <w:iCs/>
-        </w:rPr>
-        <w:t xml:space="preserve"> of </w:t>
-      </w:r>
-      <w:proofErr w:type="spellStart"/>
-      <w:r>
-        <w:rPr>
-          <w:i/>
-          <w:iCs/>
-        </w:rPr>
-        <w:t>Educational</w:t>
-      </w:r>
-      <w:proofErr w:type="spellEnd"/>
-      <w:r>
-        <w:rPr>
-          <w:i/>
-          <w:iCs/>
-        </w:rPr>
-        <w:t xml:space="preserve"> </w:t>
-      </w:r>
-      <w:proofErr w:type="spellStart"/>
-      <w:r>
-        <w:rPr>
-          <w:i/>
-          <w:iCs/>
-        </w:rPr>
-        <w:t>Objectives</w:t>
-      </w:r>
-      <w:proofErr w:type="spellEnd"/>
-      <w:r>
-        <w:rPr>
-          <w:i/>
-          <w:iCs/>
-        </w:rPr>
-        <w:t xml:space="preserve">. </w:t>
-      </w:r>
-      <w:proofErr w:type="spellStart"/>
-      <w:r>
-        <w:rPr>
-          <w:i/>
-          <w:iCs/>
-        </w:rPr>
-        <w:t>Allyn</w:t>
-      </w:r>
-      <w:proofErr w:type="spellEnd"/>
-      <w:r>
-        <w:rPr>
-          <w:i/>
-          <w:iCs/>
-        </w:rPr>
-        <w:t xml:space="preserve"> &amp; Bacon.</w:t>
-      </w:r>
-    </w:p>
-    <w:p>
-      <w:pPr>
-        <w:pStyle w:val="Geenafstand"/>
-      </w:pPr>
-      <w:hyperlink r:id="rId14" w:history="1">
+      </w:pPr>
+      <w:hyperlink r:id="rId20" w:history="1">
         <w:r>
           <w:rPr>
             <w:rStyle w:val="Hyperlink"/>
@@ -5339,6 +5296,7 @@
         <w:t xml:space="preserve"> </w:t>
       </w:r>
       <w:proofErr w:type="spellStart"/>
+      <w:proofErr w:type="gramStart"/>
       <w:r>
         <w:rPr>
           <w:i/>
@@ -5356,6 +5314,15 @@
         </w:rPr>
         <w:t>.</w:t>
       </w:r>
+      <w:r>
+        <w:rPr>
+          <w:i/>
+          <w:iCs/>
+          <w:lang w:val="en-GB"/>
+        </w:rPr>
+        <w:t>§</w:t>
+      </w:r>
+      <w:proofErr w:type="gramEnd"/>
     </w:p>
     <w:p>
       <w:pPr>
@@ -5364,7 +5331,7 @@
           <w:lang w:val="en-GB"/>
         </w:rPr>
       </w:pPr>
-      <w:hyperlink r:id="rId15" w:history="1">
+      <w:hyperlink r:id="rId21" w:history="1">
         <w:r>
           <w:rPr>
             <w:rStyle w:val="Hyperlink"/>
@@ -5397,7 +5364,25 @@
           <w:iCs/>
           <w:lang w:val="en-GB"/>
         </w:rPr>
-        <w:t>OWASP. (2023). OWASP Top 10 for Large Language Model Applications — LLM01: Prompt Injection.</w:t>
+        <w:t xml:space="preserve">Perez, F., &amp; Ribeiro, I. (2022). Ignore Previous Prompt: Attack Techniques </w:t>
+      </w:r>
+      <w:proofErr w:type="gramStart"/>
+      <w:r>
+        <w:rPr>
+          <w:i/>
+          <w:iCs/>
+          <w:lang w:val="en-GB"/>
+        </w:rPr>
+        <w:t>For</w:t>
+      </w:r>
+      <w:proofErr w:type="gramEnd"/>
+      <w:r>
+        <w:rPr>
+          <w:i/>
+          <w:iCs/>
+          <w:lang w:val="en-GB"/>
+        </w:rPr>
+        <w:t xml:space="preserve"> Language Models. arXiv. </w:t>
       </w:r>
     </w:p>
     <w:p>
@@ -5407,67 +5392,7 @@
           <w:lang w:val="en-GB"/>
         </w:rPr>
       </w:pPr>
-      <w:hyperlink r:id="rId16" w:history="1">
-        <w:r>
-          <w:rPr>
-            <w:rStyle w:val="Hyperlink"/>
-          </w:rPr>
-          <w:t>https://owasp.org/www-project-top-10-for-large-language-model-applications/</w:t>
-        </w:r>
-      </w:hyperlink>
-    </w:p>
-    <w:p>
-      <w:pPr>
-        <w:pStyle w:val="Lijstalinea"/>
-        <w:rPr>
-          <w:lang w:val="en-GB"/>
-        </w:rPr>
-      </w:pPr>
-    </w:p>
-    <w:p>
-      <w:pPr>
-        <w:pStyle w:val="Lijstalinea"/>
-        <w:rPr>
-          <w:i/>
-          <w:iCs/>
-          <w:lang w:val="en-GB"/>
-        </w:rPr>
-      </w:pPr>
-      <w:r>
-        <w:rPr>
-          <w:i/>
-          <w:iCs/>
-          <w:lang w:val="en-GB"/>
-        </w:rPr>
-        <w:t xml:space="preserve">Perez, F., &amp; Ribeiro, I. (2022). Ignore Previous Prompt: Attack Techniques </w:t>
-      </w:r>
-      <w:proofErr w:type="gramStart"/>
-      <w:r>
-        <w:rPr>
-          <w:i/>
-          <w:iCs/>
-          <w:lang w:val="en-GB"/>
-        </w:rPr>
-        <w:t>For</w:t>
-      </w:r>
-      <w:proofErr w:type="gramEnd"/>
-      <w:r>
-        <w:rPr>
-          <w:i/>
-          <w:iCs/>
-          <w:lang w:val="en-GB"/>
-        </w:rPr>
-        <w:t xml:space="preserve"> Language Models. arXiv. </w:t>
-      </w:r>
-    </w:p>
-    <w:p>
-      <w:pPr>
-        <w:pStyle w:val="Lijstalinea"/>
-        <w:rPr>
-          <w:lang w:val="en-GB"/>
-        </w:rPr>
-      </w:pPr>
-      <w:hyperlink r:id="rId17" w:history="1">
+      <w:hyperlink r:id="rId22" w:history="1">
         <w:r>
           <w:rPr>
             <w:rStyle w:val="Hyperlink"/>
@@ -5524,7 +5449,7 @@
       <w:pPr>
         <w:pStyle w:val="Lijstalinea"/>
       </w:pPr>
-      <w:hyperlink r:id="rId18" w:history="1">
+      <w:hyperlink r:id="rId23" w:history="1">
         <w:r>
           <w:rPr>
             <w:rStyle w:val="Hyperlink"/>
@@ -5774,7 +5699,7 @@
       <w:r>
         <w:t xml:space="preserve"> </w:t>
       </w:r>
-      <w:hyperlink r:id="rId19" w:tgtFrame="_blank" w:history="1">
+      <w:hyperlink r:id="rId24" w:tgtFrame="_blank" w:history="1">
         <w:r>
           <w:rPr>
             <w:color w:val="0000FF"/>
@@ -5787,27 +5712,24 @@
     <w:p>
       <w:pPr>
         <w:spacing w:before="100" w:beforeAutospacing="1" w:after="100" w:afterAutospacing="1"/>
-        <w:rPr>
-          <w:i/>
-          <w:iCs/>
-        </w:rPr>
-      </w:pPr>
+      </w:pPr>
+      <w:r>
+        <w:rPr>
+          <w:rFonts w:ascii="Arial" w:eastAsia="Arial" w:hAnsi="Arial" w:cs="Arial"/>
+        </w:rPr>
+        <w:t>Q. V. Liao &amp; K. R. Varshney. (2021). Human-</w:t>
+      </w:r>
       <w:proofErr w:type="spellStart"/>
       <w:r>
         <w:rPr>
           <w:rFonts w:ascii="Arial" w:eastAsia="Arial" w:hAnsi="Arial" w:cs="Arial"/>
-          <w:i/>
-          <w:iCs/>
-        </w:rPr>
-        <w:lastRenderedPageBreak/>
-        <w:t>Morteza</w:t>
+        </w:rPr>
+        <w:t>Centered</w:t>
       </w:r>
       <w:proofErr w:type="spellEnd"/>
       <w:r>
         <w:rPr>
           <w:rFonts w:ascii="Arial" w:eastAsia="Arial" w:hAnsi="Arial" w:cs="Arial"/>
-          <w:i/>
-          <w:iCs/>
         </w:rPr>
         <w:t xml:space="preserve"> </w:t>
       </w:r>
@@ -5815,53 +5737,41 @@
       <w:r>
         <w:rPr>
           <w:rFonts w:ascii="Arial" w:eastAsia="Arial" w:hAnsi="Arial" w:cs="Arial"/>
-          <w:i/>
-          <w:iCs/>
-        </w:rPr>
-        <w:t>Moradi</w:t>
+        </w:rPr>
+        <w:t>Explainable</w:t>
       </w:r>
       <w:proofErr w:type="spellEnd"/>
       <w:r>
         <w:rPr>
           <w:rFonts w:ascii="Arial" w:eastAsia="Arial" w:hAnsi="Arial" w:cs="Arial"/>
-          <w:i/>
-          <w:iCs/>
-        </w:rPr>
-        <w:t xml:space="preserve">, Mohammad </w:t>
+        </w:rPr>
+        <w:t xml:space="preserve"> AI (XAI): </w:t>
       </w:r>
       <w:proofErr w:type="spellStart"/>
       <w:r>
         <w:rPr>
           <w:rFonts w:ascii="Arial" w:eastAsia="Arial" w:hAnsi="Arial" w:cs="Arial"/>
-          <w:i/>
-          <w:iCs/>
-        </w:rPr>
-        <w:t>Moradi</w:t>
+        </w:rPr>
+        <w:t>From</w:t>
       </w:r>
       <w:proofErr w:type="spellEnd"/>
       <w:r>
         <w:rPr>
           <w:rFonts w:ascii="Arial" w:eastAsia="Arial" w:hAnsi="Arial" w:cs="Arial"/>
-          <w:i/>
-          <w:iCs/>
-        </w:rPr>
-        <w:t xml:space="preserve">, </w:t>
+        </w:rPr>
+        <w:t xml:space="preserve"> </w:t>
       </w:r>
       <w:proofErr w:type="spellStart"/>
       <w:r>
         <w:rPr>
           <w:rFonts w:ascii="Arial" w:eastAsia="Arial" w:hAnsi="Arial" w:cs="Arial"/>
-          <w:i/>
-          <w:iCs/>
-        </w:rPr>
-        <w:t>Farhad</w:t>
+        </w:rPr>
+        <w:t>Algorithms</w:t>
       </w:r>
       <w:proofErr w:type="spellEnd"/>
       <w:r>
         <w:rPr>
           <w:rFonts w:ascii="Arial" w:eastAsia="Arial" w:hAnsi="Arial" w:cs="Arial"/>
-          <w:i/>
-          <w:iCs/>
         </w:rPr>
         <w:t xml:space="preserve"> </w:t>
       </w:r>
@@ -5869,281 +5779,35 @@
       <w:r>
         <w:rPr>
           <w:rFonts w:ascii="Arial" w:eastAsia="Arial" w:hAnsi="Arial" w:cs="Arial"/>
-          <w:i/>
-          <w:iCs/>
-        </w:rPr>
-        <w:t>Bayat</w:t>
+        </w:rPr>
+        <w:t>to</w:t>
       </w:r>
       <w:proofErr w:type="spellEnd"/>
       <w:r>
         <w:rPr>
           <w:rFonts w:ascii="Arial" w:eastAsia="Arial" w:hAnsi="Arial" w:cs="Arial"/>
-          <w:i/>
-          <w:iCs/>
-        </w:rPr>
-        <w:t xml:space="preserve"> &amp; Adel </w:t>
+        </w:rPr>
+        <w:t xml:space="preserve"> User </w:t>
       </w:r>
       <w:proofErr w:type="spellStart"/>
       <w:r>
         <w:rPr>
           <w:rFonts w:ascii="Arial" w:eastAsia="Arial" w:hAnsi="Arial" w:cs="Arial"/>
-          <w:i/>
-          <w:iCs/>
-        </w:rPr>
-        <w:t>Nadjaran</w:t>
+        </w:rPr>
+        <w:t>Experiences</w:t>
       </w:r>
       <w:proofErr w:type="spellEnd"/>
       <w:r>
         <w:rPr>
-          <w:rFonts w:ascii="Arial" w:eastAsia="Arial" w:hAnsi="Arial" w:cs="Arial"/>
-          <w:i/>
-          <w:iCs/>
-        </w:rPr>
+          <w:i/>
+          <w:iCs/>
+        </w:rPr>
+        <w:t>.</w:t>
+      </w:r>
+      <w:r>
         <w:t xml:space="preserve"> </w:t>
       </w:r>
-      <w:proofErr w:type="spellStart"/>
-      <w:r>
-        <w:rPr>
-          <w:rFonts w:ascii="Arial" w:eastAsia="Arial" w:hAnsi="Arial" w:cs="Arial"/>
-          <w:i/>
-          <w:iCs/>
-        </w:rPr>
-        <w:t>Toosi</w:t>
-      </w:r>
-      <w:proofErr w:type="spellEnd"/>
-      <w:r>
-        <w:rPr>
-          <w:rFonts w:ascii="Arial" w:eastAsia="Arial" w:hAnsi="Arial" w:cs="Arial"/>
-          <w:i/>
-          <w:iCs/>
-        </w:rPr>
-        <w:t xml:space="preserve">. (2019). </w:t>
-      </w:r>
-      <w:proofErr w:type="spellStart"/>
-      <w:r>
-        <w:rPr>
-          <w:rFonts w:ascii="Arial" w:eastAsia="Arial" w:hAnsi="Arial" w:cs="Arial"/>
-          <w:i/>
-          <w:iCs/>
-        </w:rPr>
-        <w:t>Collective</w:t>
-      </w:r>
-      <w:proofErr w:type="spellEnd"/>
-      <w:r>
-        <w:rPr>
-          <w:rFonts w:ascii="Arial" w:eastAsia="Arial" w:hAnsi="Arial" w:cs="Arial"/>
-          <w:i/>
-          <w:iCs/>
-        </w:rPr>
-        <w:t xml:space="preserve"> </w:t>
-      </w:r>
-      <w:proofErr w:type="spellStart"/>
-      <w:r>
-        <w:rPr>
-          <w:rFonts w:ascii="Arial" w:eastAsia="Arial" w:hAnsi="Arial" w:cs="Arial"/>
-          <w:i/>
-          <w:iCs/>
-        </w:rPr>
-        <w:t>hybrid</w:t>
-      </w:r>
-      <w:proofErr w:type="spellEnd"/>
-      <w:r>
-        <w:rPr>
-          <w:rFonts w:ascii="Arial" w:eastAsia="Arial" w:hAnsi="Arial" w:cs="Arial"/>
-          <w:i/>
-          <w:iCs/>
-        </w:rPr>
-        <w:t xml:space="preserve"> intelligence: </w:t>
-      </w:r>
-      <w:proofErr w:type="spellStart"/>
-      <w:r>
-        <w:rPr>
-          <w:rFonts w:ascii="Arial" w:eastAsia="Arial" w:hAnsi="Arial" w:cs="Arial"/>
-          <w:i/>
-          <w:iCs/>
-        </w:rPr>
-        <w:t>towards</w:t>
-      </w:r>
-      <w:proofErr w:type="spellEnd"/>
-      <w:r>
-        <w:rPr>
-          <w:rFonts w:ascii="Arial" w:eastAsia="Arial" w:hAnsi="Arial" w:cs="Arial"/>
-          <w:i/>
-          <w:iCs/>
-        </w:rPr>
-        <w:t xml:space="preserve"> a </w:t>
-      </w:r>
-      <w:proofErr w:type="spellStart"/>
-      <w:r>
-        <w:rPr>
-          <w:rFonts w:ascii="Arial" w:eastAsia="Arial" w:hAnsi="Arial" w:cs="Arial"/>
-          <w:i/>
-          <w:iCs/>
-        </w:rPr>
-        <w:t>conceptual</w:t>
-      </w:r>
-      <w:proofErr w:type="spellEnd"/>
-      <w:r>
-        <w:rPr>
-          <w:rFonts w:ascii="Arial" w:eastAsia="Arial" w:hAnsi="Arial" w:cs="Arial"/>
-          <w:i/>
-          <w:iCs/>
-        </w:rPr>
-        <w:t xml:space="preserve"> framework. International Journal of </w:t>
-      </w:r>
-      <w:proofErr w:type="spellStart"/>
-      <w:r>
-        <w:rPr>
-          <w:rFonts w:ascii="Arial" w:eastAsia="Arial" w:hAnsi="Arial" w:cs="Arial"/>
-          <w:i/>
-          <w:iCs/>
-        </w:rPr>
-        <w:t>Crowd</w:t>
-      </w:r>
-      <w:proofErr w:type="spellEnd"/>
-      <w:r>
-        <w:rPr>
-          <w:rFonts w:ascii="Arial" w:eastAsia="Arial" w:hAnsi="Arial" w:cs="Arial"/>
-          <w:i/>
-          <w:iCs/>
-        </w:rPr>
-        <w:t xml:space="preserve"> </w:t>
-      </w:r>
-      <w:proofErr w:type="spellStart"/>
-      <w:r>
-        <w:rPr>
-          <w:rFonts w:ascii="Arial" w:eastAsia="Arial" w:hAnsi="Arial" w:cs="Arial"/>
-          <w:i/>
-          <w:iCs/>
-        </w:rPr>
-        <w:t>Science</w:t>
-      </w:r>
-      <w:proofErr w:type="spellEnd"/>
-      <w:r>
-        <w:rPr>
-          <w:rFonts w:ascii="Arial" w:eastAsia="Arial" w:hAnsi="Arial" w:cs="Arial"/>
-          <w:i/>
-          <w:iCs/>
-        </w:rPr>
-        <w:t>, 3(2), 198–220.</w:t>
-      </w:r>
-      <w:r>
-        <w:rPr>
-          <w:i/>
-          <w:iCs/>
-        </w:rPr>
-        <w:t xml:space="preserve"> </w:t>
-      </w:r>
-      <w:hyperlink r:id="rId20" w:history="1">
-        <w:r>
-          <w:rPr>
-            <w:rStyle w:val="Hyperlink"/>
-            <w:i/>
-            <w:iCs/>
-          </w:rPr>
-          <w:t>https://doi.org/10.1108/IJCS-03-2019-0012</w:t>
-        </w:r>
-      </w:hyperlink>
-    </w:p>
-    <w:p>
-      <w:pPr>
-        <w:spacing w:before="100" w:beforeAutospacing="1" w:after="100" w:afterAutospacing="1"/>
-      </w:pPr>
-      <w:r>
-        <w:rPr>
-          <w:rFonts w:ascii="Arial" w:eastAsia="Arial" w:hAnsi="Arial" w:cs="Arial"/>
-        </w:rPr>
-        <w:t>Q. V. Liao &amp; K. R. Varshney. (2021). Human-</w:t>
-      </w:r>
-      <w:proofErr w:type="spellStart"/>
-      <w:r>
-        <w:rPr>
-          <w:rFonts w:ascii="Arial" w:eastAsia="Arial" w:hAnsi="Arial" w:cs="Arial"/>
-        </w:rPr>
-        <w:t>Centered</w:t>
-      </w:r>
-      <w:proofErr w:type="spellEnd"/>
-      <w:r>
-        <w:rPr>
-          <w:rFonts w:ascii="Arial" w:eastAsia="Arial" w:hAnsi="Arial" w:cs="Arial"/>
-        </w:rPr>
-        <w:t xml:space="preserve"> </w:t>
-      </w:r>
-      <w:proofErr w:type="spellStart"/>
-      <w:r>
-        <w:rPr>
-          <w:rFonts w:ascii="Arial" w:eastAsia="Arial" w:hAnsi="Arial" w:cs="Arial"/>
-        </w:rPr>
-        <w:t>Explainable</w:t>
-      </w:r>
-      <w:proofErr w:type="spellEnd"/>
-      <w:r>
-        <w:rPr>
-          <w:rFonts w:ascii="Arial" w:eastAsia="Arial" w:hAnsi="Arial" w:cs="Arial"/>
-        </w:rPr>
-        <w:t xml:space="preserve"> AI (XAI): </w:t>
-      </w:r>
-      <w:proofErr w:type="spellStart"/>
-      <w:r>
-        <w:rPr>
-          <w:rFonts w:ascii="Arial" w:eastAsia="Arial" w:hAnsi="Arial" w:cs="Arial"/>
-        </w:rPr>
-        <w:t>From</w:t>
-      </w:r>
-      <w:proofErr w:type="spellEnd"/>
-      <w:r>
-        <w:rPr>
-          <w:rFonts w:ascii="Arial" w:eastAsia="Arial" w:hAnsi="Arial" w:cs="Arial"/>
-        </w:rPr>
-        <w:t xml:space="preserve"> </w:t>
-      </w:r>
-      <w:proofErr w:type="spellStart"/>
-      <w:r>
-        <w:rPr>
-          <w:rFonts w:ascii="Arial" w:eastAsia="Arial" w:hAnsi="Arial" w:cs="Arial"/>
-        </w:rPr>
-        <w:t>Algorithms</w:t>
-      </w:r>
-      <w:proofErr w:type="spellEnd"/>
-      <w:r>
-        <w:rPr>
-          <w:rFonts w:ascii="Arial" w:eastAsia="Arial" w:hAnsi="Arial" w:cs="Arial"/>
-        </w:rPr>
-        <w:t xml:space="preserve"> </w:t>
-      </w:r>
-      <w:proofErr w:type="spellStart"/>
-      <w:r>
-        <w:rPr>
-          <w:rFonts w:ascii="Arial" w:eastAsia="Arial" w:hAnsi="Arial" w:cs="Arial"/>
-        </w:rPr>
-        <w:t>to</w:t>
-      </w:r>
-      <w:proofErr w:type="spellEnd"/>
-      <w:r>
-        <w:rPr>
-          <w:rFonts w:ascii="Arial" w:eastAsia="Arial" w:hAnsi="Arial" w:cs="Arial"/>
-        </w:rPr>
-        <w:t xml:space="preserve"> User </w:t>
-      </w:r>
-      <w:proofErr w:type="spellStart"/>
-      <w:r>
-        <w:rPr>
-          <w:rFonts w:ascii="Arial" w:eastAsia="Arial" w:hAnsi="Arial" w:cs="Arial"/>
-        </w:rPr>
-        <w:t>Experiences</w:t>
-      </w:r>
-      <w:proofErr w:type="spellEnd"/>
-      <w:r>
-        <w:rPr>
-          <w:i/>
-          <w:iCs/>
-        </w:rPr>
-        <w:t>.</w:t>
-      </w:r>
-      <w:r>
-        <w:t xml:space="preserve"> </w:t>
-      </w:r>
-      <w:hyperlink r:id="rId21" w:tgtFrame="_new" w:history="1">
+      <w:hyperlink r:id="rId25" w:tgtFrame="_new" w:history="1">
         <w:r>
           <w:rPr>
             <w:rFonts w:ascii="Arial" w:eastAsia="Arial" w:hAnsi="Arial" w:cs="Arial"/>
@@ -6154,9 +5818,284 @@
         </w:r>
       </w:hyperlink>
     </w:p>
+    <w:p>
+      <w:pPr>
+        <w:spacing w:before="100" w:beforeAutospacing="1" w:after="100" w:afterAutospacing="1"/>
+        <w:rPr>
+          <w:rFonts w:ascii="Arial" w:eastAsia="Arial" w:hAnsi="Arial" w:cs="Arial"/>
+          <w:i/>
+          <w:iCs/>
+        </w:rPr>
+      </w:pPr>
+      <w:r>
+        <w:t>Z</w:t>
+      </w:r>
+      <w:r>
+        <w:rPr>
+          <w:rFonts w:ascii="Arial" w:eastAsia="Arial" w:hAnsi="Arial" w:cs="Arial"/>
+          <w:i/>
+          <w:iCs/>
+        </w:rPr>
+        <w:t xml:space="preserve">. </w:t>
+      </w:r>
+      <w:proofErr w:type="spellStart"/>
+      <w:r>
+        <w:rPr>
+          <w:rFonts w:ascii="Arial" w:eastAsia="Arial" w:hAnsi="Arial" w:cs="Arial"/>
+          <w:i/>
+          <w:iCs/>
+        </w:rPr>
+        <w:t>Akata</w:t>
+      </w:r>
+      <w:proofErr w:type="spellEnd"/>
+      <w:r>
+        <w:rPr>
+          <w:rFonts w:ascii="Arial" w:eastAsia="Arial" w:hAnsi="Arial" w:cs="Arial"/>
+          <w:i/>
+          <w:iCs/>
+        </w:rPr>
+        <w:t xml:space="preserve"> et al. (2020). A Research Agenda </w:t>
+      </w:r>
+      <w:proofErr w:type="spellStart"/>
+      <w:r>
+        <w:rPr>
+          <w:rFonts w:ascii="Arial" w:eastAsia="Arial" w:hAnsi="Arial" w:cs="Arial"/>
+          <w:i/>
+          <w:iCs/>
+        </w:rPr>
+        <w:t>for</w:t>
+      </w:r>
+      <w:proofErr w:type="spellEnd"/>
+      <w:r>
+        <w:rPr>
+          <w:rFonts w:ascii="Arial" w:eastAsia="Arial" w:hAnsi="Arial" w:cs="Arial"/>
+          <w:i/>
+          <w:iCs/>
+        </w:rPr>
+        <w:t xml:space="preserve"> </w:t>
+      </w:r>
+      <w:proofErr w:type="spellStart"/>
+      <w:r>
+        <w:rPr>
+          <w:rFonts w:ascii="Arial" w:eastAsia="Arial" w:hAnsi="Arial" w:cs="Arial"/>
+          <w:i/>
+          <w:iCs/>
+        </w:rPr>
+        <w:t>Hybrid</w:t>
+      </w:r>
+      <w:proofErr w:type="spellEnd"/>
+      <w:r>
+        <w:rPr>
+          <w:rFonts w:ascii="Arial" w:eastAsia="Arial" w:hAnsi="Arial" w:cs="Arial"/>
+          <w:i/>
+          <w:iCs/>
+        </w:rPr>
+        <w:t xml:space="preserve"> Intelligence: </w:t>
+      </w:r>
+      <w:proofErr w:type="spellStart"/>
+      <w:r>
+        <w:rPr>
+          <w:rFonts w:ascii="Arial" w:eastAsia="Arial" w:hAnsi="Arial" w:cs="Arial"/>
+          <w:i/>
+          <w:iCs/>
+        </w:rPr>
+        <w:t>Augmenting</w:t>
+      </w:r>
+      <w:proofErr w:type="spellEnd"/>
+      <w:r>
+        <w:rPr>
+          <w:rFonts w:ascii="Arial" w:eastAsia="Arial" w:hAnsi="Arial" w:cs="Arial"/>
+          <w:i/>
+          <w:iCs/>
+        </w:rPr>
+        <w:t xml:space="preserve"> Human Intellect </w:t>
+      </w:r>
+      <w:proofErr w:type="spellStart"/>
+      <w:r>
+        <w:rPr>
+          <w:rFonts w:ascii="Arial" w:eastAsia="Arial" w:hAnsi="Arial" w:cs="Arial"/>
+          <w:i/>
+          <w:iCs/>
+        </w:rPr>
+        <w:t>With</w:t>
+      </w:r>
+      <w:proofErr w:type="spellEnd"/>
+      <w:r>
+        <w:rPr>
+          <w:rFonts w:ascii="Arial" w:eastAsia="Arial" w:hAnsi="Arial" w:cs="Arial"/>
+          <w:i/>
+          <w:iCs/>
+        </w:rPr>
+        <w:t xml:space="preserve"> </w:t>
+      </w:r>
+      <w:proofErr w:type="spellStart"/>
+      <w:r>
+        <w:rPr>
+          <w:rFonts w:ascii="Arial" w:eastAsia="Arial" w:hAnsi="Arial" w:cs="Arial"/>
+          <w:i/>
+          <w:iCs/>
+        </w:rPr>
+        <w:t>Collaborative</w:t>
+      </w:r>
+      <w:proofErr w:type="spellEnd"/>
+      <w:r>
+        <w:rPr>
+          <w:rFonts w:ascii="Arial" w:eastAsia="Arial" w:hAnsi="Arial" w:cs="Arial"/>
+          <w:i/>
+          <w:iCs/>
+        </w:rPr>
+        <w:t xml:space="preserve">, </w:t>
+      </w:r>
+      <w:proofErr w:type="spellStart"/>
+      <w:r>
+        <w:rPr>
+          <w:rFonts w:ascii="Arial" w:eastAsia="Arial" w:hAnsi="Arial" w:cs="Arial"/>
+          <w:i/>
+          <w:iCs/>
+        </w:rPr>
+        <w:t>Adaptive</w:t>
+      </w:r>
+      <w:proofErr w:type="spellEnd"/>
+      <w:r>
+        <w:rPr>
+          <w:rFonts w:ascii="Arial" w:eastAsia="Arial" w:hAnsi="Arial" w:cs="Arial"/>
+          <w:i/>
+          <w:iCs/>
+        </w:rPr>
+        <w:t xml:space="preserve">, </w:t>
+      </w:r>
+      <w:proofErr w:type="spellStart"/>
+      <w:r>
+        <w:rPr>
+          <w:rFonts w:ascii="Arial" w:eastAsia="Arial" w:hAnsi="Arial" w:cs="Arial"/>
+          <w:i/>
+          <w:iCs/>
+        </w:rPr>
+        <w:t>Responsible</w:t>
+      </w:r>
+      <w:proofErr w:type="spellEnd"/>
+      <w:r>
+        <w:rPr>
+          <w:rFonts w:ascii="Arial" w:eastAsia="Arial" w:hAnsi="Arial" w:cs="Arial"/>
+          <w:i/>
+          <w:iCs/>
+        </w:rPr>
+        <w:t xml:space="preserve">, </w:t>
+      </w:r>
+      <w:proofErr w:type="spellStart"/>
+      <w:r>
+        <w:rPr>
+          <w:rFonts w:ascii="Arial" w:eastAsia="Arial" w:hAnsi="Arial" w:cs="Arial"/>
+          <w:i/>
+          <w:iCs/>
+        </w:rPr>
+        <w:t>and</w:t>
+      </w:r>
+      <w:proofErr w:type="spellEnd"/>
+      <w:r>
+        <w:rPr>
+          <w:rFonts w:ascii="Arial" w:eastAsia="Arial" w:hAnsi="Arial" w:cs="Arial"/>
+          <w:i/>
+          <w:iCs/>
+        </w:rPr>
+        <w:t xml:space="preserve"> </w:t>
+      </w:r>
+      <w:proofErr w:type="spellStart"/>
+      <w:r>
+        <w:rPr>
+          <w:rFonts w:ascii="Arial" w:eastAsia="Arial" w:hAnsi="Arial" w:cs="Arial"/>
+          <w:i/>
+          <w:iCs/>
+        </w:rPr>
+        <w:t>Explainable</w:t>
+      </w:r>
+      <w:proofErr w:type="spellEnd"/>
+      <w:r>
+        <w:rPr>
+          <w:rFonts w:ascii="Arial" w:eastAsia="Arial" w:hAnsi="Arial" w:cs="Arial"/>
+          <w:i/>
+          <w:iCs/>
+        </w:rPr>
+        <w:t xml:space="preserve"> </w:t>
+      </w:r>
+      <w:proofErr w:type="spellStart"/>
+      <w:r>
+        <w:rPr>
+          <w:rFonts w:ascii="Arial" w:eastAsia="Arial" w:hAnsi="Arial" w:cs="Arial"/>
+          <w:i/>
+          <w:iCs/>
+        </w:rPr>
+        <w:t>Artificial</w:t>
+      </w:r>
+      <w:proofErr w:type="spellEnd"/>
+      <w:r>
+        <w:rPr>
+          <w:rFonts w:ascii="Arial" w:eastAsia="Arial" w:hAnsi="Arial" w:cs="Arial"/>
+          <w:i/>
+          <w:iCs/>
+        </w:rPr>
+        <w:t xml:space="preserve"> Intelligence. Computer, 53(8), 18–28. </w:t>
+      </w:r>
+      <w:hyperlink r:id="rId26" w:history="1">
+        <w:r>
+          <w:rPr>
+            <w:rFonts w:ascii="Arial" w:eastAsia="Arial" w:hAnsi="Arial" w:cs="Arial"/>
+            <w:color w:val="0000FF"/>
+            <w:u w:val="single"/>
+          </w:rPr>
+          <w:t>https://doi.org/10.1109/MC.2020</w:t>
+        </w:r>
+        <w:r>
+          <w:rPr>
+            <w:rFonts w:ascii="Arial" w:eastAsia="Arial" w:hAnsi="Arial" w:cs="Arial"/>
+            <w:color w:val="0000FF"/>
+            <w:u w:val="single"/>
+          </w:rPr>
+          <w:t>.</w:t>
+        </w:r>
+        <w:r>
+          <w:rPr>
+            <w:rFonts w:ascii="Arial" w:eastAsia="Arial" w:hAnsi="Arial" w:cs="Arial"/>
+            <w:color w:val="0000FF"/>
+            <w:u w:val="single"/>
+          </w:rPr>
+          <w:t>2996587</w:t>
+        </w:r>
+      </w:hyperlink>
+    </w:p>
+    <w:p>
+      <w:pPr>
+        <w:spacing w:before="100" w:beforeAutospacing="1" w:after="100" w:afterAutospacing="1"/>
+        <w:rPr>
+          <w:rFonts w:ascii="Arial" w:eastAsia="Arial" w:hAnsi="Arial" w:cs="Arial"/>
+          <w:i/>
+          <w:iCs/>
+        </w:rPr>
+      </w:pPr>
+    </w:p>
+    <w:p>
+      <w:pPr>
+        <w:spacing w:before="100" w:beforeAutospacing="1" w:after="100" w:afterAutospacing="1"/>
+        <w:rPr>
+          <w:rFonts w:ascii="Arial" w:eastAsia="Arial" w:hAnsi="Arial" w:cs="Arial"/>
+          <w:i/>
+          <w:iCs/>
+        </w:rPr>
+      </w:pPr>
+    </w:p>
+    <w:p>
+      <w:pPr>
+        <w:spacing w:before="100" w:beforeAutospacing="1" w:after="100" w:afterAutospacing="1"/>
+        <w:rPr>
+          <w:rFonts w:ascii="Arial" w:eastAsia="Arial" w:hAnsi="Arial" w:cs="Arial"/>
+          <w:i/>
+          <w:iCs/>
+        </w:rPr>
+      </w:pPr>
+    </w:p>
     <w:sectPr>
-      <w:footerReference w:type="even" r:id="rId22"/>
-      <w:footerReference w:type="default" r:id="rId23"/>
+      <w:footerReference w:type="even" r:id="rId27"/>
+      <w:footerReference w:type="default" r:id="rId28"/>
       <w:pgSz w:w="11906" w:h="16838"/>
       <w:pgMar w:top="1440" w:right="1440" w:bottom="1440" w:left="1800" w:header="708" w:footer="708" w:gutter="0"/>
       <w:cols w:space="708"/>

</xml_diff>

<commit_message>
feat: enhance signal computation logic to include pending assignments and improve teacher messaging
</commit_message>
<xml_diff>
--- a/docs/Analyseren/JufAimee_Onderzoeksverslag.docx
+++ b/docs/Analyseren/JufAimee_Onderzoeksverslag.docx
@@ -2976,7 +2976,138 @@
     </w:p>
     <w:p>
       <w:pPr>
-        <w:spacing w:before="80" w:after="80"/>
+        <w:pStyle w:val="Kop2"/>
+      </w:pPr>
+      <w:bookmarkStart w:id="24" w:name="_Toc225245701"/>
+      <w:r>
+        <w:t xml:space="preserve">6.3 </w:t>
+      </w:r>
+      <w:r>
+        <w:t xml:space="preserve">Proof of concept </w:t>
+      </w:r>
+      <w:r>
+        <w:t>-</w:t>
+      </w:r>
+      <w:r>
+        <w:t xml:space="preserve"> Gerealiseerde functionaliteiten</w:t>
+      </w:r>
+    </w:p>
+    <w:p>
+      <w:r>
+        <w:t xml:space="preserve">Het proof of concept bestaat uit een webapplicatie voor leraren die drie kernsystemen integreert: een leraarsdashboard met leerlingoverzicht, een regelgebaseerd signalensysteem en een AI-gedreven adviessysteem. De </w:t>
+      </w:r>
+      <w:r>
+        <w:lastRenderedPageBreak/>
+        <w:t xml:space="preserve">applicatie is ontwikkeld met </w:t>
+      </w:r>
+      <w:r>
+        <w:t xml:space="preserve">het </w:t>
+      </w:r>
+      <w:r>
+        <w:t>Next.js</w:t>
+      </w:r>
+      <w:r>
+        <w:t xml:space="preserve"> framework</w:t>
+      </w:r>
+      <w:r>
+        <w:t xml:space="preserve"> en maakt gebruik van een lokale PostgreSQL-database met vectoropslag. Alle AI</w:t>
+      </w:r>
+      <w:r>
+        <w:t xml:space="preserve">- </w:t>
+      </w:r>
+      <w:r>
+        <w:t>componenten draaien lokaal via Ollama, een oplossing die bewust is gekozen om te voldoen aan de AVG-eis dat persoonsgegevens van minderjarigen niet worden doorgezonden naar externe cloudproviders.</w:t>
+      </w:r>
+    </w:p>
+    <w:p/>
+    <w:p>
+      <w:pPr>
+        <w:pStyle w:val="Kop3"/>
+      </w:pPr>
+      <w:r>
+        <w:t>Leraarsdashboard</w:t>
+      </w:r>
+    </w:p>
+    <w:p/>
+    <w:p>
+      <w:r>
+        <w:t>De centrale interface is een dashboard waarop de leraar per leerling een overzicht ziet van voortgang, interesses, afgeronde opdrachten en het huidige Bloom-niveau. De leerlingprofielen zijn opgebouwd uit het Individueel Ontwikkelingsperspectief (OPP): een bestaand pedagogisch document dat scholen bijhouden per leerling. De OPP-bestanden worden automatisch ingelezen, opgesplitst in tekstfragmenten en omgezet naar vectorrepresentaties met behulp van een meertalig inbeddingsmodel. Dit maakt semantisch zoeken mogelijk: het systeem kan relevante informatie uit het leerlingprofiel ophalen op basis van betekenis, niet alleen op basis van exacte zoekwoorden.</w:t>
+      </w:r>
+    </w:p>
+    <w:p/>
+    <w:p>
+      <w:pPr>
+        <w:pStyle w:val="Kop3"/>
+      </w:pPr>
+      <w:r>
+        <w:t>Signalensysteem</w:t>
+      </w:r>
+    </w:p>
+    <w:p/>
+    <w:p>
+      <w:r>
+        <w:t>Het signalensysteem detecteert automatisch vier typen situaties op basis van observeerbaar gedrag in de applicatie. Een capaciteitssignaal wordt gegenereerd wanneer een leerling twee opdrachten achter elkaar heeft afgerond op hetzelfde Bloom-niveau, wat kan duiden op onderbenutting. Een taakbetrokkenheidssignaal verschijnt wanneer een leerling openstaande opdrachten heeft maar nog niets heeft afgerond. Een intellectueel prestatiesignaal markeert leerlingen die consistent presteren op de hogere Bloom-niveaus vijf en zes. Een werktempo­signaal wordt geactiveerd wanneer een leerling op één dag drie of meer opdrachten heeft voltooid. De signalen worden gerangschikt op urgentie: waarschuwingen krijgen prioriteit boven adviezen, die op hun beurt prioriteit krijgen boven positieve observaties.</w:t>
+      </w:r>
+    </w:p>
+    <w:p/>
+    <w:p>
+      <w:pPr>
+        <w:pStyle w:val="Kop3"/>
+      </w:pPr>
+      <w:r>
+        <w:t xml:space="preserve">AI-gedreven advies </w:t>
+      </w:r>
+      <w:r>
+        <w:t>-</w:t>
+      </w:r>
+      <w:r>
+        <w:t xml:space="preserve"> Juf Aimee</w:t>
+      </w:r>
+    </w:p>
+    <w:p/>
+    <w:p>
+      <w:r>
+        <w:t>Voor elke leerling met een of meerdere actieve signalen genereert het systeem een gepersonaliseerd advies via een lokaal taalmodel. Het systeem haalt hiervoor relevante fragmenten op uit het OPP van de leerling, met name informatie over interesses, motivatie en werkstijl. Deze fragmenten worden gecombineerd met de signaalcontext en aangeboden aan het taalmodel als gestructureerde prompt.</w:t>
+      </w:r>
+    </w:p>
+    <w:p/>
+    <w:p>
+      <w:r>
+        <w:t>Wanneer een leerling meerdere gelijktijdige signalen heeft, genereert het systeem één samenhangende observatie die de signalen in verband brengt. Zo wordt voorkomen dat de leraar meerdere losstaande berichten ontvangt die samen een coherenter beeld vormen. Juf Aimee besluit elke boodschap altijd met een open vraag aan de leraar, conform het ontwerpprincipe van Hybride AI: de AI informeert en adviseert, maar de leraar houdt het eindoordeel.</w:t>
+      </w:r>
+    </w:p>
+    <w:p/>
+    <w:p>
+      <w:pPr>
+        <w:pStyle w:val="Kop3"/>
+      </w:pPr>
+      <w:r>
+        <w:t>Human in the loop</w:t>
+      </w:r>
+    </w:p>
+    <w:p/>
+    <w:p>
+      <w:r>
+        <w:t>De leraar kan via het dashboard een notitie toevoegen per leerling. Deze notitie wordt bij volgende adviesgeneraties meegenomen als leidende context, waardoor de aanbevelingen van het systeem worden bijgestuurd door de professionele kennis van de leraar. Dit sluit direct aan op het XAI-principe van uitlegbaarheid: het systeem maakt zichtbaar welke informatie ten grondslag ligt aan een aanbeveling en stelt de leraar in staat deze te corrigeren of aan te vullen.</w:t>
+      </w:r>
+    </w:p>
+    <w:p>
+      <w:pPr>
+        <w:rPr>
+          <w:b/>
+          <w:bCs/>
+          <w:color w:val="2E75B6"/>
+          <w:sz w:val="26"/>
+          <w:szCs w:val="26"/>
+        </w:rPr>
+      </w:pPr>
+      <w:r>
+        <w:br w:type="page"/>
+      </w:r>
+    </w:p>
+    <w:p>
+      <w:pPr>
+        <w:pStyle w:val="Kop2"/>
       </w:pPr>
     </w:p>
     <w:p>
@@ -2989,56 +3120,26 @@
           <w:lang w:val="en-GB"/>
         </w:rPr>
       </w:pPr>
-      <w:bookmarkStart w:id="24" w:name="_Toc225245701"/>
       <w:r>
         <w:rPr>
           <w:lang w:val="en-GB"/>
         </w:rPr>
-        <w:t xml:space="preserve">7. </w:t>
-      </w:r>
-      <w:proofErr w:type="spellStart"/>
-      <w:r>
+        <w:t>7. Acceptatiecriteria en Definition of Done</w:t>
+      </w:r>
+      <w:bookmarkEnd w:id="24"/>
+    </w:p>
+    <w:p>
+      <w:pPr>
+        <w:pStyle w:val="Kop2"/>
         <w:rPr>
           <w:lang w:val="en-GB"/>
         </w:rPr>
-        <w:t>Acceptatiecriteria</w:t>
-      </w:r>
-      <w:proofErr w:type="spellEnd"/>
+      </w:pPr>
+      <w:bookmarkStart w:id="25" w:name="_Toc225245702"/>
       <w:r>
         <w:rPr>
           <w:lang w:val="en-GB"/>
         </w:rPr>
-        <w:t xml:space="preserve"> </w:t>
-      </w:r>
-      <w:proofErr w:type="spellStart"/>
-      <w:r>
-        <w:rPr>
-          <w:lang w:val="en-GB"/>
-        </w:rPr>
-        <w:t>en</w:t>
-      </w:r>
-      <w:proofErr w:type="spellEnd"/>
-      <w:r>
-        <w:rPr>
-          <w:lang w:val="en-GB"/>
-        </w:rPr>
-        <w:t xml:space="preserve"> Definition of Done</w:t>
-      </w:r>
-      <w:bookmarkEnd w:id="24"/>
-    </w:p>
-    <w:p>
-      <w:pPr>
-        <w:pStyle w:val="Kop2"/>
-        <w:rPr>
-          <w:lang w:val="en-GB"/>
-        </w:rPr>
-      </w:pPr>
-      <w:bookmarkStart w:id="25" w:name="_Toc225245702"/>
-      <w:r>
-        <w:rPr>
-          <w:lang w:val="en-GB"/>
-        </w:rPr>
-        <w:lastRenderedPageBreak/>
         <w:t>Acceptatiecriteria</w:t>
       </w:r>
       <w:bookmarkEnd w:id="25"/>
@@ -3277,6 +3378,7 @@
         <w:jc w:val="both"/>
       </w:pPr>
       <w:r>
+        <w:lastRenderedPageBreak/>
         <w:t>Op basis van analyse van de huidige Juf Aimee-implementatie zijn twee concrete aanbevelingen geformuleerd. Deze zijn gebaseerd op bevindingen uit de ontwikkelfasen van het proof of concept en richten zich op de meest urgente verbeterpunten voor een verantwoorde en effectieve inzet van het systeem.</w:t>
       </w:r>
     </w:p>
@@ -3285,7 +3387,6 @@
         <w:pStyle w:val="Kop2"/>
       </w:pPr>
       <w:r>
-        <w:lastRenderedPageBreak/>
         <w:t>9.1 Beveiliging tegen prompt injection in de AI-pipeline</w:t>
       </w:r>
     </w:p>
@@ -3541,7 +3642,11 @@
         <w:jc w:val="both"/>
       </w:pPr>
       <w:r>
-        <w:t>De huidige RAS-pipeline (Retrieval and Structured Augmented Generation) gebruikt het Individueel Ontwikkelingsperspectief (OPP) als primaire context voor het genereren van opdrachten. Dit is een statisch startpunt: het OPP beschrijft wie de leerling was bij aanvang, maar verwerkt niet wat de leerling sindsdien heeft gedaan, geleerd of gereflecteerd. In de praktijk betekent dit dat gegenereerde opdrachten en aanbevelingen nauwelijks rekening houden met recente prestaties, patronen in fouten of de ontwikkeling die de leerling heeft doorgemaakt.</w:t>
+        <w:t xml:space="preserve">De huidige RAS-pipeline (Retrieval and Structured Augmented Generation) gebruikt het Individueel Ontwikkelingsperspectief (OPP) als primaire context voor het genereren van opdrachten. Dit is een statisch startpunt: het OPP beschrijft wie de leerling was bij aanvang, maar verwerkt niet wat de leerling sindsdien heeft </w:t>
+      </w:r>
+      <w:r>
+        <w:lastRenderedPageBreak/>
+        <w:t>gedaan, geleerd of gereflecteerd. In de praktijk betekent dit dat gegenereerde opdrachten en aanbevelingen nauwelijks rekening houden met recente prestaties, patronen in fouten of de ontwikkeling die de leerling heeft doorgemaakt.</w:t>
       </w:r>
     </w:p>
     <w:p>
@@ -3562,7 +3667,6 @@
         <w:rPr>
           <w:b/>
         </w:rPr>
-        <w:lastRenderedPageBreak/>
         <w:t>Aanbeveling</w:t>
       </w:r>
       <w:r>
@@ -3688,15 +3792,7 @@
         <w:jc w:val="both"/>
       </w:pPr>
       <w:r>
-        <w:t xml:space="preserve">In de productiefase wordt gewerkt met echte persoonsgegevens van kinderen. De AVG art. 5(1)(c) schrijft dataminimalisatie voor. Concreet advies voor een volgende fase: OPP-embeddings worden opgeslagen onder een pseudoniem leerling-ID in plaats van de naam van de leerling, namen worden uitsluitend getoond aan de direct verantwoordelijke leraar, en er geldt een bewaartermijn gekoppeld aan de schoolloopbaan. Externe AI-providers ontvangen nooit ruwe leerlingdata, in lijn met het geadviseerde lokale </w:t>
-      </w:r>
-      <w:proofErr w:type="spellStart"/>
-      <w:r>
-        <w:t>deployment</w:t>
-      </w:r>
-      <w:proofErr w:type="spellEnd"/>
-      <w:r>
-        <w:t>-model.</w:t>
+        <w:t>In de productiefase wordt gewerkt met echte persoonsgegevens van kinderen. De AVG art. 5(1)(c) schrijft dataminimalisatie voor. Concreet advies voor een volgende fase: OPP-embeddings worden opgeslagen onder een pseudoniem leerling-ID in plaats van de naam van de leerling, namen worden uitsluitend getoond aan de direct verantwoordelijke leraar, en er geldt een bewaartermijn gekoppeld aan de schoolloopbaan. Externe AI-providers ontvangen nooit ruwe leerlingdata, in lijn met het geadviseerde lokale deployment-model.</w:t>
       </w:r>
     </w:p>
     <w:p>
@@ -3728,7 +3824,6 @@
         <w:pStyle w:val="Kop2"/>
       </w:pPr>
       <w:r>
-        <w:lastRenderedPageBreak/>
         <w:t>10.3 Ouderportaal met inzagerecht</w:t>
       </w:r>
     </w:p>
@@ -4037,57 +4132,13 @@
         </w:rPr>
       </w:pPr>
       <w:r>
-        <w:t xml:space="preserve">Europees Parlement &amp; Raad van de Europese Unie. (2024). Verordening (EU) 2024/1689 betreffende artificiële intelligentie (EU AI Act), Art. 14 — Human </w:t>
-      </w:r>
-      <w:proofErr w:type="spellStart"/>
-      <w:r>
-        <w:t>Oversight</w:t>
-      </w:r>
-      <w:proofErr w:type="spellEnd"/>
-      <w:r>
-        <w:t xml:space="preserve">. </w:t>
-      </w:r>
-      <w:proofErr w:type="spellStart"/>
+        <w:t xml:space="preserve">Europees Parlement &amp; Raad van de Europese Unie. (2024). Verordening (EU) 2024/1689 betreffende artificiële intelligentie (EU AI Act), Art. 14 — Human Oversight. </w:t>
+      </w:r>
       <w:r>
         <w:rPr>
           <w:lang w:val="en-GB"/>
         </w:rPr>
-        <w:t>Publicatieblad</w:t>
-      </w:r>
-      <w:proofErr w:type="spellEnd"/>
-      <w:r>
-        <w:rPr>
-          <w:lang w:val="en-GB"/>
-        </w:rPr>
-        <w:t xml:space="preserve"> van de </w:t>
-      </w:r>
-      <w:proofErr w:type="spellStart"/>
-      <w:r>
-        <w:rPr>
-          <w:lang w:val="en-GB"/>
-        </w:rPr>
-        <w:t>Europese</w:t>
-      </w:r>
-      <w:proofErr w:type="spellEnd"/>
-      <w:r>
-        <w:rPr>
-          <w:lang w:val="en-GB"/>
-        </w:rPr>
-        <w:t xml:space="preserve"> </w:t>
-      </w:r>
-      <w:proofErr w:type="spellStart"/>
-      <w:r>
-        <w:rPr>
-          <w:lang w:val="en-GB"/>
-        </w:rPr>
-        <w:t>Unie</w:t>
-      </w:r>
-      <w:proofErr w:type="spellEnd"/>
-      <w:r>
-        <w:rPr>
-          <w:lang w:val="en-GB"/>
-        </w:rPr>
-        <w:t>.</w:t>
+        <w:t>Publicatieblad van de Europese Unie.</w:t>
       </w:r>
     </w:p>
     <w:p>
@@ -4191,25 +4242,7 @@
           <w:iCs/>
           <w:lang w:val="en-GB"/>
         </w:rPr>
-        <w:t>Academic motivation of intellectually gifted students and their classmates in regular primary school classes: A multidimensional, longitudinal, person- and variable-</w:t>
-      </w:r>
-      <w:proofErr w:type="spellStart"/>
-      <w:r>
-        <w:rPr>
-          <w:i/>
-          <w:iCs/>
-          <w:lang w:val="en-GB"/>
-        </w:rPr>
-        <w:t>centered</w:t>
-      </w:r>
-      <w:proofErr w:type="spellEnd"/>
-      <w:r>
-        <w:rPr>
-          <w:i/>
-          <w:iCs/>
-          <w:lang w:val="en-GB"/>
-        </w:rPr>
-        <w:t xml:space="preserve"> approach</w:t>
+        <w:t>Academic motivation of intellectually gifted students and their classmates in regular primary school classes: A multidimensional, longitudinal, person- and variable-centered approach</w:t>
       </w:r>
       <w:r>
         <w:rPr>
@@ -5087,7 +5120,6 @@
   <w:style w:type="character" w:default="1" w:styleId="Standaardalinea-lettertype">
     <w:name w:val="Default Paragraph Font"/>
     <w:uiPriority w:val="1"/>
-    <w:semiHidden/>
     <w:unhideWhenUsed/>
   </w:style>
   <w:style w:type="table" w:default="1" w:styleId="Standaardtabel">

</xml_diff>

<commit_message>
Update JufAimee_Onderzoeksverslag.docx with latest changes
</commit_message>
<xml_diff>
--- a/docs/Analyseren/JufAimee_Onderzoeksverslag.docx
+++ b/docs/Analyseren/JufAimee_Onderzoeksverslag.docx
@@ -4,191 +4,289 @@
   <w:body>
     <w:p>
       <w:pPr>
-        <w:spacing w:before="80" w:after="80"/>
-      </w:pPr>
-    </w:p>
-    <w:p>
-      <w:pPr>
-        <w:spacing w:before="80" w:after="80"/>
-      </w:pPr>
-    </w:p>
-    <w:p>
-      <w:pPr>
-        <w:spacing w:before="1200" w:after="200"/>
+        <w:pBdr>
+          <w:bottom w:val="single" w:sz="24" w:space="0" w:color="1B4F8A"/>
+        </w:pBdr>
+      </w:pPr>
+    </w:p>
+    <w:p>
+      <w:pPr>
+        <w:spacing w:before="480" w:after="120"/>
         <w:jc w:val="center"/>
       </w:pPr>
       <w:r>
         <w:rPr>
           <w:b/>
           <w:bCs/>
-          <w:color w:val="1F3864"/>
-          <w:sz w:val="52"/>
-          <w:szCs w:val="52"/>
+          <w:color w:val="1B3A6B"/>
+          <w:sz w:val="56"/>
+          <w:szCs w:val="56"/>
         </w:rPr>
         <w:t>ONDERZOEKSVERSLAG</w:t>
       </w:r>
     </w:p>
     <w:p>
       <w:pPr>
-        <w:spacing w:after="600"/>
+        <w:pBdr>
+          <w:bottom w:val="single" w:sz="12" w:space="4" w:color="2E75B6"/>
+        </w:pBdr>
         <w:jc w:val="center"/>
       </w:pPr>
-      <w:r>
-        <w:rPr>
+    </w:p>
+    <w:p>
+      <w:pPr>
+        <w:spacing w:before="240" w:after="120"/>
+        <w:jc w:val="center"/>
+        <w:rPr>
+          <w:b/>
+          <w:bCs/>
           <w:color w:val="2E75B6"/>
           <w:sz w:val="36"/>
           <w:szCs w:val="36"/>
         </w:rPr>
-        <w:t xml:space="preserve">Juf Aimee: AI-collega voor </w:t>
-      </w:r>
-      <w:r>
-        <w:rPr>
+      </w:pPr>
+      <w:r>
+        <w:rPr>
+          <w:b/>
+          <w:bCs/>
           <w:color w:val="2E75B6"/>
           <w:sz w:val="36"/>
           <w:szCs w:val="36"/>
         </w:rPr>
-        <w:t xml:space="preserve">hoogbegaafden </w:t>
-      </w:r>
-      <w:r>
-        <w:rPr>
+        <w:t>Juf Aimee: AI-collega voor hoogbegaafde leerlingen</w:t>
+      </w:r>
+    </w:p>
+    <w:p>
+      <w:pPr>
+        <w:spacing w:before="240" w:after="120"/>
+        <w:rPr>
+          <w:b/>
+          <w:bCs/>
           <w:color w:val="2E75B6"/>
           <w:sz w:val="36"/>
           <w:szCs w:val="36"/>
         </w:rPr>
-        <w:t>onderwijs</w:t>
-      </w:r>
-    </w:p>
-    <w:p>
-      <w:pPr>
-        <w:spacing w:after="800"/>
+      </w:pPr>
+    </w:p>
+    <w:p>
+      <w:pPr>
+        <w:spacing w:before="80" w:after="600"/>
         <w:jc w:val="center"/>
+        <w:rPr>
+          <w:sz w:val="28"/>
+          <w:szCs w:val="28"/>
+        </w:rPr>
       </w:pPr>
       <w:r>
         <w:rPr>
           <w:color w:val="555555"/>
-          <w:sz w:val="26"/>
-          <w:szCs w:val="26"/>
-        </w:rPr>
-        <w:t xml:space="preserve">Een </w:t>
+        </w:rPr>
+        <w:t>Een wetenschappelijk onderzoek naar een verantwoord AI-gedreven</w:t>
       </w:r>
       <w:r>
         <w:rPr>
           <w:color w:val="555555"/>
-          <w:sz w:val="26"/>
-          <w:szCs w:val="26"/>
-        </w:rPr>
-        <w:t xml:space="preserve">wetenschappelijk </w:t>
-      </w:r>
+        </w:rPr>
+        <w:br/>
+        <w:t xml:space="preserve"> hoogbegaafd onderwijssysteem ter ondersteuning voor de leraar</w:t>
+      </w:r>
+    </w:p>
+    <w:p>
+      <w:pPr>
+        <w:spacing w:after="600"/>
+        <w:jc w:val="center"/>
+      </w:pPr>
+      <w:r>
+        <w:rPr>
+          <w:noProof/>
+        </w:rPr>
+        <w:drawing>
+          <wp:inline distT="0" distB="0" distL="0" distR="0" wp14:anchorId="257158F1" wp14:editId="086DCBF4">
+            <wp:extent cx="3009207" cy="3009207"/>
+            <wp:effectExtent l="0" t="0" r="1270" b="1270"/>
+            <wp:docPr id="192645198" name="Afbeelding 2" descr="Afbeelding met tekenfilm, tekening, clipart, Tekenfilm&#10;&#10;Door AI gegenereerde inhoud is mogelijk onjuist."/>
+            <wp:cNvGraphicFramePr>
+              <a:graphicFrameLocks xmlns:a="http://schemas.openxmlformats.org/drawingml/2006/main" noChangeAspect="1"/>
+            </wp:cNvGraphicFramePr>
+            <a:graphic xmlns:a="http://schemas.openxmlformats.org/drawingml/2006/main">
+              <a:graphicData uri="http://schemas.openxmlformats.org/drawingml/2006/picture">
+                <pic:pic xmlns:pic="http://schemas.openxmlformats.org/drawingml/2006/picture">
+                  <pic:nvPicPr>
+                    <pic:cNvPr id="192645198" name="Afbeelding 2" descr="Afbeelding met tekenfilm, tekening, clipart, Tekenfilm&#10;&#10;Door AI gegenereerde inhoud is mogelijk onjuist."/>
+                    <pic:cNvPicPr/>
+                  </pic:nvPicPr>
+                  <pic:blipFill>
+                    <a:blip r:embed="rId8" cstate="print">
+                      <a:extLst>
+                        <a:ext uri="{28A0092B-C50C-407E-A947-70E740481C1C}">
+                          <a14:useLocalDpi xmlns:a14="http://schemas.microsoft.com/office/drawing/2010/main" val="0"/>
+                        </a:ext>
+                      </a:extLst>
+                    </a:blip>
+                    <a:stretch>
+                      <a:fillRect/>
+                    </a:stretch>
+                  </pic:blipFill>
+                  <pic:spPr>
+                    <a:xfrm>
+                      <a:off x="0" y="0"/>
+                      <a:ext cx="3019098" cy="3019098"/>
+                    </a:xfrm>
+                    <a:prstGeom prst="rect">
+                      <a:avLst/>
+                    </a:prstGeom>
+                  </pic:spPr>
+                </pic:pic>
+              </a:graphicData>
+            </a:graphic>
+          </wp:inline>
+        </w:drawing>
+      </w:r>
+    </w:p>
+    <w:p>
+      <w:pPr>
+        <w:pBdr>
+          <w:bottom w:val="single" w:sz="12" w:space="4" w:color="2E75B6"/>
+        </w:pBdr>
+        <w:spacing w:after="240"/>
+        <w:jc w:val="center"/>
+      </w:pPr>
+    </w:p>
+    <w:p>
+      <w:pPr>
+        <w:spacing w:after="80"/>
+        <w:jc w:val="center"/>
+      </w:pPr>
+      <w:r>
+        <w:rPr>
+          <w:b/>
+          <w:bCs/>
+          <w:color w:val="1B3A6B"/>
+        </w:rPr>
+        <w:t xml:space="preserve">Stephanie Kramer &amp; Michel </w:t>
+      </w:r>
+      <w:proofErr w:type="spellStart"/>
+      <w:r>
+        <w:rPr>
+          <w:b/>
+          <w:bCs/>
+          <w:color w:val="1B3A6B"/>
+        </w:rPr>
+        <w:t>Oey</w:t>
+      </w:r>
+      <w:proofErr w:type="spellEnd"/>
+    </w:p>
+    <w:p>
+      <w:pPr>
+        <w:spacing w:after="80"/>
+        <w:jc w:val="center"/>
+      </w:pPr>
       <w:r>
         <w:rPr>
           <w:color w:val="555555"/>
-          <w:sz w:val="26"/>
-          <w:szCs w:val="26"/>
-        </w:rPr>
-        <w:t xml:space="preserve">onderzoek naar </w:t>
-      </w:r>
-      <w:r>
-        <w:rPr>
-          <w:color w:val="555555"/>
-          <w:sz w:val="26"/>
-          <w:szCs w:val="26"/>
-        </w:rPr>
-        <w:t xml:space="preserve">een </w:t>
-      </w:r>
-      <w:r>
-        <w:rPr>
-          <w:color w:val="555555"/>
-          <w:sz w:val="26"/>
-          <w:szCs w:val="26"/>
-        </w:rPr>
-        <w:t xml:space="preserve">verantwoord </w:t>
-      </w:r>
-      <w:r>
-        <w:rPr>
-          <w:color w:val="555555"/>
-          <w:sz w:val="26"/>
-          <w:szCs w:val="26"/>
-        </w:rPr>
-        <w:t>AI-gedreven hoogbegaafden onderwijssysteem ter ondersteuning voor de leraar</w:t>
-      </w:r>
-    </w:p>
-    <w:p>
-      <w:pPr>
-        <w:spacing w:after="100"/>
+          <w:sz w:val="20"/>
+          <w:szCs w:val="20"/>
+        </w:rPr>
+        <w:t>Lectoraat Digital Life · Hogeschool van Amsterdam</w:t>
+      </w:r>
+    </w:p>
+    <w:p>
+      <w:pPr>
+        <w:spacing w:after="80"/>
         <w:jc w:val="center"/>
-      </w:pPr>
-      <w:r>
-        <w:rPr>
-          <w:color w:val="333333"/>
-        </w:rPr>
-        <w:t>Stephanie Kramer &amp; Michel Oey</w:t>
-      </w:r>
-    </w:p>
-    <w:p>
-      <w:pPr>
-        <w:spacing w:after="100"/>
+        <w:rPr>
+          <w:color w:val="2E75B6"/>
+        </w:rPr>
+      </w:pPr>
+      <w:proofErr w:type="gramStart"/>
+      <w:r>
+        <w:rPr>
+          <w:color w:val="2E75B6"/>
+          <w:sz w:val="20"/>
+          <w:szCs w:val="20"/>
+        </w:rPr>
+        <w:t>s.kramer2@hva.nl</w:t>
+      </w:r>
+      <w:proofErr w:type="gramEnd"/>
+      <w:r>
+        <w:rPr>
+          <w:color w:val="2E75B6"/>
+          <w:sz w:val="20"/>
+          <w:szCs w:val="20"/>
+        </w:rPr>
+        <w:t xml:space="preserve"> </w:t>
+      </w:r>
+    </w:p>
+    <w:p>
+      <w:pPr>
+        <w:spacing w:after="80"/>
         <w:jc w:val="center"/>
       </w:pPr>
       <w:r>
         <w:rPr>
-          <w:color w:val="555555"/>
-        </w:rPr>
-        <w:t xml:space="preserve">Lectoraat Digital Life </w:t>
-      </w:r>
-      <w:r>
-        <w:rPr>
-          <w:color w:val="555555"/>
-        </w:rPr>
-        <w:t>-</w:t>
-      </w:r>
-      <w:r>
-        <w:rPr>
-          <w:color w:val="555555"/>
-        </w:rPr>
-        <w:t xml:space="preserve"> Hogeschool van Amsterdam</w:t>
-      </w:r>
-    </w:p>
-    <w:p>
-      <w:pPr>
-        <w:spacing w:after="100"/>
+          <w:color w:val="2E75B6"/>
+          <w:sz w:val="20"/>
+          <w:szCs w:val="20"/>
+        </w:rPr>
+        <w:t xml:space="preserve"> </w:t>
+      </w:r>
+      <w:proofErr w:type="gramStart"/>
+      <w:r>
+        <w:rPr>
+          <w:color w:val="2E75B6"/>
+          <w:sz w:val="20"/>
+          <w:szCs w:val="20"/>
+        </w:rPr>
+        <w:t>m.a.oey@hva.nl</w:t>
+      </w:r>
+      <w:proofErr w:type="gramEnd"/>
+    </w:p>
+    <w:p>
+      <w:pPr>
+        <w:spacing w:before="80"/>
         <w:jc w:val="center"/>
-      </w:pPr>
-      <w:r>
-        <w:rPr>
-          <w:color w:val="2E75B6"/>
-          <w:sz w:val="22"/>
-          <w:szCs w:val="22"/>
-        </w:rPr>
-        <w:t xml:space="preserve">s.kramer2@hva.nl </w:t>
-      </w:r>
-      <w:r>
-        <w:rPr>
-          <w:color w:val="555555"/>
-        </w:rPr>
-        <w:t xml:space="preserve">- </w:t>
-      </w:r>
-      <w:r>
-        <w:rPr>
-          <w:color w:val="2E75B6"/>
-          <w:sz w:val="22"/>
-          <w:szCs w:val="22"/>
-        </w:rPr>
-        <w:t>m.a.oey@hva.nl</w:t>
-      </w:r>
-    </w:p>
-    <w:p>
-      <w:pPr>
-        <w:spacing w:after="2000"/>
-        <w:jc w:val="center"/>
-      </w:pPr>
-      <w:r>
-        <w:rPr>
-          <w:color w:val="888888"/>
-          <w:sz w:val="22"/>
-          <w:szCs w:val="22"/>
-        </w:rPr>
-        <w:t>Mei 2026</w:t>
-      </w:r>
+        <w:rPr>
+          <w:color w:val="7F8C8D"/>
+        </w:rPr>
+      </w:pPr>
+      <w:proofErr w:type="gramStart"/>
+      <w:r>
+        <w:rPr>
+          <w:color w:val="7F8C8D"/>
+          <w:sz w:val="20"/>
+          <w:szCs w:val="20"/>
+        </w:rPr>
+        <w:t>mei</w:t>
+      </w:r>
+      <w:proofErr w:type="gramEnd"/>
+      <w:r>
+        <w:rPr>
+          <w:color w:val="7F8C8D"/>
+          <w:sz w:val="20"/>
+          <w:szCs w:val="20"/>
+        </w:rPr>
+        <w:t xml:space="preserve"> 2026</w:t>
+      </w:r>
+    </w:p>
+    <w:p>
+      <w:pPr>
+        <w:spacing w:before="80" w:after="80"/>
+      </w:pPr>
+    </w:p>
+    <w:p>
+      <w:pPr>
+        <w:spacing w:before="80" w:after="80"/>
+      </w:pPr>
+    </w:p>
+    <w:p>
+      <w:pPr>
+        <w:spacing w:before="80" w:after="80"/>
+      </w:pPr>
+    </w:p>
+    <w:p>
+      <w:pPr>
+        <w:spacing w:before="80" w:after="80"/>
+      </w:pPr>
     </w:p>
     <w:p>
       <w:pPr>
@@ -197,59 +295,148 @@
           <w:bottom w:val="single" w:sz="4" w:space="4" w:color="2E75B6"/>
         </w:pBdr>
       </w:pPr>
-      <w:bookmarkStart w:id="0" w:name="_Toc230782935"/>
-      <w:r>
+      <w:bookmarkStart w:id="0" w:name="_Toc225245677"/>
+      <w:r>
+        <w:lastRenderedPageBreak/>
         <w:t>Samenvatting</w:t>
       </w:r>
       <w:bookmarkEnd w:id="0"/>
     </w:p>
     <w:p>
       <w:pPr>
-        <w:spacing w:before="80" w:after="80"/>
-        <w:jc w:val="both"/>
-      </w:pPr>
-      <w:r>
-        <w:t>Dit onderzoeksverslag beschrijft de achtergrond, opzet en onderzoeksvragen van het project Juf Aimee</w:t>
-      </w:r>
-      <w:r>
-        <w:t>. Een</w:t>
-      </w:r>
-      <w:r>
-        <w:t xml:space="preserve"> AI-onderwijsassistent die leraren in het primair onderwijs ondersteunt bij het bieden van passend en uitdagend onderwijs aan hoogbegaafde leerlingen. Het verslag dient als onderbouwing en documentatie voor verdere ontwikkeling van het project, inclusief de indiening van een SIA RAAK Publiek onderzoeksvoorstel in juni 2026.</w:t>
-      </w:r>
-    </w:p>
-    <w:p>
-      <w:pPr>
-        <w:spacing w:before="80" w:after="80"/>
-        <w:jc w:val="both"/>
-      </w:pPr>
-      <w:r>
-        <w:t xml:space="preserve">Het project wordt uitgevoerd vanuit </w:t>
-      </w:r>
-      <w:r>
-        <w:t>de</w:t>
-      </w:r>
-      <w:r>
-        <w:t xml:space="preserve"> </w:t>
-      </w:r>
-      <w:r>
-        <w:t>onderzoeksgroep</w:t>
-      </w:r>
-      <w:r>
-        <w:t xml:space="preserve"> Digital Life van de Hogeschool van Amsterdam, met als kernvraag hoe een verantwoord, uitlegbaar en mensge</w:t>
-      </w:r>
-      <w:r>
-        <w:t>richt</w:t>
-      </w:r>
-      <w:r>
-        <w:t xml:space="preserve"> AI-systeem kan worden ontworpen dat de professionele </w:t>
-      </w:r>
-      <w:r>
-        <w:t>betrokkenheid</w:t>
-      </w:r>
-      <w:r>
-        <w:t xml:space="preserve"> van de leraar versterkt in plaats van vervangt.</w:t>
-      </w:r>
+        <w:pStyle w:val="Geenafstand"/>
+      </w:pPr>
+      <w:r>
+        <w:t>Dit onderzoeksverslag beschrijft de achtergrond, opzet en onderzoeksvragen van het project Juf Aimee. Een AI-onderwijsassistent die leraren in het primair onderwijs ondersteunt bij het bieden van passend en uitdagend onderwijs aan hoogbegaafde leerlingen. Het verslag dient als onderbouwing en documentatie voor verdere ontwikkeling van het project, inclusief de indiening van een SIA RAAK Publiek onderzoeksvoorstel in juni 2026.</w:t>
+      </w:r>
+    </w:p>
+    <w:p>
+      <w:pPr>
+        <w:pStyle w:val="Geenafstand"/>
+      </w:pPr>
+    </w:p>
+    <w:p>
+      <w:pPr>
+        <w:pStyle w:val="Geenafstand"/>
+      </w:pPr>
+      <w:r>
+        <w:t>Het project wordt uitgevoerd vanuit de onderzoeksgroep Digital Life van de Hogeschool van Amsterdam, met als kernvraag hoe een verantwoord, uitlegbaar en mensgericht AI-systeem kan worden ontworpen dat de professionele betrokkenheid van de leraar versterkt in plaats van vervangt.</w:t>
+      </w:r>
+    </w:p>
+    <w:p>
+      <w:pPr>
+        <w:spacing w:before="80" w:after="80"/>
+      </w:pPr>
+    </w:p>
+    <w:p>
+      <w:pPr>
+        <w:spacing w:before="80" w:after="80"/>
+      </w:pPr>
+    </w:p>
+    <w:p>
+      <w:pPr>
+        <w:spacing w:before="80" w:after="80"/>
+      </w:pPr>
+    </w:p>
+    <w:p>
+      <w:pPr>
+        <w:spacing w:before="80" w:after="80"/>
+      </w:pPr>
+    </w:p>
+    <w:p>
+      <w:pPr>
+        <w:spacing w:before="80" w:after="80"/>
+      </w:pPr>
+    </w:p>
+    <w:p>
+      <w:pPr>
+        <w:spacing w:before="80" w:after="80"/>
+      </w:pPr>
+    </w:p>
+    <w:p>
+      <w:pPr>
+        <w:spacing w:before="80" w:after="80"/>
+      </w:pPr>
+    </w:p>
+    <w:p>
+      <w:pPr>
+        <w:spacing w:before="80" w:after="80"/>
+      </w:pPr>
+    </w:p>
+    <w:p>
+      <w:pPr>
+        <w:spacing w:before="80" w:after="80"/>
+      </w:pPr>
+    </w:p>
+    <w:p>
+      <w:pPr>
+        <w:spacing w:before="80" w:after="80"/>
+      </w:pPr>
+    </w:p>
+    <w:p>
+      <w:pPr>
+        <w:spacing w:before="80" w:after="80"/>
+      </w:pPr>
+    </w:p>
+    <w:p>
+      <w:pPr>
+        <w:spacing w:before="80" w:after="80"/>
+      </w:pPr>
+    </w:p>
+    <w:p>
+      <w:pPr>
+        <w:spacing w:before="80" w:after="80"/>
+      </w:pPr>
+    </w:p>
+    <w:p>
+      <w:pPr>
+        <w:spacing w:before="80" w:after="80"/>
+      </w:pPr>
+    </w:p>
+    <w:p>
+      <w:pPr>
+        <w:spacing w:before="80" w:after="80"/>
+      </w:pPr>
+    </w:p>
+    <w:p>
+      <w:pPr>
+        <w:spacing w:before="80" w:after="80"/>
+      </w:pPr>
+    </w:p>
+    <w:p>
+      <w:pPr>
+        <w:spacing w:before="80" w:after="80"/>
+      </w:pPr>
+    </w:p>
+    <w:p>
+      <w:pPr>
+        <w:spacing w:before="80" w:after="80"/>
+      </w:pPr>
+    </w:p>
+    <w:p>
+      <w:pPr>
+        <w:spacing w:before="80" w:after="80"/>
+      </w:pPr>
+    </w:p>
+    <w:p>
+      <w:pPr>
+        <w:spacing w:before="80" w:after="80"/>
+      </w:pPr>
+    </w:p>
+    <w:p>
+      <w:pPr>
+        <w:spacing w:before="80" w:after="80"/>
+      </w:pPr>
+    </w:p>
+    <w:p>
+      <w:pPr>
+        <w:spacing w:before="80" w:after="80"/>
+      </w:pPr>
+    </w:p>
+    <w:p>
+      <w:pPr>
+        <w:spacing w:before="80" w:after="80"/>
+      </w:pPr>
     </w:p>
     <w:p>
       <w:pPr>
@@ -342,7 +529,21 @@
                 <w:rStyle w:val="Hyperlink"/>
                 <w:noProof/>
               </w:rPr>
-              <w:t>Samenvatting</w:t>
+              <w:t>Samen</w:t>
+            </w:r>
+            <w:r>
+              <w:rPr>
+                <w:rStyle w:val="Hyperlink"/>
+                <w:noProof/>
+              </w:rPr>
+              <w:t>v</w:t>
+            </w:r>
+            <w:r>
+              <w:rPr>
+                <w:rStyle w:val="Hyperlink"/>
+                <w:noProof/>
+              </w:rPr>
+              <w:t>atting</w:t>
             </w:r>
             <w:r>
               <w:rPr>
@@ -1194,7 +1395,21 @@
                 <w:rStyle w:val="Hyperlink"/>
                 <w:noProof/>
               </w:rPr>
-              <w:t>Deelvraag 2 — Gebruikersbehoeften en rolverdeling</w:t>
+              <w:t>Deelvraag 2 — Gebruikersbehoe</w:t>
+            </w:r>
+            <w:r>
+              <w:rPr>
+                <w:rStyle w:val="Hyperlink"/>
+                <w:noProof/>
+              </w:rPr>
+              <w:t>f</w:t>
+            </w:r>
+            <w:r>
+              <w:rPr>
+                <w:rStyle w:val="Hyperlink"/>
+                <w:noProof/>
+              </w:rPr>
+              <w:t>ten en rolverdeling</w:t>
             </w:r>
             <w:r>
               <w:rPr>
@@ -1833,7 +2048,21 @@
                 <w:rStyle w:val="Hyperlink"/>
                 <w:noProof/>
               </w:rPr>
-              <w:t>6. Aanpak en methoden</w:t>
+              <w:t>6. Aanpak en method</w:t>
+            </w:r>
+            <w:r>
+              <w:rPr>
+                <w:rStyle w:val="Hyperlink"/>
+                <w:noProof/>
+              </w:rPr>
+              <w:t>e</w:t>
+            </w:r>
+            <w:r>
+              <w:rPr>
+                <w:rStyle w:val="Hyperlink"/>
+                <w:noProof/>
+              </w:rPr>
+              <w:t>n</w:t>
             </w:r>
             <w:r>
               <w:rPr>
@@ -2687,7 +2916,21 @@
                 <w:rStyle w:val="Hyperlink"/>
                 <w:noProof/>
               </w:rPr>
-              <w:t>9. Aanbevelingen</w:t>
+              <w:t xml:space="preserve">9. </w:t>
+            </w:r>
+            <w:r>
+              <w:rPr>
+                <w:rStyle w:val="Hyperlink"/>
+                <w:noProof/>
+              </w:rPr>
+              <w:t>A</w:t>
+            </w:r>
+            <w:r>
+              <w:rPr>
+                <w:rStyle w:val="Hyperlink"/>
+                <w:noProof/>
+              </w:rPr>
+              <w:t>anbevelingen</w:t>
             </w:r>
             <w:r>
               <w:rPr>
@@ -3357,6 +3600,111 @@
     </w:p>
     <w:p>
       <w:pPr>
+        <w:spacing w:before="80" w:after="80"/>
+      </w:pPr>
+    </w:p>
+    <w:p>
+      <w:pPr>
+        <w:spacing w:before="80" w:after="80"/>
+      </w:pPr>
+    </w:p>
+    <w:p>
+      <w:pPr>
+        <w:spacing w:before="80" w:after="80"/>
+      </w:pPr>
+    </w:p>
+    <w:p>
+      <w:pPr>
+        <w:spacing w:before="80" w:after="80"/>
+      </w:pPr>
+    </w:p>
+    <w:p>
+      <w:pPr>
+        <w:spacing w:before="80" w:after="80"/>
+      </w:pPr>
+    </w:p>
+    <w:p>
+      <w:pPr>
+        <w:spacing w:before="80" w:after="80"/>
+      </w:pPr>
+    </w:p>
+    <w:p>
+      <w:pPr>
+        <w:spacing w:before="80" w:after="80"/>
+      </w:pPr>
+    </w:p>
+    <w:p>
+      <w:pPr>
+        <w:spacing w:before="80" w:after="80"/>
+      </w:pPr>
+    </w:p>
+    <w:p>
+      <w:pPr>
+        <w:spacing w:before="80" w:after="80"/>
+      </w:pPr>
+    </w:p>
+    <w:p>
+      <w:pPr>
+        <w:spacing w:before="80" w:after="80"/>
+      </w:pPr>
+    </w:p>
+    <w:p>
+      <w:pPr>
+        <w:spacing w:before="80" w:after="80"/>
+      </w:pPr>
+    </w:p>
+    <w:p>
+      <w:pPr>
+        <w:spacing w:before="80" w:after="80"/>
+      </w:pPr>
+    </w:p>
+    <w:p>
+      <w:pPr>
+        <w:spacing w:before="80" w:after="80"/>
+      </w:pPr>
+    </w:p>
+    <w:p>
+      <w:pPr>
+        <w:spacing w:before="80" w:after="80"/>
+      </w:pPr>
+    </w:p>
+    <w:p>
+      <w:pPr>
+        <w:spacing w:before="80" w:after="80"/>
+      </w:pPr>
+    </w:p>
+    <w:p>
+      <w:pPr>
+        <w:spacing w:before="80" w:after="80"/>
+      </w:pPr>
+    </w:p>
+    <w:p>
+      <w:pPr>
+        <w:spacing w:before="80" w:after="80"/>
+      </w:pPr>
+    </w:p>
+    <w:p>
+      <w:pPr>
+        <w:spacing w:before="80" w:after="80"/>
+      </w:pPr>
+    </w:p>
+    <w:p>
+      <w:pPr>
+        <w:spacing w:before="80" w:after="80"/>
+      </w:pPr>
+    </w:p>
+    <w:p>
+      <w:pPr>
+        <w:spacing w:before="80" w:after="80"/>
+      </w:pPr>
+    </w:p>
+    <w:p>
+      <w:pPr>
+        <w:spacing w:before="80" w:after="80"/>
+      </w:pPr>
+    </w:p>
+    <w:p>
+      <w:pPr>
         <w:pStyle w:val="Kop1"/>
         <w:pBdr>
           <w:bottom w:val="single" w:sz="4" w:space="4" w:color="2E75B6"/>
@@ -3364,6 +3712,7 @@
       </w:pPr>
       <w:bookmarkStart w:id="2" w:name="_Toc230782937"/>
       <w:r>
+        <w:lastRenderedPageBreak/>
         <w:t>1. Inleiding</w:t>
       </w:r>
       <w:bookmarkEnd w:id="2"/>
@@ -3408,130 +3757,6 @@
         </w:pBdr>
       </w:pPr>
       <w:bookmarkStart w:id="3" w:name="_Toc230782938"/>
-      <w:r>
-        <w:t>2. Achtergrond en context</w:t>
-      </w:r>
-      <w:bookmarkEnd w:id="3"/>
-    </w:p>
-    <w:p>
-      <w:pPr>
-        <w:pStyle w:val="Kop2"/>
-      </w:pPr>
-      <w:bookmarkStart w:id="4" w:name="_Toc230782939"/>
-      <w:r>
-        <w:t>2.1 Digital Life — Hogeschool van Amsterdam</w:t>
-      </w:r>
-      <w:bookmarkEnd w:id="4"/>
-    </w:p>
-    <w:p>
-      <w:pPr>
-        <w:spacing w:before="80" w:after="80"/>
-        <w:jc w:val="both"/>
-      </w:pPr>
-      <w:r>
-        <w:t xml:space="preserve">Het lectoraat Digital Life maakt deel uit van de Hogeschool van Amsterdam en richt zich op het ontwerpen, ontwikkelen en onderzoeken van mensgerichte digitale technologie voor maatschappelijke vraagstukken. Centraal staat de vraag hoe digitale technologie zoals kunstmatige intelligentie, data-gedreven systemen en </w:t>
-      </w:r>
-      <w:r>
-        <w:lastRenderedPageBreak/>
-        <w:t>interactieve toepassingen</w:t>
-      </w:r>
-      <w:r>
-        <w:t xml:space="preserve"> </w:t>
-      </w:r>
-      <w:r>
-        <w:t>op een verantwoorde manier kan bijdragen aan het dagelijks leven van mensen.</w:t>
-      </w:r>
-    </w:p>
-    <w:p>
-      <w:pPr>
-        <w:spacing w:before="80" w:after="80"/>
-        <w:jc w:val="both"/>
-      </w:pPr>
-      <w:r>
-        <w:t>Digital Life werkt vanuit een human-centered en participatieve benadering, waarbij eindgebruikers actief worden betrokken in alle fasen van onderzoek en ontwerp. Co-creatie, design-based research en interdisciplinair samenwerken vormen hierbij belangrijke uitgangspunten. Het lectoraat combineert inzichten uit technologie, sociale wetenschappen en ontwerp om oplossingen te ontwikkelen die niet alleen technisch werken, maar ook aansluiten bij menselijke waarden, behoeften en contexten.</w:t>
-      </w:r>
-    </w:p>
-    <w:p>
-      <w:pPr>
-        <w:spacing w:before="80" w:after="80"/>
-        <w:jc w:val="both"/>
-      </w:pPr>
-    </w:p>
-    <w:p>
-      <w:pPr>
-        <w:spacing w:before="80" w:after="80"/>
-        <w:jc w:val="both"/>
-      </w:pPr>
-    </w:p>
-    <w:p>
-      <w:pPr>
-        <w:spacing w:before="80" w:after="80"/>
-        <w:jc w:val="both"/>
-      </w:pPr>
-    </w:p>
-    <w:p>
-      <w:pPr>
-        <w:spacing w:before="80" w:after="80"/>
-        <w:jc w:val="both"/>
-      </w:pPr>
-    </w:p>
-    <w:p>
-      <w:pPr>
-        <w:spacing w:before="80" w:after="80"/>
-        <w:jc w:val="both"/>
-      </w:pPr>
-    </w:p>
-    <w:p>
-      <w:pPr>
-        <w:pStyle w:val="Kop2"/>
-      </w:pPr>
-      <w:bookmarkStart w:id="5" w:name="_Toc230782940"/>
-      <w:r>
-        <w:t>2.2 Hoogbegaafdheid in het primair onderwijs</w:t>
-      </w:r>
-      <w:bookmarkEnd w:id="5"/>
-    </w:p>
-    <w:p>
-      <w:pPr>
-        <w:spacing w:before="80" w:after="80"/>
-        <w:jc w:val="both"/>
-      </w:pPr>
-      <w:r>
-        <w:t>In Nederland zijn er naar schatting 70.000 thuiszitters, waarvan 25 tot 40 procent hoogbegaafd is. Hoogbegaafde leerlingen hebben specifieke leerbehoeften die vragen om opdrachten die hogere-orde denkvaardigheden aanspreken, zoals analyseren, evalueren en creëren (Taxonomie van Bloom). In de praktijk krijgen deze leerlingen echter vaak ‘meer van hetzelfde’: extra werkbladen of sneller door de leerstof, zonder echte verdieping of verbreding.</w:t>
-      </w:r>
-    </w:p>
-    <w:p>
-      <w:pPr>
-        <w:spacing w:before="80" w:after="80"/>
-        <w:jc w:val="both"/>
-      </w:pPr>
-      <w:r>
-        <w:t>Lerarentekorten en hoge werkdruk maken het voor leraren structureel moeilijk om voldoende te differentiëren. Het gevolg is dat hoogbegaafde leerlingen zich ondergeprikeld voelen, afhaken of erger: thuis komen te zitten. Dit is een maatschappelijk probleem dat vraagt om schaalbare, duurzame oplossingen.</w:t>
-      </w:r>
-    </w:p>
-    <w:p>
-      <w:pPr>
-        <w:pStyle w:val="Kop2"/>
-      </w:pPr>
-      <w:bookmarkStart w:id="6" w:name="_Toc230782941"/>
-      <w:r>
-        <w:t>2.3 Hybride AI als uitgangspunt</w:t>
-      </w:r>
-      <w:bookmarkEnd w:id="6"/>
-    </w:p>
-    <w:p>
-      <w:pPr>
-        <w:spacing w:before="80" w:after="80"/>
-        <w:jc w:val="both"/>
-      </w:pPr>
-      <w:r>
-        <w:t>Het project Juf Aimee positioneert AI nadrukkelijk als mens-versterking (human augmentation) en niet als vervanging. Dit sluit aan op het framework van Hybride AI, zoals beschreven door Akata et al. (2020), waarbij mens en AI samenwerken op basis van complementaire sterktes. De leraar behoudt altijd de professionele regie; Juf Aimee functioneert als een uitlegbare, transparante AI-collega die onderbouwde suggesties doet en de leraar informeert over de redenering achter elke aanbeveling.</w:t>
-      </w:r>
-    </w:p>
-    <w:p>
-      <w:pPr>
-        <w:spacing w:before="80" w:after="80"/>
-      </w:pPr>
     </w:p>
     <w:p>
       <w:pPr>
@@ -3540,8 +3765,281 @@
           <w:bottom w:val="single" w:sz="4" w:space="4" w:color="2E75B6"/>
         </w:pBdr>
       </w:pPr>
+    </w:p>
+    <w:p>
+      <w:pPr>
+        <w:pStyle w:val="Kop1"/>
+        <w:pBdr>
+          <w:bottom w:val="single" w:sz="4" w:space="4" w:color="2E75B6"/>
+        </w:pBdr>
+      </w:pPr>
+    </w:p>
+    <w:p>
+      <w:pPr>
+        <w:pStyle w:val="Kop1"/>
+        <w:pBdr>
+          <w:bottom w:val="single" w:sz="4" w:space="4" w:color="2E75B6"/>
+        </w:pBdr>
+      </w:pPr>
+    </w:p>
+    <w:p>
+      <w:pPr>
+        <w:pStyle w:val="Kop1"/>
+        <w:pBdr>
+          <w:bottom w:val="single" w:sz="4" w:space="4" w:color="2E75B6"/>
+        </w:pBdr>
+      </w:pPr>
+    </w:p>
+    <w:p>
+      <w:pPr>
+        <w:pStyle w:val="Kop1"/>
+        <w:pBdr>
+          <w:bottom w:val="single" w:sz="4" w:space="4" w:color="2E75B6"/>
+        </w:pBdr>
+      </w:pPr>
+    </w:p>
+    <w:p>
+      <w:pPr>
+        <w:pStyle w:val="Kop1"/>
+        <w:pBdr>
+          <w:bottom w:val="single" w:sz="4" w:space="4" w:color="2E75B6"/>
+        </w:pBdr>
+      </w:pPr>
+    </w:p>
+    <w:p>
+      <w:pPr>
+        <w:pStyle w:val="Kop1"/>
+        <w:pBdr>
+          <w:bottom w:val="single" w:sz="4" w:space="4" w:color="2E75B6"/>
+        </w:pBdr>
+      </w:pPr>
+    </w:p>
+    <w:p>
+      <w:pPr>
+        <w:pStyle w:val="Kop1"/>
+        <w:pBdr>
+          <w:bottom w:val="single" w:sz="4" w:space="4" w:color="2E75B6"/>
+        </w:pBdr>
+      </w:pPr>
+    </w:p>
+    <w:p>
+      <w:pPr>
+        <w:pStyle w:val="Kop1"/>
+        <w:pBdr>
+          <w:bottom w:val="single" w:sz="4" w:space="4" w:color="2E75B6"/>
+        </w:pBdr>
+      </w:pPr>
+    </w:p>
+    <w:p>
+      <w:pPr>
+        <w:pStyle w:val="Kop1"/>
+        <w:pBdr>
+          <w:bottom w:val="single" w:sz="4" w:space="4" w:color="2E75B6"/>
+        </w:pBdr>
+      </w:pPr>
+    </w:p>
+    <w:p>
+      <w:pPr>
+        <w:pStyle w:val="Kop1"/>
+        <w:pBdr>
+          <w:bottom w:val="single" w:sz="4" w:space="4" w:color="2E75B6"/>
+        </w:pBdr>
+      </w:pPr>
+      <w:r>
+        <w:lastRenderedPageBreak/>
+        <w:t>2. Achtergrond en context</w:t>
+      </w:r>
+      <w:bookmarkEnd w:id="3"/>
+    </w:p>
+    <w:p>
+      <w:pPr>
+        <w:pStyle w:val="Kop2"/>
+      </w:pPr>
+      <w:bookmarkStart w:id="4" w:name="_Toc225245681"/>
+      <w:r>
+        <w:t>2.1 Digital Life · Hogeschool van Amsterdam</w:t>
+      </w:r>
+      <w:bookmarkEnd w:id="4"/>
+    </w:p>
+    <w:p>
+      <w:pPr>
+        <w:pStyle w:val="Geenafstand"/>
+      </w:pPr>
+      <w:r>
+        <w:t>Het lectoraat Digital Life maakt deel uit van de Hogeschool van Amsterdam en richt zich op het ontwerpen, ontwikkelen en onderzoeken van mensgerichte digitale technologie voor maatschappelijke vraagstukken. Centraal staat de vraag hoe digitale technologie zoals kunstmatige intelligentie, data-gedreven systemen en interactieve toepassingen op een verantwoorde manier kan bijdragen aan het dagelijks leven van mensen.</w:t>
+      </w:r>
+    </w:p>
+    <w:p>
+      <w:pPr>
+        <w:pStyle w:val="Geenafstand"/>
+      </w:pPr>
+    </w:p>
+    <w:p>
+      <w:pPr>
+        <w:pStyle w:val="Geenafstand"/>
+      </w:pPr>
+      <w:r>
+        <w:t xml:space="preserve">Digital Life werkt vanuit een </w:t>
+      </w:r>
+      <w:r>
+        <w:t xml:space="preserve">mensgericht </w:t>
+      </w:r>
+      <w:r>
+        <w:t xml:space="preserve">en participatieve benadering, waarbij eindgebruikers actief worden betrokken in alle fasen van onderzoek en ontwerp. Co-creatie, </w:t>
+      </w:r>
+      <w:r>
+        <w:rPr>
+          <w:i/>
+          <w:iCs/>
+        </w:rPr>
+        <w:t>design-</w:t>
+      </w:r>
+      <w:proofErr w:type="spellStart"/>
+      <w:r>
+        <w:rPr>
+          <w:i/>
+          <w:iCs/>
+        </w:rPr>
+        <w:t>based</w:t>
+      </w:r>
+      <w:proofErr w:type="spellEnd"/>
+      <w:r>
+        <w:rPr>
+          <w:i/>
+          <w:iCs/>
+        </w:rPr>
+        <w:t xml:space="preserve"> research</w:t>
+      </w:r>
+      <w:r>
+        <w:t xml:space="preserve"> en interdisciplinair samenwerken vormen hierbij belangrijke uitgangspunten. De onderzoeksgroep combineert inzichten uit technologie, sociale wetenschappen en ontwerp om oplossingen te ontwikkelen die niet alleen technisch werken, maar ook aansluiten bij menselijke waarden, behoeften en contexten.</w:t>
+      </w:r>
+    </w:p>
+    <w:p>
+      <w:pPr>
+        <w:pStyle w:val="Kop2"/>
+      </w:pPr>
+      <w:bookmarkStart w:id="5" w:name="_Toc225245682"/>
+      <w:r>
+        <w:t>2.2 Hoogbegaafdheid in het primair onderwijs</w:t>
+      </w:r>
+      <w:bookmarkEnd w:id="5"/>
+    </w:p>
+    <w:p>
+      <w:pPr>
+        <w:pStyle w:val="Geenafstand"/>
+      </w:pPr>
+      <w:r>
+        <w:t>In Nederland zijn er naar schatting 70.000 thuiszitters, waarvan 25 tot 40 procent hoogbegaafd is (</w:t>
+      </w:r>
+      <w:r>
+        <w:t>Oudervereniging Balans, 2024</w:t>
+      </w:r>
+      <w:r>
+        <w:t xml:space="preserve">). Hoogbegaafde leerlingen hebben specifieke leerbehoeften die vragen om opdrachten die hogere-orde denkvaardigheden aanspreken, zoals analyseren, evalueren en creëren </w:t>
+      </w:r>
+      <w:hyperlink r:id="rId9" w:history="1">
+        <w:r>
+          <w:rPr>
+            <w:rStyle w:val="Hyperlink"/>
+          </w:rPr>
+          <w:t>(Anderson &amp; Krathwohl, 2001).</w:t>
+        </w:r>
+      </w:hyperlink>
+      <w:r>
+        <w:t xml:space="preserve"> In de praktijk krijgen deze leerlingen echter vaak ‘meer van hetzelfde’: extra werkbladen of sneller door de leerstof, zonder echte verdieping of verbreding.</w:t>
+      </w:r>
+    </w:p>
+    <w:p>
+      <w:pPr>
+        <w:pStyle w:val="Geenafstand"/>
+      </w:pPr>
+    </w:p>
+    <w:p>
+      <w:pPr>
+        <w:pStyle w:val="Geenafstand"/>
+      </w:pPr>
+      <w:r>
+        <w:t>Lerarentekorten en hoge werkdruk maken het voor leraren structureel moeilijk om voldoende te differentiëren. Het gevolg is dat hoogbegaafde leerlingen zich ondergeprikkeld voelen, afhaken of erger: thuis komen te zitten. Dit is een maatschappelijk probleem dat vraagt om schaalbare, duurzame oplossingen.</w:t>
+      </w:r>
+    </w:p>
+    <w:p>
+      <w:pPr>
+        <w:pStyle w:val="Kop2"/>
+      </w:pPr>
+      <w:bookmarkStart w:id="6" w:name="_Toc225245683"/>
+      <w:r>
+        <w:t>2.3 Hybride AI als uitgangspunt</w:t>
+      </w:r>
+      <w:bookmarkEnd w:id="6"/>
+    </w:p>
+    <w:p>
+      <w:pPr>
+        <w:pStyle w:val="Geenafstand"/>
+      </w:pPr>
+      <w:r>
+        <w:t>Het project Juf Aimee positioneert AI nadrukkelijk als mens-versterking (</w:t>
+      </w:r>
+      <w:r>
+        <w:rPr>
+          <w:i/>
+          <w:iCs/>
+        </w:rPr>
+        <w:t xml:space="preserve">human augmentation) </w:t>
+      </w:r>
+      <w:r>
+        <w:t xml:space="preserve">en niet als vervanging. Dit sluit aan op het framework van Hybride AI, zoals beschreven door </w:t>
+      </w:r>
+      <w:hyperlink r:id="rId10" w:history="1">
+        <w:proofErr w:type="spellStart"/>
+        <w:r>
+          <w:rPr>
+            <w:rStyle w:val="Hyperlink"/>
+          </w:rPr>
+          <w:t>Akata</w:t>
+        </w:r>
+        <w:proofErr w:type="spellEnd"/>
+        <w:r>
+          <w:rPr>
+            <w:rStyle w:val="Hyperlink"/>
+          </w:rPr>
+          <w:t xml:space="preserve"> et al. (2020),</w:t>
+        </w:r>
+      </w:hyperlink>
+      <w:r>
+        <w:t xml:space="preserve"> waarbij mens en AI samenwerken op basis van complementaire sterktes. De leraar behoudt altijd de professionele regie; Juf Aimee functioneert als een uitlegbare, transparante AI-collega die onderbouwde suggesties doet en de leraar informeert over de redenering achter elke aanbeveling.</w:t>
+      </w:r>
+    </w:p>
+    <w:p>
+      <w:pPr>
+        <w:spacing w:before="80" w:after="80"/>
+      </w:pPr>
+    </w:p>
+    <w:p>
+      <w:pPr>
+        <w:pStyle w:val="Kop1"/>
+        <w:pBdr>
+          <w:bottom w:val="single" w:sz="4" w:space="4" w:color="2E75B6"/>
+        </w:pBdr>
+      </w:pPr>
       <w:bookmarkStart w:id="7" w:name="_Toc230782942"/>
-      <w:r>
+    </w:p>
+    <w:p>
+      <w:pPr>
+        <w:pStyle w:val="Kop1"/>
+        <w:pBdr>
+          <w:bottom w:val="single" w:sz="4" w:space="4" w:color="2E75B6"/>
+        </w:pBdr>
+      </w:pPr>
+    </w:p>
+    <w:p>
+      <w:pPr>
+        <w:pStyle w:val="Kop1"/>
+        <w:pBdr>
+          <w:bottom w:val="single" w:sz="4" w:space="4" w:color="2E75B6"/>
+        </w:pBdr>
+      </w:pPr>
+      <w:r>
+        <w:lastRenderedPageBreak/>
         <w:t>3. Probleemstelling</w:t>
       </w:r>
       <w:bookmarkEnd w:id="7"/>
@@ -3584,7 +4082,6 @@
         <w:jc w:val="both"/>
       </w:pPr>
       <w:r>
-        <w:lastRenderedPageBreak/>
         <w:t>Deze probleemstelling heeft drie centrale spanningsvelden die in het onderzoek worden verkend:</w:t>
       </w:r>
     </w:p>
@@ -3652,139 +4149,6 @@
         </w:pBdr>
       </w:pPr>
       <w:bookmarkStart w:id="8" w:name="_Toc230782943"/>
-      <w:r>
-        <w:t>4. Onderzoeksvragen</w:t>
-      </w:r>
-      <w:bookmarkEnd w:id="8"/>
-    </w:p>
-    <w:p>
-      <w:pPr>
-        <w:pStyle w:val="Kop2"/>
-      </w:pPr>
-      <w:bookmarkStart w:id="9" w:name="_Toc230782944"/>
-      <w:r>
-        <w:t>4.1 Hoofdvraag</w:t>
-      </w:r>
-      <w:bookmarkEnd w:id="9"/>
-    </w:p>
-    <w:p>
-      <w:pPr>
-        <w:spacing w:before="80" w:after="80"/>
-        <w:jc w:val="both"/>
-      </w:pPr>
-      <w:r>
-        <w:t>Op welke manier kan een AI-onderwijsassistent (Juf Aimee) op verantwoorde, uitlegbare en mensgerichte wijze worden ontworpen om leraren in het primair onderwijs te ondersteunen bij het personaliseren van onderwijs voor hoogbegaafde leerlingen?</w:t>
-      </w:r>
-    </w:p>
-    <w:p>
-      <w:pPr>
-        <w:pStyle w:val="Kop2"/>
-      </w:pPr>
-      <w:bookmarkStart w:id="10" w:name="_Toc230782945"/>
-      <w:r>
-        <w:t>4.2 Deelvragen</w:t>
-      </w:r>
-      <w:bookmarkEnd w:id="10"/>
-    </w:p>
-    <w:p>
-      <w:pPr>
-        <w:pStyle w:val="Kop3"/>
-      </w:pPr>
-      <w:bookmarkStart w:id="11" w:name="_Toc230782946"/>
-      <w:r>
-        <w:t>Deelvraag 1 — Pedagogische en inhoudelijke context</w:t>
-      </w:r>
-      <w:bookmarkEnd w:id="11"/>
-    </w:p>
-    <w:p>
-      <w:pPr>
-        <w:spacing w:before="80" w:after="80"/>
-        <w:jc w:val="both"/>
-      </w:pPr>
-      <w:r>
-        <w:t>Welke kenmerken en leerbehoeften van hoogbegaafde leerlingen zijn relevant voor het ontwerp van gepersonaliseerde, hogere-orde leeractiviteiten, en hoe sluiten deze aan op bestaande pedagogische kaders zoals de Taxonomie van Bloom?</w:t>
-      </w:r>
-    </w:p>
-    <w:p>
-      <w:pPr>
-        <w:pStyle w:val="Kop3"/>
-      </w:pPr>
-      <w:bookmarkStart w:id="12" w:name="_Toc230782947"/>
-      <w:r>
-        <w:t>Deelvraag 2 — Gebruikersbehoeften en rolverdeling</w:t>
-      </w:r>
-      <w:bookmarkEnd w:id="12"/>
-    </w:p>
-    <w:p>
-      <w:pPr>
-        <w:spacing w:before="80" w:after="80"/>
-        <w:jc w:val="both"/>
-      </w:pPr>
-      <w:r>
-        <w:t>Welke ondersteuningsbehoeften hebben leraren in het primair onderwijs bij het differentiëren voor hoogbegaafde leerlingen, en welke rol zien zij weggelegd voor een AI-onderwijsassistent in hun dagelijkse praktijk?</w:t>
-      </w:r>
-    </w:p>
-    <w:p>
-      <w:pPr>
-        <w:pStyle w:val="Kop3"/>
-      </w:pPr>
-      <w:bookmarkStart w:id="13" w:name="_Toc230782948"/>
-      <w:r>
-        <w:t>Deelvraag 3 — Verantwoord AI-ontwerp</w:t>
-      </w:r>
-      <w:bookmarkEnd w:id="13"/>
-    </w:p>
-    <w:p>
-      <w:pPr>
-        <w:spacing w:before="80" w:after="80"/>
-        <w:jc w:val="both"/>
-      </w:pPr>
-      <w:r>
-        <w:t>Aan welke ethische en technische randvoorwaarden moet een AI-onderwijsassistent voldoen om als verantwoord, uitlegbaar en privacyveilig te worden beschouwd in een onderwijscontext met minderjarige gebruikers?</w:t>
-      </w:r>
-    </w:p>
-    <w:p>
-      <w:pPr>
-        <w:pStyle w:val="Kop3"/>
-      </w:pPr>
-      <w:bookmarkStart w:id="14" w:name="_Toc230782949"/>
-      <w:r>
-        <w:t>Deelvraag 4 — Technische haalbaarheid</w:t>
-      </w:r>
-      <w:bookmarkEnd w:id="14"/>
-    </w:p>
-    <w:p>
-      <w:pPr>
-        <w:spacing w:before="80" w:after="80"/>
-        <w:jc w:val="both"/>
-      </w:pPr>
-      <w:r>
-        <w:t>Welke AI-architectuur, interfaces en datatypes zijn technisch haalbaar voor een proof of concept van Juf Aimee, gegeven de randvoorwaarden van verantwoord ontwerp, AVG-compliance en pedagogische kwaliteit?</w:t>
-      </w:r>
-    </w:p>
-    <w:p>
-      <w:pPr>
-        <w:pStyle w:val="Kop3"/>
-      </w:pPr>
-      <w:bookmarkStart w:id="15" w:name="_Toc230782950"/>
-      <w:r>
-        <w:t>Deelvraag 5 — Mens-AI-samenwerking</w:t>
-      </w:r>
-      <w:bookmarkEnd w:id="15"/>
-    </w:p>
-    <w:p>
-      <w:pPr>
-        <w:spacing w:before="80" w:after="80"/>
-        <w:jc w:val="both"/>
-      </w:pPr>
-      <w:r>
-        <w:t>Hoe kan de interactie tussen leraar en AI-assistent zodanig worden vormgegeven dat de leraar altijd de professionele regie behoudt en de AI transparant en begrijpelijk communiceert over haar redenering en aanbevelingen?</w:t>
-      </w:r>
-    </w:p>
-    <w:p>
-      <w:pPr>
-        <w:spacing w:before="80" w:after="80"/>
-      </w:pPr>
     </w:p>
     <w:p>
       <w:pPr>
@@ -3793,92 +4157,6 @@
           <w:bottom w:val="single" w:sz="4" w:space="4" w:color="2E75B6"/>
         </w:pBdr>
       </w:pPr>
-      <w:bookmarkStart w:id="16" w:name="_Toc230782951"/>
-      <w:r>
-        <w:t>5. Theoretisch kader</w:t>
-      </w:r>
-      <w:bookmarkEnd w:id="16"/>
-    </w:p>
-    <w:p>
-      <w:pPr>
-        <w:pStyle w:val="Kop2"/>
-      </w:pPr>
-      <w:bookmarkStart w:id="17" w:name="_Toc230782952"/>
-      <w:r>
-        <w:t>5.1 Taxonomie van Bloom</w:t>
-      </w:r>
-      <w:bookmarkEnd w:id="17"/>
-    </w:p>
-    <w:p>
-      <w:pPr>
-        <w:spacing w:before="80" w:after="80"/>
-        <w:jc w:val="both"/>
-      </w:pPr>
-      <w:r>
-        <w:t>De Taxonomie van Bloom biedt een gelaagd model van cognitieve vaardigheden, van lagere-orde (onthouden, begrijpen, toepassen) naar hogere-orde denkvaardigheden (analyseren, evalueren, creëren). Hoogbegaafde leerlingen profiteren het meest van opdrachten die de hogere niveaus aanspreken. Juf Aimee gebruikt dit kader als basis voor het genereren en categoriseren van opdrachten.</w:t>
-      </w:r>
-    </w:p>
-    <w:p>
-      <w:pPr>
-        <w:pStyle w:val="Kop2"/>
-      </w:pPr>
-      <w:bookmarkStart w:id="18" w:name="_Toc230782953"/>
-      <w:r>
-        <w:t>5.2 Hybride AI</w:t>
-      </w:r>
-      <w:bookmarkEnd w:id="18"/>
-    </w:p>
-    <w:p>
-      <w:pPr>
-        <w:spacing w:before="80" w:after="80"/>
-        <w:jc w:val="both"/>
-      </w:pPr>
-      <w:r>
-        <w:t>Het Hybride AI-framework (Akata et al., 2020) beschrijft AI-systemen die samenwerken met mensen op basis van wederzijdse aanvulling. In de context van Juf Aimee betekent dit dat de AI taken overneemt waarvoor zij beter geschikt is (grootschalige personalisatie, voortgangsmonitoring), terwijl de leraar de taken behoudt die menselijk oordeelsvermogen vereisen (pedagogische beslissingen, relatie met de leerling).</w:t>
-      </w:r>
-    </w:p>
-    <w:p>
-      <w:pPr>
-        <w:pStyle w:val="Kop2"/>
-      </w:pPr>
-      <w:bookmarkStart w:id="19" w:name="_Toc230782954"/>
-      <w:r>
-        <w:t>5.3 Uitlegbare AI (XAI)</w:t>
-      </w:r>
-      <w:bookmarkEnd w:id="19"/>
-    </w:p>
-    <w:p>
-      <w:pPr>
-        <w:spacing w:before="80" w:after="80"/>
-        <w:jc w:val="both"/>
-      </w:pPr>
-      <w:r>
-        <w:t>Explainability is een centrale randvoorwaarde voor verantwoord AI-gebruik in het onderwijs. Leraren moeten kunnen begrijpen waarom Juf Aimee een bepaalde opdracht aanbeveelt. Dit vereist ontwerpchoices rondom transparantie: korte, begrijpelijke uitleg bij elke aanbeveling, zonder technisch jargon.</w:t>
-      </w:r>
-    </w:p>
-    <w:p>
-      <w:pPr>
-        <w:pStyle w:val="Kop2"/>
-      </w:pPr>
-      <w:bookmarkStart w:id="20" w:name="_Toc230782955"/>
-      <w:r>
-        <w:t>5.4 Privacy en AVG</w:t>
-      </w:r>
-      <w:bookmarkEnd w:id="20"/>
-    </w:p>
-    <w:p>
-      <w:pPr>
-        <w:spacing w:before="80" w:after="80"/>
-        <w:jc w:val="both"/>
-      </w:pPr>
-      <w:r>
-        <w:t>Omdat Juf Aimee werkt met gegevens van minderjarige leerlingen, is AVG-compliance een harde eis. In het proof of concept wordt gewerkt met fictieve en gesimuleerde data. In de verdere ontwikkeling zullen leerlingprofielen, interactielogs en voortgangsdata zorgvuldig worden beschermd en geminimaliseerd.</w:t>
-      </w:r>
-    </w:p>
-    <w:p>
-      <w:pPr>
-        <w:spacing w:before="80" w:after="80"/>
-      </w:pPr>
     </w:p>
     <w:p>
       <w:pPr>
@@ -3887,30 +4165,1103 @@
           <w:bottom w:val="single" w:sz="4" w:space="4" w:color="2E75B6"/>
         </w:pBdr>
       </w:pPr>
-      <w:bookmarkStart w:id="21" w:name="_Toc230782956"/>
+    </w:p>
+    <w:p>
+      <w:pPr>
+        <w:pStyle w:val="Kop1"/>
+        <w:pBdr>
+          <w:bottom w:val="single" w:sz="4" w:space="4" w:color="2E75B6"/>
+        </w:pBdr>
+      </w:pPr>
+    </w:p>
+    <w:p>
+      <w:pPr>
+        <w:pStyle w:val="Kop1"/>
+        <w:pBdr>
+          <w:bottom w:val="single" w:sz="4" w:space="4" w:color="2E75B6"/>
+        </w:pBdr>
+      </w:pPr>
+    </w:p>
+    <w:p>
+      <w:pPr>
+        <w:pStyle w:val="Kop1"/>
+        <w:pBdr>
+          <w:bottom w:val="single" w:sz="4" w:space="4" w:color="2E75B6"/>
+        </w:pBdr>
+      </w:pPr>
+    </w:p>
+    <w:p>
+      <w:pPr>
+        <w:pStyle w:val="Kop1"/>
+        <w:pBdr>
+          <w:bottom w:val="single" w:sz="4" w:space="4" w:color="2E75B6"/>
+        </w:pBdr>
+      </w:pPr>
+    </w:p>
+    <w:p>
+      <w:pPr>
+        <w:pStyle w:val="Kop1"/>
+        <w:pBdr>
+          <w:bottom w:val="single" w:sz="4" w:space="4" w:color="2E75B6"/>
+        </w:pBdr>
+      </w:pPr>
+    </w:p>
+    <w:p>
+      <w:pPr>
+        <w:pStyle w:val="Kop1"/>
+        <w:pBdr>
+          <w:bottom w:val="single" w:sz="4" w:space="4" w:color="2E75B6"/>
+        </w:pBdr>
+      </w:pPr>
+    </w:p>
+    <w:p>
+      <w:pPr>
+        <w:pStyle w:val="Kop1"/>
+        <w:pBdr>
+          <w:bottom w:val="single" w:sz="4" w:space="4" w:color="2E75B6"/>
+        </w:pBdr>
+      </w:pPr>
+    </w:p>
+    <w:p>
+      <w:pPr>
+        <w:pStyle w:val="Kop1"/>
+        <w:pBdr>
+          <w:bottom w:val="single" w:sz="4" w:space="4" w:color="2E75B6"/>
+        </w:pBdr>
+      </w:pPr>
+      <w:r>
+        <w:lastRenderedPageBreak/>
+        <w:t>4. Onderzoeksvragen</w:t>
+      </w:r>
+      <w:bookmarkEnd w:id="8"/>
+    </w:p>
+    <w:p>
+      <w:pPr>
+        <w:pStyle w:val="Kop2"/>
+      </w:pPr>
+      <w:bookmarkStart w:id="9" w:name="_Toc230782944"/>
+      <w:r>
+        <w:t>4.1 Hoofdvraag</w:t>
+      </w:r>
+      <w:bookmarkEnd w:id="9"/>
+    </w:p>
+    <w:p>
+      <w:pPr>
+        <w:spacing w:before="80" w:after="80"/>
+        <w:jc w:val="both"/>
+      </w:pPr>
+      <w:r>
+        <w:t>Op welke manier kan een AI-onderwijsassistent (Juf Aimee) op verantwoorde, uitlegbare en mensgerichte wijze worden ontworpen om leraren in het primair onderwijs te ondersteunen bij het personaliseren van onderwijs voor hoogbegaafde leerlingen?</w:t>
+      </w:r>
+    </w:p>
+    <w:p>
+      <w:pPr>
+        <w:pStyle w:val="Kop2"/>
+      </w:pPr>
+      <w:bookmarkStart w:id="10" w:name="_Toc230782945"/>
+      <w:r>
+        <w:t>4.2 Deelvragen</w:t>
+      </w:r>
+      <w:bookmarkEnd w:id="10"/>
+    </w:p>
+    <w:p>
+      <w:pPr>
+        <w:pStyle w:val="Kop3"/>
+      </w:pPr>
+      <w:bookmarkStart w:id="11" w:name="_Toc230782946"/>
+      <w:r>
+        <w:t>Deelvraag 1 — Pedagogische en inhoudelijke context</w:t>
+      </w:r>
+      <w:bookmarkEnd w:id="11"/>
+    </w:p>
+    <w:p>
+      <w:pPr>
+        <w:spacing w:before="80" w:after="80"/>
+        <w:jc w:val="both"/>
+      </w:pPr>
+      <w:r>
+        <w:t>Welke kenmerken en leerbehoeften van hoogbegaafde leerlingen zijn relevant voor het ontwerp van gepersonaliseerde, hogere-orde leeractiviteiten, en hoe sluiten deze aan op bestaande pedagogische kaders zoals de Taxonomie van Bloom?</w:t>
+      </w:r>
+    </w:p>
+    <w:p>
+      <w:pPr>
+        <w:pStyle w:val="Kop3"/>
+      </w:pPr>
+      <w:bookmarkStart w:id="12" w:name="_Toc230782947"/>
+      <w:r>
+        <w:t>Deelvraag 2 — Gebruikersbehoeften en rolverdeling</w:t>
+      </w:r>
+      <w:bookmarkEnd w:id="12"/>
+    </w:p>
+    <w:p>
+      <w:pPr>
+        <w:spacing w:before="80" w:after="80"/>
+        <w:jc w:val="both"/>
+      </w:pPr>
+      <w:r>
+        <w:t>Welke ondersteuningsbehoeften hebben leraren in het primair onderwijs bij het differentiëren voor hoogbegaafde leerlingen, en welke rol zien zij weggelegd voor een AI-onderwijsassistent in hun dagelijkse praktijk?</w:t>
+      </w:r>
+    </w:p>
+    <w:p>
+      <w:pPr>
+        <w:pStyle w:val="Kop3"/>
+      </w:pPr>
+      <w:bookmarkStart w:id="13" w:name="_Toc230782948"/>
+      <w:r>
+        <w:t>Deelvraag 3 — Verantwoord AI-ontwerp</w:t>
+      </w:r>
+      <w:bookmarkEnd w:id="13"/>
+    </w:p>
+    <w:p>
+      <w:pPr>
+        <w:spacing w:before="80" w:after="80"/>
+        <w:jc w:val="both"/>
+      </w:pPr>
+      <w:r>
+        <w:t>Aan welke ethische en technische randvoorwaarden moet een AI-onderwijsassistent voldoen om als verantwoord, uitlegbaar en privacyveilig te worden beschouwd in een onderwijscontext met minderjarige gebruikers?</w:t>
+      </w:r>
+    </w:p>
+    <w:p>
+      <w:pPr>
+        <w:pStyle w:val="Kop3"/>
+      </w:pPr>
+      <w:bookmarkStart w:id="14" w:name="_Toc230782949"/>
+      <w:r>
+        <w:t>Deelvraag 4 — Technische haalbaarheid</w:t>
+      </w:r>
+      <w:bookmarkEnd w:id="14"/>
+    </w:p>
+    <w:p>
+      <w:pPr>
+        <w:spacing w:before="80" w:after="80"/>
+        <w:jc w:val="both"/>
+      </w:pPr>
+      <w:r>
+        <w:t>Welke AI-architectuur, interfaces en datatypes zijn technisch haalbaar voor een proof of concept van Juf Aimee, gegeven de randvoorwaarden van verantwoord ontwerp, AVG-compliance en pedagogische kwaliteit?</w:t>
+      </w:r>
+    </w:p>
+    <w:p>
+      <w:pPr>
+        <w:pStyle w:val="Kop3"/>
+      </w:pPr>
+      <w:bookmarkStart w:id="15" w:name="_Toc230782950"/>
+      <w:r>
+        <w:t>Deelvraag 5 — Mens-AI-samenwerking</w:t>
+      </w:r>
+      <w:bookmarkEnd w:id="15"/>
+    </w:p>
+    <w:p>
+      <w:pPr>
+        <w:spacing w:before="80" w:after="80"/>
+        <w:jc w:val="both"/>
+      </w:pPr>
+      <w:r>
+        <w:t>Hoe kan de interactie tussen leraar en AI-assistent zodanig worden vormgegeven dat de leraar altijd de professionele regie behoudt en de AI transparant en begrijpelijk communiceert over haar redenering en aanbevelingen?</w:t>
+      </w:r>
+    </w:p>
+    <w:p>
+      <w:pPr>
+        <w:spacing w:before="80" w:after="80"/>
+      </w:pPr>
+    </w:p>
+    <w:p>
+      <w:pPr>
+        <w:pStyle w:val="Kop1"/>
+        <w:pBdr>
+          <w:bottom w:val="single" w:sz="4" w:space="4" w:color="2E75B6"/>
+        </w:pBdr>
+      </w:pPr>
+      <w:bookmarkStart w:id="16" w:name="_Toc230782951"/>
+    </w:p>
+    <w:p>
+      <w:pPr>
+        <w:pStyle w:val="Kop1"/>
+        <w:pBdr>
+          <w:bottom w:val="single" w:sz="4" w:space="4" w:color="2E75B6"/>
+        </w:pBdr>
+      </w:pPr>
+    </w:p>
+    <w:p>
+      <w:pPr>
+        <w:pStyle w:val="Kop1"/>
+        <w:pBdr>
+          <w:bottom w:val="single" w:sz="4" w:space="4" w:color="2E75B6"/>
+        </w:pBdr>
+      </w:pPr>
+    </w:p>
+    <w:p>
+      <w:pPr>
+        <w:pStyle w:val="Kop1"/>
+        <w:pBdr>
+          <w:bottom w:val="single" w:sz="4" w:space="4" w:color="2E75B6"/>
+        </w:pBdr>
+      </w:pPr>
+    </w:p>
+    <w:p>
+      <w:pPr>
+        <w:pStyle w:val="Kop1"/>
+        <w:pBdr>
+          <w:bottom w:val="single" w:sz="4" w:space="4" w:color="2E75B6"/>
+        </w:pBdr>
+      </w:pPr>
+      <w:r>
+        <w:lastRenderedPageBreak/>
+        <w:t>5. Theoretisch kader</w:t>
+      </w:r>
+      <w:bookmarkEnd w:id="16"/>
+    </w:p>
+    <w:p>
+      <w:pPr>
+        <w:pStyle w:val="Kop2"/>
+      </w:pPr>
+      <w:bookmarkStart w:id="17" w:name="_Toc225245694"/>
+      <w:bookmarkStart w:id="18" w:name="_Toc230782956"/>
+      <w:r>
+        <w:rPr>
+          <w:b w:val="0"/>
+          <w:bCs w:val="0"/>
+          <w:color w:val="auto"/>
+          <w:sz w:val="24"/>
+          <w:szCs w:val="24"/>
+        </w:rPr>
+        <w:t>Juf Aimee is gebouwd op vier theoretische pijlers die samen een verantwoord en effectief AI-systeem voor het onderwijs vormen. De Taxonomie van Bloom biedt het didactisch kader voor het genereren van opdrachten die aansluiten op het cognitieve niveau van hoogbegaafde leerlingen. Het Hybride AI-framework garandeert dat de AI de leraar ondersteunt zonder diens professionele rol over te nemen. Uitlegbare AI zorgt ervoor dat leraren de aanbevelingen van het systeem kunnen begrijpen en beoordelen. Tot slot stelt AVG-compliance harde eisen aan de omgang met leerlingdata, waarbij dataminimalisatie en lokale deployment de privacy van minderjarige leerlingen waarborgen.</w:t>
+      </w:r>
+      <w:r>
+        <w:rPr>
+          <w:b w:val="0"/>
+          <w:bCs w:val="0"/>
+          <w:color w:val="auto"/>
+          <w:sz w:val="24"/>
+          <w:szCs w:val="24"/>
+        </w:rPr>
+        <w:br/>
+      </w:r>
+      <w:r>
+        <w:br/>
+        <w:t>5.1 Taxonomie van Bloom</w:t>
+      </w:r>
+      <w:bookmarkEnd w:id="17"/>
+    </w:p>
+    <w:p>
+      <w:pPr>
+        <w:pStyle w:val="Kop2"/>
+        <w:rPr>
+          <w:b w:val="0"/>
+          <w:bCs w:val="0"/>
+          <w:color w:val="auto"/>
+          <w:sz w:val="24"/>
+          <w:szCs w:val="24"/>
+        </w:rPr>
+      </w:pPr>
+      <w:bookmarkStart w:id="19" w:name="_Toc225245695"/>
+      <w:r>
+        <w:rPr>
+          <w:b w:val="0"/>
+          <w:bCs w:val="0"/>
+          <w:color w:val="auto"/>
+          <w:sz w:val="24"/>
+          <w:szCs w:val="24"/>
+        </w:rPr>
+        <w:t>De Taxonomie van Bloom biedt een gelaagd model van cognitieve vaardigheden. Het model loopt van lagere-orde vaardigheden onthouden, begrijpen en toepassen naar hogere-orde denkvaardigheden zoals analyseren, evalueren en creëren. Hoogbegaafde leerlingen profiteren het meest van opdrachten die de hogere niveaus aanspreken. Juf Aimee gebruikt dit kader als basis voor het genereren en categoriseren van opdrachten.</w:t>
+      </w:r>
+    </w:p>
+    <w:p>
+      <w:pPr>
+        <w:pStyle w:val="Kop2"/>
+      </w:pPr>
+      <w:r>
+        <w:t>5.2 Hybride AI</w:t>
+      </w:r>
+      <w:bookmarkEnd w:id="19"/>
+    </w:p>
+    <w:p>
+      <w:pPr>
+        <w:pStyle w:val="Kop2"/>
+        <w:rPr>
+          <w:b w:val="0"/>
+          <w:bCs w:val="0"/>
+          <w:color w:val="auto"/>
+          <w:sz w:val="24"/>
+          <w:szCs w:val="24"/>
+        </w:rPr>
+      </w:pPr>
+      <w:bookmarkStart w:id="20" w:name="_Toc225245696"/>
+      <w:r>
+        <w:rPr>
+          <w:b w:val="0"/>
+          <w:bCs w:val="0"/>
+          <w:color w:val="auto"/>
+          <w:sz w:val="24"/>
+          <w:szCs w:val="24"/>
+        </w:rPr>
+        <w:t xml:space="preserve">Juf Aimee is ontworpen als een hybride AI-systeem waarin </w:t>
+      </w:r>
+      <w:r>
+        <w:rPr>
+          <w:b w:val="0"/>
+          <w:bCs w:val="0"/>
+          <w:color w:val="auto"/>
+          <w:sz w:val="24"/>
+          <w:szCs w:val="24"/>
+        </w:rPr>
+        <w:t>de gebruiker</w:t>
+      </w:r>
+      <w:r>
+        <w:rPr>
+          <w:b w:val="0"/>
+          <w:bCs w:val="0"/>
+          <w:color w:val="auto"/>
+          <w:sz w:val="24"/>
+          <w:szCs w:val="24"/>
+        </w:rPr>
+        <w:t xml:space="preserve"> en </w:t>
+      </w:r>
+      <w:r>
+        <w:rPr>
+          <w:b w:val="0"/>
+          <w:bCs w:val="0"/>
+          <w:color w:val="auto"/>
+          <w:sz w:val="24"/>
+          <w:szCs w:val="24"/>
+        </w:rPr>
+        <w:t>artificiële intelligentie</w:t>
+      </w:r>
+      <w:r>
+        <w:rPr>
+          <w:b w:val="0"/>
+          <w:bCs w:val="0"/>
+          <w:color w:val="auto"/>
+          <w:sz w:val="24"/>
+          <w:szCs w:val="24"/>
+        </w:rPr>
+        <w:t xml:space="preserve"> elkaar aanvullen, niet vervangen. Het Hybride AI-</w:t>
+      </w:r>
+      <w:proofErr w:type="spellStart"/>
+      <w:r>
+        <w:rPr>
+          <w:b w:val="0"/>
+          <w:bCs w:val="0"/>
+          <w:color w:val="auto"/>
+          <w:sz w:val="24"/>
+          <w:szCs w:val="24"/>
+        </w:rPr>
+        <w:t>framework</w:t>
+      </w:r>
+      <w:proofErr w:type="spellEnd"/>
+      <w:r>
+        <w:rPr>
+          <w:b w:val="0"/>
+          <w:bCs w:val="0"/>
+          <w:color w:val="auto"/>
+          <w:sz w:val="24"/>
+          <w:szCs w:val="24"/>
+        </w:rPr>
+        <w:t xml:space="preserve"> (</w:t>
+      </w:r>
+      <w:proofErr w:type="spellStart"/>
+      <w:r>
+        <w:rPr>
+          <w:b w:val="0"/>
+          <w:bCs w:val="0"/>
+          <w:color w:val="auto"/>
+          <w:sz w:val="24"/>
+          <w:szCs w:val="24"/>
+        </w:rPr>
+        <w:t>Akata</w:t>
+      </w:r>
+      <w:proofErr w:type="spellEnd"/>
+      <w:r>
+        <w:rPr>
+          <w:b w:val="0"/>
+          <w:bCs w:val="0"/>
+          <w:color w:val="auto"/>
+          <w:sz w:val="24"/>
+          <w:szCs w:val="24"/>
+        </w:rPr>
+        <w:t xml:space="preserve"> et al., 2020) beschrijft hoe AI-systemen en mensen samenwerken op basis van wederzijdse aanvulling. Concreet betekent dit dat de AI de taken overneemt waarvoor zij beter geschikt is</w:t>
+      </w:r>
+      <w:r>
+        <w:rPr>
+          <w:b w:val="0"/>
+          <w:bCs w:val="0"/>
+          <w:color w:val="auto"/>
+          <w:sz w:val="24"/>
+          <w:szCs w:val="24"/>
+        </w:rPr>
+        <w:t>,</w:t>
+      </w:r>
+      <w:r>
+        <w:rPr>
+          <w:b w:val="0"/>
+          <w:bCs w:val="0"/>
+          <w:color w:val="auto"/>
+          <w:sz w:val="24"/>
+          <w:szCs w:val="24"/>
+        </w:rPr>
+        <w:t xml:space="preserve"> grootschalige personalisatie en voortgangsmonitoring</w:t>
+      </w:r>
+      <w:r>
+        <w:rPr>
+          <w:b w:val="0"/>
+          <w:bCs w:val="0"/>
+          <w:color w:val="auto"/>
+          <w:sz w:val="24"/>
+          <w:szCs w:val="24"/>
+        </w:rPr>
+        <w:t xml:space="preserve"> </w:t>
+      </w:r>
+      <w:r>
+        <w:rPr>
+          <w:b w:val="0"/>
+          <w:bCs w:val="0"/>
+          <w:color w:val="auto"/>
+          <w:sz w:val="24"/>
+          <w:szCs w:val="24"/>
+        </w:rPr>
+        <w:t>terwijl de leraar de taken behoudt die menselijk oordeelsvermogen vereisen: pedagogische beslissingen en de relatie met de leerling.</w:t>
+      </w:r>
+    </w:p>
+    <w:p>
+      <w:pPr>
+        <w:pStyle w:val="Kop2"/>
+      </w:pPr>
+      <w:r>
+        <w:t>5.3 Uitlegbare AI (XAI)</w:t>
+      </w:r>
+      <w:bookmarkEnd w:id="20"/>
+    </w:p>
+    <w:p>
+      <w:pPr>
+        <w:pStyle w:val="Kop2"/>
+        <w:rPr>
+          <w:b w:val="0"/>
+          <w:bCs w:val="0"/>
+          <w:color w:val="auto"/>
+          <w:sz w:val="24"/>
+          <w:szCs w:val="24"/>
+        </w:rPr>
+      </w:pPr>
+      <w:bookmarkStart w:id="21" w:name="_Toc225245697"/>
+      <w:r>
+        <w:rPr>
+          <w:b w:val="0"/>
+          <w:bCs w:val="0"/>
+          <w:color w:val="auto"/>
+          <w:sz w:val="24"/>
+          <w:szCs w:val="24"/>
+        </w:rPr>
+        <w:t xml:space="preserve">Leraren kunnen Juf Aimee alleen verantwoord inzetten als zij begrijpen waarom het systeem een bepaalde aanbeveling doet. </w:t>
+      </w:r>
+      <w:proofErr w:type="spellStart"/>
+      <w:r>
+        <w:rPr>
+          <w:b w:val="0"/>
+          <w:bCs w:val="0"/>
+          <w:color w:val="auto"/>
+          <w:sz w:val="24"/>
+          <w:szCs w:val="24"/>
+        </w:rPr>
+        <w:t>Explainability</w:t>
+      </w:r>
+      <w:proofErr w:type="spellEnd"/>
+      <w:r>
+        <w:rPr>
+          <w:b w:val="0"/>
+          <w:bCs w:val="0"/>
+          <w:color w:val="auto"/>
+          <w:sz w:val="24"/>
+          <w:szCs w:val="24"/>
+        </w:rPr>
+        <w:t xml:space="preserve"> </w:t>
+      </w:r>
+      <w:hyperlink r:id="rId11" w:history="1">
+        <w:r>
+          <w:rPr>
+            <w:rStyle w:val="Hyperlink"/>
+            <w:b w:val="0"/>
+            <w:bCs w:val="0"/>
+            <w:sz w:val="24"/>
+            <w:szCs w:val="24"/>
+          </w:rPr>
+          <w:t>(</w:t>
+        </w:r>
+        <w:proofErr w:type="spellStart"/>
+        <w:r>
+          <w:rPr>
+            <w:rStyle w:val="Hyperlink"/>
+            <w:b w:val="0"/>
+            <w:bCs w:val="0"/>
+            <w:sz w:val="24"/>
+            <w:szCs w:val="24"/>
+          </w:rPr>
+          <w:t>Liao</w:t>
+        </w:r>
+        <w:proofErr w:type="spellEnd"/>
+        <w:r>
+          <w:rPr>
+            <w:rStyle w:val="Hyperlink"/>
+            <w:b w:val="0"/>
+            <w:bCs w:val="0"/>
+            <w:sz w:val="24"/>
+            <w:szCs w:val="24"/>
+          </w:rPr>
+          <w:t xml:space="preserve"> &amp; </w:t>
+        </w:r>
+        <w:proofErr w:type="spellStart"/>
+        <w:r>
+          <w:rPr>
+            <w:rStyle w:val="Hyperlink"/>
+            <w:b w:val="0"/>
+            <w:bCs w:val="0"/>
+            <w:sz w:val="24"/>
+            <w:szCs w:val="24"/>
+          </w:rPr>
+          <w:t>Varshney</w:t>
+        </w:r>
+        <w:proofErr w:type="spellEnd"/>
+        <w:r>
+          <w:rPr>
+            <w:rStyle w:val="Hyperlink"/>
+            <w:b w:val="0"/>
+            <w:bCs w:val="0"/>
+            <w:sz w:val="24"/>
+            <w:szCs w:val="24"/>
+          </w:rPr>
+          <w:t>, 2021</w:t>
+        </w:r>
+      </w:hyperlink>
+      <w:r>
+        <w:rPr>
+          <w:b w:val="0"/>
+          <w:bCs w:val="0"/>
+          <w:color w:val="auto"/>
+          <w:sz w:val="24"/>
+          <w:szCs w:val="24"/>
+        </w:rPr>
+        <w:t>) is daarom een centrale randvoorwaarde voor verantwoord AI-gebruik in het onderwijs. Dit vereist bewuste ontwerpkeuzes rondom transparantie: elke aanbeveling gaat vergezeld van een korte, begrijpelijke uitleg zonder technisch jargon.</w:t>
+      </w:r>
+    </w:p>
+    <w:p>
+      <w:pPr>
+        <w:pStyle w:val="Kop2"/>
+      </w:pPr>
+      <w:r>
+        <w:t>5.4 Privacy en AVG</w:t>
+      </w:r>
+      <w:bookmarkEnd w:id="21"/>
+    </w:p>
+    <w:p>
+      <w:pPr>
+        <w:pStyle w:val="Geenafstand"/>
+      </w:pPr>
+      <w:r>
+        <w:t xml:space="preserve">Omdat Juf Aimee werkt met gegevens van minderjarige leerlingen, is AVG-compliance een harde eis. In het </w:t>
+      </w:r>
+      <w:proofErr w:type="spellStart"/>
+      <w:r>
+        <w:t>proof</w:t>
+      </w:r>
+      <w:proofErr w:type="spellEnd"/>
+      <w:r>
+        <w:t xml:space="preserve"> of concept wordt gewerkt met fictieve en gesimuleerde data. In de verdere ontwikkeling zullen </w:t>
+      </w:r>
+      <w:proofErr w:type="spellStart"/>
+      <w:r>
+        <w:t>leerlingprofielen</w:t>
+      </w:r>
+      <w:proofErr w:type="spellEnd"/>
+      <w:r>
+        <w:t>, interactielogs en voortgangsdata zorgvuldig worden beschermd en geminimaliseerd</w:t>
+      </w:r>
+      <w:r>
+        <w:t>.</w:t>
+      </w:r>
+    </w:p>
+    <w:p>
+      <w:pPr>
+        <w:pStyle w:val="Kop1"/>
+        <w:pBdr>
+          <w:bottom w:val="single" w:sz="4" w:space="4" w:color="2E75B6"/>
+        </w:pBdr>
+      </w:pPr>
+    </w:p>
+    <w:p>
+      <w:pPr>
+        <w:pStyle w:val="Kop1"/>
+        <w:pBdr>
+          <w:bottom w:val="single" w:sz="4" w:space="4" w:color="2E75B6"/>
+        </w:pBdr>
+      </w:pPr>
+    </w:p>
+    <w:p>
+      <w:pPr>
+        <w:pStyle w:val="Kop1"/>
+        <w:pBdr>
+          <w:bottom w:val="single" w:sz="4" w:space="4" w:color="2E75B6"/>
+        </w:pBdr>
+      </w:pPr>
+    </w:p>
+    <w:p>
+      <w:pPr>
+        <w:pStyle w:val="Kop1"/>
+        <w:pBdr>
+          <w:bottom w:val="single" w:sz="4" w:space="4" w:color="2E75B6"/>
+        </w:pBdr>
+      </w:pPr>
       <w:r>
         <w:t>6. Aanpak en methoden</w:t>
       </w:r>
-      <w:bookmarkEnd w:id="21"/>
-    </w:p>
-    <w:p>
-      <w:pPr>
-        <w:spacing w:before="80" w:after="80"/>
-        <w:jc w:val="both"/>
-      </w:pPr>
-      <w:r>
-        <w:t>Het onderzoek volgt een design-based research benadering, waarbij ontwerp, ontwikkeling en evaluatie iteratief worden uitgevoerd in nauwe samenwerking met leraren, leerlingen en andere betrokkenen.</w:t>
-      </w:r>
+      <w:bookmarkEnd w:id="18"/>
+    </w:p>
+    <w:p>
+      <w:pPr>
+        <w:pStyle w:val="Geenafstand"/>
+      </w:pPr>
+      <w:bookmarkStart w:id="22" w:name="_Toc230782959"/>
+      <w:r>
+        <w:t xml:space="preserve">Het onderzoek volgt een </w:t>
+      </w:r>
+      <w:r>
+        <w:rPr>
+          <w:i/>
+          <w:iCs/>
+        </w:rPr>
+        <w:t>design-</w:t>
+      </w:r>
+      <w:proofErr w:type="spellStart"/>
+      <w:r>
+        <w:rPr>
+          <w:i/>
+          <w:iCs/>
+        </w:rPr>
+        <w:t>based</w:t>
+      </w:r>
+      <w:proofErr w:type="spellEnd"/>
+      <w:r>
+        <w:rPr>
+          <w:i/>
+          <w:iCs/>
+        </w:rPr>
+        <w:t xml:space="preserve"> research</w:t>
+      </w:r>
+      <w:r>
+        <w:t xml:space="preserve"> </w:t>
+      </w:r>
+      <w:r>
+        <w:t xml:space="preserve">(Anderson &amp; </w:t>
+      </w:r>
+      <w:proofErr w:type="spellStart"/>
+      <w:r>
+        <w:t>Shattuck</w:t>
+      </w:r>
+      <w:proofErr w:type="spellEnd"/>
+      <w:r>
+        <w:t>, 2012)</w:t>
+      </w:r>
+      <w:r>
+        <w:t xml:space="preserve"> benadering, waarbij ontwerp, ontwikkeling en evaluatie iteratief worden uitgevoerd in nauwe samenwerking met leraren, leerlingen en andere betrokkenen.</w:t>
+      </w:r>
+      <w:r>
+        <w:t xml:space="preserve"> </w:t>
+      </w:r>
+      <w:bookmarkStart w:id="23" w:name="_Toc225245699"/>
     </w:p>
     <w:p>
       <w:pPr>
         <w:pStyle w:val="Kop2"/>
       </w:pPr>
-      <w:bookmarkStart w:id="22" w:name="_Toc230782957"/>
       <w:r>
         <w:t>6.1 Fasen</w:t>
       </w:r>
+      <w:bookmarkEnd w:id="23"/>
+    </w:p>
+    <w:p>
+      <w:pPr>
+        <w:pStyle w:val="Geenafstand"/>
+        <w:numPr>
+          <w:ilvl w:val="0"/>
+          <w:numId w:val="4"/>
+        </w:numPr>
+      </w:pPr>
+      <w:r>
+        <w:t>Verkenning: literatuuronderzoek naar hoogbegaafdheid, hybride AI en verantwoord AI-ontwerp; gesprekken met leraren en onderzoekers.</w:t>
+      </w:r>
+    </w:p>
+    <w:p>
+      <w:pPr>
+        <w:pStyle w:val="Geenafstand"/>
+        <w:numPr>
+          <w:ilvl w:val="0"/>
+          <w:numId w:val="4"/>
+        </w:numPr>
+      </w:pPr>
+      <w:r>
+        <w:rPr>
+          <w:i/>
+          <w:iCs/>
+        </w:rPr>
+        <w:t>Co-design</w:t>
+      </w:r>
+      <w:r>
+        <w:t>:</w:t>
+      </w:r>
+      <w:r>
+        <w:t xml:space="preserve"> participatieve ontwerpworkshops met leraren (en eventueel leerlingen) om gebruikersbehoeften en ontwerpkeuzes te verkennen.</w:t>
+      </w:r>
+    </w:p>
+    <w:p>
+      <w:pPr>
+        <w:pStyle w:val="Geenafstand"/>
+        <w:numPr>
+          <w:ilvl w:val="0"/>
+          <w:numId w:val="4"/>
+        </w:numPr>
+      </w:pPr>
+      <w:r>
+        <w:rPr>
+          <w:i/>
+          <w:iCs/>
+        </w:rPr>
+        <w:t>Prototype</w:t>
+      </w:r>
+      <w:r>
+        <w:t xml:space="preserve">-ontwikkeling: bouwen van een </w:t>
+      </w:r>
+      <w:proofErr w:type="spellStart"/>
+      <w:r>
+        <w:rPr>
+          <w:i/>
+          <w:iCs/>
+        </w:rPr>
+        <w:t>proof</w:t>
+      </w:r>
+      <w:proofErr w:type="spellEnd"/>
+      <w:r>
+        <w:rPr>
+          <w:i/>
+          <w:iCs/>
+        </w:rPr>
+        <w:t xml:space="preserve"> of concept</w:t>
+      </w:r>
+      <w:r>
+        <w:t xml:space="preserve"> voor (een onderdeel van) Juf Aimee, met aandacht voor technische en ethische randvoorwaarden.</w:t>
+      </w:r>
+    </w:p>
+    <w:p>
+      <w:pPr>
+        <w:pStyle w:val="Geenafstand"/>
+        <w:numPr>
+          <w:ilvl w:val="0"/>
+          <w:numId w:val="4"/>
+        </w:numPr>
+      </w:pPr>
+      <w:r>
+        <w:t>Evaluatie: testen van het prototype met eindgebruikers; evaluatie op bruikbaarheid, uitlegbaarheid en pedagogische kwaliteit.</w:t>
+      </w:r>
+    </w:p>
+    <w:p>
+      <w:pPr>
+        <w:pStyle w:val="Kop2"/>
+      </w:pPr>
+      <w:bookmarkStart w:id="24" w:name="_Toc225245700"/>
+      <w:r>
+        <w:t>6.2 Data</w:t>
+      </w:r>
+      <w:bookmarkEnd w:id="24"/>
+    </w:p>
+    <w:p>
+      <w:pPr>
+        <w:pStyle w:val="Geenafstand"/>
+      </w:pPr>
+      <w:r>
+        <w:t xml:space="preserve">Er wordt in deze fase uitsluitend gewerkt met fictieve en gesimuleerde data </w:t>
+      </w:r>
+      <w:proofErr w:type="spellStart"/>
+      <w:r>
+        <w:t>voorbeeldleerlingprofielen</w:t>
+      </w:r>
+      <w:proofErr w:type="spellEnd"/>
+      <w:r>
+        <w:t>, gesimuleerde leeractiviteiten en hypothetische onderwijsscenario’s. Er worden geen echte leerling- of persoonsgegevens gebruikt.</w:t>
+      </w:r>
+    </w:p>
+    <w:p>
+      <w:pPr>
+        <w:pStyle w:val="Kop2"/>
+      </w:pPr>
+      <w:r>
+        <w:t xml:space="preserve">6.3 </w:t>
+      </w:r>
+      <w:proofErr w:type="spellStart"/>
+      <w:r>
+        <w:t>Proof</w:t>
+      </w:r>
+      <w:proofErr w:type="spellEnd"/>
+      <w:r>
+        <w:t xml:space="preserve"> of concept </w:t>
+      </w:r>
+      <w:r>
+        <w:t>-</w:t>
+      </w:r>
+      <w:r>
+        <w:t xml:space="preserve"> Gerealiseerde functionaliteiten</w:t>
+      </w:r>
       <w:bookmarkEnd w:id="22"/>
+    </w:p>
+    <w:p>
+      <w:r>
+        <w:t xml:space="preserve">Het </w:t>
+      </w:r>
+      <w:proofErr w:type="spellStart"/>
+      <w:r>
+        <w:t>proof</w:t>
+      </w:r>
+      <w:proofErr w:type="spellEnd"/>
+      <w:r>
+        <w:t xml:space="preserve"> of concept bestaat uit een webapplicatie voor leraren die drie kernsystemen integreert: een leraarsdashboard met </w:t>
+      </w:r>
+      <w:proofErr w:type="spellStart"/>
+      <w:r>
+        <w:t>leerlingoverzicht</w:t>
+      </w:r>
+      <w:proofErr w:type="spellEnd"/>
+      <w:r>
+        <w:t xml:space="preserve">, een </w:t>
+      </w:r>
+      <w:proofErr w:type="spellStart"/>
+      <w:r>
+        <w:t>regelgebaseerd</w:t>
+      </w:r>
+      <w:proofErr w:type="spellEnd"/>
+      <w:r>
+        <w:t xml:space="preserve"> signalensysteem en een AI-gedreven adviessysteem. De applicatie is ontwikkeld met het Next.js framework en maakt gebruik van een lokale </w:t>
+      </w:r>
+      <w:proofErr w:type="spellStart"/>
+      <w:r>
+        <w:t>PostgreSQL</w:t>
+      </w:r>
+      <w:proofErr w:type="spellEnd"/>
+      <w:r>
+        <w:t>-database met vectoropslag. Alle AI</w:t>
+      </w:r>
+      <w:r>
+        <w:t xml:space="preserve">- </w:t>
+      </w:r>
+      <w:r>
+        <w:t xml:space="preserve">componenten draaien lokaal via </w:t>
+      </w:r>
+      <w:proofErr w:type="spellStart"/>
+      <w:r>
+        <w:t>Ollama</w:t>
+      </w:r>
+      <w:proofErr w:type="spellEnd"/>
+      <w:r>
+        <w:t xml:space="preserve">, een oplossing die bewust is gekozen om te voldoen aan de AVG-eis dat persoonsgegevens van minderjarigen niet worden doorgezonden naar externe </w:t>
+      </w:r>
+      <w:proofErr w:type="spellStart"/>
+      <w:r>
+        <w:t>cloudproviders</w:t>
+      </w:r>
+      <w:proofErr w:type="spellEnd"/>
+      <w:r>
+        <w:t>.</w:t>
+      </w:r>
+    </w:p>
+    <w:p/>
+    <w:p>
+      <w:pPr>
+        <w:pStyle w:val="Kop3"/>
+      </w:pPr>
+      <w:bookmarkStart w:id="25" w:name="_Toc230782960"/>
+      <w:r>
+        <w:t>Leraarsdashboard</w:t>
+      </w:r>
+      <w:bookmarkEnd w:id="25"/>
+    </w:p>
+    <w:p/>
+    <w:p>
+      <w:r>
+        <w:t xml:space="preserve">De centrale interface is een dashboard waarop de leraar per leerling een overzicht ziet van voortgang, interesses, afgeronde opdrachten en het huidige </w:t>
+      </w:r>
+      <w:r>
+        <w:lastRenderedPageBreak/>
+        <w:t xml:space="preserve">Bloom-niveau. De </w:t>
+      </w:r>
+      <w:proofErr w:type="spellStart"/>
+      <w:r>
+        <w:t>leerlingprofielen</w:t>
+      </w:r>
+      <w:proofErr w:type="spellEnd"/>
+      <w:r>
+        <w:t xml:space="preserve"> zijn opgebouwd uit het Individueel Ontwikkelingsperspectief (OPP): een bestaand pedagogisch document dat scholen bijhouden per leerling. De OPP-bestanden worden automatisch ingelezen, opgesplitst in tekstfragmenten en omgezet naar vectorrepresentaties met behulp van een meertalig inbeddingsmodel. Dit maakt semantisch zoeken mogelijk: het systeem kan relevante informatie uit het </w:t>
+      </w:r>
+      <w:proofErr w:type="spellStart"/>
+      <w:r>
+        <w:t>leerlingprofiel</w:t>
+      </w:r>
+      <w:proofErr w:type="spellEnd"/>
+      <w:r>
+        <w:t xml:space="preserve"> ophalen op basis van betekenis, niet alleen op basis van exacte zoekwoorden.</w:t>
+      </w:r>
+    </w:p>
+    <w:p/>
+    <w:p>
+      <w:pPr>
+        <w:pStyle w:val="Kop3"/>
+      </w:pPr>
+      <w:bookmarkStart w:id="26" w:name="_Toc230782961"/>
+      <w:r>
+        <w:t>Signalensysteem</w:t>
+      </w:r>
+      <w:bookmarkEnd w:id="26"/>
+    </w:p>
+    <w:p/>
+    <w:p>
+      <w:r>
+        <w:t xml:space="preserve">Het signalensysteem detecteert automatisch vier typen situaties op basis van </w:t>
+      </w:r>
+      <w:proofErr w:type="spellStart"/>
+      <w:r>
+        <w:t>observeerbaar</w:t>
+      </w:r>
+      <w:proofErr w:type="spellEnd"/>
+      <w:r>
+        <w:t xml:space="preserve"> gedrag in de applicatie. Een capaciteitssignaal wordt gegenereerd wanneer een leerling twee opdrachten achter elkaar heeft afgerond op hetzelfde Bloom-niveau, wat kan duiden op onderbenutting. Een taakbetrokkenheidssignaal verschijnt wanneer een leerling openstaande opdrachten heeft maar nog niets heeft afgerond. Een intellectueel prestatiesignaal markeert leerlingen die consistent presteren op de hogere Bloom-niveaus vijf en zes. Een werktempo­signaal wordt geactiveerd wanneer een leerling op één dag drie of meer opdrachten heeft voltooid. De signalen worden gerangschikt op urgentie: waarschuwingen krijgen prioriteit boven adviezen, die op hun beurt prioriteit krijgen boven positieve observaties.</w:t>
+      </w:r>
+    </w:p>
+    <w:p/>
+    <w:p>
+      <w:pPr>
+        <w:pStyle w:val="Kop3"/>
+      </w:pPr>
+      <w:bookmarkStart w:id="27" w:name="_Toc230782962"/>
+      <w:r>
+        <w:t xml:space="preserve">AI-gedreven advies </w:t>
+      </w:r>
+      <w:r>
+        <w:t>-</w:t>
+      </w:r>
+      <w:r>
+        <w:t xml:space="preserve"> Juf Aimee</w:t>
+      </w:r>
+      <w:bookmarkEnd w:id="27"/>
+    </w:p>
+    <w:p/>
+    <w:p>
+      <w:r>
+        <w:t>Voor elke leerling met een of meerdere actieve signalen genereert het systeem een gepersonaliseerd advies via een lokaal taalmodel. Het systeem haalt hiervoor relevante fragmenten op uit het OPP van de leerling, met name informatie over interesses, motivatie en werkstijl. Deze fragmenten worden gecombineerd met de signaalcontext en aangeboden aan het taalmodel als gestructureerde prompt.</w:t>
+      </w:r>
+    </w:p>
+    <w:p/>
+    <w:p>
+      <w:r>
+        <w:t xml:space="preserve">Wanneer een leerling meerdere gelijktijdige signalen heeft, genereert het systeem één samenhangende observatie die de signalen in verband brengt. Zo wordt voorkomen dat de leraar meerdere losstaande berichten ontvangt die samen een </w:t>
+      </w:r>
+      <w:proofErr w:type="spellStart"/>
+      <w:r>
+        <w:t>coherenter</w:t>
+      </w:r>
+      <w:proofErr w:type="spellEnd"/>
+      <w:r>
+        <w:t xml:space="preserve"> beeld vormen. Juf Aimee besluit elke boodschap altijd met een open vraag aan de leraar, </w:t>
+      </w:r>
+      <w:proofErr w:type="gramStart"/>
+      <w:r>
+        <w:t>conform</w:t>
+      </w:r>
+      <w:proofErr w:type="gramEnd"/>
+      <w:r>
+        <w:t xml:space="preserve"> het ontwerpprincipe van Hybride AI: de AI informeert en adviseert, maar de leraar houdt het eindoordeel.</w:t>
+      </w:r>
+    </w:p>
+    <w:p/>
+    <w:p>
+      <w:pPr>
+        <w:pStyle w:val="Kop3"/>
+      </w:pPr>
+      <w:bookmarkStart w:id="28" w:name="_Toc230782963"/>
+      <w:r>
+        <w:t xml:space="preserve">Human in </w:t>
+      </w:r>
+      <w:proofErr w:type="spellStart"/>
+      <w:r>
+        <w:t>the</w:t>
+      </w:r>
+      <w:proofErr w:type="spellEnd"/>
+      <w:r>
+        <w:t xml:space="preserve"> loop</w:t>
+      </w:r>
+      <w:bookmarkEnd w:id="28"/>
+    </w:p>
+    <w:p/>
+    <w:p>
+      <w:r>
+        <w:t>De leraar kan via het dashboard een notitie toevoegen per leerling. Deze notitie wordt bij volgende adviesgeneraties meegenomen als leidende context, waardoor de aanbevelingen van het systeem worden bijgestuurd door de professionele kennis van de leraar. Dit sluit direct aan op het XAI-principe van uitlegbaarheid: het systeem maakt zichtbaar welke informatie ten grondslag ligt aan een aanbeveling en stelt de leraar in staat deze te corrigeren of aan te vullen.</w:t>
+      </w:r>
+    </w:p>
+    <w:p>
+      <w:pPr>
+        <w:pStyle w:val="Kop1"/>
+        <w:pBdr>
+          <w:bottom w:val="single" w:sz="4" w:space="4" w:color="2E75B6"/>
+        </w:pBdr>
+        <w:rPr>
+          <w:lang w:val="en-GB"/>
+        </w:rPr>
+      </w:pPr>
+      <w:bookmarkStart w:id="29" w:name="_Toc230782964"/>
+      <w:r>
+        <w:rPr>
+          <w:lang w:val="en-GB"/>
+        </w:rPr>
+        <w:lastRenderedPageBreak/>
+        <w:t xml:space="preserve">7. </w:t>
+      </w:r>
+      <w:proofErr w:type="spellStart"/>
+      <w:r>
+        <w:rPr>
+          <w:lang w:val="en-GB"/>
+        </w:rPr>
+        <w:t>Acceptatiecriteria</w:t>
+      </w:r>
+      <w:proofErr w:type="spellEnd"/>
+      <w:r>
+        <w:rPr>
+          <w:lang w:val="en-GB"/>
+        </w:rPr>
+        <w:t xml:space="preserve"> </w:t>
+      </w:r>
+      <w:proofErr w:type="spellStart"/>
+      <w:r>
+        <w:rPr>
+          <w:lang w:val="en-GB"/>
+        </w:rPr>
+        <w:t>en</w:t>
+      </w:r>
+      <w:proofErr w:type="spellEnd"/>
+      <w:r>
+        <w:rPr>
+          <w:lang w:val="en-GB"/>
+        </w:rPr>
+        <w:t xml:space="preserve"> Definition of Done</w:t>
+      </w:r>
+      <w:bookmarkEnd w:id="29"/>
+    </w:p>
+    <w:p>
+      <w:pPr>
+        <w:pStyle w:val="Kop2"/>
+        <w:rPr>
+          <w:lang w:val="en-GB"/>
+        </w:rPr>
+      </w:pPr>
+      <w:bookmarkStart w:id="30" w:name="_Toc230782965"/>
+      <w:r>
+        <w:rPr>
+          <w:lang w:val="en-GB"/>
+        </w:rPr>
+        <w:t>Acceptatiecriteria</w:t>
+      </w:r>
+      <w:bookmarkEnd w:id="30"/>
     </w:p>
     <w:p>
       <w:pPr>
@@ -3922,7 +5273,7 @@
         <w:spacing w:before="60" w:after="60"/>
       </w:pPr>
       <w:r>
-        <w:t>Verkenning: literatuuronderzoek naar hoogbegaafdheid, hybride AI en verantwoord AI-ontwerp; gesprekken met leraren en onderzoekers.</w:t>
+        <w:t>Het onderzoeksverslag bevat een heldere probleemstelling, hoofd- en deelvragen, en een theoretisch kader dat aansluit op de context van het project.</w:t>
       </w:r>
     </w:p>
     <w:p>
@@ -3935,7 +5286,7 @@
         <w:spacing w:before="60" w:after="60"/>
       </w:pPr>
       <w:r>
-        <w:t>Co-design: participatieve ontwerpworkshops met leraren (en eventueel leerlingen) om gebruikersbehoeften en ontwerpkeuzes te verkennen.</w:t>
+        <w:t>De gebruikersbehoeften van zowel leraren als leerlingen zijn gedocumenteerd aan de hand van user stories en/of interviews.</w:t>
       </w:r>
     </w:p>
     <w:p>
@@ -3948,8 +5299,7 @@
         <w:spacing w:before="60" w:after="60"/>
       </w:pPr>
       <w:r>
-        <w:lastRenderedPageBreak/>
-        <w:t>Prototype-ontwikkeling: bouwen van een proof of concept voor (een onderdeel van) Juf Aimee, met aandacht voor technische en ethische randvoorwaarden.</w:t>
+        <w:t>Het proof of concept demonstreert minimaal één kernfunctionaliteit van Juf Aimee (bijv. het genereren van een gepersonaliseerde opdracht) met aandacht voor uitlegbaarheid.</w:t>
       </w:r>
     </w:p>
     <w:p>
@@ -3962,357 +5312,8 @@
         <w:spacing w:before="60" w:after="60"/>
       </w:pPr>
       <w:r>
-        <w:t>Evaluatie: testen van het prototype met eindgebruikers; evaluatie op bruikbaarheid, uitlegbaarheid en pedagogische kwaliteit.</w:t>
-      </w:r>
-    </w:p>
-    <w:p>
-      <w:pPr>
-        <w:pStyle w:val="Kop2"/>
-      </w:pPr>
-      <w:bookmarkStart w:id="23" w:name="_Toc230782958"/>
-      <w:r>
-        <w:t>6.2 Data</w:t>
-      </w:r>
-      <w:bookmarkEnd w:id="23"/>
-    </w:p>
-    <w:p>
-      <w:pPr>
-        <w:spacing w:before="80" w:after="80"/>
-        <w:jc w:val="both"/>
-      </w:pPr>
-      <w:r>
-        <w:t>Er wordt in deze fase uitsluitend gewerkt met fictieve en gesimuleerde data — voorbeeldleerlingprofielen, gesimuleerde leeractiviteiten en hypothetische onderwijsscenario’s. Er worden geen echte leerling- of persoonsgegevens gebruikt.</w:t>
-      </w:r>
-    </w:p>
-    <w:p>
-      <w:pPr>
-        <w:pStyle w:val="Kop2"/>
-      </w:pPr>
-      <w:bookmarkStart w:id="24" w:name="_Toc230782959"/>
-      <w:r>
-        <w:t xml:space="preserve">6.3 </w:t>
-      </w:r>
-      <w:proofErr w:type="spellStart"/>
-      <w:r>
-        <w:t>Proof</w:t>
-      </w:r>
-      <w:proofErr w:type="spellEnd"/>
-      <w:r>
-        <w:t xml:space="preserve"> of concept </w:t>
-      </w:r>
-      <w:r>
-        <w:t>-</w:t>
-      </w:r>
-      <w:r>
-        <w:t xml:space="preserve"> Gerealiseerde functionaliteiten</w:t>
-      </w:r>
-      <w:bookmarkEnd w:id="24"/>
-    </w:p>
-    <w:p>
-      <w:r>
-        <w:t xml:space="preserve">Het </w:t>
-      </w:r>
-      <w:proofErr w:type="spellStart"/>
-      <w:r>
-        <w:t>proof</w:t>
-      </w:r>
-      <w:proofErr w:type="spellEnd"/>
-      <w:r>
-        <w:t xml:space="preserve"> of concept bestaat uit een webapplicatie voor leraren die drie kernsystemen integreert: een leraarsdashboard met </w:t>
-      </w:r>
-      <w:proofErr w:type="spellStart"/>
-      <w:r>
-        <w:t>leerlingoverzicht</w:t>
-      </w:r>
-      <w:proofErr w:type="spellEnd"/>
-      <w:r>
-        <w:t xml:space="preserve">, een </w:t>
-      </w:r>
-      <w:proofErr w:type="spellStart"/>
-      <w:r>
-        <w:t>regelgebaseerd</w:t>
-      </w:r>
-      <w:proofErr w:type="spellEnd"/>
-      <w:r>
-        <w:t xml:space="preserve"> signalensysteem en een AI-gedreven adviessysteem. De applicatie is ontwikkeld met </w:t>
-      </w:r>
-      <w:r>
-        <w:t xml:space="preserve">het </w:t>
-      </w:r>
-      <w:r>
-        <w:t>Next.js</w:t>
-      </w:r>
-      <w:r>
-        <w:t xml:space="preserve"> </w:t>
-      </w:r>
-      <w:proofErr w:type="spellStart"/>
-      <w:r>
-        <w:t>framework</w:t>
-      </w:r>
-      <w:proofErr w:type="spellEnd"/>
-      <w:r>
-        <w:t xml:space="preserve"> en maakt gebruik van een lokale </w:t>
-      </w:r>
-      <w:proofErr w:type="spellStart"/>
-      <w:r>
-        <w:t>PostgreSQL</w:t>
-      </w:r>
-      <w:proofErr w:type="spellEnd"/>
-      <w:r>
-        <w:t>-database met vectoropslag. Alle AI</w:t>
-      </w:r>
-      <w:r>
-        <w:t xml:space="preserve">- </w:t>
-      </w:r>
-      <w:r>
-        <w:t xml:space="preserve">componenten draaien lokaal via </w:t>
-      </w:r>
-      <w:proofErr w:type="spellStart"/>
-      <w:r>
-        <w:t>Ollama</w:t>
-      </w:r>
-      <w:proofErr w:type="spellEnd"/>
-      <w:r>
-        <w:t xml:space="preserve">, een oplossing die bewust is gekozen om te voldoen aan de AVG-eis dat persoonsgegevens van minderjarigen niet worden doorgezonden naar externe </w:t>
-      </w:r>
-      <w:proofErr w:type="spellStart"/>
-      <w:r>
-        <w:t>cloudproviders</w:t>
-      </w:r>
-      <w:proofErr w:type="spellEnd"/>
-      <w:r>
-        <w:t>.</w:t>
-      </w:r>
-    </w:p>
-    <w:p/>
-    <w:p>
-      <w:pPr>
-        <w:pStyle w:val="Kop3"/>
-      </w:pPr>
-      <w:bookmarkStart w:id="25" w:name="_Toc230782960"/>
-      <w:r>
-        <w:t>Leraarsdashboard</w:t>
-      </w:r>
-      <w:bookmarkEnd w:id="25"/>
-    </w:p>
-    <w:p/>
-    <w:p>
-      <w:r>
-        <w:t xml:space="preserve">De centrale interface is een dashboard waarop de leraar per leerling een overzicht ziet van voortgang, interesses, afgeronde opdrachten en het huidige </w:t>
-      </w:r>
-      <w:proofErr w:type="spellStart"/>
-      <w:r>
-        <w:t>Bloom</w:t>
-      </w:r>
-      <w:proofErr w:type="spellEnd"/>
-      <w:r>
-        <w:t xml:space="preserve">-niveau. De </w:t>
-      </w:r>
-      <w:proofErr w:type="spellStart"/>
-      <w:r>
-        <w:t>leerlingprofielen</w:t>
-      </w:r>
-      <w:proofErr w:type="spellEnd"/>
-      <w:r>
-        <w:t xml:space="preserve"> zijn opgebouwd uit het Individueel Ontwikkelingsperspectief (OPP): een bestaand pedagogisch document dat scholen bijhouden per leerling. De OPP-bestanden worden automatisch ingelezen, opgesplitst in tekstfragmenten en omgezet naar vectorrepresentaties met behulp van een meertalig inbeddingsmodel. Dit maakt semantisch zoeken mogelijk: het systeem kan relevante informatie uit het </w:t>
-      </w:r>
-      <w:proofErr w:type="spellStart"/>
-      <w:r>
-        <w:t>leerlingprofiel</w:t>
-      </w:r>
-      <w:proofErr w:type="spellEnd"/>
-      <w:r>
-        <w:t xml:space="preserve"> ophalen op basis van betekenis, niet alleen op basis van exacte zoekwoorden.</w:t>
-      </w:r>
-    </w:p>
-    <w:p/>
-    <w:p>
-      <w:pPr>
-        <w:pStyle w:val="Kop3"/>
-      </w:pPr>
-      <w:bookmarkStart w:id="26" w:name="_Toc230782961"/>
-      <w:r>
-        <w:t>Signalensysteem</w:t>
-      </w:r>
-      <w:bookmarkEnd w:id="26"/>
-    </w:p>
-    <w:p/>
-    <w:p>
-      <w:r>
-        <w:t xml:space="preserve">Het signalensysteem detecteert automatisch vier typen situaties op basis van </w:t>
-      </w:r>
-      <w:proofErr w:type="spellStart"/>
-      <w:r>
-        <w:t>observeerbaar</w:t>
-      </w:r>
-      <w:proofErr w:type="spellEnd"/>
-      <w:r>
-        <w:t xml:space="preserve"> gedrag in de applicatie. Een capaciteitssignaal wordt gegenereerd wanneer een leerling twee opdrachten achter elkaar heeft afgerond op hetzelfde </w:t>
-      </w:r>
-      <w:proofErr w:type="spellStart"/>
-      <w:r>
-        <w:t>Bloom</w:t>
-      </w:r>
-      <w:proofErr w:type="spellEnd"/>
-      <w:r>
-        <w:t xml:space="preserve">-niveau, wat kan duiden op onderbenutting. Een taakbetrokkenheidssignaal verschijnt wanneer een leerling openstaande opdrachten heeft maar nog niets heeft afgerond. Een intellectueel prestatiesignaal markeert leerlingen die consistent presteren op de hogere </w:t>
-      </w:r>
-      <w:proofErr w:type="spellStart"/>
-      <w:r>
-        <w:t>Bloom</w:t>
-      </w:r>
-      <w:proofErr w:type="spellEnd"/>
-      <w:r>
-        <w:t xml:space="preserve">-niveaus vijf en zes. Een werktempo­signaal wordt geactiveerd wanneer een leerling op één dag drie of meer opdrachten heeft voltooid. De signalen </w:t>
-      </w:r>
-      <w:r>
-        <w:lastRenderedPageBreak/>
-        <w:t>worden gerangschikt op urgentie: waarschuwingen krijgen prioriteit boven adviezen, die op hun beurt prioriteit krijgen boven positieve observaties.</w:t>
-      </w:r>
-    </w:p>
-    <w:p/>
-    <w:p>
-      <w:pPr>
-        <w:pStyle w:val="Kop3"/>
-      </w:pPr>
-      <w:bookmarkStart w:id="27" w:name="_Toc230782962"/>
-      <w:r>
-        <w:t xml:space="preserve">AI-gedreven advies </w:t>
-      </w:r>
-      <w:r>
-        <w:t>-</w:t>
-      </w:r>
-      <w:r>
-        <w:t xml:space="preserve"> Juf Aimee</w:t>
-      </w:r>
-      <w:bookmarkEnd w:id="27"/>
-    </w:p>
-    <w:p/>
-    <w:p>
-      <w:r>
-        <w:t>Voor elke leerling met een of meerdere actieve signalen genereert het systeem een gepersonaliseerd advies via een lokaal taalmodel. Het systeem haalt hiervoor relevante fragmenten op uit het OPP van de leerling, met name informatie over interesses, motivatie en werkstijl. Deze fragmenten worden gecombineerd met de signaalcontext en aangeboden aan het taalmodel als gestructureerde prompt.</w:t>
-      </w:r>
-    </w:p>
-    <w:p/>
-    <w:p>
-      <w:r>
-        <w:t xml:space="preserve">Wanneer een leerling meerdere gelijktijdige signalen heeft, genereert het systeem één samenhangende observatie die de signalen in verband brengt. Zo wordt voorkomen dat de leraar meerdere losstaande berichten ontvangt die samen een </w:t>
-      </w:r>
-      <w:proofErr w:type="spellStart"/>
-      <w:r>
-        <w:t>coherenter</w:t>
-      </w:r>
-      <w:proofErr w:type="spellEnd"/>
-      <w:r>
-        <w:t xml:space="preserve"> beeld vormen. Juf Aimee besluit elke boodschap altijd met een open vraag aan de leraar, conform het ontwerpprincipe van Hybride AI: de AI informeert en adviseert, maar de leraar houdt het eindoordeel.</w:t>
-      </w:r>
-    </w:p>
-    <w:p/>
-    <w:p>
-      <w:pPr>
-        <w:pStyle w:val="Kop3"/>
-      </w:pPr>
-      <w:bookmarkStart w:id="28" w:name="_Toc230782963"/>
-      <w:r>
-        <w:t xml:space="preserve">Human in </w:t>
-      </w:r>
-      <w:proofErr w:type="spellStart"/>
-      <w:r>
-        <w:t>the</w:t>
-      </w:r>
-      <w:proofErr w:type="spellEnd"/>
-      <w:r>
-        <w:t xml:space="preserve"> loop</w:t>
-      </w:r>
-      <w:bookmarkEnd w:id="28"/>
-    </w:p>
-    <w:p/>
-    <w:p>
-      <w:r>
-        <w:t>De leraar kan via het dashboard een notitie toevoegen per leerling. Deze notitie wordt bij volgende adviesgeneraties meegenomen als leidende context, waardoor de aanbevelingen van het systeem worden bijgestuurd door de professionele kennis van de leraar. Dit sluit direct aan op het XAI-principe van uitlegbaarheid: het systeem maakt zichtbaar welke informatie ten grondslag ligt aan een aanbeveling en stelt de leraar in staat deze te corrigeren of aan te vullen.</w:t>
-      </w:r>
-    </w:p>
-    <w:p>
-      <w:pPr>
-        <w:rPr>
-          <w:b/>
-          <w:bCs/>
-          <w:color w:val="2E75B6"/>
-          <w:sz w:val="26"/>
-          <w:szCs w:val="26"/>
-        </w:rPr>
-      </w:pPr>
-      <w:r>
-        <w:br w:type="page"/>
-      </w:r>
-    </w:p>
-    <w:p>
-      <w:pPr>
-        <w:pStyle w:val="Kop2"/>
-      </w:pPr>
-    </w:p>
-    <w:p>
-      <w:pPr>
-        <w:pStyle w:val="Kop1"/>
-        <w:pBdr>
-          <w:bottom w:val="single" w:sz="4" w:space="4" w:color="2E75B6"/>
-        </w:pBdr>
-        <w:rPr>
-          <w:lang w:val="en-GB"/>
-        </w:rPr>
-      </w:pPr>
-      <w:bookmarkStart w:id="29" w:name="_Toc230782964"/>
-      <w:r>
-        <w:rPr>
-          <w:lang w:val="en-GB"/>
-        </w:rPr>
-        <w:t xml:space="preserve">7. </w:t>
-      </w:r>
-      <w:proofErr w:type="spellStart"/>
-      <w:r>
-        <w:rPr>
-          <w:lang w:val="en-GB"/>
-        </w:rPr>
-        <w:t>Acceptatiecriteria</w:t>
-      </w:r>
-      <w:proofErr w:type="spellEnd"/>
-      <w:r>
-        <w:rPr>
-          <w:lang w:val="en-GB"/>
-        </w:rPr>
-        <w:t xml:space="preserve"> </w:t>
-      </w:r>
-      <w:proofErr w:type="spellStart"/>
-      <w:r>
-        <w:rPr>
-          <w:lang w:val="en-GB"/>
-        </w:rPr>
-        <w:t>en</w:t>
-      </w:r>
-      <w:proofErr w:type="spellEnd"/>
-      <w:r>
-        <w:rPr>
-          <w:lang w:val="en-GB"/>
-        </w:rPr>
-        <w:t xml:space="preserve"> Definition of Done</w:t>
-      </w:r>
-      <w:bookmarkEnd w:id="29"/>
-    </w:p>
-    <w:p>
-      <w:pPr>
-        <w:pStyle w:val="Kop2"/>
-        <w:rPr>
-          <w:lang w:val="en-GB"/>
-        </w:rPr>
-      </w:pPr>
-      <w:bookmarkStart w:id="30" w:name="_Toc230782965"/>
-      <w:r>
-        <w:rPr>
-          <w:lang w:val="en-GB"/>
-        </w:rPr>
-        <w:t>Acceptatiecriteria</w:t>
-      </w:r>
-      <w:bookmarkEnd w:id="30"/>
+        <w:t>Ethische randvoorwaarden (AVG, uitlegbaarheid, regie leraar) zijn expliciet benoemd en vertaald naar ontwerpkeuzes.</w:t>
+      </w:r>
     </w:p>
     <w:p>
       <w:pPr>
@@ -4324,7 +5325,7 @@
         <w:spacing w:before="60" w:after="60"/>
       </w:pPr>
       <w:r>
-        <w:t>Het onderzoeksverslag bevat een heldere probleemstelling, hoofd- en deelvragen, en een theoretisch kader dat aansluit op de context van het project.</w:t>
+        <w:t>Het verslag is geschreven op een niveau dat toegankelijk is voor niet-technische stakeholders (leraren, schoolleiding, opdrachtgevers).</w:t>
       </w:r>
     </w:p>
     <w:p>
@@ -4337,8 +5338,18 @@
         <w:spacing w:before="60" w:after="60"/>
       </w:pPr>
       <w:r>
-        <w:t>De gebruikersbehoeften van zowel leraren als leerlingen zijn gedocumenteerd aan de hand van user stories en/of interviews.</w:t>
-      </w:r>
+        <w:t>Het verslag en prototype zijn gedeeld met de begeleidende onderzoekers en beschikbaar als input voor de SIA RAAK Publiek aanvraag.</w:t>
+      </w:r>
+    </w:p>
+    <w:p>
+      <w:pPr>
+        <w:pStyle w:val="Kop2"/>
+      </w:pPr>
+      <w:bookmarkStart w:id="31" w:name="_Toc230782966"/>
+      <w:r>
+        <w:t>Definition of Done</w:t>
+      </w:r>
+      <w:bookmarkEnd w:id="31"/>
     </w:p>
     <w:p>
       <w:pPr>
@@ -4350,7 +5361,7 @@
         <w:spacing w:before="60" w:after="60"/>
       </w:pPr>
       <w:r>
-        <w:t>Het proof of concept demonstreert minimaal één kernfunctionaliteit van Juf Aimee (bijv. het genereren van een gepersonaliseerde opdracht) met aandacht voor uitlegbaarheid.</w:t>
+        <w:t>Werk is volledig gedocumenteerd in het onderzoeksverslag.</w:t>
       </w:r>
     </w:p>
     <w:p>
@@ -4363,7 +5374,7 @@
         <w:spacing w:before="60" w:after="60"/>
       </w:pPr>
       <w:r>
-        <w:t>Ethische randvoorwaarden (AVG, uitlegbaarheid, regie leraar) zijn expliciet benoemd en vertaald naar ontwerpkeuzes.</w:t>
+        <w:t>Alle acceptatiecriteria zijn afgevinkt en goedgekeurd door de begeleiders.</w:t>
       </w:r>
     </w:p>
     <w:p>
@@ -4375,8 +5386,13 @@
         </w:numPr>
         <w:spacing w:before="60" w:after="60"/>
       </w:pPr>
-      <w:r>
-        <w:t>Het verslag is geschreven op een niveau dat toegankelijk is voor niet-technische stakeholders (leraren, schoolleiding, opdrachtgevers).</w:t>
+      <w:proofErr w:type="gramStart"/>
+      <w:r>
+        <w:t>Issue /</w:t>
+      </w:r>
+      <w:proofErr w:type="gramEnd"/>
+      <w:r>
+        <w:t xml:space="preserve"> taak staat op ‘Done’ in het projectboard.</w:t>
       </w:r>
     </w:p>
     <w:p>
@@ -4389,68 +5405,6 @@
         <w:spacing w:before="60" w:after="60"/>
       </w:pPr>
       <w:r>
-        <w:t>Het verslag en prototype zijn gedeeld met de begeleidende onderzoekers en beschikbaar als input voor de SIA RAAK Publiek aanvraag.</w:t>
-      </w:r>
-    </w:p>
-    <w:p>
-      <w:pPr>
-        <w:pStyle w:val="Kop2"/>
-      </w:pPr>
-      <w:bookmarkStart w:id="31" w:name="_Toc230782966"/>
-      <w:r>
-        <w:t>Definition of Done</w:t>
-      </w:r>
-      <w:bookmarkEnd w:id="31"/>
-    </w:p>
-    <w:p>
-      <w:pPr>
-        <w:pStyle w:val="Lijstalinea"/>
-        <w:numPr>
-          <w:ilvl w:val="0"/>
-          <w:numId w:val="2"/>
-        </w:numPr>
-        <w:spacing w:before="60" w:after="60"/>
-      </w:pPr>
-      <w:r>
-        <w:t>Werk is volledig gedocumenteerd in het onderzoeksverslag.</w:t>
-      </w:r>
-    </w:p>
-    <w:p>
-      <w:pPr>
-        <w:pStyle w:val="Lijstalinea"/>
-        <w:numPr>
-          <w:ilvl w:val="0"/>
-          <w:numId w:val="2"/>
-        </w:numPr>
-        <w:spacing w:before="60" w:after="60"/>
-      </w:pPr>
-      <w:r>
-        <w:t>Alle acceptatiecriteria zijn afgevinkt en goedgekeurd door de begeleiders.</w:t>
-      </w:r>
-    </w:p>
-    <w:p>
-      <w:pPr>
-        <w:pStyle w:val="Lijstalinea"/>
-        <w:numPr>
-          <w:ilvl w:val="0"/>
-          <w:numId w:val="2"/>
-        </w:numPr>
-        <w:spacing w:before="60" w:after="60"/>
-      </w:pPr>
-      <w:r>
-        <w:t>Issue / taak staat op ‘Done’ in het projectboard.</w:t>
-      </w:r>
-    </w:p>
-    <w:p>
-      <w:pPr>
-        <w:pStyle w:val="Lijstalinea"/>
-        <w:numPr>
-          <w:ilvl w:val="0"/>
-          <w:numId w:val="2"/>
-        </w:numPr>
-        <w:spacing w:before="60" w:after="60"/>
-      </w:pPr>
-      <w:r>
         <w:t>Verslag is gedeeld met Stephanie Kramer en Michel Oey via de afgesproken kanalen.</w:t>
       </w:r>
     </w:p>
@@ -4478,53 +5432,160 @@
         <w:jc w:val="both"/>
       </w:pPr>
       <w:r>
-        <w:t>Het project Juf Aimee wordt begeleid vanuit het lectoraat Digital Life van de Hogeschool van Amsterdam:</w:t>
-      </w:r>
-    </w:p>
-    <w:p>
-      <w:pPr>
-        <w:spacing w:before="80" w:after="80"/>
-      </w:pPr>
-    </w:p>
-    <w:p>
-      <w:pPr>
-        <w:pStyle w:val="Lijstalinea"/>
-        <w:numPr>
-          <w:ilvl w:val="0"/>
-          <w:numId w:val="2"/>
-        </w:numPr>
-        <w:spacing w:before="60" w:after="60"/>
-      </w:pPr>
-      <w:r>
-        <w:t>Stephanie Kramer — docent-onderzoeker, s.kramer2@hva.nl</w:t>
-      </w:r>
-    </w:p>
-    <w:p>
-      <w:pPr>
-        <w:pStyle w:val="Lijstalinea"/>
-        <w:numPr>
-          <w:ilvl w:val="0"/>
-          <w:numId w:val="2"/>
-        </w:numPr>
-        <w:spacing w:before="60" w:after="60"/>
-      </w:pPr>
-      <w:r>
-        <w:t>Michel Oey — docent-onderzoeker, m.a.oey@hva.nl</w:t>
-      </w:r>
-    </w:p>
-    <w:p>
-      <w:pPr>
-        <w:spacing w:before="80" w:after="80"/>
-      </w:pPr>
+        <w:t xml:space="preserve">Het project Juf Aimee wordt begeleid vanuit de onderzoeksgroep </w:t>
+      </w:r>
+      <w:r>
+        <w:rPr>
+          <w:i/>
+          <w:iCs/>
+        </w:rPr>
+        <w:t>Digital Life</w:t>
+      </w:r>
+      <w:r>
+        <w:t xml:space="preserve"> van de Hogeschool van Amsterdam</w:t>
+      </w:r>
+      <w:r>
+        <w:t>:</w:t>
+      </w:r>
+    </w:p>
+    <w:p>
+      <w:pPr>
+        <w:spacing w:before="80" w:after="80"/>
+      </w:pPr>
+    </w:p>
+    <w:p>
+      <w:pPr>
+        <w:rPr>
+          <w:b/>
+          <w:bCs/>
+        </w:rPr>
+      </w:pPr>
+      <w:r>
+        <w:rPr>
+          <w:b/>
+          <w:bCs/>
+        </w:rPr>
+        <w:t xml:space="preserve">Stephanie Kramer      Michel </w:t>
+      </w:r>
+      <w:proofErr w:type="spellStart"/>
+      <w:r>
+        <w:rPr>
+          <w:b/>
+          <w:bCs/>
+        </w:rPr>
+        <w:t>Oey</w:t>
+      </w:r>
+      <w:proofErr w:type="spellEnd"/>
+      <w:r>
+        <w:rPr>
+          <w:b/>
+          <w:bCs/>
+        </w:rPr>
+        <w:t xml:space="preserve"> </w:t>
+      </w:r>
+    </w:p>
+    <w:p>
+      <w:pPr>
+        <w:rPr>
+          <w:i/>
+          <w:iCs/>
+        </w:rPr>
+      </w:pPr>
+      <w:r>
+        <w:rPr>
+          <w:i/>
+          <w:iCs/>
+        </w:rPr>
+        <w:t xml:space="preserve">Docent-onderzoeker   </w:t>
+      </w:r>
+      <w:r>
+        <w:rPr>
+          <w:i/>
+          <w:iCs/>
+        </w:rPr>
+        <w:t xml:space="preserve"> </w:t>
+      </w:r>
+      <w:proofErr w:type="spellStart"/>
+      <w:r>
+        <w:rPr>
+          <w:i/>
+          <w:iCs/>
+        </w:rPr>
+        <w:t>Docent-onderzoeker</w:t>
+      </w:r>
+      <w:proofErr w:type="spellEnd"/>
+    </w:p>
+    <w:p>
+      <w:hyperlink r:id="rId12" w:history="1">
+        <w:r>
+          <w:rPr>
+            <w:rStyle w:val="Hyperlink"/>
+          </w:rPr>
+          <w:t>s.kramer2@hva.nl</w:t>
+        </w:r>
+      </w:hyperlink>
+      <w:r>
+        <w:t xml:space="preserve">       </w:t>
+      </w:r>
+      <w:hyperlink r:id="rId13" w:history="1">
+        <w:r>
+          <w:rPr>
+            <w:rStyle w:val="Hyperlink"/>
+          </w:rPr>
+          <w:t>m.a.oey@hva.nl</w:t>
+        </w:r>
+      </w:hyperlink>
+    </w:p>
+    <w:p>
+      <w:pPr>
+        <w:spacing w:before="80" w:after="80"/>
+      </w:pPr>
+    </w:p>
+    <w:p>
+      <w:pPr>
+        <w:pStyle w:val="Geenafstand"/>
+      </w:pPr>
+      <w:r>
+        <w:t xml:space="preserve">Studenten die werken aan het </w:t>
+      </w:r>
+      <w:proofErr w:type="spellStart"/>
+      <w:r>
+        <w:t>proof</w:t>
+      </w:r>
+      <w:proofErr w:type="spellEnd"/>
+      <w:r>
+        <w:t xml:space="preserve"> of concept doen dit binnen Studio </w:t>
+      </w:r>
+      <w:proofErr w:type="spellStart"/>
+      <w:r>
+        <w:t>Responsible</w:t>
+      </w:r>
+      <w:proofErr w:type="spellEnd"/>
+      <w:r>
+        <w:t xml:space="preserve"> AI.</w:t>
+      </w:r>
+      <w:r>
+        <w:t xml:space="preserve"> </w:t>
+      </w:r>
+    </w:p>
+    <w:p>
+      <w:pPr>
+        <w:pStyle w:val="Geenafstand"/>
+      </w:pPr>
+    </w:p>
+    <w:p>
+      <w:pPr>
+        <w:pStyle w:val="Geenafstand"/>
+      </w:pPr>
+      <w:r>
+        <w:t>Co-designsessies met leraren en leerlingen kunnen worden georganiseerd via de scholen en partijen die betrokken zijn bij het bredere onderzoeksvoorstel.</w:t>
+      </w:r>
     </w:p>
     <w:p>
       <w:pPr>
         <w:spacing w:before="80" w:after="80"/>
         <w:jc w:val="both"/>
       </w:pPr>
-      <w:r>
-        <w:t>Studenten die werken aan het proof of concept doen dit binnen Studio Responsible AI. Co-designsessies met leraren en leerlingen kunnen worden georganiseerd via de scholen en partijen die betrokken zijn bij het bredere onderzoeksvoorstel.</w:t>
-      </w:r>
     </w:p>
     <w:p>
       <w:pPr>
@@ -4540,6 +5601,7 @@
       </w:pPr>
       <w:bookmarkStart w:id="33" w:name="_Toc230782968"/>
       <w:r>
+        <w:lastRenderedPageBreak/>
         <w:t>9. Aanbevelingen</w:t>
       </w:r>
       <w:bookmarkEnd w:id="33"/>
@@ -4550,7 +5612,6 @@
         <w:jc w:val="both"/>
       </w:pPr>
       <w:r>
-        <w:lastRenderedPageBreak/>
         <w:t>Op basis van analyse van de huidige Juf Aimee-implementatie zijn twee concrete aanbevelingen geformuleerd. Deze zijn gebaseerd op bevindingen uit de ontwikkelfasen van het proof of concept en richten zich op de meest urgente verbeterpunten voor een verantwoorde en effectieve inzet van het systeem.</w:t>
       </w:r>
     </w:p>
@@ -4558,105 +5619,180 @@
       <w:pPr>
         <w:pStyle w:val="Kop2"/>
       </w:pPr>
-      <w:bookmarkStart w:id="34" w:name="_Toc230782969"/>
-      <w:r>
-        <w:t>9.1 Beveiliging tegen prompt injection in de AI-pipeline</w:t>
-      </w:r>
-      <w:bookmarkEnd w:id="34"/>
-    </w:p>
-    <w:p>
-      <w:pPr>
-        <w:spacing w:before="80" w:after="80"/>
-        <w:jc w:val="both"/>
-      </w:pPr>
-      <w:r>
-        <w:t>Uit analyse van de Juf Aimee-pipeline is gebleken dat drie invoervelden momenteel ongesaneerd het taalmodel bereiken: het focusgebied van een opdracht (ingevuld door de leraar), de feedback van de leraar op ingeleverd werk, en het ingeleverde werk van de leerling zelf. Er is geen filtering of controle aanwezig voordat deze invoer in de prompt terechtkomt. Dit maakt het systeem kwetsbaar voor prompt injection</w:t>
-      </w:r>
-      <w:r>
-        <w:t xml:space="preserve"> </w:t>
-      </w:r>
-      <w:r>
-        <w:t>een techniek waarbij een gebruiker het model via de invoer kan manipuleren om buiten zijn bedoelde functie te handelen (Perez &amp; Ribeiro, 2022; OWASP LLM Top 10, LLM01).</w:t>
-      </w:r>
-    </w:p>
-    <w:p>
-      <w:pPr>
-        <w:spacing w:before="80" w:after="80"/>
-        <w:jc w:val="both"/>
-      </w:pPr>
-      <w:r>
-        <w:t>Dit risico weegt extra zwaar omdat de doelgroep minderjarige leerlingen zijn. Een gemanipuleerd model kan ongepaste content genereren, antwoorden weggeven of gegevens van andere leerlingen tonen. Dit is strijdig met zowel de AVG als EU AI Act Art. 14, die menselijk toezicht verplicht stelt bij AI-systemen die worden ingezet voor minderjarigen.</w:t>
-      </w:r>
-    </w:p>
-    <w:p>
-      <w:pPr>
-        <w:spacing w:before="80" w:after="80"/>
-        <w:jc w:val="both"/>
-      </w:pPr>
-    </w:p>
-    <w:p>
-      <w:pPr>
-        <w:jc w:val="both"/>
-      </w:pPr>
-      <w:r>
-        <w:rPr>
-          <w:b/>
-        </w:rPr>
-        <w:t>Aanbeveling:</w:t>
-      </w:r>
-      <w:r>
-        <w:t xml:space="preserve"> </w:t>
-      </w:r>
-    </w:p>
-    <w:p>
-      <w:pPr>
-        <w:jc w:val="both"/>
-      </w:pPr>
-      <w:r>
-        <w:t>Voer</w:t>
-      </w:r>
-      <w:r>
-        <w:t xml:space="preserve"> </w:t>
-      </w:r>
-      <w:r>
-        <w:t xml:space="preserve">invoervalidatie en systeemprompt-isolatie in op alle plekken waar gebruikersinvoer het taalmodel bereikt, te beginnen bij de kwetsbaarste invoervelden. </w:t>
-      </w:r>
-    </w:p>
-    <w:p>
-      <w:pPr>
-        <w:jc w:val="both"/>
-      </w:pPr>
-    </w:p>
-    <w:p>
-      <w:pPr>
-        <w:jc w:val="both"/>
-      </w:pPr>
-      <w:r>
-        <w:t>Geprioriteerde maatregelen</w:t>
-      </w:r>
-      <w:r>
-        <w:t>:</w:t>
-      </w:r>
-    </w:p>
-    <w:p>
-      <w:pPr>
-        <w:jc w:val="both"/>
-      </w:pPr>
-      <w:r>
-        <w:t>Ranking</w:t>
-      </w:r>
-      <w:r>
-        <w:t>:</w:t>
-      </w:r>
-    </w:p>
-    <w:p>
-      <w:pPr>
-        <w:jc w:val="both"/>
+      <w:bookmarkStart w:id="34" w:name="_Toc230782970"/>
+      <w:r>
+        <w:t xml:space="preserve">9.1 Beveiliging tegen </w:t>
+      </w:r>
+      <w:r>
         <w:rPr>
           <w:i/>
           <w:iCs/>
         </w:rPr>
-      </w:pPr>
+        <w:t xml:space="preserve">prompt </w:t>
+      </w:r>
+      <w:proofErr w:type="spellStart"/>
+      <w:r>
+        <w:rPr>
+          <w:i/>
+          <w:iCs/>
+        </w:rPr>
+        <w:t>injection</w:t>
+      </w:r>
+      <w:proofErr w:type="spellEnd"/>
+      <w:r>
+        <w:t xml:space="preserve"> in de AI-pipeline</w:t>
+      </w:r>
+    </w:p>
+    <w:p>
+      <w:pPr>
+        <w:pStyle w:val="Geenafstand"/>
+      </w:pPr>
+      <w:r>
+        <w:t xml:space="preserve">Uit analyse van de Juf Aimee-pipeline is gebleken dat drie invoervelden momenteel ongesaneerd het taalmodel bereiken: het focusgebied van een opdracht (ingevuld door de leraar), de feedback van de leraar op ingeleverd werk, en het ingeleverde werk van de leerling zelf. Er is geen filtering of controle aanwezig voordat deze invoer in de prompt terechtkomt. Dit maakt het systeem kwetsbaar voor </w:t>
+      </w:r>
+      <w:r>
+        <w:rPr>
+          <w:i/>
+          <w:iCs/>
+        </w:rPr>
+        <w:t xml:space="preserve">prompt </w:t>
+      </w:r>
+      <w:proofErr w:type="spellStart"/>
+      <w:r>
+        <w:rPr>
+          <w:i/>
+          <w:iCs/>
+        </w:rPr>
+        <w:t>injection</w:t>
+      </w:r>
+      <w:proofErr w:type="spellEnd"/>
+      <w:r>
+        <w:rPr>
+          <w:i/>
+          <w:iCs/>
+        </w:rPr>
+        <w:t xml:space="preserve"> </w:t>
+      </w:r>
+      <w:r>
+        <w:t xml:space="preserve">een techniek waarbij een gebruiker het model via de invoer kan manipuleren om buiten zijn bedoelde functie te handelen </w:t>
+      </w:r>
+      <w:hyperlink r:id="rId14" w:history="1">
+        <w:r>
+          <w:rPr>
+            <w:rStyle w:val="Hyperlink"/>
+          </w:rPr>
+          <w:t xml:space="preserve">(Perez &amp; </w:t>
+        </w:r>
+        <w:proofErr w:type="spellStart"/>
+        <w:r>
+          <w:rPr>
+            <w:rStyle w:val="Hyperlink"/>
+          </w:rPr>
+          <w:t>Ribeiro</w:t>
+        </w:r>
+        <w:proofErr w:type="spellEnd"/>
+        <w:r>
+          <w:rPr>
+            <w:rStyle w:val="Hyperlink"/>
+          </w:rPr>
+          <w:t>, 2022; OWASP LLM Top 10, LLM01).</w:t>
+        </w:r>
+      </w:hyperlink>
+    </w:p>
+    <w:p>
+      <w:pPr>
+        <w:pStyle w:val="Geenafstand"/>
+      </w:pPr>
+    </w:p>
+    <w:p>
+      <w:pPr>
+        <w:pStyle w:val="Geenafstand"/>
+      </w:pPr>
+      <w:r>
+        <w:t>Dit risico weegt extra zwaar omdat de doelgroep minderjarige leerlingen zijn. Een gemanipuleerd model kan ongepaste content genereren, antwoorden weggeven of gegevens van andere leerlingen tonen. Dit is strijdig met zowel de AVG als EU AI Act Art. 14, die menselijk toezicht verplicht stelt bij AI-systemen die worden ingezet voor minderjarigen.</w:t>
+      </w:r>
+    </w:p>
+    <w:p>
+      <w:pPr>
+        <w:spacing w:before="80" w:after="80"/>
+        <w:jc w:val="both"/>
+      </w:pPr>
+    </w:p>
+    <w:p>
+      <w:pPr>
+        <w:spacing w:after="120"/>
+        <w:jc w:val="both"/>
+      </w:pPr>
+      <w:r>
+        <w:rPr>
+          <w:b/>
+        </w:rPr>
+        <w:t>Aanbeveling:</w:t>
+      </w:r>
+      <w:r>
+        <w:t xml:space="preserve"> </w:t>
+      </w:r>
+    </w:p>
+    <w:p>
+      <w:pPr>
+        <w:pStyle w:val="Geenafstand"/>
+        <w:spacing w:after="120"/>
+      </w:pPr>
+      <w:r>
+        <w:t xml:space="preserve">Voer invoervalidatie en systeemprompt-isolatie in op alle plekken waar gebruikersinvoer het taalmodel bereikt, te beginnen bij de kwetsbaarste invoervelden. </w:t>
+      </w:r>
+    </w:p>
+    <w:p>
+      <w:pPr>
+        <w:jc w:val="both"/>
+      </w:pPr>
+    </w:p>
+    <w:p>
+      <w:pPr>
+        <w:pStyle w:val="Geenafstand"/>
+      </w:pPr>
+      <w:r>
+        <w:t>Geprioriteerde maatregelen</w:t>
+      </w:r>
+      <w:r>
+        <w:t>:</w:t>
+      </w:r>
+    </w:p>
+    <w:p>
+      <w:pPr>
+        <w:pStyle w:val="Geenafstand"/>
+      </w:pPr>
+      <w:r>
+        <w:t>Ranking:</w:t>
+      </w:r>
+    </w:p>
+    <w:p>
+      <w:pPr>
+        <w:pStyle w:val="Geenafstand"/>
+      </w:pPr>
+    </w:p>
+    <w:p>
+      <w:pPr>
+        <w:pStyle w:val="Geenafstand"/>
+        <w:numPr>
+          <w:ilvl w:val="0"/>
+          <w:numId w:val="3"/>
+        </w:numPr>
+        <w:rPr>
+          <w:i/>
+          <w:iCs/>
+        </w:rPr>
+      </w:pPr>
+      <w:r>
+        <w:t>Systeemprompt</w:t>
+      </w:r>
+      <w:r>
+        <w:rPr>
+          <w:i/>
+          <w:iCs/>
+        </w:rPr>
+        <w:t>-isolatie</w:t>
+      </w:r>
     </w:p>
     <w:p>
       <w:pPr>
@@ -4676,7 +5812,7 @@
           <w:i/>
           <w:iCs/>
         </w:rPr>
-        <w:t>Systeemprompt-isolatie</w:t>
+        <w:t xml:space="preserve">Scheiding tussen vaste AI-instructies en gebruikersinvoer; </w:t>
       </w:r>
     </w:p>
     <w:p>
@@ -4686,7 +5822,6 @@
           <w:ilvl w:val="0"/>
           <w:numId w:val="3"/>
         </w:numPr>
-        <w:spacing w:before="80" w:after="80"/>
         <w:jc w:val="both"/>
         <w:rPr>
           <w:i/>
@@ -4698,7 +5833,7 @@
           <w:i/>
           <w:iCs/>
         </w:rPr>
-        <w:t xml:space="preserve">Scheiding tussen vaste AI-instructies en gebruikersinvoer; </w:t>
+        <w:t xml:space="preserve">Invoerfiltering op bekende injectiepatronen; </w:t>
       </w:r>
     </w:p>
     <w:p>
@@ -4708,7 +5843,6 @@
           <w:ilvl w:val="0"/>
           <w:numId w:val="3"/>
         </w:numPr>
-        <w:spacing w:before="80" w:after="80"/>
         <w:jc w:val="both"/>
         <w:rPr>
           <w:i/>
@@ -4720,7 +5854,7 @@
           <w:i/>
           <w:iCs/>
         </w:rPr>
-        <w:t xml:space="preserve">Invoerfiltering op bekende injectiepatronen; </w:t>
+        <w:t xml:space="preserve">Outputvalidatie; </w:t>
       </w:r>
     </w:p>
     <w:p>
@@ -4730,7 +5864,6 @@
           <w:ilvl w:val="0"/>
           <w:numId w:val="3"/>
         </w:numPr>
-        <w:spacing w:before="80"/>
         <w:jc w:val="both"/>
         <w:rPr>
           <w:i/>
@@ -4742,87 +5875,79 @@
           <w:i/>
           <w:iCs/>
         </w:rPr>
-        <w:t xml:space="preserve">Outputvalidatie; </w:t>
-      </w:r>
-    </w:p>
-    <w:p>
-      <w:pPr>
-        <w:pStyle w:val="Lijstalinea"/>
-        <w:numPr>
-          <w:ilvl w:val="0"/>
-          <w:numId w:val="3"/>
-        </w:numPr>
-        <w:spacing w:before="80"/>
+        <w:t>Auditlogging van interacties voor controle achteraf door de leraar of beheerder.</w:t>
+      </w:r>
+    </w:p>
+    <w:p>
+      <w:pPr>
+        <w:ind w:left="360"/>
         <w:jc w:val="both"/>
         <w:rPr>
           <w:i/>
           <w:iCs/>
         </w:rPr>
       </w:pPr>
-      <w:r>
-        <w:rPr>
-          <w:i/>
-          <w:iCs/>
-        </w:rPr>
-        <w:t>Auditlogging van interacties voor controle achteraf door de leraar of beheerder.</w:t>
-      </w:r>
-    </w:p>
-    <w:p>
-      <w:pPr>
-        <w:pStyle w:val="Lijstalinea"/>
-        <w:spacing w:before="80"/>
-        <w:ind w:left="720"/>
+    </w:p>
+    <w:p>
+      <w:pPr>
+        <w:spacing w:after="120"/>
         <w:jc w:val="both"/>
         <w:rPr>
-          <w:i/>
-          <w:iCs/>
-        </w:rPr>
-      </w:pPr>
-    </w:p>
-    <w:p>
-      <w:pPr>
-        <w:spacing w:before="80"/>
+          <w:b/>
+        </w:rPr>
+      </w:pPr>
+      <w:r>
+        <w:rPr>
+          <w:b/>
+        </w:rPr>
+        <w:t xml:space="preserve">Maatschappelijke impact: </w:t>
+      </w:r>
+    </w:p>
+    <w:p>
+      <w:pPr>
+        <w:pStyle w:val="Geenafstand"/>
+        <w:spacing w:after="120"/>
+      </w:pPr>
+      <w:r>
+        <w:t xml:space="preserve">Voor leerlingen biedt dit bescherming tegen misbruik en garandeert het pedagogisch verantwoorde AI-uitvoer. Voor scholen en de opdrachtgever verlaagt het </w:t>
+      </w:r>
+      <w:proofErr w:type="spellStart"/>
+      <w:r>
+        <w:t>het</w:t>
+      </w:r>
+      <w:proofErr w:type="spellEnd"/>
+      <w:r>
+        <w:t xml:space="preserve"> juridisch en reputatierisico bij inzet van het platform en maakt het aantoonbare naleving van de AVG en EU AI Act mogelijk.</w:t>
+      </w:r>
+    </w:p>
+    <w:p>
+      <w:pPr>
+        <w:pStyle w:val="Geenafstand"/>
+        <w:spacing w:after="120"/>
+      </w:pPr>
+    </w:p>
+    <w:p>
+      <w:pPr>
+        <w:pStyle w:val="Geenafstand"/>
+        <w:spacing w:after="120"/>
+      </w:pPr>
+    </w:p>
+    <w:p>
+      <w:pPr>
+        <w:pStyle w:val="Kop2"/>
+      </w:pPr>
+      <w:r>
+        <w:lastRenderedPageBreak/>
+        <w:t>9.2 RAS verrijken met individuele leerlingvoortgang</w:t>
+      </w:r>
+      <w:bookmarkEnd w:id="34"/>
+    </w:p>
+    <w:p>
+      <w:pPr>
         <w:jc w:val="both"/>
       </w:pPr>
       <w:r>
-        <w:rPr>
-          <w:b/>
-        </w:rPr>
-        <w:t>Maatschappelijke impact:</w:t>
-      </w:r>
-      <w:r>
-        <w:t xml:space="preserve"> </w:t>
-      </w:r>
-    </w:p>
-    <w:p>
-      <w:pPr>
-        <w:spacing w:before="80"/>
-        <w:jc w:val="both"/>
-      </w:pPr>
-      <w:r>
-        <w:t>Voor leerlingen biedt dit bescherming tegen misbruik en garandeert het pedagogisch verantwoorde AI-uitvoer. Voor scholen en de opdrachtgever verlaagt het het juridisch en reputatierisico bij inzet van het platform en maakt het aantoonbare naleving van de AVG en EU AI Act mogelijk.</w:t>
-      </w:r>
-    </w:p>
-    <w:p>
-      <w:pPr>
-        <w:pStyle w:val="Kop2"/>
-      </w:pPr>
-      <w:bookmarkStart w:id="35" w:name="_Toc230782970"/>
-      <w:r>
-        <w:t>9.2 RAS verrijken met individuele leerlingvoortgang</w:t>
-      </w:r>
-      <w:bookmarkEnd w:id="35"/>
-    </w:p>
-    <w:p>
-      <w:pPr>
-        <w:jc w:val="both"/>
-      </w:pPr>
-      <w:r>
-        <w:t xml:space="preserve">De huidige RAS-pipeline (Retrieval and Structured Augmented Generation) gebruikt het Individueel Ontwikkelingsperspectief (OPP) als primaire context voor het genereren van opdrachten. Dit is een statisch startpunt: het OPP beschrijft wie de leerling was bij aanvang, maar verwerkt niet wat de leerling sindsdien heeft </w:t>
-      </w:r>
-      <w:r>
-        <w:lastRenderedPageBreak/>
-        <w:t>gedaan, geleerd of gereflecteerd. In de praktijk betekent dit dat gegenereerde opdrachten en aanbevelingen nauwelijks rekening houden met recente prestaties, patronen in fouten of de ontwikkeling die de leerling heeft doorgemaakt.</w:t>
+        <w:t>De huidige RAS-pipeline (Retrieval and Structured Augmented Generation) gebruikt het Individueel Ontwikkelingsperspectief (OPP) als primaire context voor het genereren van opdrachten. Dit is een statisch startpunt: het OPP beschrijft wie de leerling was bij aanvang, maar verwerkt niet wat de leerling sindsdien heeft gedaan, geleerd of gereflecteerd. In de praktijk betekent dit dat gegenereerde opdrachten en aanbevelingen nauwelijks rekening houden met recente prestaties, patronen in fouten of de ontwikkeling die de leerling heeft doorgemaakt.</w:t>
       </w:r>
     </w:p>
     <w:p>
@@ -4911,6 +6036,91 @@
       <w:r>
         <w:t>een structureel knelpunt in het onderwijs voor hoogbegaafde leerlingen.</w:t>
       </w:r>
+    </w:p>
+    <w:p>
+      <w:pPr>
+        <w:spacing w:before="80" w:after="80"/>
+      </w:pPr>
+    </w:p>
+    <w:p>
+      <w:pPr>
+        <w:spacing w:before="80" w:after="80"/>
+      </w:pPr>
+    </w:p>
+    <w:p>
+      <w:pPr>
+        <w:spacing w:before="80" w:after="80"/>
+      </w:pPr>
+    </w:p>
+    <w:p>
+      <w:pPr>
+        <w:spacing w:before="80" w:after="80"/>
+      </w:pPr>
+    </w:p>
+    <w:p>
+      <w:pPr>
+        <w:spacing w:before="80" w:after="80"/>
+      </w:pPr>
+    </w:p>
+    <w:p>
+      <w:pPr>
+        <w:spacing w:before="80" w:after="80"/>
+      </w:pPr>
+    </w:p>
+    <w:p>
+      <w:pPr>
+        <w:spacing w:before="80" w:after="80"/>
+      </w:pPr>
+    </w:p>
+    <w:p>
+      <w:pPr>
+        <w:spacing w:before="80" w:after="80"/>
+      </w:pPr>
+    </w:p>
+    <w:p>
+      <w:pPr>
+        <w:spacing w:before="80" w:after="80"/>
+      </w:pPr>
+    </w:p>
+    <w:p>
+      <w:pPr>
+        <w:spacing w:before="80" w:after="80"/>
+      </w:pPr>
+    </w:p>
+    <w:p>
+      <w:pPr>
+        <w:spacing w:before="80" w:after="80"/>
+      </w:pPr>
+    </w:p>
+    <w:p>
+      <w:pPr>
+        <w:spacing w:before="80" w:after="80"/>
+      </w:pPr>
+    </w:p>
+    <w:p>
+      <w:pPr>
+        <w:spacing w:before="80" w:after="80"/>
+      </w:pPr>
+    </w:p>
+    <w:p>
+      <w:pPr>
+        <w:spacing w:before="80" w:after="80"/>
+      </w:pPr>
+    </w:p>
+    <w:p>
+      <w:pPr>
+        <w:spacing w:before="80" w:after="80"/>
+      </w:pPr>
+    </w:p>
+    <w:p>
+      <w:pPr>
+        <w:spacing w:before="80" w:after="80"/>
+      </w:pPr>
+    </w:p>
+    <w:p>
+      <w:pPr>
+        <w:spacing w:before="80" w:after="80"/>
+      </w:pPr>
     </w:p>
     <w:p>
       <w:pPr>
@@ -4924,16 +6134,14 @@
           <w:bottom w:val="single" w:sz="4" w:space="4" w:color="2E75B6"/>
         </w:pBdr>
       </w:pPr>
-      <w:bookmarkStart w:id="36" w:name="_Toc230782971"/>
-      <w:r>
+      <w:r>
+        <w:lastRenderedPageBreak/>
         <w:t>10. Future Work</w:t>
       </w:r>
-      <w:bookmarkEnd w:id="36"/>
-    </w:p>
-    <w:p>
-      <w:pPr>
-        <w:spacing w:before="80" w:after="80"/>
-        <w:jc w:val="both"/>
+    </w:p>
+    <w:p>
+      <w:pPr>
+        <w:pStyle w:val="Geenafstand"/>
       </w:pPr>
       <w:r>
         <w:t>Op basis van de gerealiseerde architectuur en inzichten uit analyse en modelonderzoek zijn drie doorontwikkelingen kansrijk voor een volgende fase van Juf Aimee. Deze zijn bewust niet als directe aanbevelingen geformuleerd, maar als toekomstige richtingen die voortbouwen op de huidige implementatie.</w:t>
@@ -4943,226 +6151,152 @@
       <w:pPr>
         <w:pStyle w:val="Kop2"/>
       </w:pPr>
-      <w:bookmarkStart w:id="37" w:name="_Toc230782972"/>
       <w:r>
         <w:t>10.1 AI-gespreksassistent voor leerlingen</w:t>
       </w:r>
-      <w:bookmarkEnd w:id="37"/>
-    </w:p>
-    <w:p>
-      <w:pPr>
-        <w:spacing w:before="80" w:after="80"/>
-        <w:jc w:val="both"/>
-      </w:pPr>
-      <w:r>
-        <w:t>De hybride architectuur van Juf Aimee bevat reeds een chat-modelcomponent voor begeleiding. Een logische vervolgstap is een zijpaneel waarmee leerlingen tijdens het maken van een opdracht vragen kunnen stellen. Het model geeft geen antwoorden maar hints, gebaseerd op de Socratische methode. Dit bevordert zelfstandig redeneren, wat essentieel is voor hoogbegaafde leerlingen. Conform EU AI Act Art. 14 blijft de leraar te allen tijde in staat de assistent te monitoren en in te grijpen.</w:t>
+    </w:p>
+    <w:p>
+      <w:pPr>
+        <w:pStyle w:val="Geenafstand"/>
+      </w:pPr>
+      <w:r>
+        <w:t xml:space="preserve">De hybride architectuur van Juf Aimee bevat </w:t>
+      </w:r>
+      <w:proofErr w:type="gramStart"/>
+      <w:r>
+        <w:t>reeds</w:t>
+      </w:r>
+      <w:proofErr w:type="gramEnd"/>
+      <w:r>
+        <w:t xml:space="preserve"> een chat-modelcomponent voor begeleiding. Een logische vervolgstap is een zijpaneel waarmee leerlingen tijdens het maken van een opdracht vragen kunnen stellen. Het model geeft geen antwoorden maar hints, gebaseerd op de Socratische methode. Dit bevordert zelfstandig redeneren, wat essentieel is voor hoogbegaafde leerlingen. </w:t>
+      </w:r>
+      <w:proofErr w:type="gramStart"/>
+      <w:r>
+        <w:t>Conform</w:t>
+      </w:r>
+      <w:proofErr w:type="gramEnd"/>
+      <w:r>
+        <w:t xml:space="preserve"> </w:t>
+      </w:r>
+      <w:hyperlink r:id="rId15" w:history="1">
+        <w:r>
+          <w:rPr>
+            <w:rStyle w:val="Hyperlink"/>
+          </w:rPr>
+          <w:t>EU AI Act Art. 14</w:t>
+        </w:r>
+      </w:hyperlink>
+      <w:r>
+        <w:t xml:space="preserve"> blijft de leraar te allen tijde in staat de assistent te monitoren en in te grijpen.</w:t>
       </w:r>
     </w:p>
     <w:p>
       <w:pPr>
         <w:pStyle w:val="Kop2"/>
       </w:pPr>
-      <w:bookmarkStart w:id="38" w:name="_Toc230782973"/>
-      <w:r>
-        <w:t>10.2 Anonimisering van leerlingdata</w:t>
-      </w:r>
-      <w:bookmarkEnd w:id="38"/>
-    </w:p>
-    <w:p>
-      <w:pPr>
-        <w:spacing w:before="80" w:after="80"/>
-        <w:jc w:val="both"/>
-      </w:pPr>
-      <w:r>
-        <w:t xml:space="preserve">In de productiefase wordt gewerkt met echte persoonsgegevens van kinderen. De AVG art. 5(1)(c) schrijft dataminimalisatie voor. Concreet advies voor een volgende fase: OPP-embeddings worden opgeslagen onder een pseudoniem leerling-ID in plaats van de naam van de leerling, namen worden uitsluitend getoond aan de direct verantwoordelijke leraar, en er geldt een bewaartermijn gekoppeld aan de schoolloopbaan. Externe AI-providers ontvangen nooit ruwe leerlingdata, in lijn met het geadviseerde lokale </w:t>
+      <w:r>
+        <w:t xml:space="preserve">10.2 </w:t>
       </w:r>
       <w:proofErr w:type="spellStart"/>
       <w:r>
-        <w:t>deployment</w:t>
+        <w:t>Anonimisering</w:t>
       </w:r>
       <w:proofErr w:type="spellEnd"/>
       <w:r>
-        <w:t>-model.</w:t>
-      </w:r>
-    </w:p>
-    <w:p>
-      <w:pPr>
-        <w:spacing w:before="80" w:after="80"/>
-        <w:jc w:val="both"/>
-      </w:pPr>
-    </w:p>
-    <w:p>
-      <w:pPr>
-        <w:spacing w:before="80" w:after="80"/>
-        <w:jc w:val="both"/>
-      </w:pPr>
-    </w:p>
-    <w:p>
-      <w:pPr>
-        <w:spacing w:before="80" w:after="80"/>
-        <w:jc w:val="both"/>
-      </w:pPr>
-    </w:p>
-    <w:p>
-      <w:pPr>
-        <w:spacing w:before="80" w:after="80"/>
-        <w:jc w:val="both"/>
-      </w:pPr>
+        <w:t xml:space="preserve"> van </w:t>
+      </w:r>
+      <w:proofErr w:type="spellStart"/>
+      <w:r>
+        <w:t>leerlingdata</w:t>
+      </w:r>
+      <w:proofErr w:type="spellEnd"/>
+    </w:p>
+    <w:p>
+      <w:pPr>
+        <w:pStyle w:val="Geenafstand"/>
+      </w:pPr>
+      <w:r>
+        <w:t>In de productiefase wordt gewerkt met echte persoonsgegevens van kinderen. De AVG art. 5(1)(c) schrijft dataminimalisatie voor. Concreet advies voor een volgende fase: OPP-</w:t>
+      </w:r>
+      <w:proofErr w:type="spellStart"/>
+      <w:r>
+        <w:t>embeddings</w:t>
+      </w:r>
+      <w:proofErr w:type="spellEnd"/>
+      <w:r>
+        <w:t xml:space="preserve"> worden opgeslagen onder een pseudoniem leerling-ID in plaats van de naam van de leerling, namen worden uitsluitend getoond aan de direct verantwoordelijke leraar, en er geldt een bewaartermijn gekoppeld aan de schoolloopbaan. Externe AI-providers ontvangen nooit ruwe leerlingdata, in lijn met het geadviseerde lokale deployment-model.</w:t>
+      </w:r>
     </w:p>
     <w:p>
       <w:pPr>
         <w:pStyle w:val="Kop2"/>
       </w:pPr>
-      <w:bookmarkStart w:id="39" w:name="_Toc230782974"/>
       <w:r>
         <w:t>10.3 Ouderportaal met inzagerecht</w:t>
       </w:r>
-      <w:bookmarkEnd w:id="39"/>
-    </w:p>
-    <w:p>
-      <w:pPr>
-        <w:spacing w:before="80" w:after="80"/>
-        <w:jc w:val="both"/>
-      </w:pPr>
-      <w:r>
-        <w:t>Ouders van leerlingen hebben op basis van AVG art. 15 het recht op inzage in welke gegevens over hun kind worden verwerkt. Een eenvoudig ouderportaal — uitsluitend met leesrechten, zonder bewerkingsmogelijkheden — maakt Juf Aimee transparant naar alle betrokkenen en vergroot het vertrouwen van scholen in de inzet van het platform. Dit sluit direct aan op de eis van uitlegbaarheid (XAI) en mensgerichte AI zoals beschreven in het theoretisch kader.</w:t>
+    </w:p>
+    <w:p>
+      <w:pPr>
+        <w:pStyle w:val="Geenafstand"/>
+      </w:pPr>
+      <w:r>
+        <w:t xml:space="preserve">Ouders van leerlingen hebben op basis van AVG art. 15 het recht op inzage in welke gegevens over hun kind worden verwerkt. Een eenvoudig ouderportaal uitsluitend met leesrechten, zonder bewerkingsmogelijkheden maakt Juf Aimee transparant naar alle betrokkenen en vergroot het vertrouwen van scholen in de inzet van het platform. Dit sluit direct aan op de eis van uitlegbaarheid </w:t>
+      </w:r>
+      <w:hyperlink r:id="rId16" w:history="1">
+        <w:r>
+          <w:rPr>
+            <w:rStyle w:val="Hyperlink"/>
+          </w:rPr>
+          <w:t>(XAI)</w:t>
+        </w:r>
+      </w:hyperlink>
+      <w:r>
+        <w:t xml:space="preserve"> en mensgerichte AI zoals beschreven in het theoretisch kader.</w:t>
       </w:r>
     </w:p>
     <w:p>
       <w:pPr>
         <w:pStyle w:val="Kop2"/>
       </w:pPr>
-      <w:bookmarkStart w:id="40" w:name="_Toc230782975"/>
-      <w:r>
-        <w:t>10.4 AI-taalbuddy voor leerlingen</w:t>
-      </w:r>
-      <w:bookmarkEnd w:id="40"/>
+      <w:r>
+        <w:t xml:space="preserve">10.4 AI-taalbuddy voor leerlingen </w:t>
+      </w:r>
+    </w:p>
+    <w:p>
+      <w:pPr>
+        <w:pStyle w:val="Geenafstand"/>
+      </w:pPr>
+      <w:r>
+        <w:t xml:space="preserve">Een logische doorontwikkeling van Juf Aimee is een gespreksgerichte AI-taalbuddy waarmee leerlingen een vreemde taal kunnen oefenen via gesproken dialoog. Hoogbegaafde leerlingen leren doorgaans sneller een nieuwe taal, maar vinden binnen de reguliere klas weinig ruimte voor individuele oefening </w:t>
+      </w:r>
+      <w:r>
+        <w:t>(</w:t>
+      </w:r>
+      <w:hyperlink r:id="rId17" w:history="1">
+        <w:r>
+          <w:rPr>
+            <w:rStyle w:val="Hyperlink"/>
+          </w:rPr>
+          <w:t>Hornstra et al, 2023)</w:t>
+        </w:r>
+      </w:hyperlink>
       <w:r>
         <w:t xml:space="preserve"> </w:t>
       </w:r>
-    </w:p>
-    <w:p>
-      <w:pPr>
-        <w:spacing w:before="80" w:after="80"/>
-        <w:jc w:val="both"/>
-      </w:pPr>
-      <w:r>
-        <w:t xml:space="preserve">Een logische doorontwikkeling van Juf Aimee is een gespreksgerichte AI-taalbuddy waarmee leerlingen een vreemde taal kunnen oefenen via gesproken dialoog. Hoogbegaafde leerlingen leren doorgaans sneller een nieuwe taal, maar vinden binnen de reguliere klas weinig ruimte voor individuele oefening </w:t>
-      </w:r>
-      <w:r>
-        <w:t xml:space="preserve">(Hornstra et al, 2023) </w:t>
-      </w:r>
       <w:r>
         <w:t xml:space="preserve">Een AI-taalbuddy biedt die oefentijd op maat: het systeem stemt de gespreksonderwerpen en moeilijkheidsgraad af op de interesses en het niveau van de leerling, zoals vastgelegd in het </w:t>
       </w:r>
-      <w:r>
-        <w:t>leerlingprofiel en het opbouwende portfolio</w:t>
+      <w:proofErr w:type="spellStart"/>
+      <w:r>
+        <w:t>leerlingprofiel</w:t>
+      </w:r>
+      <w:proofErr w:type="spellEnd"/>
+      <w:r>
+        <w:t xml:space="preserve"> en het opbouwende portfolio</w:t>
       </w:r>
       <w:r>
         <w:t>. De leerkracht houdt altijd inzicht in de voortgang en blijft eindverantwoordelijk voor de taalontwikkeling van de leerling.</w:t>
       </w:r>
-    </w:p>
-    <w:p>
-      <w:pPr>
-        <w:spacing w:before="80" w:after="80"/>
-        <w:jc w:val="both"/>
-      </w:pPr>
-    </w:p>
-    <w:p>
-      <w:pPr>
-        <w:spacing w:before="80" w:after="80"/>
-        <w:jc w:val="both"/>
-      </w:pPr>
-    </w:p>
-    <w:p>
-      <w:pPr>
-        <w:spacing w:before="80" w:after="80"/>
-        <w:jc w:val="both"/>
-      </w:pPr>
-    </w:p>
-    <w:p>
-      <w:pPr>
-        <w:spacing w:before="80" w:after="80"/>
-        <w:jc w:val="both"/>
-      </w:pPr>
-    </w:p>
-    <w:p>
-      <w:pPr>
-        <w:spacing w:before="80" w:after="80"/>
-        <w:jc w:val="both"/>
-      </w:pPr>
-    </w:p>
-    <w:p>
-      <w:pPr>
-        <w:spacing w:before="80" w:after="80"/>
-        <w:jc w:val="both"/>
-      </w:pPr>
-    </w:p>
-    <w:p>
-      <w:pPr>
-        <w:spacing w:before="80" w:after="80"/>
-        <w:jc w:val="both"/>
-      </w:pPr>
-    </w:p>
-    <w:p>
-      <w:pPr>
-        <w:spacing w:before="80" w:after="80"/>
-        <w:jc w:val="both"/>
-      </w:pPr>
-    </w:p>
-    <w:p>
-      <w:pPr>
-        <w:spacing w:before="80" w:after="80"/>
-        <w:jc w:val="both"/>
-      </w:pPr>
-    </w:p>
-    <w:p>
-      <w:pPr>
-        <w:spacing w:before="80" w:after="80"/>
-        <w:jc w:val="both"/>
-      </w:pPr>
-    </w:p>
-    <w:p>
-      <w:pPr>
-        <w:spacing w:before="80" w:after="80"/>
-        <w:jc w:val="both"/>
-      </w:pPr>
-    </w:p>
-    <w:p>
-      <w:pPr>
-        <w:spacing w:before="80" w:after="80"/>
-        <w:jc w:val="both"/>
-      </w:pPr>
-    </w:p>
-    <w:p>
-      <w:pPr>
-        <w:spacing w:before="80" w:after="80"/>
-        <w:jc w:val="both"/>
-      </w:pPr>
-    </w:p>
-    <w:p>
-      <w:pPr>
-        <w:spacing w:before="80" w:after="80"/>
-        <w:jc w:val="both"/>
-      </w:pPr>
-    </w:p>
-    <w:p>
-      <w:pPr>
-        <w:spacing w:before="80" w:after="80"/>
-        <w:jc w:val="both"/>
-      </w:pPr>
-    </w:p>
-    <w:p>
-      <w:pPr>
-        <w:spacing w:before="80" w:after="80"/>
-        <w:jc w:val="both"/>
-      </w:pPr>
-    </w:p>
-    <w:p>
-      <w:pPr>
-        <w:spacing w:before="80" w:after="80"/>
-        <w:jc w:val="both"/>
-      </w:pPr>
     </w:p>
     <w:p>
       <w:pPr>
@@ -5225,11 +6359,11 @@
           <w:bottom w:val="single" w:sz="4" w:space="4" w:color="2E75B6"/>
         </w:pBdr>
       </w:pPr>
-      <w:bookmarkStart w:id="41" w:name="_Toc230782976"/>
+      <w:bookmarkStart w:id="35" w:name="_Toc230782976"/>
       <w:r>
         <w:t>11. Literatuur</w:t>
       </w:r>
-      <w:bookmarkEnd w:id="41"/>
+      <w:bookmarkEnd w:id="35"/>
     </w:p>
     <w:p>
       <w:pPr>
@@ -5411,7 +6545,7 @@
           <w:lang w:val="en-GB"/>
         </w:rPr>
       </w:pPr>
-      <w:hyperlink r:id="rId8" w:history="1">
+      <w:hyperlink r:id="rId18" w:history="1">
         <w:r>
           <w:rPr>
             <w:rStyle w:val="Hyperlink"/>
@@ -5440,14 +6574,28 @@
         <w:rPr>
           <w:lang w:val="en-GB"/>
         </w:rPr>
-        <w:t xml:space="preserve">Perez, F., &amp; Ribeiro, I. (2022). Ignore Previous Prompt: Attack Techniques For Language Models. arXiv. </w:t>
+        <w:t xml:space="preserve">Perez, F., &amp; Ribeiro, I. (2022). Ignore Previous Prompt: Attack Techniques </w:t>
+      </w:r>
+      <w:proofErr w:type="gramStart"/>
+      <w:r>
+        <w:rPr>
+          <w:lang w:val="en-GB"/>
+        </w:rPr>
+        <w:t>For</w:t>
+      </w:r>
+      <w:proofErr w:type="gramEnd"/>
+      <w:r>
+        <w:rPr>
+          <w:lang w:val="en-GB"/>
+        </w:rPr>
+        <w:t xml:space="preserve"> Language Models. arXiv. </w:t>
       </w:r>
     </w:p>
     <w:p>
       <w:pPr>
         <w:pStyle w:val="Lijstalinea"/>
       </w:pPr>
-      <w:hyperlink r:id="rId9" w:history="1">
+      <w:hyperlink r:id="rId19" w:history="1">
         <w:r>
           <w:rPr>
             <w:rStyle w:val="Hyperlink"/>
@@ -5517,7 +6665,7 @@
           <w:lang w:val="en-GB"/>
         </w:rPr>
       </w:pPr>
-      <w:hyperlink r:id="rId10" w:history="1">
+      <w:hyperlink r:id="rId20" w:history="1">
         <w:r>
           <w:rPr>
             <w:rStyle w:val="Hyperlink"/>
@@ -5536,7 +6684,8 @@
       </w:pPr>
     </w:p>
     <w:sectPr>
-      <w:footerReference w:type="default" r:id="rId11"/>
+      <w:footerReference w:type="even" r:id="rId21"/>
+      <w:footerReference w:type="default" r:id="rId22"/>
       <w:pgSz w:w="11906" w:h="16838"/>
       <w:pgMar w:top="1440" w:right="1440" w:bottom="1440" w:left="1800" w:header="708" w:footer="708" w:gutter="0"/>
       <w:cols w:space="708"/>
@@ -5567,8 +6716,121 @@
 
 <file path=word/footer1.xml><?xml version="1.0" encoding="utf-8"?>
 <w:ftr xmlns:wpc="http://schemas.microsoft.com/office/word/2010/wordprocessingCanvas" xmlns:cx="http://schemas.microsoft.com/office/drawing/2014/chartex" xmlns:cx1="http://schemas.microsoft.com/office/drawing/2015/9/8/chartex" xmlns:cx2="http://schemas.microsoft.com/office/drawing/2015/10/21/chartex" xmlns:cx3="http://schemas.microsoft.com/office/drawing/2016/5/9/chartex" xmlns:cx4="http://schemas.microsoft.com/office/drawing/2016/5/10/chartex" xmlns:cx5="http://schemas.microsoft.com/office/drawing/2016/5/11/chartex" xmlns:cx6="http://schemas.microsoft.com/office/drawing/2016/5/12/chartex" xmlns:cx7="http://schemas.microsoft.com/office/drawing/2016/5/13/chartex" xmlns:cx8="http://schemas.microsoft.com/office/drawing/2016/5/14/chartex" xmlns:mc="http://schemas.openxmlformats.org/markup-compatibility/2006" xmlns:aink="http://schemas.microsoft.com/office/drawing/2016/ink" xmlns:am3d="http://schemas.microsoft.com/office/drawing/2017/model3d" xmlns:o="urn:schemas-microsoft-com:office:office" xmlns:oel="http://schemas.microsoft.com/office/2019/extlst" xmlns:r="http://schemas.openxmlformats.org/officeDocument/2006/relationships" xmlns:m="http://schemas.openxmlformats.org/officeDocument/2006/math" xmlns:v="urn:schemas-microsoft-com:vml" xmlns:wp14="http://schemas.microsoft.com/office/word/2010/wordprocessingDrawing" xmlns:wp="http://schemas.openxmlformats.org/drawingml/2006/wordprocessingDrawing" xmlns:w10="urn:schemas-microsoft-com:office:word" xmlns:w="http://schemas.openxmlformats.org/wordprocessingml/2006/main" xmlns:w14="http://schemas.microsoft.com/office/word/2010/wordml" xmlns:w15="http://schemas.microsoft.com/office/word/2012/wordml" xmlns:w16cex="http://schemas.microsoft.com/office/word/2018/wordml/cex" xmlns:w16cid="http://schemas.microsoft.com/office/word/2016/wordml/cid" xmlns:w16="http://schemas.microsoft.com/office/word/2018/wordml" xmlns:w16du="http://schemas.microsoft.com/office/word/2023/wordml/word16du" xmlns:w16sdtdh="http://schemas.microsoft.com/office/word/2020/wordml/sdtdatahash" xmlns:w16sdtfl="http://schemas.microsoft.com/office/word/2024/wordml/sdtformatlock" xmlns:w16se="http://schemas.microsoft.com/office/word/2015/wordml/symex" xmlns:wpg="http://schemas.microsoft.com/office/word/2010/wordprocessingGroup" xmlns:wpi="http://schemas.microsoft.com/office/word/2010/wordprocessingInk" xmlns:wne="http://schemas.microsoft.com/office/word/2006/wordml" xmlns:wps="http://schemas.microsoft.com/office/word/2010/wordprocessingShape" mc:Ignorable="w14 w15 w16se w16cid w16 w16cex w16sdtdh w16sdtfl w16du wp14">
+  <w:sdt>
+    <w:sdtPr>
+      <w:rPr>
+        <w:rStyle w:val="Paginanummer"/>
+      </w:rPr>
+      <w:id w:val="229280310"/>
+      <w:docPartObj>
+        <w:docPartGallery w:val="Page Numbers (Bottom of Page)"/>
+        <w:docPartUnique/>
+      </w:docPartObj>
+    </w:sdtPr>
+    <w:sdtContent>
+      <w:p>
+        <w:pPr>
+          <w:pStyle w:val="Voettekst"/>
+          <w:framePr w:wrap="none" w:vAnchor="text" w:hAnchor="margin" w:xAlign="right" w:y="1"/>
+          <w:rPr>
+            <w:rStyle w:val="Paginanummer"/>
+          </w:rPr>
+        </w:pPr>
+        <w:r>
+          <w:rPr>
+            <w:rStyle w:val="Paginanummer"/>
+          </w:rPr>
+          <w:fldChar w:fldCharType="begin"/>
+        </w:r>
+        <w:r>
+          <w:rPr>
+            <w:rStyle w:val="Paginanummer"/>
+          </w:rPr>
+          <w:instrText xml:space="preserve"> PAGE </w:instrText>
+        </w:r>
+        <w:r>
+          <w:rPr>
+            <w:rStyle w:val="Paginanummer"/>
+          </w:rPr>
+          <w:fldChar w:fldCharType="separate"/>
+        </w:r>
+        <w:r>
+          <w:rPr>
+            <w:rStyle w:val="Paginanummer"/>
+          </w:rPr>
+          <w:fldChar w:fldCharType="end"/>
+        </w:r>
+      </w:p>
+    </w:sdtContent>
+  </w:sdt>
   <w:p>
     <w:pPr>
+      <w:pStyle w:val="Voettekst"/>
+      <w:ind w:right="360"/>
+    </w:pPr>
+  </w:p>
+</w:ftr>
+</file>
+
+<file path=word/footer2.xml><?xml version="1.0" encoding="utf-8"?>
+<w:ftr xmlns:wpc="http://schemas.microsoft.com/office/word/2010/wordprocessingCanvas" xmlns:cx="http://schemas.microsoft.com/office/drawing/2014/chartex" xmlns:cx1="http://schemas.microsoft.com/office/drawing/2015/9/8/chartex" xmlns:cx2="http://schemas.microsoft.com/office/drawing/2015/10/21/chartex" xmlns:cx3="http://schemas.microsoft.com/office/drawing/2016/5/9/chartex" xmlns:cx4="http://schemas.microsoft.com/office/drawing/2016/5/10/chartex" xmlns:cx5="http://schemas.microsoft.com/office/drawing/2016/5/11/chartex" xmlns:cx6="http://schemas.microsoft.com/office/drawing/2016/5/12/chartex" xmlns:cx7="http://schemas.microsoft.com/office/drawing/2016/5/13/chartex" xmlns:cx8="http://schemas.microsoft.com/office/drawing/2016/5/14/chartex" xmlns:mc="http://schemas.openxmlformats.org/markup-compatibility/2006" xmlns:aink="http://schemas.microsoft.com/office/drawing/2016/ink" xmlns:am3d="http://schemas.microsoft.com/office/drawing/2017/model3d" xmlns:o="urn:schemas-microsoft-com:office:office" xmlns:oel="http://schemas.microsoft.com/office/2019/extlst" xmlns:r="http://schemas.openxmlformats.org/officeDocument/2006/relationships" xmlns:m="http://schemas.openxmlformats.org/officeDocument/2006/math" xmlns:v="urn:schemas-microsoft-com:vml" xmlns:wp14="http://schemas.microsoft.com/office/word/2010/wordprocessingDrawing" xmlns:wp="http://schemas.openxmlformats.org/drawingml/2006/wordprocessingDrawing" xmlns:w10="urn:schemas-microsoft-com:office:word" xmlns:w="http://schemas.openxmlformats.org/wordprocessingml/2006/main" xmlns:w14="http://schemas.microsoft.com/office/word/2010/wordml" xmlns:w15="http://schemas.microsoft.com/office/word/2012/wordml" xmlns:w16cex="http://schemas.microsoft.com/office/word/2018/wordml/cex" xmlns:w16cid="http://schemas.microsoft.com/office/word/2016/wordml/cid" xmlns:w16="http://schemas.microsoft.com/office/word/2018/wordml" xmlns:w16du="http://schemas.microsoft.com/office/word/2023/wordml/word16du" xmlns:w16sdtdh="http://schemas.microsoft.com/office/word/2020/wordml/sdtdatahash" xmlns:w16sdtfl="http://schemas.microsoft.com/office/word/2024/wordml/sdtformatlock" xmlns:w16se="http://schemas.microsoft.com/office/word/2015/wordml/symex" xmlns:wpg="http://schemas.microsoft.com/office/word/2010/wordprocessingGroup" xmlns:wpi="http://schemas.microsoft.com/office/word/2010/wordprocessingInk" xmlns:wne="http://schemas.microsoft.com/office/word/2006/wordml" xmlns:wps="http://schemas.microsoft.com/office/word/2010/wordprocessingShape" mc:Ignorable="w14 w15 w16se w16cid w16 w16cex w16sdtdh w16sdtfl w16du wp14">
+  <w:sdt>
+    <w:sdtPr>
+      <w:rPr>
+        <w:rStyle w:val="Paginanummer"/>
+      </w:rPr>
+      <w:id w:val="-2041269198"/>
+      <w:docPartObj>
+        <w:docPartGallery w:val="Page Numbers (Bottom of Page)"/>
+        <w:docPartUnique/>
+      </w:docPartObj>
+    </w:sdtPr>
+    <w:sdtContent>
+      <w:p>
+        <w:pPr>
+          <w:pStyle w:val="Voettekst"/>
+          <w:framePr w:wrap="none" w:vAnchor="text" w:hAnchor="margin" w:xAlign="right" w:y="1"/>
+          <w:rPr>
+            <w:rStyle w:val="Paginanummer"/>
+          </w:rPr>
+        </w:pPr>
+        <w:r>
+          <w:rPr>
+            <w:rStyle w:val="Paginanummer"/>
+          </w:rPr>
+          <w:fldChar w:fldCharType="begin"/>
+        </w:r>
+        <w:r>
+          <w:rPr>
+            <w:rStyle w:val="Paginanummer"/>
+          </w:rPr>
+          <w:instrText xml:space="preserve"> PAGE </w:instrText>
+        </w:r>
+        <w:r>
+          <w:rPr>
+            <w:rStyle w:val="Paginanummer"/>
+          </w:rPr>
+          <w:fldChar w:fldCharType="separate"/>
+        </w:r>
+        <w:r>
+          <w:rPr>
+            <w:rStyle w:val="Paginanummer"/>
+            <w:noProof/>
+          </w:rPr>
+          <w:t>1</w:t>
+        </w:r>
+        <w:r>
+          <w:rPr>
+            <w:rStyle w:val="Paginanummer"/>
+          </w:rPr>
+          <w:fldChar w:fldCharType="end"/>
+        </w:r>
+      </w:p>
+    </w:sdtContent>
+  </w:sdt>
+  <w:p>
+    <w:pPr>
+      <w:ind w:right="360"/>
       <w:jc w:val="center"/>
     </w:pPr>
     <w:r>
@@ -5577,49 +6839,17 @@
         <w:sz w:val="20"/>
         <w:szCs w:val="20"/>
       </w:rPr>
-      <w:t xml:space="preserve">Juf Aimee — Onderzoeksverslag  |  Digital Life, Hogeschool van Amsterdam  |  Pagina </w:t>
+      <w:t xml:space="preserve">Juf Aimee · Lectoraat Digital Life · Hogeschool van Amsterdam </w:t>
     </w:r>
-    <w:r>
+  </w:p>
+  <w:p>
+    <w:pPr>
+      <w:ind w:right="360"/>
+      <w:jc w:val="center"/>
       <w:rPr>
-        <w:color w:val="888888"/>
-        <w:sz w:val="20"/>
-        <w:szCs w:val="20"/>
+        <w:rFonts w:ascii="Times New Roman" w:hAnsi="Times New Roman" w:cs="Times New Roman"/>
       </w:rPr>
-      <w:fldChar w:fldCharType="begin"/>
-    </w:r>
-    <w:r>
-      <w:rPr>
-        <w:color w:val="888888"/>
-        <w:sz w:val="20"/>
-        <w:szCs w:val="20"/>
-      </w:rPr>
-      <w:instrText>PAGE</w:instrText>
-    </w:r>
-    <w:r>
-      <w:rPr>
-        <w:color w:val="888888"/>
-        <w:sz w:val="20"/>
-        <w:szCs w:val="20"/>
-      </w:rPr>
-      <w:fldChar w:fldCharType="separate"/>
-    </w:r>
-    <w:r>
-      <w:rPr>
-        <w:noProof/>
-        <w:color w:val="888888"/>
-        <w:sz w:val="20"/>
-        <w:szCs w:val="20"/>
-      </w:rPr>
-      <w:t>1</w:t>
-    </w:r>
-    <w:r>
-      <w:rPr>
-        <w:color w:val="888888"/>
-        <w:sz w:val="20"/>
-        <w:szCs w:val="20"/>
-      </w:rPr>
-      <w:fldChar w:fldCharType="end"/>
-    </w:r>
+    </w:pPr>
   </w:p>
 </w:ftr>
 </file>
@@ -5786,6 +7016,119 @@
     </w:lvl>
   </w:abstractNum>
   <w:abstractNum w:abstractNumId="2" w15:restartNumberingAfterBreak="0">
+    <w:nsid w:val="200D3E98"/>
+    <w:multiLevelType w:val="hybridMultilevel"/>
+    <w:tmpl w:val="1DD2700A"/>
+    <w:lvl w:ilvl="0" w:tplc="04130001">
+      <w:start w:val="1"/>
+      <w:numFmt w:val="bullet"/>
+      <w:lvlText w:val=""/>
+      <w:lvlJc w:val="left"/>
+      <w:pPr>
+        <w:ind w:left="720" w:hanging="360"/>
+      </w:pPr>
+      <w:rPr>
+        <w:rFonts w:ascii="Symbol" w:hAnsi="Symbol" w:hint="default"/>
+      </w:rPr>
+    </w:lvl>
+    <w:lvl w:ilvl="1" w:tplc="04130003" w:tentative="1">
+      <w:start w:val="1"/>
+      <w:numFmt w:val="bullet"/>
+      <w:lvlText w:val="o"/>
+      <w:lvlJc w:val="left"/>
+      <w:pPr>
+        <w:ind w:left="1440" w:hanging="360"/>
+      </w:pPr>
+      <w:rPr>
+        <w:rFonts w:ascii="Courier New" w:hAnsi="Courier New" w:hint="default"/>
+      </w:rPr>
+    </w:lvl>
+    <w:lvl w:ilvl="2" w:tplc="04130005" w:tentative="1">
+      <w:start w:val="1"/>
+      <w:numFmt w:val="bullet"/>
+      <w:lvlText w:val=""/>
+      <w:lvlJc w:val="left"/>
+      <w:pPr>
+        <w:ind w:left="2160" w:hanging="360"/>
+      </w:pPr>
+      <w:rPr>
+        <w:rFonts w:ascii="Wingdings" w:hAnsi="Wingdings" w:hint="default"/>
+      </w:rPr>
+    </w:lvl>
+    <w:lvl w:ilvl="3" w:tplc="04130001" w:tentative="1">
+      <w:start w:val="1"/>
+      <w:numFmt w:val="bullet"/>
+      <w:lvlText w:val=""/>
+      <w:lvlJc w:val="left"/>
+      <w:pPr>
+        <w:ind w:left="2880" w:hanging="360"/>
+      </w:pPr>
+      <w:rPr>
+        <w:rFonts w:ascii="Symbol" w:hAnsi="Symbol" w:hint="default"/>
+      </w:rPr>
+    </w:lvl>
+    <w:lvl w:ilvl="4" w:tplc="04130003" w:tentative="1">
+      <w:start w:val="1"/>
+      <w:numFmt w:val="bullet"/>
+      <w:lvlText w:val="o"/>
+      <w:lvlJc w:val="left"/>
+      <w:pPr>
+        <w:ind w:left="3600" w:hanging="360"/>
+      </w:pPr>
+      <w:rPr>
+        <w:rFonts w:ascii="Courier New" w:hAnsi="Courier New" w:hint="default"/>
+      </w:rPr>
+    </w:lvl>
+    <w:lvl w:ilvl="5" w:tplc="04130005" w:tentative="1">
+      <w:start w:val="1"/>
+      <w:numFmt w:val="bullet"/>
+      <w:lvlText w:val=""/>
+      <w:lvlJc w:val="left"/>
+      <w:pPr>
+        <w:ind w:left="4320" w:hanging="360"/>
+      </w:pPr>
+      <w:rPr>
+        <w:rFonts w:ascii="Wingdings" w:hAnsi="Wingdings" w:hint="default"/>
+      </w:rPr>
+    </w:lvl>
+    <w:lvl w:ilvl="6" w:tplc="04130001" w:tentative="1">
+      <w:start w:val="1"/>
+      <w:numFmt w:val="bullet"/>
+      <w:lvlText w:val=""/>
+      <w:lvlJc w:val="left"/>
+      <w:pPr>
+        <w:ind w:left="5040" w:hanging="360"/>
+      </w:pPr>
+      <w:rPr>
+        <w:rFonts w:ascii="Symbol" w:hAnsi="Symbol" w:hint="default"/>
+      </w:rPr>
+    </w:lvl>
+    <w:lvl w:ilvl="7" w:tplc="04130003" w:tentative="1">
+      <w:start w:val="1"/>
+      <w:numFmt w:val="bullet"/>
+      <w:lvlText w:val="o"/>
+      <w:lvlJc w:val="left"/>
+      <w:pPr>
+        <w:ind w:left="5760" w:hanging="360"/>
+      </w:pPr>
+      <w:rPr>
+        <w:rFonts w:ascii="Courier New" w:hAnsi="Courier New" w:hint="default"/>
+      </w:rPr>
+    </w:lvl>
+    <w:lvl w:ilvl="8" w:tplc="04130005" w:tentative="1">
+      <w:start w:val="1"/>
+      <w:numFmt w:val="bullet"/>
+      <w:lvlText w:val=""/>
+      <w:lvlJc w:val="left"/>
+      <w:pPr>
+        <w:ind w:left="6480" w:hanging="360"/>
+      </w:pPr>
+      <w:rPr>
+        <w:rFonts w:ascii="Wingdings" w:hAnsi="Wingdings" w:hint="default"/>
+      </w:rPr>
+    </w:lvl>
+  </w:abstractNum>
+  <w:abstractNum w:abstractNumId="3" w15:restartNumberingAfterBreak="0">
     <w:nsid w:val="3B421040"/>
     <w:multiLevelType w:val="hybridMultilevel"/>
     <w:tmpl w:val="E3469D86"/>
@@ -5887,6 +7230,9 @@
     </w:lvlOverride>
   </w:num>
   <w:num w:numId="3" w16cid:durableId="228655259">
+    <w:abstractNumId w:val="3"/>
+  </w:num>
+  <w:num w:numId="4" w16cid:durableId="1361515788">
     <w:abstractNumId w:val="2"/>
   </w:num>
 </w:numbering>
@@ -6379,6 +7725,7 @@
   <w:style w:type="character" w:default="1" w:styleId="Standaardalinea-lettertype">
     <w:name w:val="Default Paragraph Font"/>
     <w:uiPriority w:val="1"/>
+    <w:semiHidden/>
     <w:unhideWhenUsed/>
   </w:style>
   <w:style w:type="table" w:default="1" w:styleId="Standaardtabel">
@@ -6549,6 +7896,62 @@
       <w:i/>
       <w:iCs/>
     </w:rPr>
+  </w:style>
+  <w:style w:type="paragraph" w:styleId="Koptekst">
+    <w:name w:val="header"/>
+    <w:basedOn w:val="Standaard"/>
+    <w:link w:val="KoptekstChar"/>
+    <w:uiPriority w:val="99"/>
+    <w:unhideWhenUsed/>
+    <w:rsid w:val="00B64C5F"/>
+    <w:pPr>
+      <w:tabs>
+        <w:tab w:val="center" w:pos="4536"/>
+        <w:tab w:val="right" w:pos="9072"/>
+      </w:tabs>
+    </w:pPr>
+  </w:style>
+  <w:style w:type="character" w:customStyle="1" w:styleId="KoptekstChar">
+    <w:name w:val="Koptekst Char"/>
+    <w:basedOn w:val="Standaardalinea-lettertype"/>
+    <w:link w:val="Koptekst"/>
+    <w:uiPriority w:val="99"/>
+    <w:rsid w:val="00B64C5F"/>
+  </w:style>
+  <w:style w:type="paragraph" w:styleId="Voettekst">
+    <w:name w:val="footer"/>
+    <w:basedOn w:val="Standaard"/>
+    <w:link w:val="VoettekstChar"/>
+    <w:uiPriority w:val="99"/>
+    <w:unhideWhenUsed/>
+    <w:rsid w:val="00B64C5F"/>
+    <w:pPr>
+      <w:tabs>
+        <w:tab w:val="center" w:pos="4536"/>
+        <w:tab w:val="right" w:pos="9072"/>
+      </w:tabs>
+    </w:pPr>
+  </w:style>
+  <w:style w:type="character" w:customStyle="1" w:styleId="VoettekstChar">
+    <w:name w:val="Voettekst Char"/>
+    <w:basedOn w:val="Standaardalinea-lettertype"/>
+    <w:link w:val="Voettekst"/>
+    <w:uiPriority w:val="99"/>
+    <w:rsid w:val="00B64C5F"/>
+  </w:style>
+  <w:style w:type="character" w:styleId="Paginanummer">
+    <w:name w:val="page number"/>
+    <w:basedOn w:val="Standaardalinea-lettertype"/>
+    <w:uiPriority w:val="99"/>
+    <w:semiHidden/>
+    <w:unhideWhenUsed/>
+    <w:rsid w:val="00B64C5F"/>
+  </w:style>
+  <w:style w:type="paragraph" w:styleId="Geenafstand">
+    <w:name w:val="No Spacing"/>
+    <w:uiPriority w:val="1"/>
+    <w:qFormat/>
+    <w:rsid w:val="00B64C5F"/>
   </w:style>
 </w:styles>
 </file>

</xml_diff>

<commit_message>
feedbacksysteem voor visuele opdrachten sectie toegevoegd in onderzoeksverslag
</commit_message>
<xml_diff>
--- a/docs/Analyseren/JufAimee_Onderzoeksverslag.docx
+++ b/docs/Analyseren/JufAimee_Onderzoeksverslag.docx
@@ -198,48 +198,28 @@
           <w:color w:val="2E75B6"/>
         </w:rPr>
       </w:pPr>
-      <w:proofErr w:type="gramStart"/>
       <w:r>
         <w:rPr>
           <w:color w:val="2E75B6"/>
           <w:sz w:val="20"/>
           <w:szCs w:val="20"/>
         </w:rPr>
-        <w:t>s.kramer2@hva.nl</w:t>
-      </w:r>
-      <w:proofErr w:type="gramEnd"/>
+        <w:t xml:space="preserve">s.kramer2@hva.nl </w:t>
+      </w:r>
+    </w:p>
+    <w:p>
+      <w:pPr>
+        <w:spacing w:after="80"/>
+        <w:jc w:val="center"/>
+      </w:pPr>
       <w:r>
         <w:rPr>
           <w:color w:val="2E75B6"/>
           <w:sz w:val="20"/>
           <w:szCs w:val="20"/>
         </w:rPr>
-        <w:t xml:space="preserve"> </w:t>
-      </w:r>
-    </w:p>
-    <w:p>
-      <w:pPr>
-        <w:spacing w:after="80"/>
-        <w:jc w:val="center"/>
-      </w:pPr>
-      <w:r>
-        <w:rPr>
-          <w:color w:val="2E75B6"/>
-          <w:sz w:val="20"/>
-          <w:szCs w:val="20"/>
-        </w:rPr>
-        <w:t xml:space="preserve"> </w:t>
-      </w:r>
-      <w:proofErr w:type="gramStart"/>
-      <w:r>
-        <w:rPr>
-          <w:color w:val="2E75B6"/>
-          <w:sz w:val="20"/>
-          <w:szCs w:val="20"/>
-        </w:rPr>
-        <w:t>m.a.oey@hva.nl</w:t>
-      </w:r>
-      <w:proofErr w:type="gramEnd"/>
+        <w:t xml:space="preserve"> m.a.oey@hva.nl</w:t>
+      </w:r>
     </w:p>
     <w:p>
       <w:pPr>
@@ -249,23 +229,13 @@
           <w:color w:val="7F8C8D"/>
         </w:rPr>
       </w:pPr>
-      <w:proofErr w:type="gramStart"/>
       <w:r>
         <w:rPr>
           <w:color w:val="7F8C8D"/>
           <w:sz w:val="20"/>
           <w:szCs w:val="20"/>
         </w:rPr>
-        <w:t>mei</w:t>
-      </w:r>
-      <w:proofErr w:type="gramEnd"/>
-      <w:r>
-        <w:rPr>
-          <w:color w:val="7F8C8D"/>
-          <w:sz w:val="20"/>
-          <w:szCs w:val="20"/>
-        </w:rPr>
-        <w:t xml:space="preserve"> 2026</w:t>
+        <w:t>mei 2026</w:t>
       </w:r>
     </w:p>
     <w:p>
@@ -529,21 +499,7 @@
                 <w:rStyle w:val="Hyperlink"/>
                 <w:noProof/>
               </w:rPr>
-              <w:t>Samen</w:t>
-            </w:r>
-            <w:r>
-              <w:rPr>
-                <w:rStyle w:val="Hyperlink"/>
-                <w:noProof/>
-              </w:rPr>
-              <w:t>v</w:t>
-            </w:r>
-            <w:r>
-              <w:rPr>
-                <w:rStyle w:val="Hyperlink"/>
-                <w:noProof/>
-              </w:rPr>
-              <w:t>atting</w:t>
+              <w:t>Samenvatting</w:t>
             </w:r>
             <w:r>
               <w:rPr>
@@ -1395,21 +1351,7 @@
                 <w:rStyle w:val="Hyperlink"/>
                 <w:noProof/>
               </w:rPr>
-              <w:t>Deelvraag 2 — Gebruikersbehoe</w:t>
-            </w:r>
-            <w:r>
-              <w:rPr>
-                <w:rStyle w:val="Hyperlink"/>
-                <w:noProof/>
-              </w:rPr>
-              <w:t>f</w:t>
-            </w:r>
-            <w:r>
-              <w:rPr>
-                <w:rStyle w:val="Hyperlink"/>
-                <w:noProof/>
-              </w:rPr>
-              <w:t>ten en rolverdeling</w:t>
+              <w:t>Deelvraag 2 — Gebruikersbehoeften en rolverdeling</w:t>
             </w:r>
             <w:r>
               <w:rPr>
@@ -2048,21 +1990,7 @@
                 <w:rStyle w:val="Hyperlink"/>
                 <w:noProof/>
               </w:rPr>
-              <w:t>6. Aanpak en method</w:t>
-            </w:r>
-            <w:r>
-              <w:rPr>
-                <w:rStyle w:val="Hyperlink"/>
-                <w:noProof/>
-              </w:rPr>
-              <w:t>e</w:t>
-            </w:r>
-            <w:r>
-              <w:rPr>
-                <w:rStyle w:val="Hyperlink"/>
-                <w:noProof/>
-              </w:rPr>
-              <w:t>n</w:t>
+              <w:t>6. Aanpak en methoden</w:t>
             </w:r>
             <w:r>
               <w:rPr>
@@ -2916,21 +2844,7 @@
                 <w:rStyle w:val="Hyperlink"/>
                 <w:noProof/>
               </w:rPr>
-              <w:t xml:space="preserve">9. </w:t>
-            </w:r>
-            <w:r>
-              <w:rPr>
-                <w:rStyle w:val="Hyperlink"/>
-                <w:noProof/>
-              </w:rPr>
-              <w:t>A</w:t>
-            </w:r>
-            <w:r>
-              <w:rPr>
-                <w:rStyle w:val="Hyperlink"/>
-                <w:noProof/>
-              </w:rPr>
-              <w:t>anbevelingen</w:t>
+              <w:t>9. Aanbevelingen</w:t>
             </w:r>
             <w:r>
               <w:rPr>
@@ -4763,18 +4677,7 @@
       </w:r>
       <w:proofErr w:type="spellEnd"/>
       <w:r>
-        <w:t xml:space="preserve"> of concept wordt gewerkt met fictieve en gesimuleerde data. In de verdere ontwikkeling zullen </w:t>
-      </w:r>
-      <w:proofErr w:type="spellStart"/>
-      <w:r>
-        <w:t>leerlingprofielen</w:t>
-      </w:r>
-      <w:proofErr w:type="spellEnd"/>
-      <w:r>
-        <w:t>, interactielogs en voortgangsdata zorgvuldig worden beschermd en geminimaliseerd</w:t>
-      </w:r>
-      <w:r>
-        <w:t>.</w:t>
+        <w:t xml:space="preserve"> of concept wordt gewerkt met fictieve en gesimuleerde data. In de verdere ontwikkeling zullen leerlingprofielen, interactielogs en voortgangsdata zorgvuldig worden beschermd en geminimaliseerd</w:t>
       </w:r>
     </w:p>
     <w:p>
@@ -4784,31 +4687,8 @@
           <w:bottom w:val="single" w:sz="4" w:space="4" w:color="2E75B6"/>
         </w:pBdr>
       </w:pPr>
-    </w:p>
-    <w:p>
-      <w:pPr>
-        <w:pStyle w:val="Kop1"/>
-        <w:pBdr>
-          <w:bottom w:val="single" w:sz="4" w:space="4" w:color="2E75B6"/>
-        </w:pBdr>
-      </w:pPr>
-    </w:p>
-    <w:p>
-      <w:pPr>
-        <w:pStyle w:val="Kop1"/>
-        <w:pBdr>
-          <w:bottom w:val="single" w:sz="4" w:space="4" w:color="2E75B6"/>
-        </w:pBdr>
-      </w:pPr>
-    </w:p>
-    <w:p>
-      <w:pPr>
-        <w:pStyle w:val="Kop1"/>
-        <w:pBdr>
-          <w:bottom w:val="single" w:sz="4" w:space="4" w:color="2E75B6"/>
-        </w:pBdr>
-      </w:pPr>
-      <w:r>
+      <w:r>
+        <w:lastRenderedPageBreak/>
         <w:t>6. Aanpak en methoden</w:t>
       </w:r>
       <w:bookmarkEnd w:id="18"/>
@@ -4974,231 +4854,287 @@
         <w:pStyle w:val="Geenafstand"/>
       </w:pPr>
       <w:r>
-        <w:t xml:space="preserve">Er wordt in deze fase uitsluitend gewerkt met fictieve en gesimuleerde data </w:t>
+        <w:t>Er wordt in deze fase uitsluitend gewerkt met fictieve en gesimuleerde data voorbeeldleerlingprofielen, gesimuleerde leeractiviteiten en hypothetische onderwijsscenario’s. Er worden geen echte leerling- of persoonsgegevens gebruikt.</w:t>
+      </w:r>
+    </w:p>
+    <w:p>
+      <w:pPr>
+        <w:pStyle w:val="Kop2"/>
+      </w:pPr>
+      <w:r>
+        <w:t xml:space="preserve">6.3 </w:t>
       </w:r>
       <w:proofErr w:type="spellStart"/>
       <w:r>
-        <w:t>voorbeeldleerlingprofielen</w:t>
+        <w:t>Proof</w:t>
       </w:r>
       <w:proofErr w:type="spellEnd"/>
       <w:r>
-        <w:t>, gesimuleerde leeractiviteiten en hypothetische onderwijsscenario’s. Er worden geen echte leerling- of persoonsgegevens gebruikt.</w:t>
-      </w:r>
-    </w:p>
-    <w:p>
-      <w:pPr>
-        <w:pStyle w:val="Kop2"/>
-      </w:pPr>
-      <w:r>
-        <w:t xml:space="preserve">6.3 </w:t>
+        <w:t xml:space="preserve"> of concept </w:t>
+      </w:r>
+      <w:r>
+        <w:t>-</w:t>
+      </w:r>
+      <w:r>
+        <w:t xml:space="preserve"> Gerealiseerde functionaliteiten</w:t>
+      </w:r>
+      <w:bookmarkEnd w:id="22"/>
+    </w:p>
+    <w:p>
+      <w:r>
+        <w:t xml:space="preserve">Het </w:t>
       </w:r>
       <w:proofErr w:type="spellStart"/>
       <w:r>
-        <w:t>Proof</w:t>
+        <w:t>proof</w:t>
       </w:r>
       <w:proofErr w:type="spellEnd"/>
       <w:r>
-        <w:t xml:space="preserve"> of concept </w:t>
+        <w:t xml:space="preserve"> of concept bestaat uit een webapplicatie voor leraren die drie kernsystemen integreert: een leraarsdashboard met </w:t>
+      </w:r>
+      <w:proofErr w:type="spellStart"/>
+      <w:r>
+        <w:t>leerlingoverzicht</w:t>
+      </w:r>
+      <w:proofErr w:type="spellEnd"/>
+      <w:r>
+        <w:t xml:space="preserve">, een </w:t>
+      </w:r>
+      <w:proofErr w:type="spellStart"/>
+      <w:r>
+        <w:t>regelgebaseerd</w:t>
+      </w:r>
+      <w:proofErr w:type="spellEnd"/>
+      <w:r>
+        <w:t xml:space="preserve"> signalensysteem en een AI-gedreven adviessysteem. De applicatie is ontwikkeld met het Next.js framework en maakt gebruik van een lokale </w:t>
+      </w:r>
+      <w:proofErr w:type="spellStart"/>
+      <w:r>
+        <w:t>PostgreSQL</w:t>
+      </w:r>
+      <w:proofErr w:type="spellEnd"/>
+      <w:r>
+        <w:t>-database met vectoropslag. Alle AI</w:t>
+      </w:r>
+      <w:r>
+        <w:t xml:space="preserve">- </w:t>
+      </w:r>
+      <w:r>
+        <w:t xml:space="preserve">componenten draaien lokaal via Ollama, een oplossing die bewust is gekozen om te voldoen aan de AVG-eis dat persoonsgegevens van minderjarigen niet worden doorgezonden naar externe </w:t>
+      </w:r>
+      <w:proofErr w:type="spellStart"/>
+      <w:r>
+        <w:t>cloudproviders</w:t>
+      </w:r>
+      <w:proofErr w:type="spellEnd"/>
+      <w:r>
+        <w:t>.</w:t>
+      </w:r>
+      <w:bookmarkStart w:id="25" w:name="_Toc230782960"/>
+    </w:p>
+    <w:p/>
+    <w:p>
+      <w:pPr>
+        <w:pStyle w:val="Kop3"/>
+      </w:pPr>
+      <w:r>
+        <w:t>Leraarsdashboard</w:t>
+      </w:r>
+      <w:bookmarkEnd w:id="25"/>
+    </w:p>
+    <w:p/>
+    <w:p>
+      <w:r>
+        <w:t>De centrale interface is een dashboard waarop de leraar per leerling een overzicht ziet van voortgang, interesses, afgeronde opdrachten en het huidige Bloom-niveau. De leerlingprofielen zijn opgebouwd uit het Individueel Ontwikkelingsperspectief (OPP): een bestaand pedagogisch document dat scholen bijhouden per leerling. De OPP-bestanden worden automatisch ingelezen, opgesplitst in tekstfragmenten en omgezet naar vectorrepresentaties met behulp van een meertalig inbeddingsmodel. Dit maakt semantisch zoeken mogelijk: het systeem kan relevante informatie uit het leerlingprofiel ophalen op basis van betekenis, niet alleen op basis van exacte zoekwoorden.</w:t>
+      </w:r>
+    </w:p>
+    <w:p/>
+    <w:p>
+      <w:pPr>
+        <w:pStyle w:val="Kop3"/>
+      </w:pPr>
+      <w:bookmarkStart w:id="26" w:name="_Toc230782961"/>
+      <w:r>
+        <w:lastRenderedPageBreak/>
+        <w:t>Signalensysteem</w:t>
+      </w:r>
+      <w:bookmarkEnd w:id="26"/>
+    </w:p>
+    <w:p/>
+    <w:p>
+      <w:r>
+        <w:t xml:space="preserve">Het signalensysteem detecteert automatisch vier typen situaties op basis van </w:t>
+      </w:r>
+      <w:proofErr w:type="spellStart"/>
+      <w:r>
+        <w:t>observeerbaar</w:t>
+      </w:r>
+      <w:proofErr w:type="spellEnd"/>
+      <w:r>
+        <w:t xml:space="preserve"> gedrag in de applicatie. Een capaciteitssignaal wordt gegenereerd wanneer een leerling twee opdrachten achter elkaar heeft afgerond op hetzelfde Bloom-niveau, wat kan duiden op onderbenutting. Een taakbetrokkenheidssignaal verschijnt wanneer een leerling openstaande opdrachten heeft maar nog niets heeft afgerond. Een intellectueel prestatiesignaal markeert leerlingen die consistent presteren op de hogere Bloom-niveaus vijf en zes. Een werktempo­signaal wordt geactiveerd wanneer een leerling op één dag drie of meer opdrachten heeft voltooid. De signalen worden gerangschikt op urgentie: waarschuwingen krijgen prioriteit boven adviezen, die op hun beurt prioriteit krijgen boven positieve observaties.</w:t>
+      </w:r>
+    </w:p>
+    <w:p/>
+    <w:p>
+      <w:pPr>
+        <w:pStyle w:val="Kop3"/>
+      </w:pPr>
+      <w:bookmarkStart w:id="27" w:name="_Toc230782962"/>
+      <w:r>
+        <w:t xml:space="preserve">AI-gedreven advies </w:t>
       </w:r>
       <w:r>
         <w:t>-</w:t>
       </w:r>
       <w:r>
-        <w:t xml:space="preserve"> Gerealiseerde functionaliteiten</w:t>
-      </w:r>
-      <w:bookmarkEnd w:id="22"/>
-    </w:p>
-    <w:p>
-      <w:r>
-        <w:t xml:space="preserve">Het </w:t>
+        <w:t xml:space="preserve"> Juf Aimee</w:t>
+      </w:r>
+      <w:bookmarkEnd w:id="27"/>
+    </w:p>
+    <w:p/>
+    <w:p>
+      <w:r>
+        <w:t>Voor elke leerling met een of meerdere actieve signalen genereert het systeem een gepersonaliseerd advies via een lokaal taalmodel. Het systeem haalt hiervoor relevante fragmenten op uit het OPP van de leerling, met name informatie over interesses, motivatie en werkstijl. Deze fragmenten worden gecombineerd met de signaalcontext en aangeboden aan het taalmodel als gestructureerde prompt.</w:t>
+      </w:r>
+    </w:p>
+    <w:p/>
+    <w:p>
+      <w:r>
+        <w:t xml:space="preserve">Wanneer een leerling meerdere gelijktijdige signalen heeft, genereert het systeem één samenhangende observatie die de signalen in verband brengt. Zo wordt voorkomen dat de leraar meerdere losstaande berichten ontvangt die samen een coherenter beeld vormen. Juf Aimee besluit elke boodschap altijd met een open vraag aan de leraar, </w:t>
+      </w:r>
+      <w:proofErr w:type="gramStart"/>
+      <w:r>
+        <w:t>conform</w:t>
+      </w:r>
+      <w:proofErr w:type="gramEnd"/>
+      <w:r>
+        <w:t xml:space="preserve"> het ontwerpprincipe van Hybride AI: de AI informeert en adviseert, maar de leraar houdt het eindoordeel.</w:t>
+      </w:r>
+    </w:p>
+    <w:p/>
+    <w:p>
+      <w:pPr>
+        <w:rPr>
+          <w:b/>
+          <w:bCs/>
+          <w:color w:val="374785"/>
+        </w:rPr>
+      </w:pPr>
+    </w:p>
+    <w:p>
+      <w:pPr>
+        <w:rPr>
+          <w:b/>
+          <w:bCs/>
+          <w:color w:val="374785"/>
+        </w:rPr>
+      </w:pPr>
+      <w:r>
+        <w:rPr>
+          <w:b/>
+          <w:bCs/>
+          <w:color w:val="374785"/>
+        </w:rPr>
+        <w:t>Feedbacksysteem voor visuele opdrachten</w:t>
+      </w:r>
+    </w:p>
+    <w:p>
+      <w:pPr>
+        <w:rPr>
+          <w:b/>
+          <w:bCs/>
+          <w:color w:val="374785"/>
+        </w:rPr>
+      </w:pPr>
+    </w:p>
+    <w:p>
+      <w:r>
+        <w:t>Lera</w:t>
+      </w:r>
+      <w:r>
+        <w:t>ren kunnen automatische feedback genereren voor visuele opdrachten. Het doel is het werk van de leraar te vergemakkelijken zodat de leraar efficiënter werk kan nakijken en feedback geven. In deze context blijft de regie wel in handen van de leraar, want de automatisch gegenereerde feedback kan nog verfijnd worden dan pas wordt de feedback opgeslagen in de database.</w:t>
+      </w:r>
+    </w:p>
+    <w:p>
+      <w:r>
+        <w:t>Nadat de feedback is gegenereerd kan de leraar</w:t>
+      </w:r>
+      <w:r>
+        <w:t xml:space="preserve"> een heranalyse uitvoeren zodat het AI-model kritisch kan kijken naar de feedback en noodzakelijke verbeteringen kan doorvoeren.</w:t>
+      </w:r>
+    </w:p>
+    <w:p/>
+    <w:p/>
+    <w:p/>
+    <w:p/>
+    <w:p/>
+    <w:p/>
+    <w:p/>
+    <w:p>
+      <w:pPr>
+        <w:pStyle w:val="Kop3"/>
+      </w:pPr>
+      <w:bookmarkStart w:id="28" w:name="_Toc230782963"/>
+      <w:r>
+        <w:lastRenderedPageBreak/>
+        <w:t xml:space="preserve">Human in </w:t>
       </w:r>
       <w:proofErr w:type="spellStart"/>
       <w:r>
-        <w:t>proof</w:t>
+        <w:t>the</w:t>
       </w:r>
       <w:proofErr w:type="spellEnd"/>
       <w:r>
-        <w:t xml:space="preserve"> of concept bestaat uit een webapplicatie voor leraren die drie kernsystemen integreert: een leraarsdashboard met </w:t>
-      </w:r>
-      <w:proofErr w:type="spellStart"/>
-      <w:r>
-        <w:t>leerlingoverzicht</w:t>
-      </w:r>
-      <w:proofErr w:type="spellEnd"/>
-      <w:r>
-        <w:t xml:space="preserve">, een </w:t>
-      </w:r>
-      <w:proofErr w:type="spellStart"/>
-      <w:r>
-        <w:t>regelgebaseerd</w:t>
-      </w:r>
-      <w:proofErr w:type="spellEnd"/>
-      <w:r>
-        <w:t xml:space="preserve"> signalensysteem en een AI-gedreven adviessysteem. De applicatie is ontwikkeld met het Next.js framework en maakt gebruik van een lokale </w:t>
-      </w:r>
-      <w:proofErr w:type="spellStart"/>
-      <w:r>
-        <w:t>PostgreSQL</w:t>
-      </w:r>
-      <w:proofErr w:type="spellEnd"/>
-      <w:r>
-        <w:t>-database met vectoropslag. Alle AI</w:t>
-      </w:r>
-      <w:r>
-        <w:t xml:space="preserve">- </w:t>
-      </w:r>
-      <w:r>
-        <w:t xml:space="preserve">componenten draaien lokaal via </w:t>
-      </w:r>
-      <w:proofErr w:type="spellStart"/>
-      <w:r>
-        <w:t>Ollama</w:t>
-      </w:r>
-      <w:proofErr w:type="spellEnd"/>
-      <w:r>
-        <w:t xml:space="preserve">, een oplossing die bewust is gekozen om te voldoen aan de AVG-eis dat persoonsgegevens van minderjarigen niet worden doorgezonden naar externe </w:t>
-      </w:r>
-      <w:proofErr w:type="spellStart"/>
-      <w:r>
-        <w:t>cloudproviders</w:t>
-      </w:r>
-      <w:proofErr w:type="spellEnd"/>
-      <w:r>
-        <w:t>.</w:t>
-      </w:r>
+        <w:t xml:space="preserve"> loop</w:t>
+      </w:r>
+      <w:bookmarkEnd w:id="28"/>
     </w:p>
     <w:p/>
     <w:p>
-      <w:pPr>
-        <w:pStyle w:val="Kop3"/>
-      </w:pPr>
-      <w:bookmarkStart w:id="25" w:name="_Toc230782960"/>
-      <w:r>
-        <w:t>Leraarsdashboard</w:t>
-      </w:r>
-      <w:bookmarkEnd w:id="25"/>
+      <w:r>
+        <w:t>De leraar kan via het dashboard een notitie toevoegen per leerling. Deze notitie wordt bij volgende adviesgeneraties meegenomen als leidende context, waardoor de aanbevelingen van het systeem worden bijgestuurd door de professionele kennis van de leraar. Dit sluit direct aan op het XAI-principe van uitlegbaarheid: het systeem maakt zichtbaar welke informatie ten grondslag ligt aan een aanbeveling en stelt de leraar in staat deze te corrigeren of aan te vullen.</w:t>
+      </w:r>
     </w:p>
     <w:p/>
-    <w:p>
-      <w:r>
-        <w:t xml:space="preserve">De centrale interface is een dashboard waarop de leraar per leerling een overzicht ziet van voortgang, interesses, afgeronde opdrachten en het huidige </w:t>
-      </w:r>
-      <w:r>
-        <w:lastRenderedPageBreak/>
-        <w:t xml:space="preserve">Bloom-niveau. De </w:t>
-      </w:r>
-      <w:proofErr w:type="spellStart"/>
-      <w:r>
-        <w:t>leerlingprofielen</w:t>
-      </w:r>
-      <w:proofErr w:type="spellEnd"/>
-      <w:r>
-        <w:t xml:space="preserve"> zijn opgebouwd uit het Individueel Ontwikkelingsperspectief (OPP): een bestaand pedagogisch document dat scholen bijhouden per leerling. De OPP-bestanden worden automatisch ingelezen, opgesplitst in tekstfragmenten en omgezet naar vectorrepresentaties met behulp van een meertalig inbeddingsmodel. Dit maakt semantisch zoeken mogelijk: het systeem kan relevante informatie uit het </w:t>
-      </w:r>
-      <w:proofErr w:type="spellStart"/>
-      <w:r>
-        <w:t>leerlingprofiel</w:t>
-      </w:r>
-      <w:proofErr w:type="spellEnd"/>
-      <w:r>
-        <w:t xml:space="preserve"> ophalen op basis van betekenis, niet alleen op basis van exacte zoekwoorden.</w:t>
-      </w:r>
-    </w:p>
     <w:p/>
-    <w:p>
-      <w:pPr>
-        <w:pStyle w:val="Kop3"/>
-      </w:pPr>
-      <w:bookmarkStart w:id="26" w:name="_Toc230782961"/>
-      <w:r>
-        <w:t>Signalensysteem</w:t>
-      </w:r>
-      <w:bookmarkEnd w:id="26"/>
-    </w:p>
     <w:p/>
-    <w:p>
-      <w:r>
-        <w:t xml:space="preserve">Het signalensysteem detecteert automatisch vier typen situaties op basis van </w:t>
-      </w:r>
-      <w:proofErr w:type="spellStart"/>
-      <w:r>
-        <w:t>observeerbaar</w:t>
-      </w:r>
-      <w:proofErr w:type="spellEnd"/>
-      <w:r>
-        <w:t xml:space="preserve"> gedrag in de applicatie. Een capaciteitssignaal wordt gegenereerd wanneer een leerling twee opdrachten achter elkaar heeft afgerond op hetzelfde Bloom-niveau, wat kan duiden op onderbenutting. Een taakbetrokkenheidssignaal verschijnt wanneer een leerling openstaande opdrachten heeft maar nog niets heeft afgerond. Een intellectueel prestatiesignaal markeert leerlingen die consistent presteren op de hogere Bloom-niveaus vijf en zes. Een werktempo­signaal wordt geactiveerd wanneer een leerling op één dag drie of meer opdrachten heeft voltooid. De signalen worden gerangschikt op urgentie: waarschuwingen krijgen prioriteit boven adviezen, die op hun beurt prioriteit krijgen boven positieve observaties.</w:t>
-      </w:r>
-    </w:p>
     <w:p/>
-    <w:p>
-      <w:pPr>
-        <w:pStyle w:val="Kop3"/>
-      </w:pPr>
-      <w:bookmarkStart w:id="27" w:name="_Toc230782962"/>
-      <w:r>
-        <w:t xml:space="preserve">AI-gedreven advies </w:t>
-      </w:r>
-      <w:r>
-        <w:t>-</w:t>
-      </w:r>
-      <w:r>
-        <w:t xml:space="preserve"> Juf Aimee</w:t>
-      </w:r>
-      <w:bookmarkEnd w:id="27"/>
-    </w:p>
     <w:p/>
-    <w:p>
-      <w:r>
-        <w:t>Voor elke leerling met een of meerdere actieve signalen genereert het systeem een gepersonaliseerd advies via een lokaal taalmodel. Het systeem haalt hiervoor relevante fragmenten op uit het OPP van de leerling, met name informatie over interesses, motivatie en werkstijl. Deze fragmenten worden gecombineerd met de signaalcontext en aangeboden aan het taalmodel als gestructureerde prompt.</w:t>
-      </w:r>
-    </w:p>
     <w:p/>
-    <w:p>
-      <w:r>
-        <w:t xml:space="preserve">Wanneer een leerling meerdere gelijktijdige signalen heeft, genereert het systeem één samenhangende observatie die de signalen in verband brengt. Zo wordt voorkomen dat de leraar meerdere losstaande berichten ontvangt die samen een </w:t>
-      </w:r>
-      <w:proofErr w:type="spellStart"/>
-      <w:r>
-        <w:t>coherenter</w:t>
-      </w:r>
-      <w:proofErr w:type="spellEnd"/>
-      <w:r>
-        <w:t xml:space="preserve"> beeld vormen. Juf Aimee besluit elke boodschap altijd met een open vraag aan de leraar, </w:t>
-      </w:r>
-      <w:proofErr w:type="gramStart"/>
-      <w:r>
-        <w:t>conform</w:t>
-      </w:r>
-      <w:proofErr w:type="gramEnd"/>
-      <w:r>
-        <w:t xml:space="preserve"> het ontwerpprincipe van Hybride AI: de AI informeert en adviseert, maar de leraar houdt het eindoordeel.</w:t>
-      </w:r>
-    </w:p>
     <w:p/>
-    <w:p>
-      <w:pPr>
-        <w:pStyle w:val="Kop3"/>
-      </w:pPr>
-      <w:bookmarkStart w:id="28" w:name="_Toc230782963"/>
-      <w:r>
-        <w:t xml:space="preserve">Human in </w:t>
-      </w:r>
-      <w:proofErr w:type="spellStart"/>
-      <w:r>
-        <w:t>the</w:t>
-      </w:r>
-      <w:proofErr w:type="spellEnd"/>
-      <w:r>
-        <w:t xml:space="preserve"> loop</w:t>
-      </w:r>
-      <w:bookmarkEnd w:id="28"/>
-    </w:p>
     <w:p/>
-    <w:p>
-      <w:r>
-        <w:t>De leraar kan via het dashboard een notitie toevoegen per leerling. Deze notitie wordt bij volgende adviesgeneraties meegenomen als leidende context, waardoor de aanbevelingen van het systeem worden bijgestuurd door de professionele kennis van de leraar. Dit sluit direct aan op het XAI-principe van uitlegbaarheid: het systeem maakt zichtbaar welke informatie ten grondslag ligt aan een aanbeveling en stelt de leraar in staat deze te corrigeren of aan te vullen.</w:t>
-      </w:r>
-    </w:p>
+    <w:p/>
+    <w:p/>
+    <w:p/>
+    <w:p/>
+    <w:p/>
+    <w:p/>
+    <w:p/>
+    <w:p/>
+    <w:p/>
+    <w:p/>
+    <w:p/>
+    <w:p/>
+    <w:p/>
+    <w:p/>
+    <w:p/>
+    <w:p/>
+    <w:p/>
+    <w:p/>
+    <w:p/>
+    <w:p/>
+    <w:p/>
+    <w:p/>
+    <w:p/>
+    <w:p/>
+    <w:p/>
+    <w:p/>
+    <w:p/>
+    <w:p/>
+    <w:p/>
+    <w:p/>
+    <w:p/>
+    <w:p/>
     <w:p>
       <w:pPr>
         <w:pStyle w:val="Kop1"/>
@@ -5386,13 +5322,8 @@
         </w:numPr>
         <w:spacing w:before="60" w:after="60"/>
       </w:pPr>
-      <w:proofErr w:type="gramStart"/>
-      <w:r>
-        <w:t>Issue /</w:t>
-      </w:r>
-      <w:proofErr w:type="gramEnd"/>
-      <w:r>
-        <w:t xml:space="preserve"> taak staat op ‘Done’ in het projectboard.</w:t>
+      <w:r>
+        <w:t>Issue / taak staat op ‘Done’ in het projectboard.</w:t>
       </w:r>
     </w:p>
     <w:p>
@@ -5415,6 +5346,81 @@
     </w:p>
     <w:p>
       <w:pPr>
+        <w:spacing w:before="80" w:after="80"/>
+      </w:pPr>
+    </w:p>
+    <w:p>
+      <w:pPr>
+        <w:spacing w:before="80" w:after="80"/>
+      </w:pPr>
+    </w:p>
+    <w:p>
+      <w:pPr>
+        <w:spacing w:before="80" w:after="80"/>
+      </w:pPr>
+    </w:p>
+    <w:p>
+      <w:pPr>
+        <w:spacing w:before="80" w:after="80"/>
+      </w:pPr>
+    </w:p>
+    <w:p>
+      <w:pPr>
+        <w:spacing w:before="80" w:after="80"/>
+      </w:pPr>
+    </w:p>
+    <w:p>
+      <w:pPr>
+        <w:spacing w:before="80" w:after="80"/>
+      </w:pPr>
+    </w:p>
+    <w:p>
+      <w:pPr>
+        <w:spacing w:before="80" w:after="80"/>
+      </w:pPr>
+    </w:p>
+    <w:p>
+      <w:pPr>
+        <w:spacing w:before="80" w:after="80"/>
+      </w:pPr>
+    </w:p>
+    <w:p>
+      <w:pPr>
+        <w:spacing w:before="80" w:after="80"/>
+      </w:pPr>
+    </w:p>
+    <w:p>
+      <w:pPr>
+        <w:spacing w:before="80" w:after="80"/>
+      </w:pPr>
+    </w:p>
+    <w:p>
+      <w:pPr>
+        <w:spacing w:before="80" w:after="80"/>
+      </w:pPr>
+    </w:p>
+    <w:p>
+      <w:pPr>
+        <w:spacing w:before="80" w:after="80"/>
+      </w:pPr>
+    </w:p>
+    <w:p>
+      <w:pPr>
+        <w:spacing w:before="80" w:after="80"/>
+      </w:pPr>
+    </w:p>
+    <w:p>
+      <w:pPr>
+        <w:spacing w:before="80" w:after="80"/>
+      </w:pPr>
+    </w:p>
+    <w:p>
+      <w:pPr>
+        <w:spacing w:before="80" w:after="80"/>
+      </w:pPr>
+    </w:p>
+    <w:p>
+      <w:pPr>
         <w:pStyle w:val="Kop1"/>
         <w:pBdr>
           <w:bottom w:val="single" w:sz="4" w:space="4" w:color="2E75B6"/>
@@ -5422,6 +5428,7 @@
       </w:pPr>
       <w:bookmarkStart w:id="32" w:name="_Toc230782967"/>
       <w:r>
+        <w:lastRenderedPageBreak/>
         <w:t>8. Betrokkenen en begeleiding</w:t>
       </w:r>
       <w:bookmarkEnd w:id="32"/>
@@ -5505,7 +5512,6 @@
         </w:rPr>
         <w:t xml:space="preserve"> </w:t>
       </w:r>
-      <w:proofErr w:type="spellStart"/>
       <w:r>
         <w:rPr>
           <w:i/>
@@ -5513,7 +5519,6 @@
         </w:rPr>
         <w:t>Docent-onderzoeker</w:t>
       </w:r>
-      <w:proofErr w:type="spellEnd"/>
     </w:p>
     <w:p>
       <w:hyperlink r:id="rId12" w:history="1">
@@ -5554,15 +5559,7 @@
       </w:r>
       <w:proofErr w:type="spellEnd"/>
       <w:r>
-        <w:t xml:space="preserve"> of concept doen dit binnen Studio </w:t>
-      </w:r>
-      <w:proofErr w:type="spellStart"/>
-      <w:r>
-        <w:t>Responsible</w:t>
-      </w:r>
-      <w:proofErr w:type="spellEnd"/>
-      <w:r>
-        <w:t xml:space="preserve"> AI.</w:t>
+        <w:t xml:space="preserve"> of concept doen dit binnen Studio Responsible AI.</w:t>
       </w:r>
       <w:r>
         <w:t xml:space="preserve"> </w:t>
@@ -5600,6 +5597,94 @@
         </w:pBdr>
       </w:pPr>
       <w:bookmarkStart w:id="33" w:name="_Toc230782968"/>
+    </w:p>
+    <w:p>
+      <w:pPr>
+        <w:pStyle w:val="Kop1"/>
+        <w:pBdr>
+          <w:bottom w:val="single" w:sz="4" w:space="4" w:color="2E75B6"/>
+        </w:pBdr>
+      </w:pPr>
+    </w:p>
+    <w:p>
+      <w:pPr>
+        <w:pStyle w:val="Kop1"/>
+        <w:pBdr>
+          <w:bottom w:val="single" w:sz="4" w:space="4" w:color="2E75B6"/>
+        </w:pBdr>
+      </w:pPr>
+    </w:p>
+    <w:p>
+      <w:pPr>
+        <w:pStyle w:val="Kop1"/>
+        <w:pBdr>
+          <w:bottom w:val="single" w:sz="4" w:space="4" w:color="2E75B6"/>
+        </w:pBdr>
+      </w:pPr>
+    </w:p>
+    <w:p>
+      <w:pPr>
+        <w:pStyle w:val="Kop1"/>
+        <w:pBdr>
+          <w:bottom w:val="single" w:sz="4" w:space="4" w:color="2E75B6"/>
+        </w:pBdr>
+      </w:pPr>
+    </w:p>
+    <w:p>
+      <w:pPr>
+        <w:pStyle w:val="Kop1"/>
+        <w:pBdr>
+          <w:bottom w:val="single" w:sz="4" w:space="4" w:color="2E75B6"/>
+        </w:pBdr>
+      </w:pPr>
+    </w:p>
+    <w:p>
+      <w:pPr>
+        <w:pStyle w:val="Kop1"/>
+        <w:pBdr>
+          <w:bottom w:val="single" w:sz="4" w:space="4" w:color="2E75B6"/>
+        </w:pBdr>
+      </w:pPr>
+    </w:p>
+    <w:p>
+      <w:pPr>
+        <w:pStyle w:val="Kop1"/>
+        <w:pBdr>
+          <w:bottom w:val="single" w:sz="4" w:space="4" w:color="2E75B6"/>
+        </w:pBdr>
+      </w:pPr>
+    </w:p>
+    <w:p>
+      <w:pPr>
+        <w:pStyle w:val="Kop1"/>
+        <w:pBdr>
+          <w:bottom w:val="single" w:sz="4" w:space="4" w:color="2E75B6"/>
+        </w:pBdr>
+      </w:pPr>
+    </w:p>
+    <w:p>
+      <w:pPr>
+        <w:pStyle w:val="Kop1"/>
+        <w:pBdr>
+          <w:bottom w:val="single" w:sz="4" w:space="4" w:color="2E75B6"/>
+        </w:pBdr>
+      </w:pPr>
+    </w:p>
+    <w:p>
+      <w:pPr>
+        <w:pStyle w:val="Kop1"/>
+        <w:pBdr>
+          <w:bottom w:val="single" w:sz="4" w:space="4" w:color="2E75B6"/>
+        </w:pBdr>
+      </w:pPr>
+    </w:p>
+    <w:p>
+      <w:pPr>
+        <w:pStyle w:val="Kop1"/>
+        <w:pBdr>
+          <w:bottom w:val="single" w:sz="4" w:space="4" w:color="2E75B6"/>
+        </w:pBdr>
+      </w:pPr>
       <w:r>
         <w:lastRenderedPageBreak/>
         <w:t>9. Aanbevelingen</w:t>
@@ -5628,50 +5713,25 @@
           <w:i/>
           <w:iCs/>
         </w:rPr>
-        <w:t xml:space="preserve">prompt </w:t>
-      </w:r>
-      <w:proofErr w:type="spellStart"/>
+        <w:t>prompt injection</w:t>
+      </w:r>
+      <w:r>
+        <w:t xml:space="preserve"> in de AI-pipeline</w:t>
+      </w:r>
+    </w:p>
+    <w:p>
+      <w:pPr>
+        <w:pStyle w:val="Geenafstand"/>
+      </w:pPr>
+      <w:r>
+        <w:t xml:space="preserve">Uit analyse van de Juf Aimee-pipeline is gebleken dat drie invoervelden momenteel ongesaneerd het taalmodel bereiken: het focusgebied van een opdracht (ingevuld door de leraar), de feedback van de leraar op ingeleverd werk, en het ingeleverde werk van de leerling zelf. Er is geen filtering of controle aanwezig voordat deze invoer in de prompt terechtkomt. Dit maakt het systeem kwetsbaar voor </w:t>
+      </w:r>
       <w:r>
         <w:rPr>
           <w:i/>
           <w:iCs/>
         </w:rPr>
-        <w:t>injection</w:t>
-      </w:r>
-      <w:proofErr w:type="spellEnd"/>
-      <w:r>
-        <w:t xml:space="preserve"> in de AI-pipeline</w:t>
-      </w:r>
-    </w:p>
-    <w:p>
-      <w:pPr>
-        <w:pStyle w:val="Geenafstand"/>
-      </w:pPr>
-      <w:r>
-        <w:t xml:space="preserve">Uit analyse van de Juf Aimee-pipeline is gebleken dat drie invoervelden momenteel ongesaneerd het taalmodel bereiken: het focusgebied van een opdracht (ingevuld door de leraar), de feedback van de leraar op ingeleverd werk, en het ingeleverde werk van de leerling zelf. Er is geen filtering of controle aanwezig voordat deze invoer in de prompt terechtkomt. Dit maakt het systeem kwetsbaar voor </w:t>
-      </w:r>
-      <w:r>
-        <w:rPr>
-          <w:i/>
-          <w:iCs/>
-        </w:rPr>
-        <w:t xml:space="preserve">prompt </w:t>
-      </w:r>
-      <w:proofErr w:type="spellStart"/>
-      <w:r>
-        <w:rPr>
-          <w:i/>
-          <w:iCs/>
-        </w:rPr>
-        <w:t>injection</w:t>
-      </w:r>
-      <w:proofErr w:type="spellEnd"/>
-      <w:r>
-        <w:rPr>
-          <w:i/>
-          <w:iCs/>
-        </w:rPr>
-        <w:t xml:space="preserve"> </w:t>
+        <w:t xml:space="preserve">prompt injection </w:t>
       </w:r>
       <w:r>
         <w:t xml:space="preserve">een techniek waarbij een gebruiker het model via de invoer kan manipuleren om buiten zijn bedoelde functie te handelen </w:t>
@@ -6286,59 +6346,12 @@
       <w:r>
         <w:t xml:space="preserve">Een AI-taalbuddy biedt die oefentijd op maat: het systeem stemt de gespreksonderwerpen en moeilijkheidsgraad af op de interesses en het niveau van de leerling, zoals vastgelegd in het </w:t>
       </w:r>
-      <w:proofErr w:type="spellStart"/>
-      <w:r>
-        <w:t>leerlingprofiel</w:t>
-      </w:r>
-      <w:proofErr w:type="spellEnd"/>
-      <w:r>
-        <w:t xml:space="preserve"> en het opbouwende portfolio</w:t>
+      <w:r>
+        <w:t>leerlingprofiel en het opbouwende portfolio</w:t>
       </w:r>
       <w:r>
         <w:t>. De leerkracht houdt altijd inzicht in de voortgang en blijft eindverantwoordelijk voor de taalontwikkeling van de leerling.</w:t>
       </w:r>
-    </w:p>
-    <w:p>
-      <w:pPr>
-        <w:spacing w:before="80" w:after="80"/>
-        <w:jc w:val="both"/>
-      </w:pPr>
-    </w:p>
-    <w:p>
-      <w:pPr>
-        <w:spacing w:before="80" w:after="80"/>
-        <w:jc w:val="both"/>
-      </w:pPr>
-    </w:p>
-    <w:p>
-      <w:pPr>
-        <w:spacing w:before="80" w:after="80"/>
-        <w:jc w:val="both"/>
-      </w:pPr>
-    </w:p>
-    <w:p>
-      <w:pPr>
-        <w:spacing w:before="80" w:after="80"/>
-        <w:jc w:val="both"/>
-      </w:pPr>
-    </w:p>
-    <w:p>
-      <w:pPr>
-        <w:spacing w:before="80" w:after="80"/>
-        <w:jc w:val="both"/>
-      </w:pPr>
-    </w:p>
-    <w:p>
-      <w:pPr>
-        <w:spacing w:before="80" w:after="80"/>
-        <w:jc w:val="both"/>
-      </w:pPr>
-    </w:p>
-    <w:p>
-      <w:pPr>
-        <w:spacing w:before="80" w:after="80"/>
-        <w:jc w:val="both"/>
-      </w:pPr>
     </w:p>
     <w:p>
       <w:pPr>
@@ -6361,6 +6374,7 @@
       </w:pPr>
       <w:bookmarkStart w:id="35" w:name="_Toc230782976"/>
       <w:r>
+        <w:lastRenderedPageBreak/>
         <w:t>11. Literatuur</w:t>
       </w:r>
       <w:bookmarkEnd w:id="35"/>
@@ -6833,6 +6847,14 @@
       <w:ind w:right="360"/>
       <w:jc w:val="center"/>
     </w:pPr>
+    <w:r>
+      <w:rPr>
+        <w:color w:val="888888"/>
+        <w:sz w:val="20"/>
+        <w:szCs w:val="20"/>
+      </w:rPr>
+      <w:t xml:space="preserve"> </w:t>
+    </w:r>
     <w:r>
       <w:rPr>
         <w:color w:val="888888"/>

</xml_diff>

<commit_message>
lokale modellen aanbeveling in onderzoeksverslag
</commit_message>
<xml_diff>
--- a/docs/Analyseren/JufAimee_Onderzoeksverslag.docx
+++ b/docs/Analyseren/JufAimee_Onderzoeksverslag.docx
@@ -4920,15 +4920,7 @@
         <w:t xml:space="preserve">- </w:t>
       </w:r>
       <w:r>
-        <w:t xml:space="preserve">componenten draaien lokaal via Ollama, een oplossing die bewust is gekozen om te voldoen aan de AVG-eis dat persoonsgegevens van minderjarigen niet worden doorgezonden naar externe </w:t>
-      </w:r>
-      <w:proofErr w:type="spellStart"/>
-      <w:r>
-        <w:t>cloudproviders</w:t>
-      </w:r>
-      <w:proofErr w:type="spellEnd"/>
-      <w:r>
-        <w:t>.</w:t>
+        <w:t>componenten draaien lokaal via Ollama, een oplossing die bewust is gekozen om te voldoen aan de AVG-eis dat persoonsgegevens van minderjarigen niet worden doorgezonden naar externe cloudproviders.</w:t>
       </w:r>
       <w:bookmarkStart w:id="25" w:name="_Toc230782960"/>
     </w:p>
@@ -5002,11 +4994,9 @@
       <w:r>
         <w:t xml:space="preserve">Wanneer een leerling meerdere gelijktijdige signalen heeft, genereert het systeem één samenhangende observatie die de signalen in verband brengt. Zo wordt voorkomen dat de leraar meerdere losstaande berichten ontvangt die samen een coherenter beeld vormen. Juf Aimee besluit elke boodschap altijd met een open vraag aan de leraar, </w:t>
       </w:r>
-      <w:proofErr w:type="gramStart"/>
-      <w:r>
-        <w:t>conform</w:t>
-      </w:r>
-      <w:proofErr w:type="gramEnd"/>
+      <w:r>
+        <w:t>volgens</w:t>
+      </w:r>
       <w:r>
         <w:t xml:space="preserve"> het ontwerpprincipe van Hybride AI: de AI informeert en adviseert, maar de leraar houdt het eindoordeel.</w:t>
       </w:r>
@@ -6184,6 +6174,608 @@
     </w:p>
     <w:p>
       <w:pPr>
+        <w:autoSpaceDE w:val="0"/>
+        <w:autoSpaceDN w:val="0"/>
+        <w:adjustRightInd w:val="0"/>
+        <w:rPr>
+          <w:rFonts w:ascii="AppleSystemUIFont" w:hAnsi="AppleSystemUIFont" w:cs="AppleSystemUIFont"/>
+          <w:sz w:val="26"/>
+          <w:szCs w:val="26"/>
+        </w:rPr>
+      </w:pPr>
+    </w:p>
+    <w:p>
+      <w:pPr>
+        <w:pStyle w:val="Kop2"/>
+      </w:pPr>
+      <w:r>
+        <w:lastRenderedPageBreak/>
+        <w:t>9.</w:t>
+      </w:r>
+      <w:r>
+        <w:t xml:space="preserve">3 </w:t>
+      </w:r>
+      <w:r>
+        <w:t>Modelselectie voor loka</w:t>
+      </w:r>
+      <w:r>
+        <w:t>al</w:t>
+      </w:r>
+    </w:p>
+    <w:p>
+      <w:pPr>
+        <w:autoSpaceDE w:val="0"/>
+        <w:autoSpaceDN w:val="0"/>
+        <w:adjustRightInd w:val="0"/>
+        <w:rPr>
+          <w:rFonts w:ascii="AppleSystemUIFont" w:hAnsi="AppleSystemUIFont" w:cs="AppleSystemUIFont"/>
+          <w:sz w:val="26"/>
+          <w:szCs w:val="26"/>
+        </w:rPr>
+      </w:pPr>
+    </w:p>
+    <w:p>
+      <w:pPr>
+        <w:autoSpaceDE w:val="0"/>
+        <w:autoSpaceDN w:val="0"/>
+        <w:adjustRightInd w:val="0"/>
+        <w:rPr>
+          <w:rFonts w:ascii="AppleSystemUIFont" w:hAnsi="AppleSystemUIFont" w:cs="AppleSystemUIFont"/>
+          <w:sz w:val="26"/>
+          <w:szCs w:val="26"/>
+        </w:rPr>
+      </w:pPr>
+      <w:r>
+        <w:rPr>
+          <w:rFonts w:ascii="AppleSystemUIFont" w:hAnsi="AppleSystemUIFont" w:cs="AppleSystemUIFont"/>
+          <w:sz w:val="26"/>
+          <w:szCs w:val="26"/>
+        </w:rPr>
+        <w:t xml:space="preserve">Uit de analyse van de Juf Aimee-architectuur is gebleken dat het systeem momenteel gebruikmaakt van externe cloudproviders voor taalmodelverwerking. Hierbij verlaten persoonsgebonden </w:t>
+      </w:r>
+      <w:r>
+        <w:rPr>
+          <w:rFonts w:ascii="AppleSystemUIFont" w:hAnsi="AppleSystemUIFont" w:cs="AppleSystemUIFont"/>
+          <w:sz w:val="26"/>
+          <w:szCs w:val="26"/>
+        </w:rPr>
+        <w:t>gegevens waaronder</w:t>
+      </w:r>
+      <w:r>
+        <w:rPr>
+          <w:rFonts w:ascii="AppleSystemUIFont" w:hAnsi="AppleSystemUIFont" w:cs="AppleSystemUIFont"/>
+          <w:sz w:val="26"/>
+          <w:szCs w:val="26"/>
+        </w:rPr>
+        <w:t xml:space="preserve"> leerlingprofiel-inhoud, leerlingwerk en leraarbeoordelingen de schoolinfrastructuur. Dit is onwenselijk zolang er geen verwerkersovereenkomst met de betreffende provider is gesloten en de gegevenslocatie niet gegarandeerd binnen de EU valt (AVG art. 44–46).</w:t>
+      </w:r>
+    </w:p>
+    <w:p>
+      <w:pPr>
+        <w:autoSpaceDE w:val="0"/>
+        <w:autoSpaceDN w:val="0"/>
+        <w:adjustRightInd w:val="0"/>
+        <w:rPr>
+          <w:rFonts w:ascii="AppleSystemUIFont" w:hAnsi="AppleSystemUIFont" w:cs="AppleSystemUIFont"/>
+          <w:sz w:val="26"/>
+          <w:szCs w:val="26"/>
+        </w:rPr>
+      </w:pPr>
+    </w:p>
+    <w:p>
+      <w:pPr>
+        <w:autoSpaceDE w:val="0"/>
+        <w:autoSpaceDN w:val="0"/>
+        <w:adjustRightInd w:val="0"/>
+        <w:rPr>
+          <w:rFonts w:ascii="AppleSystemUIFont" w:hAnsi="AppleSystemUIFont" w:cs="AppleSystemUIFont"/>
+          <w:sz w:val="26"/>
+          <w:szCs w:val="26"/>
+        </w:rPr>
+      </w:pPr>
+      <w:r>
+        <w:rPr>
+          <w:rFonts w:ascii="AppleSystemUIFont" w:hAnsi="AppleSystemUIFont" w:cs="AppleSystemUIFont"/>
+          <w:sz w:val="26"/>
+          <w:szCs w:val="26"/>
+        </w:rPr>
+        <w:t xml:space="preserve">Dit risico is structureel van aard: elke modelaanroep stuurt potentieel herleidbare leerlingdata naar een externe partij. Voor een systeem dat ingezet wordt bij minderjarigen in het primair onderwijs is dit strijdig met het </w:t>
+      </w:r>
+      <w:proofErr w:type="spellStart"/>
+      <w:r>
+        <w:rPr>
+          <w:rFonts w:ascii="AppleSystemUIFont" w:hAnsi="AppleSystemUIFont" w:cs="AppleSystemUIFont"/>
+          <w:sz w:val="26"/>
+          <w:szCs w:val="26"/>
+        </w:rPr>
+        <w:t>dataminimalisatiebeginsel</w:t>
+      </w:r>
+      <w:proofErr w:type="spellEnd"/>
+      <w:r>
+        <w:rPr>
+          <w:rFonts w:ascii="AppleSystemUIFont" w:hAnsi="AppleSystemUIFont" w:cs="AppleSystemUIFont"/>
+          <w:sz w:val="26"/>
+          <w:szCs w:val="26"/>
+        </w:rPr>
+        <w:t xml:space="preserve"> (AVG art. 5(1)(c)) en de vereisten van de EU AI Act voor hoogrisicosystemen in het onderwijs.</w:t>
+      </w:r>
+    </w:p>
+    <w:p>
+      <w:pPr>
+        <w:autoSpaceDE w:val="0"/>
+        <w:autoSpaceDN w:val="0"/>
+        <w:adjustRightInd w:val="0"/>
+        <w:rPr>
+          <w:rFonts w:ascii="AppleSystemUIFont" w:hAnsi="AppleSystemUIFont" w:cs="AppleSystemUIFont"/>
+          <w:sz w:val="26"/>
+          <w:szCs w:val="26"/>
+        </w:rPr>
+      </w:pPr>
+    </w:p>
+    <w:p>
+      <w:pPr>
+        <w:autoSpaceDE w:val="0"/>
+        <w:autoSpaceDN w:val="0"/>
+        <w:adjustRightInd w:val="0"/>
+        <w:rPr>
+          <w:rFonts w:ascii="AppleSystemUIFont" w:hAnsi="AppleSystemUIFont" w:cs="AppleSystemUIFont"/>
+          <w:sz w:val="26"/>
+          <w:szCs w:val="26"/>
+        </w:rPr>
+      </w:pPr>
+      <w:r>
+        <w:rPr>
+          <w:rFonts w:ascii="AppleSystemUIFont" w:hAnsi="AppleSystemUIFont" w:cs="AppleSystemUIFont"/>
+          <w:b/>
+          <w:bCs/>
+          <w:sz w:val="26"/>
+          <w:szCs w:val="26"/>
+        </w:rPr>
+        <w:t>Aanbeveling:</w:t>
+      </w:r>
+      <w:r>
+        <w:rPr>
+          <w:rFonts w:ascii="MS Gothic" w:eastAsia="MS Gothic" w:hAnsi="MS Gothic" w:cs="MS Gothic" w:hint="eastAsia"/>
+          <w:sz w:val="26"/>
+          <w:szCs w:val="26"/>
+        </w:rPr>
+        <w:t> +</w:t>
+      </w:r>
+      <w:r>
+        <w:rPr>
+          <w:rFonts w:ascii="AppleSystemUIFont" w:hAnsi="AppleSystemUIFont" w:cs="AppleSystemUIFont"/>
+          <w:sz w:val="26"/>
+          <w:szCs w:val="26"/>
+        </w:rPr>
+        <w:t>Vervang externe cloudmodellen door lokaal gehoste open</w:t>
+      </w:r>
+      <w:r>
+        <w:rPr>
+          <w:rFonts w:ascii="AppleSystemUIFont" w:hAnsi="AppleSystemUIFont" w:cs="AppleSystemUIFont"/>
+          <w:sz w:val="26"/>
+          <w:szCs w:val="26"/>
+        </w:rPr>
+        <w:t xml:space="preserve"> </w:t>
+      </w:r>
+      <w:r>
+        <w:rPr>
+          <w:rFonts w:ascii="AppleSystemUIFont" w:hAnsi="AppleSystemUIFont" w:cs="AppleSystemUIFont"/>
+          <w:sz w:val="26"/>
+          <w:szCs w:val="26"/>
+        </w:rPr>
+        <w:t>source modellen die draaien op de bestaande GPU-serverinfrastructuur, zodat geen leerlingdata de schoolomgeving verlaat.</w:t>
+      </w:r>
+    </w:p>
+    <w:p>
+      <w:pPr>
+        <w:autoSpaceDE w:val="0"/>
+        <w:autoSpaceDN w:val="0"/>
+        <w:adjustRightInd w:val="0"/>
+        <w:rPr>
+          <w:rFonts w:ascii="AppleSystemUIFont" w:hAnsi="AppleSystemUIFont" w:cs="AppleSystemUIFont"/>
+          <w:sz w:val="26"/>
+          <w:szCs w:val="26"/>
+        </w:rPr>
+      </w:pPr>
+    </w:p>
+    <w:p>
+      <w:pPr>
+        <w:autoSpaceDE w:val="0"/>
+        <w:autoSpaceDN w:val="0"/>
+        <w:adjustRightInd w:val="0"/>
+        <w:rPr>
+          <w:rFonts w:ascii="MS Gothic" w:eastAsia="MS Gothic" w:hAnsi="MS Gothic" w:cs="MS Gothic"/>
+          <w:sz w:val="26"/>
+          <w:szCs w:val="26"/>
+        </w:rPr>
+      </w:pPr>
+      <w:r>
+        <w:rPr>
+          <w:rFonts w:ascii="AppleSystemUIFont" w:hAnsi="AppleSystemUIFont" w:cs="AppleSystemUIFont"/>
+          <w:sz w:val="26"/>
+          <w:szCs w:val="26"/>
+        </w:rPr>
+        <w:t>Geprioriteerde maatregelen:</w:t>
+      </w:r>
+      <w:r>
+        <w:rPr>
+          <w:rFonts w:ascii="MS Gothic" w:eastAsia="MS Gothic" w:hAnsi="MS Gothic" w:cs="MS Gothic" w:hint="eastAsia"/>
+          <w:sz w:val="26"/>
+          <w:szCs w:val="26"/>
+        </w:rPr>
+        <w:t> +</w:t>
+      </w:r>
+    </w:p>
+    <w:p>
+      <w:pPr>
+        <w:autoSpaceDE w:val="0"/>
+        <w:autoSpaceDN w:val="0"/>
+        <w:adjustRightInd w:val="0"/>
+        <w:rPr>
+          <w:rFonts w:ascii="AppleSystemUIFont" w:hAnsi="AppleSystemUIFont" w:cs="AppleSystemUIFont"/>
+          <w:i/>
+          <w:iCs/>
+          <w:sz w:val="26"/>
+          <w:szCs w:val="26"/>
+        </w:rPr>
+      </w:pPr>
+      <w:r>
+        <w:rPr>
+          <w:rFonts w:ascii="AppleSystemUIFont" w:hAnsi="AppleSystemUIFont" w:cs="AppleSystemUIFont"/>
+          <w:i/>
+          <w:iCs/>
+          <w:sz w:val="26"/>
+          <w:szCs w:val="26"/>
+        </w:rPr>
+        <w:t>Ranking</w:t>
+      </w:r>
+      <w:r>
+        <w:rPr>
+          <w:rFonts w:ascii="AppleSystemUIFont" w:hAnsi="AppleSystemUIFont" w:cs="AppleSystemUIFont"/>
+          <w:i/>
+          <w:iCs/>
+          <w:sz w:val="26"/>
+          <w:szCs w:val="26"/>
+        </w:rPr>
+        <w:t>:</w:t>
+      </w:r>
+    </w:p>
+    <w:p>
+      <w:pPr>
+        <w:autoSpaceDE w:val="0"/>
+        <w:autoSpaceDN w:val="0"/>
+        <w:adjustRightInd w:val="0"/>
+        <w:rPr>
+          <w:rFonts w:ascii="AppleSystemUIFont" w:hAnsi="AppleSystemUIFont" w:cs="AppleSystemUIFont"/>
+          <w:sz w:val="26"/>
+          <w:szCs w:val="26"/>
+        </w:rPr>
+      </w:pPr>
+    </w:p>
+    <w:p>
+      <w:pPr>
+        <w:pStyle w:val="Lijstalinea"/>
+        <w:numPr>
+          <w:ilvl w:val="0"/>
+          <w:numId w:val="8"/>
+        </w:numPr>
+        <w:autoSpaceDE w:val="0"/>
+        <w:autoSpaceDN w:val="0"/>
+        <w:adjustRightInd w:val="0"/>
+        <w:rPr>
+          <w:rFonts w:ascii="MS Gothic" w:eastAsia="MS Gothic" w:hAnsi="MS Gothic" w:cs="MS Gothic"/>
+          <w:sz w:val="26"/>
+          <w:szCs w:val="26"/>
+        </w:rPr>
+      </w:pPr>
+      <w:r>
+        <w:rPr>
+          <w:rFonts w:ascii="AppleSystemUIFont" w:hAnsi="AppleSystemUIFont" w:cs="AppleSystemUIFont"/>
+          <w:i/>
+          <w:iCs/>
+          <w:sz w:val="26"/>
+          <w:szCs w:val="26"/>
+        </w:rPr>
+        <w:t>Generatie-model: Qwen 2.5 7B-instruct als primair taalmodel voor opdrachtgeneratie;</w:t>
+      </w:r>
+      <w:r>
+        <w:rPr>
+          <w:rFonts w:ascii="MS Gothic" w:eastAsia="MS Gothic" w:hAnsi="MS Gothic" w:cs="MS Gothic" w:hint="eastAsia"/>
+          <w:sz w:val="26"/>
+          <w:szCs w:val="26"/>
+        </w:rPr>
+        <w:t> +</w:t>
+      </w:r>
+    </w:p>
+    <w:p>
+      <w:pPr>
+        <w:pStyle w:val="Lijstalinea"/>
+        <w:numPr>
+          <w:ilvl w:val="0"/>
+          <w:numId w:val="8"/>
+        </w:numPr>
+        <w:autoSpaceDE w:val="0"/>
+        <w:autoSpaceDN w:val="0"/>
+        <w:adjustRightInd w:val="0"/>
+        <w:rPr>
+          <w:rFonts w:ascii="AppleSystemUIFont" w:hAnsi="AppleSystemUIFont" w:cs="AppleSystemUIFont"/>
+          <w:i/>
+          <w:iCs/>
+          <w:sz w:val="26"/>
+          <w:szCs w:val="26"/>
+        </w:rPr>
+      </w:pPr>
+      <w:r>
+        <w:rPr>
+          <w:rFonts w:ascii="AppleSystemUIFont" w:hAnsi="AppleSystemUIFont" w:cs="AppleSystemUIFont"/>
+          <w:i/>
+          <w:iCs/>
+          <w:sz w:val="26"/>
+          <w:szCs w:val="26"/>
+        </w:rPr>
+        <w:t>Embeddings: jeffh/intfloat-multilingual-e5-large voor meertalige OPP-vector via pgvector;</w:t>
+      </w:r>
+      <w:r>
+        <w:rPr>
+          <w:rFonts w:ascii="MS Gothic" w:eastAsia="MS Gothic" w:hAnsi="MS Gothic" w:cs="MS Gothic" w:hint="eastAsia"/>
+          <w:sz w:val="26"/>
+          <w:szCs w:val="26"/>
+        </w:rPr>
+        <w:t> +</w:t>
+      </w:r>
+    </w:p>
+    <w:p>
+      <w:pPr>
+        <w:pStyle w:val="Lijstalinea"/>
+        <w:numPr>
+          <w:ilvl w:val="0"/>
+          <w:numId w:val="8"/>
+        </w:numPr>
+        <w:autoSpaceDE w:val="0"/>
+        <w:autoSpaceDN w:val="0"/>
+        <w:adjustRightInd w:val="0"/>
+        <w:rPr>
+          <w:rFonts w:ascii="AppleSystemUIFont" w:hAnsi="AppleSystemUIFont" w:cs="AppleSystemUIFont"/>
+          <w:i/>
+          <w:iCs/>
+          <w:sz w:val="26"/>
+          <w:szCs w:val="26"/>
+        </w:rPr>
+      </w:pPr>
+      <w:r>
+        <w:rPr>
+          <w:rFonts w:ascii="AppleSystemUIFont" w:hAnsi="AppleSystemUIFont" w:cs="AppleSystemUIFont"/>
+          <w:i/>
+          <w:iCs/>
+          <w:sz w:val="26"/>
+          <w:szCs w:val="26"/>
+        </w:rPr>
+        <w:t>Kwaliteitsbeoordeling: Prometheus 2 als lokale LLM-as-a-</w:t>
+      </w:r>
+      <w:proofErr w:type="spellStart"/>
+      <w:r>
+        <w:rPr>
+          <w:rFonts w:ascii="AppleSystemUIFont" w:hAnsi="AppleSystemUIFont" w:cs="AppleSystemUIFont"/>
+          <w:i/>
+          <w:iCs/>
+          <w:sz w:val="26"/>
+          <w:szCs w:val="26"/>
+        </w:rPr>
+        <w:t>judge</w:t>
+      </w:r>
+      <w:proofErr w:type="spellEnd"/>
+      <w:r>
+        <w:rPr>
+          <w:rFonts w:ascii="AppleSystemUIFont" w:hAnsi="AppleSystemUIFont" w:cs="AppleSystemUIFont"/>
+          <w:i/>
+          <w:iCs/>
+          <w:sz w:val="26"/>
+          <w:szCs w:val="26"/>
+        </w:rPr>
+        <w:t xml:space="preserve"> voor outputvalidatie;</w:t>
+      </w:r>
+      <w:r>
+        <w:rPr>
+          <w:rFonts w:ascii="MS Gothic" w:eastAsia="MS Gothic" w:hAnsi="MS Gothic" w:cs="MS Gothic" w:hint="eastAsia"/>
+          <w:sz w:val="26"/>
+          <w:szCs w:val="26"/>
+        </w:rPr>
+        <w:t> +</w:t>
+      </w:r>
+    </w:p>
+    <w:p>
+      <w:pPr>
+        <w:pStyle w:val="Lijstalinea"/>
+        <w:numPr>
+          <w:ilvl w:val="0"/>
+          <w:numId w:val="8"/>
+        </w:numPr>
+        <w:autoSpaceDE w:val="0"/>
+        <w:autoSpaceDN w:val="0"/>
+        <w:adjustRightInd w:val="0"/>
+        <w:rPr>
+          <w:rFonts w:ascii="AppleSystemUIFont" w:hAnsi="AppleSystemUIFont" w:cs="AppleSystemUIFont"/>
+          <w:i/>
+          <w:iCs/>
+          <w:sz w:val="26"/>
+          <w:szCs w:val="26"/>
+        </w:rPr>
+      </w:pPr>
+      <w:proofErr w:type="spellStart"/>
+      <w:r>
+        <w:rPr>
+          <w:rFonts w:ascii="AppleSystemUIFont" w:hAnsi="AppleSystemUIFont" w:cs="AppleSystemUIFont"/>
+          <w:i/>
+          <w:iCs/>
+          <w:sz w:val="26"/>
+          <w:szCs w:val="26"/>
+        </w:rPr>
+        <w:t>Vision</w:t>
+      </w:r>
+      <w:proofErr w:type="spellEnd"/>
+      <w:r>
+        <w:rPr>
+          <w:rFonts w:ascii="AppleSystemUIFont" w:hAnsi="AppleSystemUIFont" w:cs="AppleSystemUIFont"/>
+          <w:i/>
+          <w:iCs/>
+          <w:sz w:val="26"/>
+          <w:szCs w:val="26"/>
+        </w:rPr>
+        <w:t>-model</w:t>
+      </w:r>
+      <w:r>
+        <w:rPr>
+          <w:rFonts w:ascii="AppleSystemUIFont" w:hAnsi="AppleSystemUIFont" w:cs="AppleSystemUIFont"/>
+          <w:i/>
+          <w:iCs/>
+          <w:sz w:val="26"/>
+          <w:szCs w:val="26"/>
+        </w:rPr>
+        <w:t xml:space="preserve">: </w:t>
+      </w:r>
+      <w:r>
+        <w:rPr>
+          <w:rFonts w:ascii="AppleSystemUIFont" w:hAnsi="AppleSystemUIFont" w:cs="AppleSystemUIFont"/>
+          <w:i/>
+          <w:iCs/>
+          <w:sz w:val="26"/>
+          <w:szCs w:val="26"/>
+        </w:rPr>
+        <w:t>qwen2.5vl:7b</w:t>
+      </w:r>
+      <w:r>
+        <w:rPr>
+          <w:rFonts w:ascii="AppleSystemUIFont" w:hAnsi="AppleSystemUIFont" w:cs="AppleSystemUIFont"/>
+          <w:i/>
+          <w:iCs/>
+          <w:sz w:val="26"/>
+          <w:szCs w:val="26"/>
+        </w:rPr>
+        <w:t xml:space="preserve"> lichtgewicht model voor automatische feedbackgeneratie voor tekeningen.</w:t>
+      </w:r>
+    </w:p>
+    <w:p>
+      <w:pPr>
+        <w:pStyle w:val="Lijstalinea"/>
+        <w:numPr>
+          <w:ilvl w:val="0"/>
+          <w:numId w:val="8"/>
+        </w:numPr>
+        <w:autoSpaceDE w:val="0"/>
+        <w:autoSpaceDN w:val="0"/>
+        <w:adjustRightInd w:val="0"/>
+        <w:rPr>
+          <w:rFonts w:ascii="AppleSystemUIFont" w:hAnsi="AppleSystemUIFont" w:cs="AppleSystemUIFont"/>
+          <w:i/>
+          <w:iCs/>
+          <w:sz w:val="26"/>
+          <w:szCs w:val="26"/>
+        </w:rPr>
+      </w:pPr>
+      <w:r>
+        <w:rPr>
+          <w:rFonts w:ascii="AppleSystemUIFont" w:hAnsi="AppleSystemUIFont" w:cs="AppleSystemUIFont"/>
+          <w:i/>
+          <w:iCs/>
+          <w:sz w:val="26"/>
+          <w:szCs w:val="26"/>
+        </w:rPr>
+        <w:t>Monitoring: logging van modelversie en inferentieparameters per aanroep voor reproduceerbaarheid en auditeerbaarheid.</w:t>
+      </w:r>
+    </w:p>
+    <w:p>
+      <w:pPr>
+        <w:autoSpaceDE w:val="0"/>
+        <w:autoSpaceDN w:val="0"/>
+        <w:adjustRightInd w:val="0"/>
+        <w:rPr>
+          <w:rFonts w:ascii="AppleSystemUIFont" w:hAnsi="AppleSystemUIFont" w:cs="AppleSystemUIFont"/>
+          <w:sz w:val="26"/>
+          <w:szCs w:val="26"/>
+        </w:rPr>
+      </w:pPr>
+    </w:p>
+    <w:p>
+      <w:pPr>
+        <w:autoSpaceDE w:val="0"/>
+        <w:autoSpaceDN w:val="0"/>
+        <w:adjustRightInd w:val="0"/>
+        <w:rPr>
+          <w:rFonts w:ascii="AppleSystemUIFont" w:hAnsi="AppleSystemUIFont" w:cs="AppleSystemUIFont"/>
+          <w:b/>
+          <w:bCs/>
+          <w:sz w:val="26"/>
+          <w:szCs w:val="26"/>
+        </w:rPr>
+      </w:pPr>
+      <w:r>
+        <w:rPr>
+          <w:rFonts w:ascii="AppleSystemUIFont" w:hAnsi="AppleSystemUIFont" w:cs="AppleSystemUIFont"/>
+          <w:b/>
+          <w:bCs/>
+          <w:sz w:val="26"/>
+          <w:szCs w:val="26"/>
+        </w:rPr>
+        <w:t>Maatschappelijke impact:</w:t>
+      </w:r>
+    </w:p>
+    <w:p>
+      <w:pPr>
+        <w:autoSpaceDE w:val="0"/>
+        <w:autoSpaceDN w:val="0"/>
+        <w:adjustRightInd w:val="0"/>
+        <w:rPr>
+          <w:rFonts w:ascii="AppleSystemUIFont" w:hAnsi="AppleSystemUIFont" w:cs="AppleSystemUIFont"/>
+          <w:b/>
+          <w:bCs/>
+          <w:sz w:val="26"/>
+          <w:szCs w:val="26"/>
+        </w:rPr>
+      </w:pPr>
+    </w:p>
+    <w:p>
+      <w:pPr>
+        <w:autoSpaceDE w:val="0"/>
+        <w:autoSpaceDN w:val="0"/>
+        <w:adjustRightInd w:val="0"/>
+        <w:rPr>
+          <w:rFonts w:ascii="AppleSystemUIFont" w:hAnsi="AppleSystemUIFont" w:cs="AppleSystemUIFont"/>
+          <w:sz w:val="26"/>
+          <w:szCs w:val="26"/>
+        </w:rPr>
+      </w:pPr>
+      <w:r>
+        <w:rPr>
+          <w:rFonts w:ascii="AppleSystemUIFont" w:hAnsi="AppleSystemUIFont" w:cs="AppleSystemUIFont"/>
+          <w:sz w:val="26"/>
+          <w:szCs w:val="26"/>
+        </w:rPr>
+        <w:t>Lokal</w:t>
+      </w:r>
+      <w:r>
+        <w:rPr>
+          <w:rFonts w:ascii="AppleSystemUIFont" w:hAnsi="AppleSystemUIFont" w:cs="AppleSystemUIFont"/>
+          <w:sz w:val="26"/>
+          <w:szCs w:val="26"/>
+        </w:rPr>
+        <w:t xml:space="preserve">e inzet </w:t>
+      </w:r>
+      <w:r>
+        <w:rPr>
+          <w:rFonts w:ascii="AppleSystemUIFont" w:hAnsi="AppleSystemUIFont" w:cs="AppleSystemUIFont"/>
+          <w:sz w:val="26"/>
+          <w:szCs w:val="26"/>
+        </w:rPr>
+        <w:t>garandeert dat leerlingdata de schoolinfrastructuur niet verlaat, waarmee het systeem voldoet aan de AVG en het vertrouwen van scholen, ouders en toezichthouders vergroot. Voor de opdrachtgever verlaagt het de juridische blootstelling en maakt het een aantoonbaar privacy by design ontwerp mogelijk; een voorwaarde voor verantwoorde opschaling naar meerdere scholen.</w:t>
+      </w:r>
+    </w:p>
+    <w:p>
+      <w:pPr>
         <w:spacing w:before="80" w:after="80"/>
       </w:pPr>
     </w:p>
@@ -6263,13 +6855,8 @@
       </w:r>
       <w:proofErr w:type="spellEnd"/>
       <w:r>
-        <w:t xml:space="preserve"> van </w:t>
-      </w:r>
-      <w:proofErr w:type="spellStart"/>
-      <w:r>
-        <w:t>leerlingdata</w:t>
-      </w:r>
-      <w:proofErr w:type="spellEnd"/>
+        <w:t xml:space="preserve"> van leerlingdata</w:t>
+      </w:r>
     </w:p>
     <w:p>
       <w:pPr>
@@ -6361,18 +6948,20 @@
     </w:p>
     <w:p>
       <w:pPr>
-        <w:spacing w:before="80" w:after="80"/>
-        <w:jc w:val="both"/>
-      </w:pPr>
-    </w:p>
-    <w:p>
-      <w:pPr>
         <w:pStyle w:val="Kop1"/>
         <w:pBdr>
           <w:bottom w:val="single" w:sz="4" w:space="4" w:color="2E75B6"/>
         </w:pBdr>
       </w:pPr>
       <w:bookmarkStart w:id="35" w:name="_Toc230782976"/>
+    </w:p>
+    <w:p>
+      <w:pPr>
+        <w:pStyle w:val="Kop1"/>
+        <w:pBdr>
+          <w:bottom w:val="single" w:sz="4" w:space="4" w:color="2E75B6"/>
+        </w:pBdr>
+      </w:pPr>
       <w:r>
         <w:lastRenderedPageBreak/>
         <w:t>11. Literatuur</w:t>
@@ -6898,6 +7487,181 @@
 <file path=word/numbering.xml><?xml version="1.0" encoding="utf-8"?>
 <w:numbering xmlns:wpc="http://schemas.microsoft.com/office/word/2010/wordprocessingCanvas" xmlns:cx="http://schemas.microsoft.com/office/drawing/2014/chartex" xmlns:cx1="http://schemas.microsoft.com/office/drawing/2015/9/8/chartex" xmlns:cx2="http://schemas.microsoft.com/office/drawing/2015/10/21/chartex" xmlns:cx3="http://schemas.microsoft.com/office/drawing/2016/5/9/chartex" xmlns:cx4="http://schemas.microsoft.com/office/drawing/2016/5/10/chartex" xmlns:cx5="http://schemas.microsoft.com/office/drawing/2016/5/11/chartex" xmlns:cx6="http://schemas.microsoft.com/office/drawing/2016/5/12/chartex" xmlns:cx7="http://schemas.microsoft.com/office/drawing/2016/5/13/chartex" xmlns:cx8="http://schemas.microsoft.com/office/drawing/2016/5/14/chartex" xmlns:mc="http://schemas.openxmlformats.org/markup-compatibility/2006" xmlns:aink="http://schemas.microsoft.com/office/drawing/2016/ink" xmlns:am3d="http://schemas.microsoft.com/office/drawing/2017/model3d" xmlns:o="urn:schemas-microsoft-com:office:office" xmlns:oel="http://schemas.microsoft.com/office/2019/extlst" xmlns:r="http://schemas.openxmlformats.org/officeDocument/2006/relationships" xmlns:m="http://schemas.openxmlformats.org/officeDocument/2006/math" xmlns:v="urn:schemas-microsoft-com:vml" xmlns:wp14="http://schemas.microsoft.com/office/word/2010/wordprocessingDrawing" xmlns:wp="http://schemas.openxmlformats.org/drawingml/2006/wordprocessingDrawing" xmlns:w10="urn:schemas-microsoft-com:office:word" xmlns:w="http://schemas.openxmlformats.org/wordprocessingml/2006/main" xmlns:w14="http://schemas.microsoft.com/office/word/2010/wordml" xmlns:w15="http://schemas.microsoft.com/office/word/2012/wordml" xmlns:w16cex="http://schemas.microsoft.com/office/word/2018/wordml/cex" xmlns:w16cid="http://schemas.microsoft.com/office/word/2016/wordml/cid" xmlns:w16="http://schemas.microsoft.com/office/word/2018/wordml" xmlns:w16du="http://schemas.microsoft.com/office/word/2023/wordml/word16du" xmlns:w16sdtdh="http://schemas.microsoft.com/office/word/2020/wordml/sdtdatahash" xmlns:w16sdtfl="http://schemas.microsoft.com/office/word/2024/wordml/sdtformatlock" xmlns:w16se="http://schemas.microsoft.com/office/word/2015/wordml/symex" xmlns:wpg="http://schemas.microsoft.com/office/word/2010/wordprocessingGroup" xmlns:wpi="http://schemas.microsoft.com/office/word/2010/wordprocessingInk" xmlns:wne="http://schemas.microsoft.com/office/word/2006/wordml" xmlns:wps="http://schemas.microsoft.com/office/word/2010/wordprocessingShape" mc:Ignorable="w14 w15 w16se w16cid w16 w16cex w16sdtdh w16sdtfl w16du wp14">
   <w:abstractNum w:abstractNumId="0" w15:restartNumberingAfterBreak="0">
+    <w:nsid w:val="03311BBD"/>
+    <w:multiLevelType w:val="hybridMultilevel"/>
+    <w:tmpl w:val="38C8A72A"/>
+    <w:lvl w:ilvl="0" w:tplc="04130001">
+      <w:start w:val="1"/>
+      <w:numFmt w:val="bullet"/>
+      <w:lvlText w:val=""/>
+      <w:lvlJc w:val="left"/>
+      <w:pPr>
+        <w:ind w:left="720" w:hanging="360"/>
+      </w:pPr>
+      <w:rPr>
+        <w:rFonts w:ascii="Symbol" w:hAnsi="Symbol" w:hint="default"/>
+      </w:rPr>
+    </w:lvl>
+    <w:lvl w:ilvl="1" w:tplc="FFFFFFFF" w:tentative="1">
+      <w:start w:val="1"/>
+      <w:numFmt w:val="lowerLetter"/>
+      <w:lvlText w:val="%2."/>
+      <w:lvlJc w:val="left"/>
+      <w:pPr>
+        <w:ind w:left="1440" w:hanging="360"/>
+      </w:pPr>
+    </w:lvl>
+    <w:lvl w:ilvl="2" w:tplc="FFFFFFFF" w:tentative="1">
+      <w:start w:val="1"/>
+      <w:numFmt w:val="lowerRoman"/>
+      <w:lvlText w:val="%3."/>
+      <w:lvlJc w:val="right"/>
+      <w:pPr>
+        <w:ind w:left="2160" w:hanging="180"/>
+      </w:pPr>
+    </w:lvl>
+    <w:lvl w:ilvl="3" w:tplc="FFFFFFFF" w:tentative="1">
+      <w:start w:val="1"/>
+      <w:numFmt w:val="decimal"/>
+      <w:lvlText w:val="%4."/>
+      <w:lvlJc w:val="left"/>
+      <w:pPr>
+        <w:ind w:left="2880" w:hanging="360"/>
+      </w:pPr>
+    </w:lvl>
+    <w:lvl w:ilvl="4" w:tplc="FFFFFFFF" w:tentative="1">
+      <w:start w:val="1"/>
+      <w:numFmt w:val="lowerLetter"/>
+      <w:lvlText w:val="%5."/>
+      <w:lvlJc w:val="left"/>
+      <w:pPr>
+        <w:ind w:left="3600" w:hanging="360"/>
+      </w:pPr>
+    </w:lvl>
+    <w:lvl w:ilvl="5" w:tplc="FFFFFFFF" w:tentative="1">
+      <w:start w:val="1"/>
+      <w:numFmt w:val="lowerRoman"/>
+      <w:lvlText w:val="%6."/>
+      <w:lvlJc w:val="right"/>
+      <w:pPr>
+        <w:ind w:left="4320" w:hanging="180"/>
+      </w:pPr>
+    </w:lvl>
+    <w:lvl w:ilvl="6" w:tplc="FFFFFFFF" w:tentative="1">
+      <w:start w:val="1"/>
+      <w:numFmt w:val="decimal"/>
+      <w:lvlText w:val="%7."/>
+      <w:lvlJc w:val="left"/>
+      <w:pPr>
+        <w:ind w:left="5040" w:hanging="360"/>
+      </w:pPr>
+    </w:lvl>
+    <w:lvl w:ilvl="7" w:tplc="FFFFFFFF" w:tentative="1">
+      <w:start w:val="1"/>
+      <w:numFmt w:val="lowerLetter"/>
+      <w:lvlText w:val="%8."/>
+      <w:lvlJc w:val="left"/>
+      <w:pPr>
+        <w:ind w:left="5760" w:hanging="360"/>
+      </w:pPr>
+    </w:lvl>
+    <w:lvl w:ilvl="8" w:tplc="FFFFFFFF" w:tentative="1">
+      <w:start w:val="1"/>
+      <w:numFmt w:val="lowerRoman"/>
+      <w:lvlText w:val="%9."/>
+      <w:lvlJc w:val="right"/>
+      <w:pPr>
+        <w:ind w:left="6480" w:hanging="180"/>
+      </w:pPr>
+    </w:lvl>
+  </w:abstractNum>
+  <w:abstractNum w:abstractNumId="1" w15:restartNumberingAfterBreak="0">
+    <w:nsid w:val="0EFB5523"/>
+    <w:multiLevelType w:val="hybridMultilevel"/>
+    <w:tmpl w:val="C576FAC2"/>
+    <w:lvl w:ilvl="0" w:tplc="0413000F">
+      <w:start w:val="1"/>
+      <w:numFmt w:val="decimal"/>
+      <w:lvlText w:val="%1."/>
+      <w:lvlJc w:val="left"/>
+      <w:pPr>
+        <w:ind w:left="720" w:hanging="360"/>
+      </w:pPr>
+    </w:lvl>
+    <w:lvl w:ilvl="1" w:tplc="04130019" w:tentative="1">
+      <w:start w:val="1"/>
+      <w:numFmt w:val="lowerLetter"/>
+      <w:lvlText w:val="%2."/>
+      <w:lvlJc w:val="left"/>
+      <w:pPr>
+        <w:ind w:left="1440" w:hanging="360"/>
+      </w:pPr>
+    </w:lvl>
+    <w:lvl w:ilvl="2" w:tplc="0413001B" w:tentative="1">
+      <w:start w:val="1"/>
+      <w:numFmt w:val="lowerRoman"/>
+      <w:lvlText w:val="%3."/>
+      <w:lvlJc w:val="right"/>
+      <w:pPr>
+        <w:ind w:left="2160" w:hanging="180"/>
+      </w:pPr>
+    </w:lvl>
+    <w:lvl w:ilvl="3" w:tplc="0413000F" w:tentative="1">
+      <w:start w:val="1"/>
+      <w:numFmt w:val="decimal"/>
+      <w:lvlText w:val="%4."/>
+      <w:lvlJc w:val="left"/>
+      <w:pPr>
+        <w:ind w:left="2880" w:hanging="360"/>
+      </w:pPr>
+    </w:lvl>
+    <w:lvl w:ilvl="4" w:tplc="04130019" w:tentative="1">
+      <w:start w:val="1"/>
+      <w:numFmt w:val="lowerLetter"/>
+      <w:lvlText w:val="%5."/>
+      <w:lvlJc w:val="left"/>
+      <w:pPr>
+        <w:ind w:left="3600" w:hanging="360"/>
+      </w:pPr>
+    </w:lvl>
+    <w:lvl w:ilvl="5" w:tplc="0413001B" w:tentative="1">
+      <w:start w:val="1"/>
+      <w:numFmt w:val="lowerRoman"/>
+      <w:lvlText w:val="%6."/>
+      <w:lvlJc w:val="right"/>
+      <w:pPr>
+        <w:ind w:left="4320" w:hanging="180"/>
+      </w:pPr>
+    </w:lvl>
+    <w:lvl w:ilvl="6" w:tplc="0413000F" w:tentative="1">
+      <w:start w:val="1"/>
+      <w:numFmt w:val="decimal"/>
+      <w:lvlText w:val="%7."/>
+      <w:lvlJc w:val="left"/>
+      <w:pPr>
+        <w:ind w:left="5040" w:hanging="360"/>
+      </w:pPr>
+    </w:lvl>
+    <w:lvl w:ilvl="7" w:tplc="04130019" w:tentative="1">
+      <w:start w:val="1"/>
+      <w:numFmt w:val="lowerLetter"/>
+      <w:lvlText w:val="%8."/>
+      <w:lvlJc w:val="left"/>
+      <w:pPr>
+        <w:ind w:left="5760" w:hanging="360"/>
+      </w:pPr>
+    </w:lvl>
+    <w:lvl w:ilvl="8" w:tplc="0413001B" w:tentative="1">
+      <w:start w:val="1"/>
+      <w:numFmt w:val="lowerRoman"/>
+      <w:lvlText w:val="%9."/>
+      <w:lvlJc w:val="right"/>
+      <w:pPr>
+        <w:ind w:left="6480" w:hanging="180"/>
+      </w:pPr>
+    </w:lvl>
+  </w:abstractNum>
+  <w:abstractNum w:abstractNumId="2" w15:restartNumberingAfterBreak="0">
     <w:nsid w:val="10F255A9"/>
     <w:multiLevelType w:val="hybridMultilevel"/>
     <w:tmpl w:val="EB9C4682"/>
@@ -6983,7 +7747,7 @@
       </w:pPr>
     </w:lvl>
   </w:abstractNum>
-  <w:abstractNum w:abstractNumId="1" w15:restartNumberingAfterBreak="0">
+  <w:abstractNum w:abstractNumId="3" w15:restartNumberingAfterBreak="0">
     <w:nsid w:val="11797794"/>
     <w:multiLevelType w:val="hybridMultilevel"/>
     <w:tmpl w:val="5CB8624A"/>
@@ -7037,7 +7801,7 @@
       <w:lvlJc w:val="left"/>
     </w:lvl>
   </w:abstractNum>
-  <w:abstractNum w:abstractNumId="2" w15:restartNumberingAfterBreak="0">
+  <w:abstractNum w:abstractNumId="4" w15:restartNumberingAfterBreak="0">
     <w:nsid w:val="200D3E98"/>
     <w:multiLevelType w:val="hybridMultilevel"/>
     <w:tmpl w:val="1DD2700A"/>
@@ -7150,7 +7914,7 @@
       </w:rPr>
     </w:lvl>
   </w:abstractNum>
-  <w:abstractNum w:abstractNumId="3" w15:restartNumberingAfterBreak="0">
+  <w:abstractNum w:abstractNumId="5" w15:restartNumberingAfterBreak="0">
     <w:nsid w:val="3B421040"/>
     <w:multiLevelType w:val="hybridMultilevel"/>
     <w:tmpl w:val="E3469D86"/>
@@ -7239,23 +8003,211 @@
       </w:pPr>
     </w:lvl>
   </w:abstractNum>
+  <w:abstractNum w:abstractNumId="6" w15:restartNumberingAfterBreak="0">
+    <w:nsid w:val="4840713F"/>
+    <w:multiLevelType w:val="hybridMultilevel"/>
+    <w:tmpl w:val="F7D8A2CC"/>
+    <w:lvl w:ilvl="0" w:tplc="7AD0DAFE">
+      <w:start w:val="1"/>
+      <w:numFmt w:val="decimal"/>
+      <w:lvlText w:val="(%1)"/>
+      <w:lvlJc w:val="left"/>
+      <w:pPr>
+        <w:ind w:left="720" w:hanging="360"/>
+      </w:pPr>
+      <w:rPr>
+        <w:rFonts w:ascii="AppleSystemUIFont" w:eastAsia="Arial" w:hAnsi="AppleSystemUIFont" w:cs="AppleSystemUIFont" w:hint="default"/>
+        <w:i/>
+      </w:rPr>
+    </w:lvl>
+    <w:lvl w:ilvl="1" w:tplc="04130019" w:tentative="1">
+      <w:start w:val="1"/>
+      <w:numFmt w:val="lowerLetter"/>
+      <w:lvlText w:val="%2."/>
+      <w:lvlJc w:val="left"/>
+      <w:pPr>
+        <w:ind w:left="1440" w:hanging="360"/>
+      </w:pPr>
+    </w:lvl>
+    <w:lvl w:ilvl="2" w:tplc="0413001B" w:tentative="1">
+      <w:start w:val="1"/>
+      <w:numFmt w:val="lowerRoman"/>
+      <w:lvlText w:val="%3."/>
+      <w:lvlJc w:val="right"/>
+      <w:pPr>
+        <w:ind w:left="2160" w:hanging="180"/>
+      </w:pPr>
+    </w:lvl>
+    <w:lvl w:ilvl="3" w:tplc="0413000F" w:tentative="1">
+      <w:start w:val="1"/>
+      <w:numFmt w:val="decimal"/>
+      <w:lvlText w:val="%4."/>
+      <w:lvlJc w:val="left"/>
+      <w:pPr>
+        <w:ind w:left="2880" w:hanging="360"/>
+      </w:pPr>
+    </w:lvl>
+    <w:lvl w:ilvl="4" w:tplc="04130019" w:tentative="1">
+      <w:start w:val="1"/>
+      <w:numFmt w:val="lowerLetter"/>
+      <w:lvlText w:val="%5."/>
+      <w:lvlJc w:val="left"/>
+      <w:pPr>
+        <w:ind w:left="3600" w:hanging="360"/>
+      </w:pPr>
+    </w:lvl>
+    <w:lvl w:ilvl="5" w:tplc="0413001B" w:tentative="1">
+      <w:start w:val="1"/>
+      <w:numFmt w:val="lowerRoman"/>
+      <w:lvlText w:val="%6."/>
+      <w:lvlJc w:val="right"/>
+      <w:pPr>
+        <w:ind w:left="4320" w:hanging="180"/>
+      </w:pPr>
+    </w:lvl>
+    <w:lvl w:ilvl="6" w:tplc="0413000F" w:tentative="1">
+      <w:start w:val="1"/>
+      <w:numFmt w:val="decimal"/>
+      <w:lvlText w:val="%7."/>
+      <w:lvlJc w:val="left"/>
+      <w:pPr>
+        <w:ind w:left="5040" w:hanging="360"/>
+      </w:pPr>
+    </w:lvl>
+    <w:lvl w:ilvl="7" w:tplc="04130019" w:tentative="1">
+      <w:start w:val="1"/>
+      <w:numFmt w:val="lowerLetter"/>
+      <w:lvlText w:val="%8."/>
+      <w:lvlJc w:val="left"/>
+      <w:pPr>
+        <w:ind w:left="5760" w:hanging="360"/>
+      </w:pPr>
+    </w:lvl>
+    <w:lvl w:ilvl="8" w:tplc="0413001B" w:tentative="1">
+      <w:start w:val="1"/>
+      <w:numFmt w:val="lowerRoman"/>
+      <w:lvlText w:val="%9."/>
+      <w:lvlJc w:val="right"/>
+      <w:pPr>
+        <w:ind w:left="6480" w:hanging="180"/>
+      </w:pPr>
+    </w:lvl>
+  </w:abstractNum>
+  <w:abstractNum w:abstractNumId="7" w15:restartNumberingAfterBreak="0">
+    <w:nsid w:val="49297FA0"/>
+    <w:multiLevelType w:val="hybridMultilevel"/>
+    <w:tmpl w:val="E2348664"/>
+    <w:lvl w:ilvl="0" w:tplc="0413000F">
+      <w:start w:val="1"/>
+      <w:numFmt w:val="decimal"/>
+      <w:lvlText w:val="%1."/>
+      <w:lvlJc w:val="left"/>
+      <w:pPr>
+        <w:ind w:left="720" w:hanging="360"/>
+      </w:pPr>
+    </w:lvl>
+    <w:lvl w:ilvl="1" w:tplc="04130019" w:tentative="1">
+      <w:start w:val="1"/>
+      <w:numFmt w:val="lowerLetter"/>
+      <w:lvlText w:val="%2."/>
+      <w:lvlJc w:val="left"/>
+      <w:pPr>
+        <w:ind w:left="1440" w:hanging="360"/>
+      </w:pPr>
+    </w:lvl>
+    <w:lvl w:ilvl="2" w:tplc="0413001B" w:tentative="1">
+      <w:start w:val="1"/>
+      <w:numFmt w:val="lowerRoman"/>
+      <w:lvlText w:val="%3."/>
+      <w:lvlJc w:val="right"/>
+      <w:pPr>
+        <w:ind w:left="2160" w:hanging="180"/>
+      </w:pPr>
+    </w:lvl>
+    <w:lvl w:ilvl="3" w:tplc="0413000F" w:tentative="1">
+      <w:start w:val="1"/>
+      <w:numFmt w:val="decimal"/>
+      <w:lvlText w:val="%4."/>
+      <w:lvlJc w:val="left"/>
+      <w:pPr>
+        <w:ind w:left="2880" w:hanging="360"/>
+      </w:pPr>
+    </w:lvl>
+    <w:lvl w:ilvl="4" w:tplc="04130019" w:tentative="1">
+      <w:start w:val="1"/>
+      <w:numFmt w:val="lowerLetter"/>
+      <w:lvlText w:val="%5."/>
+      <w:lvlJc w:val="left"/>
+      <w:pPr>
+        <w:ind w:left="3600" w:hanging="360"/>
+      </w:pPr>
+    </w:lvl>
+    <w:lvl w:ilvl="5" w:tplc="0413001B" w:tentative="1">
+      <w:start w:val="1"/>
+      <w:numFmt w:val="lowerRoman"/>
+      <w:lvlText w:val="%6."/>
+      <w:lvlJc w:val="right"/>
+      <w:pPr>
+        <w:ind w:left="4320" w:hanging="180"/>
+      </w:pPr>
+    </w:lvl>
+    <w:lvl w:ilvl="6" w:tplc="0413000F" w:tentative="1">
+      <w:start w:val="1"/>
+      <w:numFmt w:val="decimal"/>
+      <w:lvlText w:val="%7."/>
+      <w:lvlJc w:val="left"/>
+      <w:pPr>
+        <w:ind w:left="5040" w:hanging="360"/>
+      </w:pPr>
+    </w:lvl>
+    <w:lvl w:ilvl="7" w:tplc="04130019" w:tentative="1">
+      <w:start w:val="1"/>
+      <w:numFmt w:val="lowerLetter"/>
+      <w:lvlText w:val="%8."/>
+      <w:lvlJc w:val="left"/>
+      <w:pPr>
+        <w:ind w:left="5760" w:hanging="360"/>
+      </w:pPr>
+    </w:lvl>
+    <w:lvl w:ilvl="8" w:tplc="0413001B" w:tentative="1">
+      <w:start w:val="1"/>
+      <w:numFmt w:val="lowerRoman"/>
+      <w:lvlText w:val="%9."/>
+      <w:lvlJc w:val="right"/>
+      <w:pPr>
+        <w:ind w:left="6480" w:hanging="180"/>
+      </w:pPr>
+    </w:lvl>
+  </w:abstractNum>
   <w:num w:numId="1" w16cid:durableId="1163817982">
-    <w:abstractNumId w:val="0"/>
+    <w:abstractNumId w:val="2"/>
     <w:lvlOverride w:ilvl="0">
       <w:startOverride w:val="1"/>
     </w:lvlOverride>
   </w:num>
   <w:num w:numId="2" w16cid:durableId="990716718">
-    <w:abstractNumId w:val="1"/>
+    <w:abstractNumId w:val="3"/>
     <w:lvlOverride w:ilvl="0">
       <w:startOverride w:val="1"/>
     </w:lvlOverride>
   </w:num>
   <w:num w:numId="3" w16cid:durableId="228655259">
-    <w:abstractNumId w:val="3"/>
+    <w:abstractNumId w:val="5"/>
   </w:num>
   <w:num w:numId="4" w16cid:durableId="1361515788">
-    <w:abstractNumId w:val="2"/>
+    <w:abstractNumId w:val="4"/>
+  </w:num>
+  <w:num w:numId="5" w16cid:durableId="1350175836">
+    <w:abstractNumId w:val="7"/>
+  </w:num>
+  <w:num w:numId="6" w16cid:durableId="4793657">
+    <w:abstractNumId w:val="6"/>
+  </w:num>
+  <w:num w:numId="7" w16cid:durableId="1219394671">
+    <w:abstractNumId w:val="1"/>
+  </w:num>
+  <w:num w:numId="8" w16cid:durableId="1625771710">
+    <w:abstractNumId w:val="0"/>
   </w:num>
 </w:numbering>
 </file>
@@ -7654,6 +8606,7 @@
   <w:style w:type="paragraph" w:default="1" w:styleId="Standaard">
     <w:name w:val="Normal"/>
     <w:qFormat/>
+    <w:rsid w:val="00A553C9"/>
   </w:style>
   <w:style w:type="paragraph" w:styleId="Kop1">
     <w:name w:val="heading 1"/>

</xml_diff>